<commit_message>
Guide d'utilisation : rapport Ventes à jour (page Agrégats, noms de colonnes lisibles, sécurité sur les agrégats)
Co-Authored-By: Claude Opus 5.5 <noreply@anthropic.com>
Claude-Session: https://claude.ai/code/session_01UgeLXzj9G5UyQ5F9qqzBDt
</commit_message>
<xml_diff>
--- a/docs/MobiPass_Guide_utilisation_outils_analyse.docx
+++ b/docs/MobiPass_Guide_utilisation_outils_analyse.docx
@@ -2976,6 +2976,437 @@
     </w:p>
     <w:p>
       <w:pPr>
+        <w:spacing w:after="120"/>
+      </w:pPr>
+      <w:r>
+        <w:t xml:space="preserve">Le rapport compte </w:t>
+      </w:r>
+      <w:r>
+        <w:rPr>
+          <w:b/>
+          <w:bCs/>
+        </w:rPr>
+        <w:t xml:space="preserve">trois pages</w:t>
+      </w:r>
+      <w:r>
+        <w:t xml:space="preserve">. Les deux premières interrogent le fait détaillé </w:t>
+      </w:r>
+      <w:r>
+        <w:rPr>
+          <w:rFonts w:ascii="Consolas" w:cs="Consolas" w:eastAsia="Consolas" w:hAnsi="Consolas"/>
+          <w:sz w:val="19"/>
+          <w:szCs w:val="19"/>
+        </w:rPr>
+        <w:t xml:space="preserve">ACHAT_MD2</w:t>
+      </w:r>
+      <w:r>
+        <w:t xml:space="preserve"> et ses dimensions ; la troisième interroge directement les </w:t>
+      </w:r>
+      <w:r>
+        <w:rPr>
+          <w:b/>
+          <w:bCs/>
+        </w:rPr>
+        <w:t xml:space="preserve">trois agrégats</w:t>
+      </w:r>
+      <w:r>
+        <w:t xml:space="preserve"> du treillis (vues matérialisées).</w:t>
+      </w:r>
+    </w:p>
+    <w:tbl>
+      <w:tblPr>
+        <w:tblW w:type="dxa" w:w="9638"/>
+        <w:tblBorders>
+          <w:top w:val="single" w:color="auto" w:sz="4"/>
+          <w:left w:val="single" w:color="auto" w:sz="4"/>
+          <w:bottom w:val="single" w:color="auto" w:sz="4"/>
+          <w:right w:val="single" w:color="auto" w:sz="4"/>
+          <w:insideH w:val="single" w:color="auto" w:sz="4"/>
+          <w:insideV w:val="single" w:color="auto" w:sz="4"/>
+        </w:tblBorders>
+      </w:tblPr>
+      <w:tblGrid>
+        <w:gridCol w:w="2300"/>
+        <w:gridCol w:w="4300"/>
+        <w:gridCol w:w="3038"/>
+      </w:tblGrid>
+      <w:tr>
+        <w:trPr>
+          <w:tblHeader/>
+        </w:trPr>
+        <w:tc>
+          <w:tcPr>
+            <w:tcW w:type="dxa" w:w="2300"/>
+            <w:tcBorders>
+              <w:top w:val="single" w:color="8EA9C8" w:sz="4"/>
+              <w:left w:val="single" w:color="8EA9C8" w:sz="4"/>
+              <w:bottom w:val="single" w:color="8EA9C8" w:sz="4"/>
+              <w:right w:val="single" w:color="8EA9C8" w:sz="4"/>
+            </w:tcBorders>
+            <w:shd w:fill="A7C7F2" w:color="auto" w:val="clear"/>
+            <w:tcMar>
+              <w:top w:type="dxa" w:w="60"/>
+              <w:left w:type="dxa" w:w="100"/>
+              <w:bottom w:type="dxa" w:w="60"/>
+              <w:right w:type="dxa" w:w="100"/>
+            </w:tcMar>
+          </w:tcPr>
+          <w:p>
+            <w:pPr>
+              <w:spacing w:after="0"/>
+            </w:pPr>
+            <w:r>
+              <w:rPr>
+                <w:b/>
+                <w:bCs/>
+              </w:rPr>
+              <w:t xml:space="preserve">Page</w:t>
+            </w:r>
+          </w:p>
+        </w:tc>
+        <w:tc>
+          <w:tcPr>
+            <w:tcW w:type="dxa" w:w="4300"/>
+            <w:tcBorders>
+              <w:top w:val="single" w:color="8EA9C8" w:sz="4"/>
+              <w:left w:val="single" w:color="8EA9C8" w:sz="4"/>
+              <w:bottom w:val="single" w:color="8EA9C8" w:sz="4"/>
+              <w:right w:val="single" w:color="8EA9C8" w:sz="4"/>
+            </w:tcBorders>
+            <w:shd w:fill="A7C7F2" w:color="auto" w:val="clear"/>
+            <w:tcMar>
+              <w:top w:type="dxa" w:w="60"/>
+              <w:left w:type="dxa" w:w="100"/>
+              <w:bottom w:type="dxa" w:w="60"/>
+              <w:right w:type="dxa" w:w="100"/>
+            </w:tcMar>
+          </w:tcPr>
+          <w:p>
+            <w:pPr>
+              <w:spacing w:after="0"/>
+            </w:pPr>
+            <w:r>
+              <w:rPr>
+                <w:b/>
+                <w:bCs/>
+              </w:rPr>
+              <w:t xml:space="preserve">Question à laquelle elle répond</w:t>
+            </w:r>
+          </w:p>
+        </w:tc>
+        <w:tc>
+          <w:tcPr>
+            <w:tcW w:type="dxa" w:w="3038"/>
+            <w:tcBorders>
+              <w:top w:val="single" w:color="8EA9C8" w:sz="4"/>
+              <w:left w:val="single" w:color="8EA9C8" w:sz="4"/>
+              <w:bottom w:val="single" w:color="8EA9C8" w:sz="4"/>
+              <w:right w:val="single" w:color="8EA9C8" w:sz="4"/>
+            </w:tcBorders>
+            <w:shd w:fill="A7C7F2" w:color="auto" w:val="clear"/>
+            <w:tcMar>
+              <w:top w:type="dxa" w:w="60"/>
+              <w:left w:type="dxa" w:w="100"/>
+              <w:bottom w:type="dxa" w:w="60"/>
+              <w:right w:type="dxa" w:w="100"/>
+            </w:tcMar>
+          </w:tcPr>
+          <w:p>
+            <w:pPr>
+              <w:spacing w:after="0"/>
+            </w:pPr>
+            <w:r>
+              <w:rPr>
+                <w:b/>
+                <w:bCs/>
+              </w:rPr>
+              <w:t xml:space="preserve">Source</w:t>
+            </w:r>
+          </w:p>
+        </w:tc>
+      </w:tr>
+      <w:tr>
+        <w:tc>
+          <w:tcPr>
+            <w:tcW w:type="dxa" w:w="2300"/>
+            <w:tcBorders>
+              <w:top w:val="single" w:color="8EA9C8" w:sz="4"/>
+              <w:left w:val="single" w:color="8EA9C8" w:sz="4"/>
+              <w:bottom w:val="single" w:color="8EA9C8" w:sz="4"/>
+              <w:right w:val="single" w:color="8EA9C8" w:sz="4"/>
+            </w:tcBorders>
+            <w:tcMar>
+              <w:top w:type="dxa" w:w="60"/>
+              <w:left w:type="dxa" w:w="100"/>
+              <w:bottom w:type="dxa" w:w="60"/>
+              <w:right w:type="dxa" w:w="100"/>
+            </w:tcMar>
+          </w:tcPr>
+          <w:p>
+            <w:pPr>
+              <w:spacing w:after="0"/>
+            </w:pPr>
+            <w:r>
+              <w:t xml:space="preserve">Analyse des ventes</w:t>
+            </w:r>
+          </w:p>
+        </w:tc>
+        <w:tc>
+          <w:tcPr>
+            <w:tcW w:type="dxa" w:w="4300"/>
+            <w:tcBorders>
+              <w:top w:val="single" w:color="8EA9C8" w:sz="4"/>
+              <w:left w:val="single" w:color="8EA9C8" w:sz="4"/>
+              <w:bottom w:val="single" w:color="8EA9C8" w:sz="4"/>
+              <w:right w:val="single" w:color="8EA9C8" w:sz="4"/>
+            </w:tcBorders>
+            <w:tcMar>
+              <w:top w:type="dxa" w:w="60"/>
+              <w:left w:type="dxa" w:w="100"/>
+              <w:bottom w:type="dxa" w:w="60"/>
+              <w:right w:type="dxa" w:w="100"/>
+            </w:tcMar>
+          </w:tcPr>
+          <w:p>
+            <w:pPr>
+              <w:spacing w:after="0"/>
+            </w:pPr>
+            <w:r>
+              <w:t xml:space="preserve">Que vend-on, où, et comment les ventes évoluent-elles mois par mois ?</w:t>
+            </w:r>
+          </w:p>
+        </w:tc>
+        <w:tc>
+          <w:tcPr>
+            <w:tcW w:type="dxa" w:w="3038"/>
+            <w:tcBorders>
+              <w:top w:val="single" w:color="8EA9C8" w:sz="4"/>
+              <w:left w:val="single" w:color="8EA9C8" w:sz="4"/>
+              <w:bottom w:val="single" w:color="8EA9C8" w:sz="4"/>
+              <w:right w:val="single" w:color="8EA9C8" w:sz="4"/>
+            </w:tcBorders>
+            <w:tcMar>
+              <w:top w:type="dxa" w:w="60"/>
+              <w:left w:type="dxa" w:w="100"/>
+              <w:bottom w:type="dxa" w:w="60"/>
+              <w:right w:type="dxa" w:w="100"/>
+            </w:tcMar>
+          </w:tcPr>
+          <w:p>
+            <w:pPr>
+              <w:spacing w:after="0"/>
+            </w:pPr>
+            <w:r>
+              <w:rPr>
+                <w:rFonts w:ascii="Consolas" w:cs="Consolas" w:eastAsia="Consolas" w:hAnsi="Consolas"/>
+                <w:sz w:val="19"/>
+                <w:szCs w:val="19"/>
+              </w:rPr>
+              <w:t xml:space="preserve">ACHAT_MD2</w:t>
+            </w:r>
+            <w:r>
+              <w:t xml:space="preserve"> et dimensions</w:t>
+            </w:r>
+          </w:p>
+        </w:tc>
+      </w:tr>
+      <w:tr>
+        <w:tc>
+          <w:tcPr>
+            <w:tcW w:type="dxa" w:w="2300"/>
+            <w:tcBorders>
+              <w:top w:val="single" w:color="8EA9C8" w:sz="4"/>
+              <w:left w:val="single" w:color="8EA9C8" w:sz="4"/>
+              <w:bottom w:val="single" w:color="8EA9C8" w:sz="4"/>
+              <w:right w:val="single" w:color="8EA9C8" w:sz="4"/>
+            </w:tcBorders>
+            <w:tcMar>
+              <w:top w:type="dxa" w:w="60"/>
+              <w:left w:type="dxa" w:w="100"/>
+              <w:bottom w:type="dxa" w:w="60"/>
+              <w:right w:type="dxa" w:w="100"/>
+            </w:tcMar>
+          </w:tcPr>
+          <w:p>
+            <w:pPr>
+              <w:spacing w:after="0"/>
+            </w:pPr>
+            <w:r>
+              <w:t xml:space="preserve">Comparaison annuelle</w:t>
+            </w:r>
+          </w:p>
+        </w:tc>
+        <w:tc>
+          <w:tcPr>
+            <w:tcW w:type="dxa" w:w="4300"/>
+            <w:tcBorders>
+              <w:top w:val="single" w:color="8EA9C8" w:sz="4"/>
+              <w:left w:val="single" w:color="8EA9C8" w:sz="4"/>
+              <w:bottom w:val="single" w:color="8EA9C8" w:sz="4"/>
+              <w:right w:val="single" w:color="8EA9C8" w:sz="4"/>
+            </w:tcBorders>
+            <w:tcMar>
+              <w:top w:type="dxa" w:w="60"/>
+              <w:left w:type="dxa" w:w="100"/>
+              <w:bottom w:type="dxa" w:w="60"/>
+              <w:right w:type="dxa" w:w="100"/>
+            </w:tcMar>
+          </w:tcPr>
+          <w:p>
+            <w:pPr>
+              <w:spacing w:after="0"/>
+            </w:pPr>
+            <w:r>
+              <w:t xml:space="preserve">Les ventes progressent-elles par rapport à l'année précédente ?</w:t>
+            </w:r>
+          </w:p>
+        </w:tc>
+        <w:tc>
+          <w:tcPr>
+            <w:tcW w:type="dxa" w:w="3038"/>
+            <w:tcBorders>
+              <w:top w:val="single" w:color="8EA9C8" w:sz="4"/>
+              <w:left w:val="single" w:color="8EA9C8" w:sz="4"/>
+              <w:bottom w:val="single" w:color="8EA9C8" w:sz="4"/>
+              <w:right w:val="single" w:color="8EA9C8" w:sz="4"/>
+            </w:tcBorders>
+            <w:tcMar>
+              <w:top w:type="dxa" w:w="60"/>
+              <w:left w:type="dxa" w:w="100"/>
+              <w:bottom w:type="dxa" w:w="60"/>
+              <w:right w:type="dxa" w:w="100"/>
+            </w:tcMar>
+          </w:tcPr>
+          <w:p>
+            <w:pPr>
+              <w:spacing w:after="0"/>
+            </w:pPr>
+            <w:r>
+              <w:rPr>
+                <w:rFonts w:ascii="Consolas" w:cs="Consolas" w:eastAsia="Consolas" w:hAnsi="Consolas"/>
+                <w:sz w:val="19"/>
+                <w:szCs w:val="19"/>
+              </w:rPr>
+              <w:t xml:space="preserve">ACHAT_MD2</w:t>
+            </w:r>
+            <w:r>
+              <w:t xml:space="preserve"> et dimensions</w:t>
+            </w:r>
+          </w:p>
+        </w:tc>
+      </w:tr>
+      <w:tr>
+        <w:tc>
+          <w:tcPr>
+            <w:tcW w:type="dxa" w:w="2300"/>
+            <w:tcBorders>
+              <w:top w:val="single" w:color="8EA9C8" w:sz="4"/>
+              <w:left w:val="single" w:color="8EA9C8" w:sz="4"/>
+              <w:bottom w:val="single" w:color="8EA9C8" w:sz="4"/>
+              <w:right w:val="single" w:color="8EA9C8" w:sz="4"/>
+            </w:tcBorders>
+            <w:tcMar>
+              <w:top w:type="dxa" w:w="60"/>
+              <w:left w:type="dxa" w:w="100"/>
+              <w:bottom w:type="dxa" w:w="60"/>
+              <w:right w:type="dxa" w:w="100"/>
+            </w:tcMar>
+          </w:tcPr>
+          <w:p>
+            <w:pPr>
+              <w:spacing w:after="0"/>
+            </w:pPr>
+            <w:r>
+              <w:t xml:space="preserve">Agrégats</w:t>
+            </w:r>
+          </w:p>
+        </w:tc>
+        <w:tc>
+          <w:tcPr>
+            <w:tcW w:type="dxa" w:w="4300"/>
+            <w:tcBorders>
+              <w:top w:val="single" w:color="8EA9C8" w:sz="4"/>
+              <w:left w:val="single" w:color="8EA9C8" w:sz="4"/>
+              <w:bottom w:val="single" w:color="8EA9C8" w:sz="4"/>
+              <w:right w:val="single" w:color="8EA9C8" w:sz="4"/>
+            </w:tcBorders>
+            <w:tcMar>
+              <w:top w:type="dxa" w:w="60"/>
+              <w:left w:type="dxa" w:w="100"/>
+              <w:bottom w:type="dxa" w:w="60"/>
+              <w:right w:type="dxa" w:w="100"/>
+            </w:tcMar>
+          </w:tcPr>
+          <w:p>
+            <w:pPr>
+              <w:spacing w:after="0"/>
+            </w:pPr>
+            <w:r>
+              <w:t xml:space="preserve">Évolution par pays, gammes par territoire, types et catégories juridiques des sociétés clientes</w:t>
+            </w:r>
+          </w:p>
+        </w:tc>
+        <w:tc>
+          <w:tcPr>
+            <w:tcW w:type="dxa" w:w="3038"/>
+            <w:tcBorders>
+              <w:top w:val="single" w:color="8EA9C8" w:sz="4"/>
+              <w:left w:val="single" w:color="8EA9C8" w:sz="4"/>
+              <w:bottom w:val="single" w:color="8EA9C8" w:sz="4"/>
+              <w:right w:val="single" w:color="8EA9C8" w:sz="4"/>
+            </w:tcBorders>
+            <w:tcMar>
+              <w:top w:type="dxa" w:w="60"/>
+              <w:left w:type="dxa" w:w="100"/>
+              <w:bottom w:type="dxa" w:w="60"/>
+              <w:right w:type="dxa" w:w="100"/>
+            </w:tcMar>
+          </w:tcPr>
+          <w:p>
+            <w:pPr>
+              <w:spacing w:after="0"/>
+            </w:pPr>
+            <w:r>
+              <w:rPr>
+                <w:rFonts w:ascii="Consolas" w:cs="Consolas" w:eastAsia="Consolas" w:hAnsi="Consolas"/>
+                <w:sz w:val="19"/>
+                <w:szCs w:val="19"/>
+              </w:rPr>
+              <w:t xml:space="preserve">MV_ACH_PAYS_MOIS</w:t>
+            </w:r>
+            <w:r>
+              <w:t xml:space="preserve">, </w:t>
+            </w:r>
+            <w:r>
+              <w:rPr>
+                <w:rFonts w:ascii="Consolas" w:cs="Consolas" w:eastAsia="Consolas" w:hAnsi="Consolas"/>
+                <w:sz w:val="19"/>
+                <w:szCs w:val="19"/>
+              </w:rPr>
+              <w:t xml:space="preserve">MV_ACH_GAM_REG_MOIS</w:t>
+            </w:r>
+            <w:r>
+              <w:t xml:space="preserve">, </w:t>
+            </w:r>
+            <w:r>
+              <w:rPr>
+                <w:rFonts w:ascii="Consolas" w:cs="Consolas" w:eastAsia="Consolas" w:hAnsi="Consolas"/>
+                <w:sz w:val="19"/>
+                <w:szCs w:val="19"/>
+              </w:rPr>
+              <w:t xml:space="preserve">MV_ACH_TYPE_CJ_MOIS</w:t>
+            </w:r>
+          </w:p>
+        </w:tc>
+      </w:tr>
+    </w:tbl>
+    <w:p>
+      <w:pPr>
+        <w:spacing w:after="120"/>
+      </w:pPr>
+    </w:p>
+    <w:p>
+      <w:pPr>
         <w:pStyle w:val="Heading2"/>
       </w:pPr>
       <w:r>
@@ -3402,6 +3833,83 @@
           </w:p>
         </w:tc>
       </w:tr>
+      <w:tr>
+        <w:tc>
+          <w:tcPr>
+            <w:tcW w:type="dxa" w:w="2600"/>
+            <w:tcBorders>
+              <w:top w:val="single" w:color="8EA9C8" w:sz="4"/>
+              <w:left w:val="single" w:color="8EA9C8" w:sz="4"/>
+              <w:bottom w:val="single" w:color="8EA9C8" w:sz="4"/>
+              <w:right w:val="single" w:color="8EA9C8" w:sz="4"/>
+            </w:tcBorders>
+            <w:tcMar>
+              <w:top w:type="dxa" w:w="60"/>
+              <w:left w:type="dxa" w:w="100"/>
+              <w:bottom w:type="dxa" w:w="60"/>
+              <w:right w:type="dxa" w:w="100"/>
+            </w:tcMar>
+          </w:tcPr>
+          <w:p>
+            <w:pPr>
+              <w:spacing w:after="0"/>
+            </w:pPr>
+            <w:r>
+              <w:t xml:space="preserve">Montant payé (AGG1), (AGG2), (AGG3)</w:t>
+            </w:r>
+          </w:p>
+        </w:tc>
+        <w:tc>
+          <w:tcPr>
+            <w:tcW w:type="dxa" w:w="4600"/>
+            <w:tcBorders>
+              <w:top w:val="single" w:color="8EA9C8" w:sz="4"/>
+              <w:left w:val="single" w:color="8EA9C8" w:sz="4"/>
+              <w:bottom w:val="single" w:color="8EA9C8" w:sz="4"/>
+              <w:right w:val="single" w:color="8EA9C8" w:sz="4"/>
+            </w:tcBorders>
+            <w:tcMar>
+              <w:top w:type="dxa" w:w="60"/>
+              <w:left w:type="dxa" w:w="100"/>
+              <w:bottom w:type="dxa" w:w="60"/>
+              <w:right w:type="dxa" w:w="100"/>
+            </w:tcMar>
+          </w:tcPr>
+          <w:p>
+            <w:pPr>
+              <w:spacing w:after="0"/>
+            </w:pPr>
+            <w:r>
+              <w:t xml:space="preserve">Montant réellement payé, lu dans chacun des trois agrégats (page Agrégats). Le total est identique à celui du Montant réel payé : c'est le contrôle de cohérence du treillis.</w:t>
+            </w:r>
+          </w:p>
+        </w:tc>
+        <w:tc>
+          <w:tcPr>
+            <w:tcW w:type="dxa" w:w="2438"/>
+            <w:tcBorders>
+              <w:top w:val="single" w:color="8EA9C8" w:sz="4"/>
+              <w:left w:val="single" w:color="8EA9C8" w:sz="4"/>
+              <w:bottom w:val="single" w:color="8EA9C8" w:sz="4"/>
+              <w:right w:val="single" w:color="8EA9C8" w:sz="4"/>
+            </w:tcBorders>
+            <w:tcMar>
+              <w:top w:type="dxa" w:w="60"/>
+              <w:left w:type="dxa" w:w="100"/>
+              <w:bottom w:type="dxa" w:w="60"/>
+              <w:right w:type="dxa" w:w="100"/>
+            </w:tcMar>
+          </w:tcPr>
+          <w:p>
+            <w:pPr>
+              <w:spacing w:after="0"/>
+            </w:pPr>
+            <w:r>
+              <w:t xml:space="preserve">€ TTC</w:t>
+            </w:r>
+          </w:p>
+        </w:tc>
+      </w:tr>
     </w:tbl>
     <w:p>
       <w:pPr>
@@ -3440,10 +3948,108 @@
     </w:p>
     <w:p>
       <w:pPr>
+        <w:spacing w:after="120"/>
+      </w:pPr>
+      <w:r>
+        <w:t xml:space="preserve">Les colonnes du modèle portent des noms lisibles (</w:t>
+      </w:r>
+      <w:r>
+        <w:rPr>
+          <w:b/>
+          <w:bCs/>
+        </w:rPr>
+        <w:t xml:space="preserve">Gamme</w:t>
+      </w:r>
+      <w:r>
+        <w:t xml:space="preserve">, </w:t>
+      </w:r>
+      <w:r>
+        <w:rPr>
+          <w:b/>
+          <w:bCs/>
+        </w:rPr>
+        <w:t xml:space="preserve">Secteur</w:t>
+      </w:r>
+      <w:r>
+        <w:t xml:space="preserve">, </w:t>
+      </w:r>
+      <w:r>
+        <w:rPr>
+          <w:b/>
+          <w:bCs/>
+        </w:rPr>
+        <w:t xml:space="preserve">Pays</w:t>
+      </w:r>
+      <w:r>
+        <w:t xml:space="preserve">, </w:t>
+      </w:r>
+      <w:r>
+        <w:rPr>
+          <w:b/>
+          <w:bCs/>
+        </w:rPr>
+        <w:t xml:space="preserve">Société</w:t>
+      </w:r>
+      <w:r>
+        <w:t xml:space="preserve">, </w:t>
+      </w:r>
+      <w:r>
+        <w:rPr>
+          <w:b/>
+          <w:bCs/>
+        </w:rPr>
+        <w:t xml:space="preserve">Type de société</w:t>
+      </w:r>
+      <w:r>
+        <w:t xml:space="preserve">, </w:t>
+      </w:r>
+      <w:r>
+        <w:rPr>
+          <w:b/>
+          <w:bCs/>
+        </w:rPr>
+        <w:t xml:space="preserve">Région / Land</w:t>
+      </w:r>
+      <w:r>
+        <w:t xml:space="preserve">, </w:t>
+      </w:r>
+      <w:r>
+        <w:rPr>
+          <w:b/>
+          <w:bCs/>
+        </w:rPr>
+        <w:t xml:space="preserve">Année</w:t>
+      </w:r>
+      <w:r>
+        <w:t xml:space="preserve">, </w:t>
+      </w:r>
+      <w:r>
+        <w:rPr>
+          <w:b/>
+          <w:bCs/>
+        </w:rPr>
+        <w:t xml:space="preserve">Mois</w:t>
+      </w:r>
+      <w:r>
+        <w:t xml:space="preserve">, </w:t>
+      </w:r>
+      <w:r>
+        <w:rPr>
+          <w:b/>
+          <w:bCs/>
+        </w:rPr>
+        <w:t xml:space="preserve">Catégorie juridique</w:t>
+      </w:r>
+      <w:r>
+        <w:t xml:space="preserve">) : ce sont ces noms qui apparaissent dans les segments, les titres et les info-bulles.</w:t>
+      </w:r>
+    </w:p>
+    <w:p>
+      <w:pPr>
         <w:pStyle w:val="Heading2"/>
       </w:pPr>
       <w:r>
-        <w:t xml:space="preserve">Page « Analyse ventes 1 »</w:t>
+        <w:t xml:space="preserve">Page « Analyse des ventes »</w:t>
       </w:r>
     </w:p>
     <w:p>
@@ -3768,7 +4374,7 @@
               <w:spacing w:after="0"/>
             </w:pPr>
             <w:r>
-              <w:t xml:space="preserve">L'évolution mois par mois : quantités en colonnes, montant payé et bénéfice en courbes. On y lit la saisonnalité (pic au printemps et en été).</w:t>
+              <w:t xml:space="preserve">L'évolution mois par mois, d'octobre 2024 à octobre 2026 : quantités en colonnes, montant payé et bénéfice en courbes. On y lit la saisonnalité (pic au printemps et en été).</w:t>
             </w:r>
           </w:p>
         </w:tc>
@@ -3876,7 +4482,7 @@
         <w:spacing w:after="60"/>
       </w:pPr>
       <w:r>
-        <w:t xml:space="preserve">Dans la matrice, cliquez sur le </w:t>
+        <w:t xml:space="preserve">Dans la matrice « Comparaison N / N-1 par mois », cliquez sur le </w:t>
       </w:r>
       <w:r>
         <w:rPr>
@@ -4138,6 +4744,450 @@
       </w:pPr>
       <w:r>
         <w:t xml:space="preserve">Les deux histogrammes de droite montrent le même indicateur par secteur de produits et par société. Cliquez sur une société pour limiter la matrice à ses achats.</w:t>
+      </w:r>
+    </w:p>
+    <w:p>
+      <w:pPr>
+        <w:pStyle w:val="Heading2"/>
+      </w:pPr>
+      <w:r>
+        <w:t xml:space="preserve">Page « Agrégats »</w:t>
+      </w:r>
+    </w:p>
+    <w:p>
+      <w:pPr>
+        <w:spacing w:after="120"/>
+      </w:pPr>
+      <w:r>
+        <w:t xml:space="preserve">Cette page montre les ventes </w:t>
+      </w:r>
+      <w:r>
+        <w:rPr>
+          <w:b/>
+          <w:bCs/>
+        </w:rPr>
+        <w:t xml:space="preserve">telles que les servent les vues matérialisées</w:t>
+      </w:r>
+      <w:r>
+        <w:t xml:space="preserve"> du magasin, sans repasser par le fait détaillé. Chaque visuel lit un agrégat différent du treillis ; c'est ce qui rend les rapports mensuels rapides, même quand le volume d'achats augmente.</w:t>
+      </w:r>
+    </w:p>
+    <w:tbl>
+      <w:tblPr>
+        <w:tblW w:type="dxa" w:w="9638"/>
+        <w:tblBorders>
+          <w:top w:val="single" w:color="auto" w:sz="4"/>
+          <w:left w:val="single" w:color="auto" w:sz="4"/>
+          <w:bottom w:val="single" w:color="auto" w:sz="4"/>
+          <w:right w:val="single" w:color="auto" w:sz="4"/>
+          <w:insideH w:val="single" w:color="auto" w:sz="4"/>
+          <w:insideV w:val="single" w:color="auto" w:sz="4"/>
+        </w:tblBorders>
+      </w:tblPr>
+      <w:tblGrid>
+        <w:gridCol w:w="2700"/>
+        <w:gridCol w:w="2700"/>
+        <w:gridCol w:w="4238"/>
+      </w:tblGrid>
+      <w:tr>
+        <w:trPr>
+          <w:tblHeader/>
+        </w:trPr>
+        <w:tc>
+          <w:tcPr>
+            <w:tcW w:type="dxa" w:w="2700"/>
+            <w:tcBorders>
+              <w:top w:val="single" w:color="8EA9C8" w:sz="4"/>
+              <w:left w:val="single" w:color="8EA9C8" w:sz="4"/>
+              <w:bottom w:val="single" w:color="8EA9C8" w:sz="4"/>
+              <w:right w:val="single" w:color="8EA9C8" w:sz="4"/>
+            </w:tcBorders>
+            <w:shd w:fill="A7C7F2" w:color="auto" w:val="clear"/>
+            <w:tcMar>
+              <w:top w:type="dxa" w:w="60"/>
+              <w:left w:type="dxa" w:w="100"/>
+              <w:bottom w:type="dxa" w:w="60"/>
+              <w:right w:type="dxa" w:w="100"/>
+            </w:tcMar>
+          </w:tcPr>
+          <w:p>
+            <w:pPr>
+              <w:spacing w:after="0"/>
+            </w:pPr>
+            <w:r>
+              <w:rPr>
+                <w:b/>
+                <w:bCs/>
+              </w:rPr>
+              <w:t xml:space="preserve">Visuel</w:t>
+            </w:r>
+          </w:p>
+        </w:tc>
+        <w:tc>
+          <w:tcPr>
+            <w:tcW w:type="dxa" w:w="2700"/>
+            <w:tcBorders>
+              <w:top w:val="single" w:color="8EA9C8" w:sz="4"/>
+              <w:left w:val="single" w:color="8EA9C8" w:sz="4"/>
+              <w:bottom w:val="single" w:color="8EA9C8" w:sz="4"/>
+              <w:right w:val="single" w:color="8EA9C8" w:sz="4"/>
+            </w:tcBorders>
+            <w:shd w:fill="A7C7F2" w:color="auto" w:val="clear"/>
+            <w:tcMar>
+              <w:top w:type="dxa" w:w="60"/>
+              <w:left w:type="dxa" w:w="100"/>
+              <w:bottom w:type="dxa" w:w="60"/>
+              <w:right w:type="dxa" w:w="100"/>
+            </w:tcMar>
+          </w:tcPr>
+          <w:p>
+            <w:pPr>
+              <w:spacing w:after="0"/>
+            </w:pPr>
+            <w:r>
+              <w:rPr>
+                <w:b/>
+                <w:bCs/>
+              </w:rPr>
+              <w:t xml:space="preserve">Agrégat lu</w:t>
+            </w:r>
+          </w:p>
+        </w:tc>
+        <w:tc>
+          <w:tcPr>
+            <w:tcW w:type="dxa" w:w="4238"/>
+            <w:tcBorders>
+              <w:top w:val="single" w:color="8EA9C8" w:sz="4"/>
+              <w:left w:val="single" w:color="8EA9C8" w:sz="4"/>
+              <w:bottom w:val="single" w:color="8EA9C8" w:sz="4"/>
+              <w:right w:val="single" w:color="8EA9C8" w:sz="4"/>
+            </w:tcBorders>
+            <w:shd w:fill="A7C7F2" w:color="auto" w:val="clear"/>
+            <w:tcMar>
+              <w:top w:type="dxa" w:w="60"/>
+              <w:left w:type="dxa" w:w="100"/>
+              <w:bottom w:type="dxa" w:w="60"/>
+              <w:right w:type="dxa" w:w="100"/>
+            </w:tcMar>
+          </w:tcPr>
+          <w:p>
+            <w:pPr>
+              <w:spacing w:after="0"/>
+            </w:pPr>
+            <w:r>
+              <w:rPr>
+                <w:b/>
+                <w:bCs/>
+              </w:rPr>
+              <w:t xml:space="preserve">Comment le lire</w:t>
+            </w:r>
+          </w:p>
+        </w:tc>
+      </w:tr>
+      <w:tr>
+        <w:tc>
+          <w:tcPr>
+            <w:tcW w:type="dxa" w:w="2700"/>
+            <w:tcBorders>
+              <w:top w:val="single" w:color="8EA9C8" w:sz="4"/>
+              <w:left w:val="single" w:color="8EA9C8" w:sz="4"/>
+              <w:bottom w:val="single" w:color="8EA9C8" w:sz="4"/>
+              <w:right w:val="single" w:color="8EA9C8" w:sz="4"/>
+            </w:tcBorders>
+            <w:tcMar>
+              <w:top w:type="dxa" w:w="60"/>
+              <w:left w:type="dxa" w:w="100"/>
+              <w:bottom w:type="dxa" w:w="60"/>
+              <w:right w:type="dxa" w:w="100"/>
+            </w:tcMar>
+          </w:tcPr>
+          <w:p>
+            <w:pPr>
+              <w:spacing w:after="0"/>
+            </w:pPr>
+            <w:r>
+              <w:t xml:space="preserve">AGG1 : Évolution mensuelle du montant payé par pays</w:t>
+            </w:r>
+          </w:p>
+        </w:tc>
+        <w:tc>
+          <w:tcPr>
+            <w:tcW w:type="dxa" w:w="2700"/>
+            <w:tcBorders>
+              <w:top w:val="single" w:color="8EA9C8" w:sz="4"/>
+              <w:left w:val="single" w:color="8EA9C8" w:sz="4"/>
+              <w:bottom w:val="single" w:color="8EA9C8" w:sz="4"/>
+              <w:right w:val="single" w:color="8EA9C8" w:sz="4"/>
+            </w:tcBorders>
+            <w:tcMar>
+              <w:top w:type="dxa" w:w="60"/>
+              <w:left w:type="dxa" w:w="100"/>
+              <w:bottom w:type="dxa" w:w="60"/>
+              <w:right w:type="dxa" w:w="100"/>
+            </w:tcMar>
+          </w:tcPr>
+          <w:p>
+            <w:pPr>
+              <w:spacing w:after="0"/>
+            </w:pPr>
+            <w:r>
+              <w:rPr>
+                <w:rFonts w:ascii="Consolas" w:cs="Consolas" w:eastAsia="Consolas" w:hAnsi="Consolas"/>
+                <w:sz w:val="19"/>
+                <w:szCs w:val="19"/>
+              </w:rPr>
+              <w:t xml:space="preserve">MV_ACH_PAYS_MOIS</w:t>
+            </w:r>
+          </w:p>
+          <w:p>
+            <w:pPr>
+              <w:spacing w:after="0"/>
+            </w:pPr>
+            <w:r>
+              <w:t xml:space="preserve">(Pays, Mois)</w:t>
+            </w:r>
+          </w:p>
+        </w:tc>
+        <w:tc>
+          <w:tcPr>
+            <w:tcW w:type="dxa" w:w="4238"/>
+            <w:tcBorders>
+              <w:top w:val="single" w:color="8EA9C8" w:sz="4"/>
+              <w:left w:val="single" w:color="8EA9C8" w:sz="4"/>
+              <w:bottom w:val="single" w:color="8EA9C8" w:sz="4"/>
+              <w:right w:val="single" w:color="8EA9C8" w:sz="4"/>
+            </w:tcBorders>
+            <w:tcMar>
+              <w:top w:type="dxa" w:w="60"/>
+              <w:left w:type="dxa" w:w="100"/>
+              <w:bottom w:type="dxa" w:w="60"/>
+              <w:right w:type="dxa" w:w="100"/>
+            </w:tcMar>
+          </w:tcPr>
+          <w:p>
+            <w:pPr>
+              <w:spacing w:after="0"/>
+            </w:pPr>
+            <w:r>
+              <w:t xml:space="preserve">Une courbe par pays. On compare la saisonnalité française et allemande, et on voit le démarrage de l'activité allemande en 2026.</w:t>
+            </w:r>
+          </w:p>
+        </w:tc>
+      </w:tr>
+      <w:tr>
+        <w:tc>
+          <w:tcPr>
+            <w:tcW w:type="dxa" w:w="2700"/>
+            <w:tcBorders>
+              <w:top w:val="single" w:color="8EA9C8" w:sz="4"/>
+              <w:left w:val="single" w:color="8EA9C8" w:sz="4"/>
+              <w:bottom w:val="single" w:color="8EA9C8" w:sz="4"/>
+              <w:right w:val="single" w:color="8EA9C8" w:sz="4"/>
+            </w:tcBorders>
+            <w:tcMar>
+              <w:top w:type="dxa" w:w="60"/>
+              <w:left w:type="dxa" w:w="100"/>
+              <w:bottom w:type="dxa" w:w="60"/>
+              <w:right w:type="dxa" w:w="100"/>
+            </w:tcMar>
+          </w:tcPr>
+          <w:p>
+            <w:pPr>
+              <w:spacing w:after="0"/>
+            </w:pPr>
+            <w:r>
+              <w:t xml:space="preserve">AGG2 : Montant payé par gamme et par région / Land</w:t>
+            </w:r>
+          </w:p>
+        </w:tc>
+        <w:tc>
+          <w:tcPr>
+            <w:tcW w:type="dxa" w:w="2700"/>
+            <w:tcBorders>
+              <w:top w:val="single" w:color="8EA9C8" w:sz="4"/>
+              <w:left w:val="single" w:color="8EA9C8" w:sz="4"/>
+              <w:bottom w:val="single" w:color="8EA9C8" w:sz="4"/>
+              <w:right w:val="single" w:color="8EA9C8" w:sz="4"/>
+            </w:tcBorders>
+            <w:tcMar>
+              <w:top w:type="dxa" w:w="60"/>
+              <w:left w:type="dxa" w:w="100"/>
+              <w:bottom w:type="dxa" w:w="60"/>
+              <w:right w:type="dxa" w:w="100"/>
+            </w:tcMar>
+          </w:tcPr>
+          <w:p>
+            <w:pPr>
+              <w:spacing w:after="0"/>
+            </w:pPr>
+            <w:r>
+              <w:rPr>
+                <w:rFonts w:ascii="Consolas" w:cs="Consolas" w:eastAsia="Consolas" w:hAnsi="Consolas"/>
+                <w:sz w:val="19"/>
+                <w:szCs w:val="19"/>
+              </w:rPr>
+              <w:t xml:space="preserve">MV_ACH_GAM_REG_MOIS</w:t>
+            </w:r>
+          </w:p>
+          <w:p>
+            <w:pPr>
+              <w:spacing w:after="0"/>
+            </w:pPr>
+            <w:r>
+              <w:t xml:space="preserve">(Gamme, Région / Land, Mois)</w:t>
+            </w:r>
+          </w:p>
+        </w:tc>
+        <w:tc>
+          <w:tcPr>
+            <w:tcW w:type="dxa" w:w="4238"/>
+            <w:tcBorders>
+              <w:top w:val="single" w:color="8EA9C8" w:sz="4"/>
+              <w:left w:val="single" w:color="8EA9C8" w:sz="4"/>
+              <w:bottom w:val="single" w:color="8EA9C8" w:sz="4"/>
+              <w:right w:val="single" w:color="8EA9C8" w:sz="4"/>
+            </w:tcBorders>
+            <w:tcMar>
+              <w:top w:type="dxa" w:w="60"/>
+              <w:left w:type="dxa" w:w="100"/>
+              <w:bottom w:type="dxa" w:w="60"/>
+              <w:right w:type="dxa" w:w="100"/>
+            </w:tcMar>
+          </w:tcPr>
+          <w:p>
+            <w:pPr>
+              <w:spacing w:after="0"/>
+            </w:pPr>
+            <w:r>
+              <w:t xml:space="preserve">Matrice colorée : plus une case est foncée, plus la gamme se vend dans ce territoire. La case la plus foncée de chaque ligne donne la gamme la plus adaptée au territoire.</w:t>
+            </w:r>
+          </w:p>
+        </w:tc>
+      </w:tr>
+      <w:tr>
+        <w:tc>
+          <w:tcPr>
+            <w:tcW w:type="dxa" w:w="2700"/>
+            <w:tcBorders>
+              <w:top w:val="single" w:color="8EA9C8" w:sz="4"/>
+              <w:left w:val="single" w:color="8EA9C8" w:sz="4"/>
+              <w:bottom w:val="single" w:color="8EA9C8" w:sz="4"/>
+              <w:right w:val="single" w:color="8EA9C8" w:sz="4"/>
+            </w:tcBorders>
+            <w:tcMar>
+              <w:top w:type="dxa" w:w="60"/>
+              <w:left w:type="dxa" w:w="100"/>
+              <w:bottom w:type="dxa" w:w="60"/>
+              <w:right w:type="dxa" w:w="100"/>
+            </w:tcMar>
+          </w:tcPr>
+          <w:p>
+            <w:pPr>
+              <w:spacing w:after="0"/>
+            </w:pPr>
+            <w:r>
+              <w:t xml:space="preserve">AGG3 : Montant payé par type de société et catégorie juridique</w:t>
+            </w:r>
+          </w:p>
+        </w:tc>
+        <w:tc>
+          <w:tcPr>
+            <w:tcW w:type="dxa" w:w="2700"/>
+            <w:tcBorders>
+              <w:top w:val="single" w:color="8EA9C8" w:sz="4"/>
+              <w:left w:val="single" w:color="8EA9C8" w:sz="4"/>
+              <w:bottom w:val="single" w:color="8EA9C8" w:sz="4"/>
+              <w:right w:val="single" w:color="8EA9C8" w:sz="4"/>
+            </w:tcBorders>
+            <w:tcMar>
+              <w:top w:type="dxa" w:w="60"/>
+              <w:left w:type="dxa" w:w="100"/>
+              <w:bottom w:type="dxa" w:w="60"/>
+              <w:right w:type="dxa" w:w="100"/>
+            </w:tcMar>
+          </w:tcPr>
+          <w:p>
+            <w:pPr>
+              <w:spacing w:after="0"/>
+            </w:pPr>
+            <w:r>
+              <w:rPr>
+                <w:rFonts w:ascii="Consolas" w:cs="Consolas" w:eastAsia="Consolas" w:hAnsi="Consolas"/>
+                <w:sz w:val="19"/>
+                <w:szCs w:val="19"/>
+              </w:rPr>
+              <w:t xml:space="preserve">MV_ACH_TYPE_CJ_MOIS</w:t>
+            </w:r>
+          </w:p>
+          <w:p>
+            <w:pPr>
+              <w:spacing w:after="0"/>
+            </w:pPr>
+            <w:r>
+              <w:t xml:space="preserve">(Type × Catégorie juridique, Mois)</w:t>
+            </w:r>
+          </w:p>
+        </w:tc>
+        <w:tc>
+          <w:tcPr>
+            <w:tcW w:type="dxa" w:w="4238"/>
+            <w:tcBorders>
+              <w:top w:val="single" w:color="8EA9C8" w:sz="4"/>
+              <w:left w:val="single" w:color="8EA9C8" w:sz="4"/>
+              <w:bottom w:val="single" w:color="8EA9C8" w:sz="4"/>
+              <w:right w:val="single" w:color="8EA9C8" w:sz="4"/>
+            </w:tcBorders>
+            <w:tcMar>
+              <w:top w:type="dxa" w:w="60"/>
+              <w:left w:type="dxa" w:w="100"/>
+              <w:bottom w:type="dxa" w:w="60"/>
+              <w:right w:type="dxa" w:w="100"/>
+            </w:tcMar>
+          </w:tcPr>
+          <w:p>
+            <w:pPr>
+              <w:spacing w:after="0"/>
+            </w:pPr>
+            <w:r>
+              <w:t xml:space="preserve">Une barre par type de société, découpée par catégorie juridique (SAS, SA, SARL, GmbH…). On repère les profils de sociétés clientes qui achètent le plus.</w:t>
+            </w:r>
+          </w:p>
+        </w:tc>
+      </w:tr>
+    </w:tbl>
+    <w:p>
+      <w:pPr>
+        <w:spacing w:after="120"/>
+      </w:pPr>
+    </w:p>
+    <w:p>
+      <w:pPr>
+        <w:pBdr>
+          <w:left w:val="single" w:color="2E75B6" w:sz="18" w:space="6"/>
+        </w:pBdr>
+        <w:shd w:fill="EAF2FC" w:color="auto" w:val="clear"/>
+        <w:spacing w:after="160" w:before="60"/>
+        <w:ind w:left="120"/>
+      </w:pPr>
+      <w:r>
+        <w:rPr>
+          <w:b/>
+          <w:bCs/>
+        </w:rPr>
+        <w:t xml:space="preserve">Pas de segment sur cette page.</w:t>
+      </w:r>
+      <w:r>
+        <w:t xml:space="preserve"> Les trois agrégats sont des tables indépendantes, sans relation entre elles : un segment n'en filtrerait qu'un seul. Pour filtrer, cliquez sur un élément d'un visuel (un pays de la légende, une ligne de la matrice) ou utilisez le volet </w:t>
+      </w:r>
+      <w:r>
+        <w:rPr>
+          <w:b/>
+          <w:bCs/>
+        </w:rPr>
+        <w:t xml:space="preserve">Filtres</w:t>
+      </w:r>
+      <w:r>
+        <w:t xml:space="preserve"> du visuel concerné. La sécurité par pays (Lyon / Berlin) s'applique quand même, car chaque agrégat conserve le code pays.</w:t>
       </w:r>
     </w:p>
     <w:p>
@@ -4453,72 +5503,126 @@
         <w:spacing w:after="120"/>
       </w:pPr>
       <w:r>
-        <w:t xml:space="preserve">Le filtre est posé sur la dimension Employé (et sur les agrégats, qui gardent le code pays) ; il s'applique donc à toutes les pages.</w:t>
-      </w:r>
-    </w:p>
-    <w:p>
-      <w:pPr>
-        <w:spacing w:after="120"/>
-      </w:pPr>
+        <w:t xml:space="preserve">Le filtre est posé sur </w:t>
+      </w:r>
       <w:r>
         <w:rPr>
           <w:b/>
           <w:bCs/>
         </w:rPr>
-        <w:t xml:space="preserve">Pour tester une vue dans Power BI Desktop</w:t>
-      </w:r>
-      <w:r>
-        <w:t xml:space="preserve"> : onglet </w:t>
-      </w:r>
+        <w:t xml:space="preserve">quatre tables</w:t>
+      </w:r>
+      <w:r>
+        <w:t xml:space="preserve"> : la dimension </w:t>
+      </w:r>
+      <w:r>
+        <w:rPr>
+          <w:rFonts w:ascii="Consolas" w:cs="Consolas" w:eastAsia="Consolas" w:hAnsi="Consolas"/>
+          <w:sz w:val="19"/>
+          <w:szCs w:val="19"/>
+        </w:rPr>
+        <w:t xml:space="preserve">EMPLOYE_MD2</w:t>
+      </w:r>
+      <w:r>
+        <w:t xml:space="preserve"> (il se propage au fait, donc aux pages 1 et 2) et les trois agrégats </w:t>
+      </w:r>
+      <w:r>
+        <w:rPr>
+          <w:rFonts w:ascii="Consolas" w:cs="Consolas" w:eastAsia="Consolas" w:hAnsi="Consolas"/>
+          <w:sz w:val="19"/>
+          <w:szCs w:val="19"/>
+        </w:rPr>
+        <w:t xml:space="preserve">MV_ACH_PAYS_MOIS</w:t>
+      </w:r>
+      <w:r>
+        <w:t xml:space="preserve">, </w:t>
+      </w:r>
+      <w:r>
+        <w:rPr>
+          <w:rFonts w:ascii="Consolas" w:cs="Consolas" w:eastAsia="Consolas" w:hAnsi="Consolas"/>
+          <w:sz w:val="19"/>
+          <w:szCs w:val="19"/>
+        </w:rPr>
+        <w:t xml:space="preserve">MV_ACH_GAM_REG_MOIS</w:t>
+      </w:r>
+      <w:r>
+        <w:t xml:space="preserve"> et </w:t>
+      </w:r>
+      <w:r>
+        <w:rPr>
+          <w:rFonts w:ascii="Consolas" w:cs="Consolas" w:eastAsia="Consolas" w:hAnsi="Consolas"/>
+          <w:sz w:val="19"/>
+          <w:szCs w:val="19"/>
+        </w:rPr>
+        <w:t xml:space="preserve">MV_ACH_TYPE_CJ_MOIS</w:t>
+      </w:r>
+      <w:r>
+        <w:t xml:space="preserve"> (page 3), qui ne sont pas reliés à la dimension Employé.</w:t>
+      </w:r>
+    </w:p>
+    <w:p>
+      <w:pPr>
+        <w:spacing w:after="120"/>
+      </w:pPr>
       <w:r>
         <w:rPr>
           <w:b/>
           <w:bCs/>
         </w:rPr>
-        <w:t xml:space="preserve">Modélisation</w:t>
-      </w:r>
-      <w:r>
-        <w:t xml:space="preserve">, </w:t>
+        <w:t xml:space="preserve">Pour tester une vue dans Power BI Desktop</w:t>
+      </w:r>
+      <w:r>
+        <w:t xml:space="preserve"> : onglet </w:t>
       </w:r>
       <w:r>
         <w:rPr>
           <w:b/>
           <w:bCs/>
         </w:rPr>
-        <w:t xml:space="preserve">Voir comme</w:t>
-      </w:r>
-      <w:r>
-        <w:t xml:space="preserve">, cochez </w:t>
+        <w:t xml:space="preserve">Modélisation</w:t>
+      </w:r>
+      <w:r>
+        <w:t xml:space="preserve">, </w:t>
       </w:r>
       <w:r>
         <w:rPr>
           <w:b/>
           <w:bCs/>
         </w:rPr>
-        <w:t xml:space="preserve">Lyon</w:t>
-      </w:r>
-      <w:r>
-        <w:t xml:space="preserve"> ou </w:t>
+        <w:t xml:space="preserve">Voir comme</w:t>
+      </w:r>
+      <w:r>
+        <w:t xml:space="preserve">, cochez </w:t>
       </w:r>
       <w:r>
         <w:rPr>
           <w:b/>
           <w:bCs/>
         </w:rPr>
-        <w:t xml:space="preserve">Berlin</w:t>
-      </w:r>
-      <w:r>
-        <w:t xml:space="preserve">, puis </w:t>
+        <w:t xml:space="preserve">Lyon</w:t>
+      </w:r>
+      <w:r>
+        <w:t xml:space="preserve"> ou </w:t>
       </w:r>
       <w:r>
         <w:rPr>
           <w:b/>
           <w:bCs/>
         </w:rPr>
+        <w:t xml:space="preserve">Berlin</w:t>
+      </w:r>
+      <w:r>
+        <w:t xml:space="preserve">, puis </w:t>
+      </w:r>
+      <w:r>
+        <w:rPr>
+          <w:b/>
+          <w:bCs/>
+        </w:rPr>
         <w:t xml:space="preserve">OK</w:t>
       </w:r>
       <w:r>
-        <w:t xml:space="preserve">. Le segment Pays ne propose plus que le pays du rôle. Cliquez sur </w:t>
+        <w:t xml:space="preserve">. Le segment Pays ne propose plus que le pays du rôle, et les trois visuels de la page Agrégats ne montrent plus que ce pays. Cliquez sur </w:t>
       </w:r>
       <w:r>
         <w:rPr>
@@ -4942,7 +6046,7 @@
               <w:spacing w:after="0"/>
             </w:pPr>
             <w:r>
-              <w:t xml:space="preserve">Ventes, page Analyse ventes 1 (cliquer sur le territoire)</w:t>
+              <w:t xml:space="preserve">Ventes, page Agrégats (matrice AGG2), ou page Analyse des ventes en cliquant sur le territoire</w:t>
             </w:r>
           </w:p>
         </w:tc>
@@ -4969,7 +6073,7 @@
               <w:spacing w:after="0"/>
             </w:pPr>
             <w:r>
-              <w:t xml:space="preserve">Quelle est la saisonnalité des ventes ?</w:t>
+              <w:t xml:space="preserve">Quelle est la saisonnalité des ventes, en France et en Allemagne ?</w:t>
             </w:r>
           </w:p>
         </w:tc>
@@ -4994,7 +6098,7 @@
               <w:spacing w:after="0"/>
             </w:pPr>
             <w:r>
-              <w:t xml:space="preserve">Ventes, page Analyse ventes 1 (graphique mensuel)</w:t>
+              <w:t xml:space="preserve">Ventes, page Analyse des ventes (graphique mensuel) et page Agrégats (courbes AGG1)</w:t>
             </w:r>
           </w:p>
         </w:tc>
@@ -5073,7 +6177,7 @@
               <w:spacing w:after="0"/>
             </w:pPr>
             <w:r>
-              <w:t xml:space="preserve">Quels types de sociétés et quelles sociétés achètent le plus ?</w:t>
+              <w:t xml:space="preserve">Quels types de sociétés, et quelles formes juridiques, achètent le plus ?</w:t>
             </w:r>
           </w:p>
         </w:tc>
@@ -5098,7 +6202,7 @@
               <w:spacing w:after="0"/>
             </w:pPr>
             <w:r>
-              <w:t xml:space="preserve">Ventes, page Comparaison annuelle (segment Type de société, histogramme par société)</w:t>
+              <w:t xml:space="preserve">Ventes, page Agrégats (histogramme AGG3)</w:t>
             </w:r>
           </w:p>
         </w:tc>
@@ -5125,6 +6229,58 @@
               <w:spacing w:after="0"/>
             </w:pPr>
             <w:r>
+              <w:t xml:space="preserve">Quelles sociétés clientes achètent le plus ?</w:t>
+            </w:r>
+          </w:p>
+        </w:tc>
+        <w:tc>
+          <w:tcPr>
+            <w:tcW w:type="dxa" w:w="4638"/>
+            <w:tcBorders>
+              <w:top w:val="single" w:color="8EA9C8" w:sz="4"/>
+              <w:left w:val="single" w:color="8EA9C8" w:sz="4"/>
+              <w:bottom w:val="single" w:color="8EA9C8" w:sz="4"/>
+              <w:right w:val="single" w:color="8EA9C8" w:sz="4"/>
+            </w:tcBorders>
+            <w:tcMar>
+              <w:top w:type="dxa" w:w="60"/>
+              <w:left w:type="dxa" w:w="100"/>
+              <w:bottom w:type="dxa" w:w="60"/>
+              <w:right w:type="dxa" w:w="100"/>
+            </w:tcMar>
+          </w:tcPr>
+          <w:p>
+            <w:pPr>
+              <w:spacing w:after="0"/>
+            </w:pPr>
+            <w:r>
+              <w:t xml:space="preserve">Ventes, page Comparaison annuelle (histogramme par société)</w:t>
+            </w:r>
+          </w:p>
+        </w:tc>
+      </w:tr>
+      <w:tr>
+        <w:tc>
+          <w:tcPr>
+            <w:tcW w:type="dxa" w:w="5000"/>
+            <w:tcBorders>
+              <w:top w:val="single" w:color="8EA9C8" w:sz="4"/>
+              <w:left w:val="single" w:color="8EA9C8" w:sz="4"/>
+              <w:bottom w:val="single" w:color="8EA9C8" w:sz="4"/>
+              <w:right w:val="single" w:color="8EA9C8" w:sz="4"/>
+            </w:tcBorders>
+            <w:tcMar>
+              <w:top w:type="dxa" w:w="60"/>
+              <w:left w:type="dxa" w:w="100"/>
+              <w:bottom w:type="dxa" w:w="60"/>
+              <w:right w:type="dxa" w:w="100"/>
+            </w:tcMar>
+          </w:tcPr>
+          <w:p>
+            <w:pPr>
+              <w:spacing w:after="0"/>
+            </w:pPr>
+            <w:r>
               <w:t xml:space="preserve">Combien MobiPass gagne-t-il sur les ventes ?</w:t>
             </w:r>
           </w:p>
@@ -5150,7 +6306,7 @@
               <w:spacing w:after="0"/>
             </w:pPr>
             <w:r>
-              <w:t xml:space="preserve">Ventes, n'importe quelle page avec l'indicateur Bénéfice HT</w:t>
+              <w:t xml:space="preserve">Ventes, pages 1 et 2 avec l'indicateur Bénéfice HT</w:t>
             </w:r>
           </w:p>
         </w:tc>
@@ -5599,6 +6755,58 @@
             </w:pPr>
             <w:r>
               <w:t xml:space="preserve">Un élément est sélectionné dans un autre graphique : cliquez dans une zone vide de la page.</w:t>
+            </w:r>
+          </w:p>
+        </w:tc>
+      </w:tr>
+      <w:tr>
+        <w:tc>
+          <w:tcPr>
+            <w:tcW w:type="dxa" w:w="3600"/>
+            <w:tcBorders>
+              <w:top w:val="single" w:color="8EA9C8" w:sz="4"/>
+              <w:left w:val="single" w:color="8EA9C8" w:sz="4"/>
+              <w:bottom w:val="single" w:color="8EA9C8" w:sz="4"/>
+              <w:right w:val="single" w:color="8EA9C8" w:sz="4"/>
+            </w:tcBorders>
+            <w:tcMar>
+              <w:top w:type="dxa" w:w="60"/>
+              <w:left w:type="dxa" w:w="100"/>
+              <w:bottom w:type="dxa" w:w="60"/>
+              <w:right w:type="dxa" w:w="100"/>
+            </w:tcMar>
+          </w:tcPr>
+          <w:p>
+            <w:pPr>
+              <w:spacing w:after="0"/>
+            </w:pPr>
+            <w:r>
+              <w:t xml:space="preserve">Un segment ne propose qu'une seule année</w:t>
+            </w:r>
+          </w:p>
+        </w:tc>
+        <w:tc>
+          <w:tcPr>
+            <w:tcW w:type="dxa" w:w="6038"/>
+            <w:tcBorders>
+              <w:top w:val="single" w:color="8EA9C8" w:sz="4"/>
+              <w:left w:val="single" w:color="8EA9C8" w:sz="4"/>
+              <w:bottom w:val="single" w:color="8EA9C8" w:sz="4"/>
+              <w:right w:val="single" w:color="8EA9C8" w:sz="4"/>
+            </w:tcBorders>
+            <w:tcMar>
+              <w:top w:type="dxa" w:w="60"/>
+              <w:left w:type="dxa" w:w="100"/>
+              <w:bottom w:type="dxa" w:w="60"/>
+              <w:right w:type="dxa" w:w="100"/>
+            </w:tcMar>
+          </w:tcPr>
+          <w:p>
+            <w:pPr>
+              <w:spacing w:after="0"/>
+            </w:pPr>
+            <w:r>
+              <w:t xml:space="preserve">Une cellule ou une colonne d'une matrice est sélectionnée et filtre le segment : cliquez à nouveau dessus pour la désélectionner.</w:t>
             </w:r>
           </w:p>
         </w:tc>

</xml_diff>

<commit_message>
Guide d'utilisation : couleurs rouge clair
Co-Authored-By: Claude Opus 5.5 <noreply@anthropic.com>
Claude-Session: https://claude.ai/code/session_01UgeLXzj9G5UyQ5F9qqzBDt
</commit_message>
<xml_diff>
--- a/docs/MobiPass_Guide_utilisation_outils_analyse.docx
+++ b/docs/MobiPass_Guide_utilisation_outils_analyse.docx
@@ -11,7 +11,7 @@
         <w:rPr>
           <w:b/>
           <w:bCs/>
-          <w:color w:val="1F4E79"/>
+          <w:color w:val="9B2C2C"/>
           <w:sz w:val="56"/>
           <w:szCs w:val="56"/>
         </w:rPr>
@@ -25,7 +25,7 @@
       </w:pPr>
       <w:r>
         <w:rPr>
-          <w:color w:val="1F4E79"/>
+          <w:color w:val="9B2C2C"/>
           <w:sz w:val="36"/>
           <w:szCs w:val="36"/>
         </w:rPr>
@@ -140,12 +140,12 @@
           <w:tcPr>
             <w:tcW w:type="dxa" w:w="2300"/>
             <w:tcBorders>
-              <w:top w:val="single" w:color="8EA9C8" w:sz="4"/>
-              <w:left w:val="single" w:color="8EA9C8" w:sz="4"/>
-              <w:bottom w:val="single" w:color="8EA9C8" w:sz="4"/>
-              <w:right w:val="single" w:color="8EA9C8" w:sz="4"/>
-            </w:tcBorders>
-            <w:shd w:fill="A7C7F2" w:color="auto" w:val="clear"/>
+              <w:top w:val="single" w:color="E3A3A3" w:sz="4"/>
+              <w:left w:val="single" w:color="E3A3A3" w:sz="4"/>
+              <w:bottom w:val="single" w:color="E3A3A3" w:sz="4"/>
+              <w:right w:val="single" w:color="E3A3A3" w:sz="4"/>
+            </w:tcBorders>
+            <w:shd w:fill="F6C1C1" w:color="auto" w:val="clear"/>
             <w:tcMar>
               <w:top w:type="dxa" w:w="60"/>
               <w:left w:type="dxa" w:w="100"/>
@@ -170,12 +170,12 @@
           <w:tcPr>
             <w:tcW w:type="dxa" w:w="2600"/>
             <w:tcBorders>
-              <w:top w:val="single" w:color="8EA9C8" w:sz="4"/>
-              <w:left w:val="single" w:color="8EA9C8" w:sz="4"/>
-              <w:bottom w:val="single" w:color="8EA9C8" w:sz="4"/>
-              <w:right w:val="single" w:color="8EA9C8" w:sz="4"/>
-            </w:tcBorders>
-            <w:shd w:fill="A7C7F2" w:color="auto" w:val="clear"/>
+              <w:top w:val="single" w:color="E3A3A3" w:sz="4"/>
+              <w:left w:val="single" w:color="E3A3A3" w:sz="4"/>
+              <w:bottom w:val="single" w:color="E3A3A3" w:sz="4"/>
+              <w:right w:val="single" w:color="E3A3A3" w:sz="4"/>
+            </w:tcBorders>
+            <w:shd w:fill="F6C1C1" w:color="auto" w:val="clear"/>
             <w:tcMar>
               <w:top w:type="dxa" w:w="60"/>
               <w:left w:type="dxa" w:w="100"/>
@@ -200,12 +200,12 @@
           <w:tcPr>
             <w:tcW w:type="dxa" w:w="2400"/>
             <w:tcBorders>
-              <w:top w:val="single" w:color="8EA9C8" w:sz="4"/>
-              <w:left w:val="single" w:color="8EA9C8" w:sz="4"/>
-              <w:bottom w:val="single" w:color="8EA9C8" w:sz="4"/>
-              <w:right w:val="single" w:color="8EA9C8" w:sz="4"/>
-            </w:tcBorders>
-            <w:shd w:fill="A7C7F2" w:color="auto" w:val="clear"/>
+              <w:top w:val="single" w:color="E3A3A3" w:sz="4"/>
+              <w:left w:val="single" w:color="E3A3A3" w:sz="4"/>
+              <w:bottom w:val="single" w:color="E3A3A3" w:sz="4"/>
+              <w:right w:val="single" w:color="E3A3A3" w:sz="4"/>
+            </w:tcBorders>
+            <w:shd w:fill="F6C1C1" w:color="auto" w:val="clear"/>
             <w:tcMar>
               <w:top w:type="dxa" w:w="60"/>
               <w:left w:type="dxa" w:w="100"/>
@@ -230,12 +230,12 @@
           <w:tcPr>
             <w:tcW w:type="dxa" w:w="2338"/>
             <w:tcBorders>
-              <w:top w:val="single" w:color="8EA9C8" w:sz="4"/>
-              <w:left w:val="single" w:color="8EA9C8" w:sz="4"/>
-              <w:bottom w:val="single" w:color="8EA9C8" w:sz="4"/>
-              <w:right w:val="single" w:color="8EA9C8" w:sz="4"/>
-            </w:tcBorders>
-            <w:shd w:fill="A7C7F2" w:color="auto" w:val="clear"/>
+              <w:top w:val="single" w:color="E3A3A3" w:sz="4"/>
+              <w:left w:val="single" w:color="E3A3A3" w:sz="4"/>
+              <w:bottom w:val="single" w:color="E3A3A3" w:sz="4"/>
+              <w:right w:val="single" w:color="E3A3A3" w:sz="4"/>
+            </w:tcBorders>
+            <w:shd w:fill="F6C1C1" w:color="auto" w:val="clear"/>
             <w:tcMar>
               <w:top w:type="dxa" w:w="60"/>
               <w:left w:type="dxa" w:w="100"/>
@@ -262,10 +262,10 @@
           <w:tcPr>
             <w:tcW w:type="dxa" w:w="2300"/>
             <w:tcBorders>
-              <w:top w:val="single" w:color="8EA9C8" w:sz="4"/>
-              <w:left w:val="single" w:color="8EA9C8" w:sz="4"/>
-              <w:bottom w:val="single" w:color="8EA9C8" w:sz="4"/>
-              <w:right w:val="single" w:color="8EA9C8" w:sz="4"/>
+              <w:top w:val="single" w:color="E3A3A3" w:sz="4"/>
+              <w:left w:val="single" w:color="E3A3A3" w:sz="4"/>
+              <w:bottom w:val="single" w:color="E3A3A3" w:sz="4"/>
+              <w:right w:val="single" w:color="E3A3A3" w:sz="4"/>
             </w:tcBorders>
             <w:tcMar>
               <w:top w:type="dxa" w:w="60"/>
@@ -287,10 +287,10 @@
           <w:tcPr>
             <w:tcW w:type="dxa" w:w="2600"/>
             <w:tcBorders>
-              <w:top w:val="single" w:color="8EA9C8" w:sz="4"/>
-              <w:left w:val="single" w:color="8EA9C8" w:sz="4"/>
-              <w:bottom w:val="single" w:color="8EA9C8" w:sz="4"/>
-              <w:right w:val="single" w:color="8EA9C8" w:sz="4"/>
+              <w:top w:val="single" w:color="E3A3A3" w:sz="4"/>
+              <w:left w:val="single" w:color="E3A3A3" w:sz="4"/>
+              <w:bottom w:val="single" w:color="E3A3A3" w:sz="4"/>
+              <w:right w:val="single" w:color="E3A3A3" w:sz="4"/>
             </w:tcBorders>
             <w:tcMar>
               <w:top w:type="dxa" w:w="60"/>
@@ -317,10 +317,10 @@
           <w:tcPr>
             <w:tcW w:type="dxa" w:w="2400"/>
             <w:tcBorders>
-              <w:top w:val="single" w:color="8EA9C8" w:sz="4"/>
-              <w:left w:val="single" w:color="8EA9C8" w:sz="4"/>
-              <w:bottom w:val="single" w:color="8EA9C8" w:sz="4"/>
-              <w:right w:val="single" w:color="8EA9C8" w:sz="4"/>
+              <w:top w:val="single" w:color="E3A3A3" w:sz="4"/>
+              <w:left w:val="single" w:color="E3A3A3" w:sz="4"/>
+              <w:bottom w:val="single" w:color="E3A3A3" w:sz="4"/>
+              <w:right w:val="single" w:color="E3A3A3" w:sz="4"/>
             </w:tcBorders>
             <w:tcMar>
               <w:top w:type="dxa" w:w="60"/>
@@ -353,10 +353,10 @@
           <w:tcPr>
             <w:tcW w:type="dxa" w:w="2338"/>
             <w:tcBorders>
-              <w:top w:val="single" w:color="8EA9C8" w:sz="4"/>
-              <w:left w:val="single" w:color="8EA9C8" w:sz="4"/>
-              <w:bottom w:val="single" w:color="8EA9C8" w:sz="4"/>
-              <w:right w:val="single" w:color="8EA9C8" w:sz="4"/>
+              <w:top w:val="single" w:color="E3A3A3" w:sz="4"/>
+              <w:left w:val="single" w:color="E3A3A3" w:sz="4"/>
+              <w:bottom w:val="single" w:color="E3A3A3" w:sz="4"/>
+              <w:right w:val="single" w:color="E3A3A3" w:sz="4"/>
             </w:tcBorders>
             <w:tcMar>
               <w:top w:type="dxa" w:w="60"/>
@@ -380,10 +380,10 @@
           <w:tcPr>
             <w:tcW w:type="dxa" w:w="2300"/>
             <w:tcBorders>
-              <w:top w:val="single" w:color="8EA9C8" w:sz="4"/>
-              <w:left w:val="single" w:color="8EA9C8" w:sz="4"/>
-              <w:bottom w:val="single" w:color="8EA9C8" w:sz="4"/>
-              <w:right w:val="single" w:color="8EA9C8" w:sz="4"/>
+              <w:top w:val="single" w:color="E3A3A3" w:sz="4"/>
+              <w:left w:val="single" w:color="E3A3A3" w:sz="4"/>
+              <w:bottom w:val="single" w:color="E3A3A3" w:sz="4"/>
+              <w:right w:val="single" w:color="E3A3A3" w:sz="4"/>
             </w:tcBorders>
             <w:tcMar>
               <w:top w:type="dxa" w:w="60"/>
@@ -405,10 +405,10 @@
           <w:tcPr>
             <w:tcW w:type="dxa" w:w="2600"/>
             <w:tcBorders>
-              <w:top w:val="single" w:color="8EA9C8" w:sz="4"/>
-              <w:left w:val="single" w:color="8EA9C8" w:sz="4"/>
-              <w:bottom w:val="single" w:color="8EA9C8" w:sz="4"/>
-              <w:right w:val="single" w:color="8EA9C8" w:sz="4"/>
+              <w:top w:val="single" w:color="E3A3A3" w:sz="4"/>
+              <w:left w:val="single" w:color="E3A3A3" w:sz="4"/>
+              <w:bottom w:val="single" w:color="E3A3A3" w:sz="4"/>
+              <w:right w:val="single" w:color="E3A3A3" w:sz="4"/>
             </w:tcBorders>
             <w:tcMar>
               <w:top w:type="dxa" w:w="60"/>
@@ -435,10 +435,10 @@
           <w:tcPr>
             <w:tcW w:type="dxa" w:w="2400"/>
             <w:tcBorders>
-              <w:top w:val="single" w:color="8EA9C8" w:sz="4"/>
-              <w:left w:val="single" w:color="8EA9C8" w:sz="4"/>
-              <w:bottom w:val="single" w:color="8EA9C8" w:sz="4"/>
-              <w:right w:val="single" w:color="8EA9C8" w:sz="4"/>
+              <w:top w:val="single" w:color="E3A3A3" w:sz="4"/>
+              <w:left w:val="single" w:color="E3A3A3" w:sz="4"/>
+              <w:bottom w:val="single" w:color="E3A3A3" w:sz="4"/>
+              <w:right w:val="single" w:color="E3A3A3" w:sz="4"/>
             </w:tcBorders>
             <w:tcMar>
               <w:top w:type="dxa" w:w="60"/>
@@ -471,10 +471,10 @@
           <w:tcPr>
             <w:tcW w:type="dxa" w:w="2338"/>
             <w:tcBorders>
-              <w:top w:val="single" w:color="8EA9C8" w:sz="4"/>
-              <w:left w:val="single" w:color="8EA9C8" w:sz="4"/>
-              <w:bottom w:val="single" w:color="8EA9C8" w:sz="4"/>
-              <w:right w:val="single" w:color="8EA9C8" w:sz="4"/>
+              <w:top w:val="single" w:color="E3A3A3" w:sz="4"/>
+              <w:left w:val="single" w:color="E3A3A3" w:sz="4"/>
+              <w:bottom w:val="single" w:color="E3A3A3" w:sz="4"/>
+              <w:right w:val="single" w:color="E3A3A3" w:sz="4"/>
             </w:tcBorders>
             <w:tcMar>
               <w:top w:type="dxa" w:w="60"/>
@@ -886,9 +886,9 @@
     <w:p>
       <w:pPr>
         <w:pBdr>
-          <w:left w:val="single" w:color="2E75B6" w:sz="18" w:space="6"/>
+          <w:left w:val="single" w:color="E06666" w:sz="18" w:space="6"/>
         </w:pBdr>
-        <w:shd w:fill="EAF2FC" w:color="auto" w:val="clear"/>
+        <w:shd w:fill="FDECEC" w:color="auto" w:val="clear"/>
         <w:spacing w:after="160" w:before="60"/>
         <w:ind w:left="120"/>
       </w:pPr>
@@ -1359,12 +1359,12 @@
           <w:tcPr>
             <w:tcW w:type="dxa" w:w="3000"/>
             <w:tcBorders>
-              <w:top w:val="single" w:color="8EA9C8" w:sz="4"/>
-              <w:left w:val="single" w:color="8EA9C8" w:sz="4"/>
-              <w:bottom w:val="single" w:color="8EA9C8" w:sz="4"/>
-              <w:right w:val="single" w:color="8EA9C8" w:sz="4"/>
-            </w:tcBorders>
-            <w:shd w:fill="A7C7F2" w:color="auto" w:val="clear"/>
+              <w:top w:val="single" w:color="E3A3A3" w:sz="4"/>
+              <w:left w:val="single" w:color="E3A3A3" w:sz="4"/>
+              <w:bottom w:val="single" w:color="E3A3A3" w:sz="4"/>
+              <w:right w:val="single" w:color="E3A3A3" w:sz="4"/>
+            </w:tcBorders>
+            <w:shd w:fill="F6C1C1" w:color="auto" w:val="clear"/>
             <w:tcMar>
               <w:top w:type="dxa" w:w="60"/>
               <w:left w:type="dxa" w:w="100"/>
@@ -1389,12 +1389,12 @@
           <w:tcPr>
             <w:tcW w:type="dxa" w:w="6638"/>
             <w:tcBorders>
-              <w:top w:val="single" w:color="8EA9C8" w:sz="4"/>
-              <w:left w:val="single" w:color="8EA9C8" w:sz="4"/>
-              <w:bottom w:val="single" w:color="8EA9C8" w:sz="4"/>
-              <w:right w:val="single" w:color="8EA9C8" w:sz="4"/>
-            </w:tcBorders>
-            <w:shd w:fill="A7C7F2" w:color="auto" w:val="clear"/>
+              <w:top w:val="single" w:color="E3A3A3" w:sz="4"/>
+              <w:left w:val="single" w:color="E3A3A3" w:sz="4"/>
+              <w:bottom w:val="single" w:color="E3A3A3" w:sz="4"/>
+              <w:right w:val="single" w:color="E3A3A3" w:sz="4"/>
+            </w:tcBorders>
+            <w:shd w:fill="F6C1C1" w:color="auto" w:val="clear"/>
             <w:tcMar>
               <w:top w:type="dxa" w:w="60"/>
               <w:left w:type="dxa" w:w="100"/>
@@ -1421,10 +1421,10 @@
           <w:tcPr>
             <w:tcW w:type="dxa" w:w="3000"/>
             <w:tcBorders>
-              <w:top w:val="single" w:color="8EA9C8" w:sz="4"/>
-              <w:left w:val="single" w:color="8EA9C8" w:sz="4"/>
-              <w:bottom w:val="single" w:color="8EA9C8" w:sz="4"/>
-              <w:right w:val="single" w:color="8EA9C8" w:sz="4"/>
+              <w:top w:val="single" w:color="E3A3A3" w:sz="4"/>
+              <w:left w:val="single" w:color="E3A3A3" w:sz="4"/>
+              <w:bottom w:val="single" w:color="E3A3A3" w:sz="4"/>
+              <w:right w:val="single" w:color="E3A3A3" w:sz="4"/>
             </w:tcBorders>
             <w:tcMar>
               <w:top w:type="dxa" w:w="60"/>
@@ -1446,10 +1446,10 @@
           <w:tcPr>
             <w:tcW w:type="dxa" w:w="6638"/>
             <w:tcBorders>
-              <w:top w:val="single" w:color="8EA9C8" w:sz="4"/>
-              <w:left w:val="single" w:color="8EA9C8" w:sz="4"/>
-              <w:bottom w:val="single" w:color="8EA9C8" w:sz="4"/>
-              <w:right w:val="single" w:color="8EA9C8" w:sz="4"/>
+              <w:top w:val="single" w:color="E3A3A3" w:sz="4"/>
+              <w:left w:val="single" w:color="E3A3A3" w:sz="4"/>
+              <w:bottom w:val="single" w:color="E3A3A3" w:sz="4"/>
+              <w:right w:val="single" w:color="E3A3A3" w:sz="4"/>
             </w:tcBorders>
             <w:tcMar>
               <w:top w:type="dxa" w:w="60"/>
@@ -1493,10 +1493,10 @@
           <w:tcPr>
             <w:tcW w:type="dxa" w:w="3000"/>
             <w:tcBorders>
-              <w:top w:val="single" w:color="8EA9C8" w:sz="4"/>
-              <w:left w:val="single" w:color="8EA9C8" w:sz="4"/>
-              <w:bottom w:val="single" w:color="8EA9C8" w:sz="4"/>
-              <w:right w:val="single" w:color="8EA9C8" w:sz="4"/>
+              <w:top w:val="single" w:color="E3A3A3" w:sz="4"/>
+              <w:left w:val="single" w:color="E3A3A3" w:sz="4"/>
+              <w:bottom w:val="single" w:color="E3A3A3" w:sz="4"/>
+              <w:right w:val="single" w:color="E3A3A3" w:sz="4"/>
             </w:tcBorders>
             <w:tcMar>
               <w:top w:type="dxa" w:w="60"/>
@@ -1518,10 +1518,10 @@
           <w:tcPr>
             <w:tcW w:type="dxa" w:w="6638"/>
             <w:tcBorders>
-              <w:top w:val="single" w:color="8EA9C8" w:sz="4"/>
-              <w:left w:val="single" w:color="8EA9C8" w:sz="4"/>
-              <w:bottom w:val="single" w:color="8EA9C8" w:sz="4"/>
-              <w:right w:val="single" w:color="8EA9C8" w:sz="4"/>
+              <w:top w:val="single" w:color="E3A3A3" w:sz="4"/>
+              <w:left w:val="single" w:color="E3A3A3" w:sz="4"/>
+              <w:bottom w:val="single" w:color="E3A3A3" w:sz="4"/>
+              <w:right w:val="single" w:color="E3A3A3" w:sz="4"/>
             </w:tcBorders>
             <w:tcMar>
               <w:top w:type="dxa" w:w="60"/>
@@ -1555,10 +1555,10 @@
           <w:tcPr>
             <w:tcW w:type="dxa" w:w="3000"/>
             <w:tcBorders>
-              <w:top w:val="single" w:color="8EA9C8" w:sz="4"/>
-              <w:left w:val="single" w:color="8EA9C8" w:sz="4"/>
-              <w:bottom w:val="single" w:color="8EA9C8" w:sz="4"/>
-              <w:right w:val="single" w:color="8EA9C8" w:sz="4"/>
+              <w:top w:val="single" w:color="E3A3A3" w:sz="4"/>
+              <w:left w:val="single" w:color="E3A3A3" w:sz="4"/>
+              <w:bottom w:val="single" w:color="E3A3A3" w:sz="4"/>
+              <w:right w:val="single" w:color="E3A3A3" w:sz="4"/>
             </w:tcBorders>
             <w:tcMar>
               <w:top w:type="dxa" w:w="60"/>
@@ -1580,10 +1580,10 @@
           <w:tcPr>
             <w:tcW w:type="dxa" w:w="6638"/>
             <w:tcBorders>
-              <w:top w:val="single" w:color="8EA9C8" w:sz="4"/>
-              <w:left w:val="single" w:color="8EA9C8" w:sz="4"/>
-              <w:bottom w:val="single" w:color="8EA9C8" w:sz="4"/>
-              <w:right w:val="single" w:color="8EA9C8" w:sz="4"/>
+              <w:top w:val="single" w:color="E3A3A3" w:sz="4"/>
+              <w:left w:val="single" w:color="E3A3A3" w:sz="4"/>
+              <w:bottom w:val="single" w:color="E3A3A3" w:sz="4"/>
+              <w:right w:val="single" w:color="E3A3A3" w:sz="4"/>
             </w:tcBorders>
             <w:tcMar>
               <w:top w:type="dxa" w:w="60"/>
@@ -1617,10 +1617,10 @@
           <w:tcPr>
             <w:tcW w:type="dxa" w:w="3000"/>
             <w:tcBorders>
-              <w:top w:val="single" w:color="8EA9C8" w:sz="4"/>
-              <w:left w:val="single" w:color="8EA9C8" w:sz="4"/>
-              <w:bottom w:val="single" w:color="8EA9C8" w:sz="4"/>
-              <w:right w:val="single" w:color="8EA9C8" w:sz="4"/>
+              <w:top w:val="single" w:color="E3A3A3" w:sz="4"/>
+              <w:left w:val="single" w:color="E3A3A3" w:sz="4"/>
+              <w:bottom w:val="single" w:color="E3A3A3" w:sz="4"/>
+              <w:right w:val="single" w:color="E3A3A3" w:sz="4"/>
             </w:tcBorders>
             <w:tcMar>
               <w:top w:type="dxa" w:w="60"/>
@@ -1642,10 +1642,10 @@
           <w:tcPr>
             <w:tcW w:type="dxa" w:w="6638"/>
             <w:tcBorders>
-              <w:top w:val="single" w:color="8EA9C8" w:sz="4"/>
-              <w:left w:val="single" w:color="8EA9C8" w:sz="4"/>
-              <w:bottom w:val="single" w:color="8EA9C8" w:sz="4"/>
-              <w:right w:val="single" w:color="8EA9C8" w:sz="4"/>
+              <w:top w:val="single" w:color="E3A3A3" w:sz="4"/>
+              <w:left w:val="single" w:color="E3A3A3" w:sz="4"/>
+              <w:bottom w:val="single" w:color="E3A3A3" w:sz="4"/>
+              <w:right w:val="single" w:color="E3A3A3" w:sz="4"/>
             </w:tcBorders>
             <w:tcMar>
               <w:top w:type="dxa" w:w="60"/>
@@ -1669,10 +1669,10 @@
           <w:tcPr>
             <w:tcW w:type="dxa" w:w="3000"/>
             <w:tcBorders>
-              <w:top w:val="single" w:color="8EA9C8" w:sz="4"/>
-              <w:left w:val="single" w:color="8EA9C8" w:sz="4"/>
-              <w:bottom w:val="single" w:color="8EA9C8" w:sz="4"/>
-              <w:right w:val="single" w:color="8EA9C8" w:sz="4"/>
+              <w:top w:val="single" w:color="E3A3A3" w:sz="4"/>
+              <w:left w:val="single" w:color="E3A3A3" w:sz="4"/>
+              <w:bottom w:val="single" w:color="E3A3A3" w:sz="4"/>
+              <w:right w:val="single" w:color="E3A3A3" w:sz="4"/>
             </w:tcBorders>
             <w:tcMar>
               <w:top w:type="dxa" w:w="60"/>
@@ -1694,10 +1694,10 @@
           <w:tcPr>
             <w:tcW w:type="dxa" w:w="6638"/>
             <w:tcBorders>
-              <w:top w:val="single" w:color="8EA9C8" w:sz="4"/>
-              <w:left w:val="single" w:color="8EA9C8" w:sz="4"/>
-              <w:bottom w:val="single" w:color="8EA9C8" w:sz="4"/>
-              <w:right w:val="single" w:color="8EA9C8" w:sz="4"/>
+              <w:top w:val="single" w:color="E3A3A3" w:sz="4"/>
+              <w:left w:val="single" w:color="E3A3A3" w:sz="4"/>
+              <w:bottom w:val="single" w:color="E3A3A3" w:sz="4"/>
+              <w:right w:val="single" w:color="E3A3A3" w:sz="4"/>
             </w:tcBorders>
             <w:tcMar>
               <w:top w:type="dxa" w:w="60"/>
@@ -1721,10 +1721,10 @@
           <w:tcPr>
             <w:tcW w:type="dxa" w:w="3000"/>
             <w:tcBorders>
-              <w:top w:val="single" w:color="8EA9C8" w:sz="4"/>
-              <w:left w:val="single" w:color="8EA9C8" w:sz="4"/>
-              <w:bottom w:val="single" w:color="8EA9C8" w:sz="4"/>
-              <w:right w:val="single" w:color="8EA9C8" w:sz="4"/>
+              <w:top w:val="single" w:color="E3A3A3" w:sz="4"/>
+              <w:left w:val="single" w:color="E3A3A3" w:sz="4"/>
+              <w:bottom w:val="single" w:color="E3A3A3" w:sz="4"/>
+              <w:right w:val="single" w:color="E3A3A3" w:sz="4"/>
             </w:tcBorders>
             <w:tcMar>
               <w:top w:type="dxa" w:w="60"/>
@@ -1746,10 +1746,10 @@
           <w:tcPr>
             <w:tcW w:type="dxa" w:w="6638"/>
             <w:tcBorders>
-              <w:top w:val="single" w:color="8EA9C8" w:sz="4"/>
-              <w:left w:val="single" w:color="8EA9C8" w:sz="4"/>
-              <w:bottom w:val="single" w:color="8EA9C8" w:sz="4"/>
-              <w:right w:val="single" w:color="8EA9C8" w:sz="4"/>
+              <w:top w:val="single" w:color="E3A3A3" w:sz="4"/>
+              <w:left w:val="single" w:color="E3A3A3" w:sz="4"/>
+              <w:bottom w:val="single" w:color="E3A3A3" w:sz="4"/>
+              <w:right w:val="single" w:color="E3A3A3" w:sz="4"/>
             </w:tcBorders>
             <w:tcMar>
               <w:top w:type="dxa" w:w="60"/>
@@ -1793,10 +1793,10 @@
           <w:tcPr>
             <w:tcW w:type="dxa" w:w="3000"/>
             <w:tcBorders>
-              <w:top w:val="single" w:color="8EA9C8" w:sz="4"/>
-              <w:left w:val="single" w:color="8EA9C8" w:sz="4"/>
-              <w:bottom w:val="single" w:color="8EA9C8" w:sz="4"/>
-              <w:right w:val="single" w:color="8EA9C8" w:sz="4"/>
+              <w:top w:val="single" w:color="E3A3A3" w:sz="4"/>
+              <w:left w:val="single" w:color="E3A3A3" w:sz="4"/>
+              <w:bottom w:val="single" w:color="E3A3A3" w:sz="4"/>
+              <w:right w:val="single" w:color="E3A3A3" w:sz="4"/>
             </w:tcBorders>
             <w:tcMar>
               <w:top w:type="dxa" w:w="60"/>
@@ -1818,10 +1818,10 @@
           <w:tcPr>
             <w:tcW w:type="dxa" w:w="6638"/>
             <w:tcBorders>
-              <w:top w:val="single" w:color="8EA9C8" w:sz="4"/>
-              <w:left w:val="single" w:color="8EA9C8" w:sz="4"/>
-              <w:bottom w:val="single" w:color="8EA9C8" w:sz="4"/>
-              <w:right w:val="single" w:color="8EA9C8" w:sz="4"/>
+              <w:top w:val="single" w:color="E3A3A3" w:sz="4"/>
+              <w:left w:val="single" w:color="E3A3A3" w:sz="4"/>
+              <w:bottom w:val="single" w:color="E3A3A3" w:sz="4"/>
+              <w:right w:val="single" w:color="E3A3A3" w:sz="4"/>
             </w:tcBorders>
             <w:tcMar>
               <w:top w:type="dxa" w:w="60"/>
@@ -1845,10 +1845,10 @@
           <w:tcPr>
             <w:tcW w:type="dxa" w:w="3000"/>
             <w:tcBorders>
-              <w:top w:val="single" w:color="8EA9C8" w:sz="4"/>
-              <w:left w:val="single" w:color="8EA9C8" w:sz="4"/>
-              <w:bottom w:val="single" w:color="8EA9C8" w:sz="4"/>
-              <w:right w:val="single" w:color="8EA9C8" w:sz="4"/>
+              <w:top w:val="single" w:color="E3A3A3" w:sz="4"/>
+              <w:left w:val="single" w:color="E3A3A3" w:sz="4"/>
+              <w:bottom w:val="single" w:color="E3A3A3" w:sz="4"/>
+              <w:right w:val="single" w:color="E3A3A3" w:sz="4"/>
             </w:tcBorders>
             <w:tcMar>
               <w:top w:type="dxa" w:w="60"/>
@@ -1870,10 +1870,10 @@
           <w:tcPr>
             <w:tcW w:type="dxa" w:w="6638"/>
             <w:tcBorders>
-              <w:top w:val="single" w:color="8EA9C8" w:sz="4"/>
-              <w:left w:val="single" w:color="8EA9C8" w:sz="4"/>
-              <w:bottom w:val="single" w:color="8EA9C8" w:sz="4"/>
-              <w:right w:val="single" w:color="8EA9C8" w:sz="4"/>
+              <w:top w:val="single" w:color="E3A3A3" w:sz="4"/>
+              <w:left w:val="single" w:color="E3A3A3" w:sz="4"/>
+              <w:bottom w:val="single" w:color="E3A3A3" w:sz="4"/>
+              <w:right w:val="single" w:color="E3A3A3" w:sz="4"/>
             </w:tcBorders>
             <w:tcMar>
               <w:top w:type="dxa" w:w="60"/>
@@ -1917,10 +1917,10 @@
           <w:tcPr>
             <w:tcW w:type="dxa" w:w="3000"/>
             <w:tcBorders>
-              <w:top w:val="single" w:color="8EA9C8" w:sz="4"/>
-              <w:left w:val="single" w:color="8EA9C8" w:sz="4"/>
-              <w:bottom w:val="single" w:color="8EA9C8" w:sz="4"/>
-              <w:right w:val="single" w:color="8EA9C8" w:sz="4"/>
+              <w:top w:val="single" w:color="E3A3A3" w:sz="4"/>
+              <w:left w:val="single" w:color="E3A3A3" w:sz="4"/>
+              <w:bottom w:val="single" w:color="E3A3A3" w:sz="4"/>
+              <w:right w:val="single" w:color="E3A3A3" w:sz="4"/>
             </w:tcBorders>
             <w:tcMar>
               <w:top w:type="dxa" w:w="60"/>
@@ -1942,10 +1942,10 @@
           <w:tcPr>
             <w:tcW w:type="dxa" w:w="6638"/>
             <w:tcBorders>
-              <w:top w:val="single" w:color="8EA9C8" w:sz="4"/>
-              <w:left w:val="single" w:color="8EA9C8" w:sz="4"/>
-              <w:bottom w:val="single" w:color="8EA9C8" w:sz="4"/>
-              <w:right w:val="single" w:color="8EA9C8" w:sz="4"/>
+              <w:top w:val="single" w:color="E3A3A3" w:sz="4"/>
+              <w:left w:val="single" w:color="E3A3A3" w:sz="4"/>
+              <w:bottom w:val="single" w:color="E3A3A3" w:sz="4"/>
+              <w:right w:val="single" w:color="E3A3A3" w:sz="4"/>
             </w:tcBorders>
             <w:tcMar>
               <w:top w:type="dxa" w:w="60"/>
@@ -1989,10 +1989,10 @@
           <w:tcPr>
             <w:tcW w:type="dxa" w:w="3000"/>
             <w:tcBorders>
-              <w:top w:val="single" w:color="8EA9C8" w:sz="4"/>
-              <w:left w:val="single" w:color="8EA9C8" w:sz="4"/>
-              <w:bottom w:val="single" w:color="8EA9C8" w:sz="4"/>
-              <w:right w:val="single" w:color="8EA9C8" w:sz="4"/>
+              <w:top w:val="single" w:color="E3A3A3" w:sz="4"/>
+              <w:left w:val="single" w:color="E3A3A3" w:sz="4"/>
+              <w:bottom w:val="single" w:color="E3A3A3" w:sz="4"/>
+              <w:right w:val="single" w:color="E3A3A3" w:sz="4"/>
             </w:tcBorders>
             <w:tcMar>
               <w:top w:type="dxa" w:w="60"/>
@@ -2014,10 +2014,10 @@
           <w:tcPr>
             <w:tcW w:type="dxa" w:w="6638"/>
             <w:tcBorders>
-              <w:top w:val="single" w:color="8EA9C8" w:sz="4"/>
-              <w:left w:val="single" w:color="8EA9C8" w:sz="4"/>
-              <w:bottom w:val="single" w:color="8EA9C8" w:sz="4"/>
-              <w:right w:val="single" w:color="8EA9C8" w:sz="4"/>
+              <w:top w:val="single" w:color="E3A3A3" w:sz="4"/>
+              <w:left w:val="single" w:color="E3A3A3" w:sz="4"/>
+              <w:bottom w:val="single" w:color="E3A3A3" w:sz="4"/>
+              <w:right w:val="single" w:color="E3A3A3" w:sz="4"/>
             </w:tcBorders>
             <w:tcMar>
               <w:top w:type="dxa" w:w="60"/>
@@ -2134,12 +2134,12 @@
           <w:tcPr>
             <w:tcW w:type="dxa" w:w="1700"/>
             <w:tcBorders>
-              <w:top w:val="single" w:color="8EA9C8" w:sz="4"/>
-              <w:left w:val="single" w:color="8EA9C8" w:sz="4"/>
-              <w:bottom w:val="single" w:color="8EA9C8" w:sz="4"/>
-              <w:right w:val="single" w:color="8EA9C8" w:sz="4"/>
-            </w:tcBorders>
-            <w:shd w:fill="A7C7F2" w:color="auto" w:val="clear"/>
+              <w:top w:val="single" w:color="E3A3A3" w:sz="4"/>
+              <w:left w:val="single" w:color="E3A3A3" w:sz="4"/>
+              <w:bottom w:val="single" w:color="E3A3A3" w:sz="4"/>
+              <w:right w:val="single" w:color="E3A3A3" w:sz="4"/>
+            </w:tcBorders>
+            <w:shd w:fill="F6C1C1" w:color="auto" w:val="clear"/>
             <w:tcMar>
               <w:top w:type="dxa" w:w="60"/>
               <w:left w:type="dxa" w:w="100"/>
@@ -2164,12 +2164,12 @@
           <w:tcPr>
             <w:tcW w:type="dxa" w:w="3300"/>
             <w:tcBorders>
-              <w:top w:val="single" w:color="8EA9C8" w:sz="4"/>
-              <w:left w:val="single" w:color="8EA9C8" w:sz="4"/>
-              <w:bottom w:val="single" w:color="8EA9C8" w:sz="4"/>
-              <w:right w:val="single" w:color="8EA9C8" w:sz="4"/>
-            </w:tcBorders>
-            <w:shd w:fill="A7C7F2" w:color="auto" w:val="clear"/>
+              <w:top w:val="single" w:color="E3A3A3" w:sz="4"/>
+              <w:left w:val="single" w:color="E3A3A3" w:sz="4"/>
+              <w:bottom w:val="single" w:color="E3A3A3" w:sz="4"/>
+              <w:right w:val="single" w:color="E3A3A3" w:sz="4"/>
+            </w:tcBorders>
+            <w:shd w:fill="F6C1C1" w:color="auto" w:val="clear"/>
             <w:tcMar>
               <w:top w:type="dxa" w:w="60"/>
               <w:left w:type="dxa" w:w="100"/>
@@ -2194,12 +2194,12 @@
           <w:tcPr>
             <w:tcW w:type="dxa" w:w="2700"/>
             <w:tcBorders>
-              <w:top w:val="single" w:color="8EA9C8" w:sz="4"/>
-              <w:left w:val="single" w:color="8EA9C8" w:sz="4"/>
-              <w:bottom w:val="single" w:color="8EA9C8" w:sz="4"/>
-              <w:right w:val="single" w:color="8EA9C8" w:sz="4"/>
-            </w:tcBorders>
-            <w:shd w:fill="A7C7F2" w:color="auto" w:val="clear"/>
+              <w:top w:val="single" w:color="E3A3A3" w:sz="4"/>
+              <w:left w:val="single" w:color="E3A3A3" w:sz="4"/>
+              <w:bottom w:val="single" w:color="E3A3A3" w:sz="4"/>
+              <w:right w:val="single" w:color="E3A3A3" w:sz="4"/>
+            </w:tcBorders>
+            <w:shd w:fill="F6C1C1" w:color="auto" w:val="clear"/>
             <w:tcMar>
               <w:top w:type="dxa" w:w="60"/>
               <w:left w:type="dxa" w:w="100"/>
@@ -2224,12 +2224,12 @@
           <w:tcPr>
             <w:tcW w:type="dxa" w:w="1938"/>
             <w:tcBorders>
-              <w:top w:val="single" w:color="8EA9C8" w:sz="4"/>
-              <w:left w:val="single" w:color="8EA9C8" w:sz="4"/>
-              <w:bottom w:val="single" w:color="8EA9C8" w:sz="4"/>
-              <w:right w:val="single" w:color="8EA9C8" w:sz="4"/>
-            </w:tcBorders>
-            <w:shd w:fill="A7C7F2" w:color="auto" w:val="clear"/>
+              <w:top w:val="single" w:color="E3A3A3" w:sz="4"/>
+              <w:left w:val="single" w:color="E3A3A3" w:sz="4"/>
+              <w:bottom w:val="single" w:color="E3A3A3" w:sz="4"/>
+              <w:right w:val="single" w:color="E3A3A3" w:sz="4"/>
+            </w:tcBorders>
+            <w:shd w:fill="F6C1C1" w:color="auto" w:val="clear"/>
             <w:tcMar>
               <w:top w:type="dxa" w:w="60"/>
               <w:left w:type="dxa" w:w="100"/>
@@ -2256,10 +2256,10 @@
           <w:tcPr>
             <w:tcW w:type="dxa" w:w="1700"/>
             <w:tcBorders>
-              <w:top w:val="single" w:color="8EA9C8" w:sz="4"/>
-              <w:left w:val="single" w:color="8EA9C8" w:sz="4"/>
-              <w:bottom w:val="single" w:color="8EA9C8" w:sz="4"/>
-              <w:right w:val="single" w:color="8EA9C8" w:sz="4"/>
+              <w:top w:val="single" w:color="E3A3A3" w:sz="4"/>
+              <w:left w:val="single" w:color="E3A3A3" w:sz="4"/>
+              <w:bottom w:val="single" w:color="E3A3A3" w:sz="4"/>
+              <w:right w:val="single" w:color="E3A3A3" w:sz="4"/>
             </w:tcBorders>
             <w:tcMar>
               <w:top w:type="dxa" w:w="60"/>
@@ -2281,10 +2281,10 @@
           <w:tcPr>
             <w:tcW w:type="dxa" w:w="3300"/>
             <w:tcBorders>
-              <w:top w:val="single" w:color="8EA9C8" w:sz="4"/>
-              <w:left w:val="single" w:color="8EA9C8" w:sz="4"/>
-              <w:bottom w:val="single" w:color="8EA9C8" w:sz="4"/>
-              <w:right w:val="single" w:color="8EA9C8" w:sz="4"/>
+              <w:top w:val="single" w:color="E3A3A3" w:sz="4"/>
+              <w:left w:val="single" w:color="E3A3A3" w:sz="4"/>
+              <w:bottom w:val="single" w:color="E3A3A3" w:sz="4"/>
+              <w:right w:val="single" w:color="E3A3A3" w:sz="4"/>
             </w:tcBorders>
             <w:tcMar>
               <w:top w:type="dxa" w:w="60"/>
@@ -2306,10 +2306,10 @@
           <w:tcPr>
             <w:tcW w:type="dxa" w:w="2700"/>
             <w:tcBorders>
-              <w:top w:val="single" w:color="8EA9C8" w:sz="4"/>
-              <w:left w:val="single" w:color="8EA9C8" w:sz="4"/>
-              <w:bottom w:val="single" w:color="8EA9C8" w:sz="4"/>
-              <w:right w:val="single" w:color="8EA9C8" w:sz="4"/>
+              <w:top w:val="single" w:color="E3A3A3" w:sz="4"/>
+              <w:left w:val="single" w:color="E3A3A3" w:sz="4"/>
+              <w:bottom w:val="single" w:color="E3A3A3" w:sz="4"/>
+              <w:right w:val="single" w:color="E3A3A3" w:sz="4"/>
             </w:tcBorders>
             <w:tcMar>
               <w:top w:type="dxa" w:w="60"/>
@@ -2331,10 +2331,10 @@
           <w:tcPr>
             <w:tcW w:type="dxa" w:w="1938"/>
             <w:tcBorders>
-              <w:top w:val="single" w:color="8EA9C8" w:sz="4"/>
-              <w:left w:val="single" w:color="8EA9C8" w:sz="4"/>
-              <w:bottom w:val="single" w:color="8EA9C8" w:sz="4"/>
-              <w:right w:val="single" w:color="8EA9C8" w:sz="4"/>
+              <w:top w:val="single" w:color="E3A3A3" w:sz="4"/>
+              <w:left w:val="single" w:color="E3A3A3" w:sz="4"/>
+              <w:bottom w:val="single" w:color="E3A3A3" w:sz="4"/>
+              <w:right w:val="single" w:color="E3A3A3" w:sz="4"/>
             </w:tcBorders>
             <w:tcMar>
               <w:top w:type="dxa" w:w="60"/>
@@ -2363,10 +2363,10 @@
           <w:tcPr>
             <w:tcW w:type="dxa" w:w="1700"/>
             <w:tcBorders>
-              <w:top w:val="single" w:color="8EA9C8" w:sz="4"/>
-              <w:left w:val="single" w:color="8EA9C8" w:sz="4"/>
-              <w:bottom w:val="single" w:color="8EA9C8" w:sz="4"/>
-              <w:right w:val="single" w:color="8EA9C8" w:sz="4"/>
+              <w:top w:val="single" w:color="E3A3A3" w:sz="4"/>
+              <w:left w:val="single" w:color="E3A3A3" w:sz="4"/>
+              <w:bottom w:val="single" w:color="E3A3A3" w:sz="4"/>
+              <w:right w:val="single" w:color="E3A3A3" w:sz="4"/>
             </w:tcBorders>
             <w:tcMar>
               <w:top w:type="dxa" w:w="60"/>
@@ -2388,10 +2388,10 @@
           <w:tcPr>
             <w:tcW w:type="dxa" w:w="3300"/>
             <w:tcBorders>
-              <w:top w:val="single" w:color="8EA9C8" w:sz="4"/>
-              <w:left w:val="single" w:color="8EA9C8" w:sz="4"/>
-              <w:bottom w:val="single" w:color="8EA9C8" w:sz="4"/>
-              <w:right w:val="single" w:color="8EA9C8" w:sz="4"/>
+              <w:top w:val="single" w:color="E3A3A3" w:sz="4"/>
+              <w:left w:val="single" w:color="E3A3A3" w:sz="4"/>
+              <w:bottom w:val="single" w:color="E3A3A3" w:sz="4"/>
+              <w:right w:val="single" w:color="E3A3A3" w:sz="4"/>
             </w:tcBorders>
             <w:tcMar>
               <w:top w:type="dxa" w:w="60"/>
@@ -2413,10 +2413,10 @@
           <w:tcPr>
             <w:tcW w:type="dxa" w:w="2700"/>
             <w:tcBorders>
-              <w:top w:val="single" w:color="8EA9C8" w:sz="4"/>
-              <w:left w:val="single" w:color="8EA9C8" w:sz="4"/>
-              <w:bottom w:val="single" w:color="8EA9C8" w:sz="4"/>
-              <w:right w:val="single" w:color="8EA9C8" w:sz="4"/>
+              <w:top w:val="single" w:color="E3A3A3" w:sz="4"/>
+              <w:left w:val="single" w:color="E3A3A3" w:sz="4"/>
+              <w:bottom w:val="single" w:color="E3A3A3" w:sz="4"/>
+              <w:right w:val="single" w:color="E3A3A3" w:sz="4"/>
             </w:tcBorders>
             <w:tcMar>
               <w:top w:type="dxa" w:w="60"/>
@@ -2438,10 +2438,10 @@
           <w:tcPr>
             <w:tcW w:type="dxa" w:w="1938"/>
             <w:tcBorders>
-              <w:top w:val="single" w:color="8EA9C8" w:sz="4"/>
-              <w:left w:val="single" w:color="8EA9C8" w:sz="4"/>
-              <w:bottom w:val="single" w:color="8EA9C8" w:sz="4"/>
-              <w:right w:val="single" w:color="8EA9C8" w:sz="4"/>
+              <w:top w:val="single" w:color="E3A3A3" w:sz="4"/>
+              <w:left w:val="single" w:color="E3A3A3" w:sz="4"/>
+              <w:bottom w:val="single" w:color="E3A3A3" w:sz="4"/>
+              <w:right w:val="single" w:color="E3A3A3" w:sz="4"/>
             </w:tcBorders>
             <w:tcMar>
               <w:top w:type="dxa" w:w="60"/>
@@ -2470,10 +2470,10 @@
           <w:tcPr>
             <w:tcW w:type="dxa" w:w="1700"/>
             <w:tcBorders>
-              <w:top w:val="single" w:color="8EA9C8" w:sz="4"/>
-              <w:left w:val="single" w:color="8EA9C8" w:sz="4"/>
-              <w:bottom w:val="single" w:color="8EA9C8" w:sz="4"/>
-              <w:right w:val="single" w:color="8EA9C8" w:sz="4"/>
+              <w:top w:val="single" w:color="E3A3A3" w:sz="4"/>
+              <w:left w:val="single" w:color="E3A3A3" w:sz="4"/>
+              <w:bottom w:val="single" w:color="E3A3A3" w:sz="4"/>
+              <w:right w:val="single" w:color="E3A3A3" w:sz="4"/>
             </w:tcBorders>
             <w:tcMar>
               <w:top w:type="dxa" w:w="60"/>
@@ -2495,10 +2495,10 @@
           <w:tcPr>
             <w:tcW w:type="dxa" w:w="3300"/>
             <w:tcBorders>
-              <w:top w:val="single" w:color="8EA9C8" w:sz="4"/>
-              <w:left w:val="single" w:color="8EA9C8" w:sz="4"/>
-              <w:bottom w:val="single" w:color="8EA9C8" w:sz="4"/>
-              <w:right w:val="single" w:color="8EA9C8" w:sz="4"/>
+              <w:top w:val="single" w:color="E3A3A3" w:sz="4"/>
+              <w:left w:val="single" w:color="E3A3A3" w:sz="4"/>
+              <w:bottom w:val="single" w:color="E3A3A3" w:sz="4"/>
+              <w:right w:val="single" w:color="E3A3A3" w:sz="4"/>
             </w:tcBorders>
             <w:tcMar>
               <w:top w:type="dxa" w:w="60"/>
@@ -2520,10 +2520,10 @@
           <w:tcPr>
             <w:tcW w:type="dxa" w:w="2700"/>
             <w:tcBorders>
-              <w:top w:val="single" w:color="8EA9C8" w:sz="4"/>
-              <w:left w:val="single" w:color="8EA9C8" w:sz="4"/>
-              <w:bottom w:val="single" w:color="8EA9C8" w:sz="4"/>
-              <w:right w:val="single" w:color="8EA9C8" w:sz="4"/>
+              <w:top w:val="single" w:color="E3A3A3" w:sz="4"/>
+              <w:left w:val="single" w:color="E3A3A3" w:sz="4"/>
+              <w:bottom w:val="single" w:color="E3A3A3" w:sz="4"/>
+              <w:right w:val="single" w:color="E3A3A3" w:sz="4"/>
             </w:tcBorders>
             <w:tcMar>
               <w:top w:type="dxa" w:w="60"/>
@@ -2545,10 +2545,10 @@
           <w:tcPr>
             <w:tcW w:type="dxa" w:w="1938"/>
             <w:tcBorders>
-              <w:top w:val="single" w:color="8EA9C8" w:sz="4"/>
-              <w:left w:val="single" w:color="8EA9C8" w:sz="4"/>
-              <w:bottom w:val="single" w:color="8EA9C8" w:sz="4"/>
-              <w:right w:val="single" w:color="8EA9C8" w:sz="4"/>
+              <w:top w:val="single" w:color="E3A3A3" w:sz="4"/>
+              <w:left w:val="single" w:color="E3A3A3" w:sz="4"/>
+              <w:bottom w:val="single" w:color="E3A3A3" w:sz="4"/>
+              <w:right w:val="single" w:color="E3A3A3" w:sz="4"/>
             </w:tcBorders>
             <w:tcMar>
               <w:top w:type="dxa" w:w="60"/>
@@ -2577,10 +2577,10 @@
           <w:tcPr>
             <w:tcW w:type="dxa" w:w="1700"/>
             <w:tcBorders>
-              <w:top w:val="single" w:color="8EA9C8" w:sz="4"/>
-              <w:left w:val="single" w:color="8EA9C8" w:sz="4"/>
-              <w:bottom w:val="single" w:color="8EA9C8" w:sz="4"/>
-              <w:right w:val="single" w:color="8EA9C8" w:sz="4"/>
+              <w:top w:val="single" w:color="E3A3A3" w:sz="4"/>
+              <w:left w:val="single" w:color="E3A3A3" w:sz="4"/>
+              <w:bottom w:val="single" w:color="E3A3A3" w:sz="4"/>
+              <w:right w:val="single" w:color="E3A3A3" w:sz="4"/>
             </w:tcBorders>
             <w:tcMar>
               <w:top w:type="dxa" w:w="60"/>
@@ -2602,10 +2602,10 @@
           <w:tcPr>
             <w:tcW w:type="dxa" w:w="3300"/>
             <w:tcBorders>
-              <w:top w:val="single" w:color="8EA9C8" w:sz="4"/>
-              <w:left w:val="single" w:color="8EA9C8" w:sz="4"/>
-              <w:bottom w:val="single" w:color="8EA9C8" w:sz="4"/>
-              <w:right w:val="single" w:color="8EA9C8" w:sz="4"/>
+              <w:top w:val="single" w:color="E3A3A3" w:sz="4"/>
+              <w:left w:val="single" w:color="E3A3A3" w:sz="4"/>
+              <w:bottom w:val="single" w:color="E3A3A3" w:sz="4"/>
+              <w:right w:val="single" w:color="E3A3A3" w:sz="4"/>
             </w:tcBorders>
             <w:tcMar>
               <w:top w:type="dxa" w:w="60"/>
@@ -2627,10 +2627,10 @@
           <w:tcPr>
             <w:tcW w:type="dxa" w:w="2700"/>
             <w:tcBorders>
-              <w:top w:val="single" w:color="8EA9C8" w:sz="4"/>
-              <w:left w:val="single" w:color="8EA9C8" w:sz="4"/>
-              <w:bottom w:val="single" w:color="8EA9C8" w:sz="4"/>
-              <w:right w:val="single" w:color="8EA9C8" w:sz="4"/>
+              <w:top w:val="single" w:color="E3A3A3" w:sz="4"/>
+              <w:left w:val="single" w:color="E3A3A3" w:sz="4"/>
+              <w:bottom w:val="single" w:color="E3A3A3" w:sz="4"/>
+              <w:right w:val="single" w:color="E3A3A3" w:sz="4"/>
             </w:tcBorders>
             <w:tcMar>
               <w:top w:type="dxa" w:w="60"/>
@@ -2652,10 +2652,10 @@
           <w:tcPr>
             <w:tcW w:type="dxa" w:w="1938"/>
             <w:tcBorders>
-              <w:top w:val="single" w:color="8EA9C8" w:sz="4"/>
-              <w:left w:val="single" w:color="8EA9C8" w:sz="4"/>
-              <w:bottom w:val="single" w:color="8EA9C8" w:sz="4"/>
-              <w:right w:val="single" w:color="8EA9C8" w:sz="4"/>
+              <w:top w:val="single" w:color="E3A3A3" w:sz="4"/>
+              <w:left w:val="single" w:color="E3A3A3" w:sz="4"/>
+              <w:bottom w:val="single" w:color="E3A3A3" w:sz="4"/>
+              <w:right w:val="single" w:color="E3A3A3" w:sz="4"/>
             </w:tcBorders>
             <w:tcMar>
               <w:top w:type="dxa" w:w="60"/>
@@ -2684,10 +2684,10 @@
           <w:tcPr>
             <w:tcW w:type="dxa" w:w="1700"/>
             <w:tcBorders>
-              <w:top w:val="single" w:color="8EA9C8" w:sz="4"/>
-              <w:left w:val="single" w:color="8EA9C8" w:sz="4"/>
-              <w:bottom w:val="single" w:color="8EA9C8" w:sz="4"/>
-              <w:right w:val="single" w:color="8EA9C8" w:sz="4"/>
+              <w:top w:val="single" w:color="E3A3A3" w:sz="4"/>
+              <w:left w:val="single" w:color="E3A3A3" w:sz="4"/>
+              <w:bottom w:val="single" w:color="E3A3A3" w:sz="4"/>
+              <w:right w:val="single" w:color="E3A3A3" w:sz="4"/>
             </w:tcBorders>
             <w:tcMar>
               <w:top w:type="dxa" w:w="60"/>
@@ -2709,10 +2709,10 @@
           <w:tcPr>
             <w:tcW w:type="dxa" w:w="3300"/>
             <w:tcBorders>
-              <w:top w:val="single" w:color="8EA9C8" w:sz="4"/>
-              <w:left w:val="single" w:color="8EA9C8" w:sz="4"/>
-              <w:bottom w:val="single" w:color="8EA9C8" w:sz="4"/>
-              <w:right w:val="single" w:color="8EA9C8" w:sz="4"/>
+              <w:top w:val="single" w:color="E3A3A3" w:sz="4"/>
+              <w:left w:val="single" w:color="E3A3A3" w:sz="4"/>
+              <w:bottom w:val="single" w:color="E3A3A3" w:sz="4"/>
+              <w:right w:val="single" w:color="E3A3A3" w:sz="4"/>
             </w:tcBorders>
             <w:tcMar>
               <w:top w:type="dxa" w:w="60"/>
@@ -2734,10 +2734,10 @@
           <w:tcPr>
             <w:tcW w:type="dxa" w:w="2700"/>
             <w:tcBorders>
-              <w:top w:val="single" w:color="8EA9C8" w:sz="4"/>
-              <w:left w:val="single" w:color="8EA9C8" w:sz="4"/>
-              <w:bottom w:val="single" w:color="8EA9C8" w:sz="4"/>
-              <w:right w:val="single" w:color="8EA9C8" w:sz="4"/>
+              <w:top w:val="single" w:color="E3A3A3" w:sz="4"/>
+              <w:left w:val="single" w:color="E3A3A3" w:sz="4"/>
+              <w:bottom w:val="single" w:color="E3A3A3" w:sz="4"/>
+              <w:right w:val="single" w:color="E3A3A3" w:sz="4"/>
             </w:tcBorders>
             <w:tcMar>
               <w:top w:type="dxa" w:w="60"/>
@@ -2759,10 +2759,10 @@
           <w:tcPr>
             <w:tcW w:type="dxa" w:w="1938"/>
             <w:tcBorders>
-              <w:top w:val="single" w:color="8EA9C8" w:sz="4"/>
-              <w:left w:val="single" w:color="8EA9C8" w:sz="4"/>
-              <w:bottom w:val="single" w:color="8EA9C8" w:sz="4"/>
-              <w:right w:val="single" w:color="8EA9C8" w:sz="4"/>
+              <w:top w:val="single" w:color="E3A3A3" w:sz="4"/>
+              <w:left w:val="single" w:color="E3A3A3" w:sz="4"/>
+              <w:bottom w:val="single" w:color="E3A3A3" w:sz="4"/>
+              <w:right w:val="single" w:color="E3A3A3" w:sz="4"/>
             </w:tcBorders>
             <w:tcMar>
               <w:top w:type="dxa" w:w="60"/>
@@ -3038,12 +3038,12 @@
           <w:tcPr>
             <w:tcW w:type="dxa" w:w="2300"/>
             <w:tcBorders>
-              <w:top w:val="single" w:color="8EA9C8" w:sz="4"/>
-              <w:left w:val="single" w:color="8EA9C8" w:sz="4"/>
-              <w:bottom w:val="single" w:color="8EA9C8" w:sz="4"/>
-              <w:right w:val="single" w:color="8EA9C8" w:sz="4"/>
-            </w:tcBorders>
-            <w:shd w:fill="A7C7F2" w:color="auto" w:val="clear"/>
+              <w:top w:val="single" w:color="E3A3A3" w:sz="4"/>
+              <w:left w:val="single" w:color="E3A3A3" w:sz="4"/>
+              <w:bottom w:val="single" w:color="E3A3A3" w:sz="4"/>
+              <w:right w:val="single" w:color="E3A3A3" w:sz="4"/>
+            </w:tcBorders>
+            <w:shd w:fill="F6C1C1" w:color="auto" w:val="clear"/>
             <w:tcMar>
               <w:top w:type="dxa" w:w="60"/>
               <w:left w:type="dxa" w:w="100"/>
@@ -3068,12 +3068,12 @@
           <w:tcPr>
             <w:tcW w:type="dxa" w:w="4300"/>
             <w:tcBorders>
-              <w:top w:val="single" w:color="8EA9C8" w:sz="4"/>
-              <w:left w:val="single" w:color="8EA9C8" w:sz="4"/>
-              <w:bottom w:val="single" w:color="8EA9C8" w:sz="4"/>
-              <w:right w:val="single" w:color="8EA9C8" w:sz="4"/>
-            </w:tcBorders>
-            <w:shd w:fill="A7C7F2" w:color="auto" w:val="clear"/>
+              <w:top w:val="single" w:color="E3A3A3" w:sz="4"/>
+              <w:left w:val="single" w:color="E3A3A3" w:sz="4"/>
+              <w:bottom w:val="single" w:color="E3A3A3" w:sz="4"/>
+              <w:right w:val="single" w:color="E3A3A3" w:sz="4"/>
+            </w:tcBorders>
+            <w:shd w:fill="F6C1C1" w:color="auto" w:val="clear"/>
             <w:tcMar>
               <w:top w:type="dxa" w:w="60"/>
               <w:left w:type="dxa" w:w="100"/>
@@ -3098,12 +3098,12 @@
           <w:tcPr>
             <w:tcW w:type="dxa" w:w="3038"/>
             <w:tcBorders>
-              <w:top w:val="single" w:color="8EA9C8" w:sz="4"/>
-              <w:left w:val="single" w:color="8EA9C8" w:sz="4"/>
-              <w:bottom w:val="single" w:color="8EA9C8" w:sz="4"/>
-              <w:right w:val="single" w:color="8EA9C8" w:sz="4"/>
-            </w:tcBorders>
-            <w:shd w:fill="A7C7F2" w:color="auto" w:val="clear"/>
+              <w:top w:val="single" w:color="E3A3A3" w:sz="4"/>
+              <w:left w:val="single" w:color="E3A3A3" w:sz="4"/>
+              <w:bottom w:val="single" w:color="E3A3A3" w:sz="4"/>
+              <w:right w:val="single" w:color="E3A3A3" w:sz="4"/>
+            </w:tcBorders>
+            <w:shd w:fill="F6C1C1" w:color="auto" w:val="clear"/>
             <w:tcMar>
               <w:top w:type="dxa" w:w="60"/>
               <w:left w:type="dxa" w:w="100"/>
@@ -3130,10 +3130,10 @@
           <w:tcPr>
             <w:tcW w:type="dxa" w:w="2300"/>
             <w:tcBorders>
-              <w:top w:val="single" w:color="8EA9C8" w:sz="4"/>
-              <w:left w:val="single" w:color="8EA9C8" w:sz="4"/>
-              <w:bottom w:val="single" w:color="8EA9C8" w:sz="4"/>
-              <w:right w:val="single" w:color="8EA9C8" w:sz="4"/>
+              <w:top w:val="single" w:color="E3A3A3" w:sz="4"/>
+              <w:left w:val="single" w:color="E3A3A3" w:sz="4"/>
+              <w:bottom w:val="single" w:color="E3A3A3" w:sz="4"/>
+              <w:right w:val="single" w:color="E3A3A3" w:sz="4"/>
             </w:tcBorders>
             <w:tcMar>
               <w:top w:type="dxa" w:w="60"/>
@@ -3155,10 +3155,10 @@
           <w:tcPr>
             <w:tcW w:type="dxa" w:w="4300"/>
             <w:tcBorders>
-              <w:top w:val="single" w:color="8EA9C8" w:sz="4"/>
-              <w:left w:val="single" w:color="8EA9C8" w:sz="4"/>
-              <w:bottom w:val="single" w:color="8EA9C8" w:sz="4"/>
-              <w:right w:val="single" w:color="8EA9C8" w:sz="4"/>
+              <w:top w:val="single" w:color="E3A3A3" w:sz="4"/>
+              <w:left w:val="single" w:color="E3A3A3" w:sz="4"/>
+              <w:bottom w:val="single" w:color="E3A3A3" w:sz="4"/>
+              <w:right w:val="single" w:color="E3A3A3" w:sz="4"/>
             </w:tcBorders>
             <w:tcMar>
               <w:top w:type="dxa" w:w="60"/>
@@ -3180,10 +3180,10 @@
           <w:tcPr>
             <w:tcW w:type="dxa" w:w="3038"/>
             <w:tcBorders>
-              <w:top w:val="single" w:color="8EA9C8" w:sz="4"/>
-              <w:left w:val="single" w:color="8EA9C8" w:sz="4"/>
-              <w:bottom w:val="single" w:color="8EA9C8" w:sz="4"/>
-              <w:right w:val="single" w:color="8EA9C8" w:sz="4"/>
+              <w:top w:val="single" w:color="E3A3A3" w:sz="4"/>
+              <w:left w:val="single" w:color="E3A3A3" w:sz="4"/>
+              <w:bottom w:val="single" w:color="E3A3A3" w:sz="4"/>
+              <w:right w:val="single" w:color="E3A3A3" w:sz="4"/>
             </w:tcBorders>
             <w:tcMar>
               <w:top w:type="dxa" w:w="60"/>
@@ -3215,10 +3215,10 @@
           <w:tcPr>
             <w:tcW w:type="dxa" w:w="2300"/>
             <w:tcBorders>
-              <w:top w:val="single" w:color="8EA9C8" w:sz="4"/>
-              <w:left w:val="single" w:color="8EA9C8" w:sz="4"/>
-              <w:bottom w:val="single" w:color="8EA9C8" w:sz="4"/>
-              <w:right w:val="single" w:color="8EA9C8" w:sz="4"/>
+              <w:top w:val="single" w:color="E3A3A3" w:sz="4"/>
+              <w:left w:val="single" w:color="E3A3A3" w:sz="4"/>
+              <w:bottom w:val="single" w:color="E3A3A3" w:sz="4"/>
+              <w:right w:val="single" w:color="E3A3A3" w:sz="4"/>
             </w:tcBorders>
             <w:tcMar>
               <w:top w:type="dxa" w:w="60"/>
@@ -3240,10 +3240,10 @@
           <w:tcPr>
             <w:tcW w:type="dxa" w:w="4300"/>
             <w:tcBorders>
-              <w:top w:val="single" w:color="8EA9C8" w:sz="4"/>
-              <w:left w:val="single" w:color="8EA9C8" w:sz="4"/>
-              <w:bottom w:val="single" w:color="8EA9C8" w:sz="4"/>
-              <w:right w:val="single" w:color="8EA9C8" w:sz="4"/>
+              <w:top w:val="single" w:color="E3A3A3" w:sz="4"/>
+              <w:left w:val="single" w:color="E3A3A3" w:sz="4"/>
+              <w:bottom w:val="single" w:color="E3A3A3" w:sz="4"/>
+              <w:right w:val="single" w:color="E3A3A3" w:sz="4"/>
             </w:tcBorders>
             <w:tcMar>
               <w:top w:type="dxa" w:w="60"/>
@@ -3265,10 +3265,10 @@
           <w:tcPr>
             <w:tcW w:type="dxa" w:w="3038"/>
             <w:tcBorders>
-              <w:top w:val="single" w:color="8EA9C8" w:sz="4"/>
-              <w:left w:val="single" w:color="8EA9C8" w:sz="4"/>
-              <w:bottom w:val="single" w:color="8EA9C8" w:sz="4"/>
-              <w:right w:val="single" w:color="8EA9C8" w:sz="4"/>
+              <w:top w:val="single" w:color="E3A3A3" w:sz="4"/>
+              <w:left w:val="single" w:color="E3A3A3" w:sz="4"/>
+              <w:bottom w:val="single" w:color="E3A3A3" w:sz="4"/>
+              <w:right w:val="single" w:color="E3A3A3" w:sz="4"/>
             </w:tcBorders>
             <w:tcMar>
               <w:top w:type="dxa" w:w="60"/>
@@ -3300,10 +3300,10 @@
           <w:tcPr>
             <w:tcW w:type="dxa" w:w="2300"/>
             <w:tcBorders>
-              <w:top w:val="single" w:color="8EA9C8" w:sz="4"/>
-              <w:left w:val="single" w:color="8EA9C8" w:sz="4"/>
-              <w:bottom w:val="single" w:color="8EA9C8" w:sz="4"/>
-              <w:right w:val="single" w:color="8EA9C8" w:sz="4"/>
+              <w:top w:val="single" w:color="E3A3A3" w:sz="4"/>
+              <w:left w:val="single" w:color="E3A3A3" w:sz="4"/>
+              <w:bottom w:val="single" w:color="E3A3A3" w:sz="4"/>
+              <w:right w:val="single" w:color="E3A3A3" w:sz="4"/>
             </w:tcBorders>
             <w:tcMar>
               <w:top w:type="dxa" w:w="60"/>
@@ -3325,10 +3325,10 @@
           <w:tcPr>
             <w:tcW w:type="dxa" w:w="4300"/>
             <w:tcBorders>
-              <w:top w:val="single" w:color="8EA9C8" w:sz="4"/>
-              <w:left w:val="single" w:color="8EA9C8" w:sz="4"/>
-              <w:bottom w:val="single" w:color="8EA9C8" w:sz="4"/>
-              <w:right w:val="single" w:color="8EA9C8" w:sz="4"/>
+              <w:top w:val="single" w:color="E3A3A3" w:sz="4"/>
+              <w:left w:val="single" w:color="E3A3A3" w:sz="4"/>
+              <w:bottom w:val="single" w:color="E3A3A3" w:sz="4"/>
+              <w:right w:val="single" w:color="E3A3A3" w:sz="4"/>
             </w:tcBorders>
             <w:tcMar>
               <w:top w:type="dxa" w:w="60"/>
@@ -3350,10 +3350,10 @@
           <w:tcPr>
             <w:tcW w:type="dxa" w:w="3038"/>
             <w:tcBorders>
-              <w:top w:val="single" w:color="8EA9C8" w:sz="4"/>
-              <w:left w:val="single" w:color="8EA9C8" w:sz="4"/>
-              <w:bottom w:val="single" w:color="8EA9C8" w:sz="4"/>
-              <w:right w:val="single" w:color="8EA9C8" w:sz="4"/>
+              <w:top w:val="single" w:color="E3A3A3" w:sz="4"/>
+              <w:left w:val="single" w:color="E3A3A3" w:sz="4"/>
+              <w:bottom w:val="single" w:color="E3A3A3" w:sz="4"/>
+              <w:right w:val="single" w:color="E3A3A3" w:sz="4"/>
             </w:tcBorders>
             <w:tcMar>
               <w:top w:type="dxa" w:w="60"/>
@@ -3438,12 +3438,12 @@
           <w:tcPr>
             <w:tcW w:type="dxa" w:w="2600"/>
             <w:tcBorders>
-              <w:top w:val="single" w:color="8EA9C8" w:sz="4"/>
-              <w:left w:val="single" w:color="8EA9C8" w:sz="4"/>
-              <w:bottom w:val="single" w:color="8EA9C8" w:sz="4"/>
-              <w:right w:val="single" w:color="8EA9C8" w:sz="4"/>
-            </w:tcBorders>
-            <w:shd w:fill="A7C7F2" w:color="auto" w:val="clear"/>
+              <w:top w:val="single" w:color="E3A3A3" w:sz="4"/>
+              <w:left w:val="single" w:color="E3A3A3" w:sz="4"/>
+              <w:bottom w:val="single" w:color="E3A3A3" w:sz="4"/>
+              <w:right w:val="single" w:color="E3A3A3" w:sz="4"/>
+            </w:tcBorders>
+            <w:shd w:fill="F6C1C1" w:color="auto" w:val="clear"/>
             <w:tcMar>
               <w:top w:type="dxa" w:w="60"/>
               <w:left w:type="dxa" w:w="100"/>
@@ -3468,12 +3468,12 @@
           <w:tcPr>
             <w:tcW w:type="dxa" w:w="4600"/>
             <w:tcBorders>
-              <w:top w:val="single" w:color="8EA9C8" w:sz="4"/>
-              <w:left w:val="single" w:color="8EA9C8" w:sz="4"/>
-              <w:bottom w:val="single" w:color="8EA9C8" w:sz="4"/>
-              <w:right w:val="single" w:color="8EA9C8" w:sz="4"/>
-            </w:tcBorders>
-            <w:shd w:fill="A7C7F2" w:color="auto" w:val="clear"/>
+              <w:top w:val="single" w:color="E3A3A3" w:sz="4"/>
+              <w:left w:val="single" w:color="E3A3A3" w:sz="4"/>
+              <w:bottom w:val="single" w:color="E3A3A3" w:sz="4"/>
+              <w:right w:val="single" w:color="E3A3A3" w:sz="4"/>
+            </w:tcBorders>
+            <w:shd w:fill="F6C1C1" w:color="auto" w:val="clear"/>
             <w:tcMar>
               <w:top w:type="dxa" w:w="60"/>
               <w:left w:type="dxa" w:w="100"/>
@@ -3498,12 +3498,12 @@
           <w:tcPr>
             <w:tcW w:type="dxa" w:w="2438"/>
             <w:tcBorders>
-              <w:top w:val="single" w:color="8EA9C8" w:sz="4"/>
-              <w:left w:val="single" w:color="8EA9C8" w:sz="4"/>
-              <w:bottom w:val="single" w:color="8EA9C8" w:sz="4"/>
-              <w:right w:val="single" w:color="8EA9C8" w:sz="4"/>
-            </w:tcBorders>
-            <w:shd w:fill="A7C7F2" w:color="auto" w:val="clear"/>
+              <w:top w:val="single" w:color="E3A3A3" w:sz="4"/>
+              <w:left w:val="single" w:color="E3A3A3" w:sz="4"/>
+              <w:bottom w:val="single" w:color="E3A3A3" w:sz="4"/>
+              <w:right w:val="single" w:color="E3A3A3" w:sz="4"/>
+            </w:tcBorders>
+            <w:shd w:fill="F6C1C1" w:color="auto" w:val="clear"/>
             <w:tcMar>
               <w:top w:type="dxa" w:w="60"/>
               <w:left w:type="dxa" w:w="100"/>
@@ -3530,10 +3530,10 @@
           <w:tcPr>
             <w:tcW w:type="dxa" w:w="2600"/>
             <w:tcBorders>
-              <w:top w:val="single" w:color="8EA9C8" w:sz="4"/>
-              <w:left w:val="single" w:color="8EA9C8" w:sz="4"/>
-              <w:bottom w:val="single" w:color="8EA9C8" w:sz="4"/>
-              <w:right w:val="single" w:color="8EA9C8" w:sz="4"/>
+              <w:top w:val="single" w:color="E3A3A3" w:sz="4"/>
+              <w:left w:val="single" w:color="E3A3A3" w:sz="4"/>
+              <w:bottom w:val="single" w:color="E3A3A3" w:sz="4"/>
+              <w:right w:val="single" w:color="E3A3A3" w:sz="4"/>
             </w:tcBorders>
             <w:tcMar>
               <w:top w:type="dxa" w:w="60"/>
@@ -3555,10 +3555,10 @@
           <w:tcPr>
             <w:tcW w:type="dxa" w:w="4600"/>
             <w:tcBorders>
-              <w:top w:val="single" w:color="8EA9C8" w:sz="4"/>
-              <w:left w:val="single" w:color="8EA9C8" w:sz="4"/>
-              <w:bottom w:val="single" w:color="8EA9C8" w:sz="4"/>
-              <w:right w:val="single" w:color="8EA9C8" w:sz="4"/>
+              <w:top w:val="single" w:color="E3A3A3" w:sz="4"/>
+              <w:left w:val="single" w:color="E3A3A3" w:sz="4"/>
+              <w:bottom w:val="single" w:color="E3A3A3" w:sz="4"/>
+              <w:right w:val="single" w:color="E3A3A3" w:sz="4"/>
             </w:tcBorders>
             <w:tcMar>
               <w:top w:type="dxa" w:w="60"/>
@@ -3580,10 +3580,10 @@
           <w:tcPr>
             <w:tcW w:type="dxa" w:w="2438"/>
             <w:tcBorders>
-              <w:top w:val="single" w:color="8EA9C8" w:sz="4"/>
-              <w:left w:val="single" w:color="8EA9C8" w:sz="4"/>
-              <w:bottom w:val="single" w:color="8EA9C8" w:sz="4"/>
-              <w:right w:val="single" w:color="8EA9C8" w:sz="4"/>
+              <w:top w:val="single" w:color="E3A3A3" w:sz="4"/>
+              <w:left w:val="single" w:color="E3A3A3" w:sz="4"/>
+              <w:bottom w:val="single" w:color="E3A3A3" w:sz="4"/>
+              <w:right w:val="single" w:color="E3A3A3" w:sz="4"/>
             </w:tcBorders>
             <w:tcMar>
               <w:top w:type="dxa" w:w="60"/>
@@ -3607,10 +3607,10 @@
           <w:tcPr>
             <w:tcW w:type="dxa" w:w="2600"/>
             <w:tcBorders>
-              <w:top w:val="single" w:color="8EA9C8" w:sz="4"/>
-              <w:left w:val="single" w:color="8EA9C8" w:sz="4"/>
-              <w:bottom w:val="single" w:color="8EA9C8" w:sz="4"/>
-              <w:right w:val="single" w:color="8EA9C8" w:sz="4"/>
+              <w:top w:val="single" w:color="E3A3A3" w:sz="4"/>
+              <w:left w:val="single" w:color="E3A3A3" w:sz="4"/>
+              <w:bottom w:val="single" w:color="E3A3A3" w:sz="4"/>
+              <w:right w:val="single" w:color="E3A3A3" w:sz="4"/>
             </w:tcBorders>
             <w:tcMar>
               <w:top w:type="dxa" w:w="60"/>
@@ -3632,10 +3632,10 @@
           <w:tcPr>
             <w:tcW w:type="dxa" w:w="4600"/>
             <w:tcBorders>
-              <w:top w:val="single" w:color="8EA9C8" w:sz="4"/>
-              <w:left w:val="single" w:color="8EA9C8" w:sz="4"/>
-              <w:bottom w:val="single" w:color="8EA9C8" w:sz="4"/>
-              <w:right w:val="single" w:color="8EA9C8" w:sz="4"/>
+              <w:top w:val="single" w:color="E3A3A3" w:sz="4"/>
+              <w:left w:val="single" w:color="E3A3A3" w:sz="4"/>
+              <w:bottom w:val="single" w:color="E3A3A3" w:sz="4"/>
+              <w:right w:val="single" w:color="E3A3A3" w:sz="4"/>
             </w:tcBorders>
             <w:tcMar>
               <w:top w:type="dxa" w:w="60"/>
@@ -3657,10 +3657,10 @@
           <w:tcPr>
             <w:tcW w:type="dxa" w:w="2438"/>
             <w:tcBorders>
-              <w:top w:val="single" w:color="8EA9C8" w:sz="4"/>
-              <w:left w:val="single" w:color="8EA9C8" w:sz="4"/>
-              <w:bottom w:val="single" w:color="8EA9C8" w:sz="4"/>
-              <w:right w:val="single" w:color="8EA9C8" w:sz="4"/>
+              <w:top w:val="single" w:color="E3A3A3" w:sz="4"/>
+              <w:left w:val="single" w:color="E3A3A3" w:sz="4"/>
+              <w:bottom w:val="single" w:color="E3A3A3" w:sz="4"/>
+              <w:right w:val="single" w:color="E3A3A3" w:sz="4"/>
             </w:tcBorders>
             <w:tcMar>
               <w:top w:type="dxa" w:w="60"/>
@@ -3684,10 +3684,10 @@
           <w:tcPr>
             <w:tcW w:type="dxa" w:w="2600"/>
             <w:tcBorders>
-              <w:top w:val="single" w:color="8EA9C8" w:sz="4"/>
-              <w:left w:val="single" w:color="8EA9C8" w:sz="4"/>
-              <w:bottom w:val="single" w:color="8EA9C8" w:sz="4"/>
-              <w:right w:val="single" w:color="8EA9C8" w:sz="4"/>
+              <w:top w:val="single" w:color="E3A3A3" w:sz="4"/>
+              <w:left w:val="single" w:color="E3A3A3" w:sz="4"/>
+              <w:bottom w:val="single" w:color="E3A3A3" w:sz="4"/>
+              <w:right w:val="single" w:color="E3A3A3" w:sz="4"/>
             </w:tcBorders>
             <w:tcMar>
               <w:top w:type="dxa" w:w="60"/>
@@ -3709,10 +3709,10 @@
           <w:tcPr>
             <w:tcW w:type="dxa" w:w="4600"/>
             <w:tcBorders>
-              <w:top w:val="single" w:color="8EA9C8" w:sz="4"/>
-              <w:left w:val="single" w:color="8EA9C8" w:sz="4"/>
-              <w:bottom w:val="single" w:color="8EA9C8" w:sz="4"/>
-              <w:right w:val="single" w:color="8EA9C8" w:sz="4"/>
+              <w:top w:val="single" w:color="E3A3A3" w:sz="4"/>
+              <w:left w:val="single" w:color="E3A3A3" w:sz="4"/>
+              <w:bottom w:val="single" w:color="E3A3A3" w:sz="4"/>
+              <w:right w:val="single" w:color="E3A3A3" w:sz="4"/>
             </w:tcBorders>
             <w:tcMar>
               <w:top w:type="dxa" w:w="60"/>
@@ -3734,10 +3734,10 @@
           <w:tcPr>
             <w:tcW w:type="dxa" w:w="2438"/>
             <w:tcBorders>
-              <w:top w:val="single" w:color="8EA9C8" w:sz="4"/>
-              <w:left w:val="single" w:color="8EA9C8" w:sz="4"/>
-              <w:bottom w:val="single" w:color="8EA9C8" w:sz="4"/>
-              <w:right w:val="single" w:color="8EA9C8" w:sz="4"/>
+              <w:top w:val="single" w:color="E3A3A3" w:sz="4"/>
+              <w:left w:val="single" w:color="E3A3A3" w:sz="4"/>
+              <w:bottom w:val="single" w:color="E3A3A3" w:sz="4"/>
+              <w:right w:val="single" w:color="E3A3A3" w:sz="4"/>
             </w:tcBorders>
             <w:tcMar>
               <w:top w:type="dxa" w:w="60"/>
@@ -3761,10 +3761,10 @@
           <w:tcPr>
             <w:tcW w:type="dxa" w:w="2600"/>
             <w:tcBorders>
-              <w:top w:val="single" w:color="8EA9C8" w:sz="4"/>
-              <w:left w:val="single" w:color="8EA9C8" w:sz="4"/>
-              <w:bottom w:val="single" w:color="8EA9C8" w:sz="4"/>
-              <w:right w:val="single" w:color="8EA9C8" w:sz="4"/>
+              <w:top w:val="single" w:color="E3A3A3" w:sz="4"/>
+              <w:left w:val="single" w:color="E3A3A3" w:sz="4"/>
+              <w:bottom w:val="single" w:color="E3A3A3" w:sz="4"/>
+              <w:right w:val="single" w:color="E3A3A3" w:sz="4"/>
             </w:tcBorders>
             <w:tcMar>
               <w:top w:type="dxa" w:w="60"/>
@@ -3786,10 +3786,10 @@
           <w:tcPr>
             <w:tcW w:type="dxa" w:w="4600"/>
             <w:tcBorders>
-              <w:top w:val="single" w:color="8EA9C8" w:sz="4"/>
-              <w:left w:val="single" w:color="8EA9C8" w:sz="4"/>
-              <w:bottom w:val="single" w:color="8EA9C8" w:sz="4"/>
-              <w:right w:val="single" w:color="8EA9C8" w:sz="4"/>
+              <w:top w:val="single" w:color="E3A3A3" w:sz="4"/>
+              <w:left w:val="single" w:color="E3A3A3" w:sz="4"/>
+              <w:bottom w:val="single" w:color="E3A3A3" w:sz="4"/>
+              <w:right w:val="single" w:color="E3A3A3" w:sz="4"/>
             </w:tcBorders>
             <w:tcMar>
               <w:top w:type="dxa" w:w="60"/>
@@ -3811,10 +3811,10 @@
           <w:tcPr>
             <w:tcW w:type="dxa" w:w="2438"/>
             <w:tcBorders>
-              <w:top w:val="single" w:color="8EA9C8" w:sz="4"/>
-              <w:left w:val="single" w:color="8EA9C8" w:sz="4"/>
-              <w:bottom w:val="single" w:color="8EA9C8" w:sz="4"/>
-              <w:right w:val="single" w:color="8EA9C8" w:sz="4"/>
+              <w:top w:val="single" w:color="E3A3A3" w:sz="4"/>
+              <w:left w:val="single" w:color="E3A3A3" w:sz="4"/>
+              <w:bottom w:val="single" w:color="E3A3A3" w:sz="4"/>
+              <w:right w:val="single" w:color="E3A3A3" w:sz="4"/>
             </w:tcBorders>
             <w:tcMar>
               <w:top w:type="dxa" w:w="60"/>
@@ -3838,10 +3838,10 @@
           <w:tcPr>
             <w:tcW w:type="dxa" w:w="2600"/>
             <w:tcBorders>
-              <w:top w:val="single" w:color="8EA9C8" w:sz="4"/>
-              <w:left w:val="single" w:color="8EA9C8" w:sz="4"/>
-              <w:bottom w:val="single" w:color="8EA9C8" w:sz="4"/>
-              <w:right w:val="single" w:color="8EA9C8" w:sz="4"/>
+              <w:top w:val="single" w:color="E3A3A3" w:sz="4"/>
+              <w:left w:val="single" w:color="E3A3A3" w:sz="4"/>
+              <w:bottom w:val="single" w:color="E3A3A3" w:sz="4"/>
+              <w:right w:val="single" w:color="E3A3A3" w:sz="4"/>
             </w:tcBorders>
             <w:tcMar>
               <w:top w:type="dxa" w:w="60"/>
@@ -3863,10 +3863,10 @@
           <w:tcPr>
             <w:tcW w:type="dxa" w:w="4600"/>
             <w:tcBorders>
-              <w:top w:val="single" w:color="8EA9C8" w:sz="4"/>
-              <w:left w:val="single" w:color="8EA9C8" w:sz="4"/>
-              <w:bottom w:val="single" w:color="8EA9C8" w:sz="4"/>
-              <w:right w:val="single" w:color="8EA9C8" w:sz="4"/>
+              <w:top w:val="single" w:color="E3A3A3" w:sz="4"/>
+              <w:left w:val="single" w:color="E3A3A3" w:sz="4"/>
+              <w:bottom w:val="single" w:color="E3A3A3" w:sz="4"/>
+              <w:right w:val="single" w:color="E3A3A3" w:sz="4"/>
             </w:tcBorders>
             <w:tcMar>
               <w:top w:type="dxa" w:w="60"/>
@@ -3888,10 +3888,10 @@
           <w:tcPr>
             <w:tcW w:type="dxa" w:w="2438"/>
             <w:tcBorders>
-              <w:top w:val="single" w:color="8EA9C8" w:sz="4"/>
-              <w:left w:val="single" w:color="8EA9C8" w:sz="4"/>
-              <w:bottom w:val="single" w:color="8EA9C8" w:sz="4"/>
-              <w:right w:val="single" w:color="8EA9C8" w:sz="4"/>
+              <w:top w:val="single" w:color="E3A3A3" w:sz="4"/>
+              <w:left w:val="single" w:color="E3A3A3" w:sz="4"/>
+              <w:bottom w:val="single" w:color="E3A3A3" w:sz="4"/>
+              <w:right w:val="single" w:color="E3A3A3" w:sz="4"/>
             </w:tcBorders>
             <w:tcMar>
               <w:top w:type="dxa" w:w="60"/>
@@ -3919,9 +3919,9 @@
     <w:p>
       <w:pPr>
         <w:pBdr>
-          <w:left w:val="single" w:color="2E75B6" w:sz="18" w:space="6"/>
+          <w:left w:val="single" w:color="E06666" w:sz="18" w:space="6"/>
         </w:pBdr>
-        <w:shd w:fill="EAF2FC" w:color="auto" w:val="clear"/>
+        <w:shd w:fill="FDECEC" w:color="auto" w:val="clear"/>
         <w:spacing w:after="160" w:before="60"/>
         <w:ind w:left="120"/>
       </w:pPr>
@@ -4114,12 +4114,12 @@
           <w:tcPr>
             <w:tcW w:type="dxa" w:w="3300"/>
             <w:tcBorders>
-              <w:top w:val="single" w:color="8EA9C8" w:sz="4"/>
-              <w:left w:val="single" w:color="8EA9C8" w:sz="4"/>
-              <w:bottom w:val="single" w:color="8EA9C8" w:sz="4"/>
-              <w:right w:val="single" w:color="8EA9C8" w:sz="4"/>
-            </w:tcBorders>
-            <w:shd w:fill="A7C7F2" w:color="auto" w:val="clear"/>
+              <w:top w:val="single" w:color="E3A3A3" w:sz="4"/>
+              <w:left w:val="single" w:color="E3A3A3" w:sz="4"/>
+              <w:bottom w:val="single" w:color="E3A3A3" w:sz="4"/>
+              <w:right w:val="single" w:color="E3A3A3" w:sz="4"/>
+            </w:tcBorders>
+            <w:shd w:fill="F6C1C1" w:color="auto" w:val="clear"/>
             <w:tcMar>
               <w:top w:type="dxa" w:w="60"/>
               <w:left w:type="dxa" w:w="100"/>
@@ -4144,12 +4144,12 @@
           <w:tcPr>
             <w:tcW w:type="dxa" w:w="6338"/>
             <w:tcBorders>
-              <w:top w:val="single" w:color="8EA9C8" w:sz="4"/>
-              <w:left w:val="single" w:color="8EA9C8" w:sz="4"/>
-              <w:bottom w:val="single" w:color="8EA9C8" w:sz="4"/>
-              <w:right w:val="single" w:color="8EA9C8" w:sz="4"/>
-            </w:tcBorders>
-            <w:shd w:fill="A7C7F2" w:color="auto" w:val="clear"/>
+              <w:top w:val="single" w:color="E3A3A3" w:sz="4"/>
+              <w:left w:val="single" w:color="E3A3A3" w:sz="4"/>
+              <w:bottom w:val="single" w:color="E3A3A3" w:sz="4"/>
+              <w:right w:val="single" w:color="E3A3A3" w:sz="4"/>
+            </w:tcBorders>
+            <w:shd w:fill="F6C1C1" w:color="auto" w:val="clear"/>
             <w:tcMar>
               <w:top w:type="dxa" w:w="60"/>
               <w:left w:type="dxa" w:w="100"/>
@@ -4176,10 +4176,10 @@
           <w:tcPr>
             <w:tcW w:type="dxa" w:w="3300"/>
             <w:tcBorders>
-              <w:top w:val="single" w:color="8EA9C8" w:sz="4"/>
-              <w:left w:val="single" w:color="8EA9C8" w:sz="4"/>
-              <w:bottom w:val="single" w:color="8EA9C8" w:sz="4"/>
-              <w:right w:val="single" w:color="8EA9C8" w:sz="4"/>
+              <w:top w:val="single" w:color="E3A3A3" w:sz="4"/>
+              <w:left w:val="single" w:color="E3A3A3" w:sz="4"/>
+              <w:bottom w:val="single" w:color="E3A3A3" w:sz="4"/>
+              <w:right w:val="single" w:color="E3A3A3" w:sz="4"/>
             </w:tcBorders>
             <w:tcMar>
               <w:top w:type="dxa" w:w="60"/>
@@ -4201,10 +4201,10 @@
           <w:tcPr>
             <w:tcW w:type="dxa" w:w="6338"/>
             <w:tcBorders>
-              <w:top w:val="single" w:color="8EA9C8" w:sz="4"/>
-              <w:left w:val="single" w:color="8EA9C8" w:sz="4"/>
-              <w:bottom w:val="single" w:color="8EA9C8" w:sz="4"/>
-              <w:right w:val="single" w:color="8EA9C8" w:sz="4"/>
+              <w:top w:val="single" w:color="E3A3A3" w:sz="4"/>
+              <w:left w:val="single" w:color="E3A3A3" w:sz="4"/>
+              <w:bottom w:val="single" w:color="E3A3A3" w:sz="4"/>
+              <w:right w:val="single" w:color="E3A3A3" w:sz="4"/>
             </w:tcBorders>
             <w:tcMar>
               <w:top w:type="dxa" w:w="60"/>
@@ -4228,10 +4228,10 @@
           <w:tcPr>
             <w:tcW w:type="dxa" w:w="3300"/>
             <w:tcBorders>
-              <w:top w:val="single" w:color="8EA9C8" w:sz="4"/>
-              <w:left w:val="single" w:color="8EA9C8" w:sz="4"/>
-              <w:bottom w:val="single" w:color="8EA9C8" w:sz="4"/>
-              <w:right w:val="single" w:color="8EA9C8" w:sz="4"/>
+              <w:top w:val="single" w:color="E3A3A3" w:sz="4"/>
+              <w:left w:val="single" w:color="E3A3A3" w:sz="4"/>
+              <w:bottom w:val="single" w:color="E3A3A3" w:sz="4"/>
+              <w:right w:val="single" w:color="E3A3A3" w:sz="4"/>
             </w:tcBorders>
             <w:tcMar>
               <w:top w:type="dxa" w:w="60"/>
@@ -4253,10 +4253,10 @@
           <w:tcPr>
             <w:tcW w:type="dxa" w:w="6338"/>
             <w:tcBorders>
-              <w:top w:val="single" w:color="8EA9C8" w:sz="4"/>
-              <w:left w:val="single" w:color="8EA9C8" w:sz="4"/>
-              <w:bottom w:val="single" w:color="8EA9C8" w:sz="4"/>
-              <w:right w:val="single" w:color="8EA9C8" w:sz="4"/>
+              <w:top w:val="single" w:color="E3A3A3" w:sz="4"/>
+              <w:left w:val="single" w:color="E3A3A3" w:sz="4"/>
+              <w:bottom w:val="single" w:color="E3A3A3" w:sz="4"/>
+              <w:right w:val="single" w:color="E3A3A3" w:sz="4"/>
             </w:tcBorders>
             <w:tcMar>
               <w:top w:type="dxa" w:w="60"/>
@@ -4280,10 +4280,10 @@
           <w:tcPr>
             <w:tcW w:type="dxa" w:w="3300"/>
             <w:tcBorders>
-              <w:top w:val="single" w:color="8EA9C8" w:sz="4"/>
-              <w:left w:val="single" w:color="8EA9C8" w:sz="4"/>
-              <w:bottom w:val="single" w:color="8EA9C8" w:sz="4"/>
-              <w:right w:val="single" w:color="8EA9C8" w:sz="4"/>
+              <w:top w:val="single" w:color="E3A3A3" w:sz="4"/>
+              <w:left w:val="single" w:color="E3A3A3" w:sz="4"/>
+              <w:bottom w:val="single" w:color="E3A3A3" w:sz="4"/>
+              <w:right w:val="single" w:color="E3A3A3" w:sz="4"/>
             </w:tcBorders>
             <w:tcMar>
               <w:top w:type="dxa" w:w="60"/>
@@ -4305,10 +4305,10 @@
           <w:tcPr>
             <w:tcW w:type="dxa" w:w="6338"/>
             <w:tcBorders>
-              <w:top w:val="single" w:color="8EA9C8" w:sz="4"/>
-              <w:left w:val="single" w:color="8EA9C8" w:sz="4"/>
-              <w:bottom w:val="single" w:color="8EA9C8" w:sz="4"/>
-              <w:right w:val="single" w:color="8EA9C8" w:sz="4"/>
+              <w:top w:val="single" w:color="E3A3A3" w:sz="4"/>
+              <w:left w:val="single" w:color="E3A3A3" w:sz="4"/>
+              <w:bottom w:val="single" w:color="E3A3A3" w:sz="4"/>
+              <w:right w:val="single" w:color="E3A3A3" w:sz="4"/>
             </w:tcBorders>
             <w:tcMar>
               <w:top w:type="dxa" w:w="60"/>
@@ -4332,10 +4332,10 @@
           <w:tcPr>
             <w:tcW w:type="dxa" w:w="3300"/>
             <w:tcBorders>
-              <w:top w:val="single" w:color="8EA9C8" w:sz="4"/>
-              <w:left w:val="single" w:color="8EA9C8" w:sz="4"/>
-              <w:bottom w:val="single" w:color="8EA9C8" w:sz="4"/>
-              <w:right w:val="single" w:color="8EA9C8" w:sz="4"/>
+              <w:top w:val="single" w:color="E3A3A3" w:sz="4"/>
+              <w:left w:val="single" w:color="E3A3A3" w:sz="4"/>
+              <w:bottom w:val="single" w:color="E3A3A3" w:sz="4"/>
+              <w:right w:val="single" w:color="E3A3A3" w:sz="4"/>
             </w:tcBorders>
             <w:tcMar>
               <w:top w:type="dxa" w:w="60"/>
@@ -4357,10 +4357,10 @@
           <w:tcPr>
             <w:tcW w:type="dxa" w:w="6338"/>
             <w:tcBorders>
-              <w:top w:val="single" w:color="8EA9C8" w:sz="4"/>
-              <w:left w:val="single" w:color="8EA9C8" w:sz="4"/>
-              <w:bottom w:val="single" w:color="8EA9C8" w:sz="4"/>
-              <w:right w:val="single" w:color="8EA9C8" w:sz="4"/>
+              <w:top w:val="single" w:color="E3A3A3" w:sz="4"/>
+              <w:left w:val="single" w:color="E3A3A3" w:sz="4"/>
+              <w:bottom w:val="single" w:color="E3A3A3" w:sz="4"/>
+              <w:right w:val="single" w:color="E3A3A3" w:sz="4"/>
             </w:tcBorders>
             <w:tcMar>
               <w:top w:type="dxa" w:w="60"/>
@@ -4519,12 +4519,12 @@
           <w:tcPr>
             <w:tcW w:type="dxa" w:w="2600"/>
             <w:tcBorders>
-              <w:top w:val="single" w:color="8EA9C8" w:sz="4"/>
-              <w:left w:val="single" w:color="8EA9C8" w:sz="4"/>
-              <w:bottom w:val="single" w:color="8EA9C8" w:sz="4"/>
-              <w:right w:val="single" w:color="8EA9C8" w:sz="4"/>
-            </w:tcBorders>
-            <w:shd w:fill="A7C7F2" w:color="auto" w:val="clear"/>
+              <w:top w:val="single" w:color="E3A3A3" w:sz="4"/>
+              <w:left w:val="single" w:color="E3A3A3" w:sz="4"/>
+              <w:bottom w:val="single" w:color="E3A3A3" w:sz="4"/>
+              <w:right w:val="single" w:color="E3A3A3" w:sz="4"/>
+            </w:tcBorders>
+            <w:shd w:fill="F6C1C1" w:color="auto" w:val="clear"/>
             <w:tcMar>
               <w:top w:type="dxa" w:w="60"/>
               <w:left w:type="dxa" w:w="100"/>
@@ -4549,12 +4549,12 @@
           <w:tcPr>
             <w:tcW w:type="dxa" w:w="7038"/>
             <w:tcBorders>
-              <w:top w:val="single" w:color="8EA9C8" w:sz="4"/>
-              <w:left w:val="single" w:color="8EA9C8" w:sz="4"/>
-              <w:bottom w:val="single" w:color="8EA9C8" w:sz="4"/>
-              <w:right w:val="single" w:color="8EA9C8" w:sz="4"/>
-            </w:tcBorders>
-            <w:shd w:fill="A7C7F2" w:color="auto" w:val="clear"/>
+              <w:top w:val="single" w:color="E3A3A3" w:sz="4"/>
+              <w:left w:val="single" w:color="E3A3A3" w:sz="4"/>
+              <w:bottom w:val="single" w:color="E3A3A3" w:sz="4"/>
+              <w:right w:val="single" w:color="E3A3A3" w:sz="4"/>
+            </w:tcBorders>
+            <w:shd w:fill="F6C1C1" w:color="auto" w:val="clear"/>
             <w:tcMar>
               <w:top w:type="dxa" w:w="60"/>
               <w:left w:type="dxa" w:w="100"/>
@@ -4581,10 +4581,10 @@
           <w:tcPr>
             <w:tcW w:type="dxa" w:w="2600"/>
             <w:tcBorders>
-              <w:top w:val="single" w:color="8EA9C8" w:sz="4"/>
-              <w:left w:val="single" w:color="8EA9C8" w:sz="4"/>
-              <w:bottom w:val="single" w:color="8EA9C8" w:sz="4"/>
-              <w:right w:val="single" w:color="8EA9C8" w:sz="4"/>
+              <w:top w:val="single" w:color="E3A3A3" w:sz="4"/>
+              <w:left w:val="single" w:color="E3A3A3" w:sz="4"/>
+              <w:bottom w:val="single" w:color="E3A3A3" w:sz="4"/>
+              <w:right w:val="single" w:color="E3A3A3" w:sz="4"/>
             </w:tcBorders>
             <w:tcMar>
               <w:top w:type="dxa" w:w="60"/>
@@ -4606,10 +4606,10 @@
           <w:tcPr>
             <w:tcW w:type="dxa" w:w="7038"/>
             <w:tcBorders>
-              <w:top w:val="single" w:color="8EA9C8" w:sz="4"/>
-              <w:left w:val="single" w:color="8EA9C8" w:sz="4"/>
-              <w:bottom w:val="single" w:color="8EA9C8" w:sz="4"/>
-              <w:right w:val="single" w:color="8EA9C8" w:sz="4"/>
+              <w:top w:val="single" w:color="E3A3A3" w:sz="4"/>
+              <w:left w:val="single" w:color="E3A3A3" w:sz="4"/>
+              <w:bottom w:val="single" w:color="E3A3A3" w:sz="4"/>
+              <w:right w:val="single" w:color="E3A3A3" w:sz="4"/>
             </w:tcBorders>
             <w:tcMar>
               <w:top w:type="dxa" w:w="60"/>
@@ -4633,10 +4633,10 @@
           <w:tcPr>
             <w:tcW w:type="dxa" w:w="2600"/>
             <w:tcBorders>
-              <w:top w:val="single" w:color="8EA9C8" w:sz="4"/>
-              <w:left w:val="single" w:color="8EA9C8" w:sz="4"/>
-              <w:bottom w:val="single" w:color="8EA9C8" w:sz="4"/>
-              <w:right w:val="single" w:color="8EA9C8" w:sz="4"/>
+              <w:top w:val="single" w:color="E3A3A3" w:sz="4"/>
+              <w:left w:val="single" w:color="E3A3A3" w:sz="4"/>
+              <w:bottom w:val="single" w:color="E3A3A3" w:sz="4"/>
+              <w:right w:val="single" w:color="E3A3A3" w:sz="4"/>
             </w:tcBorders>
             <w:tcMar>
               <w:top w:type="dxa" w:w="60"/>
@@ -4658,10 +4658,10 @@
           <w:tcPr>
             <w:tcW w:type="dxa" w:w="7038"/>
             <w:tcBorders>
-              <w:top w:val="single" w:color="8EA9C8" w:sz="4"/>
-              <w:left w:val="single" w:color="8EA9C8" w:sz="4"/>
-              <w:bottom w:val="single" w:color="8EA9C8" w:sz="4"/>
-              <w:right w:val="single" w:color="8EA9C8" w:sz="4"/>
+              <w:top w:val="single" w:color="E3A3A3" w:sz="4"/>
+              <w:left w:val="single" w:color="E3A3A3" w:sz="4"/>
+              <w:bottom w:val="single" w:color="E3A3A3" w:sz="4"/>
+              <w:right w:val="single" w:color="E3A3A3" w:sz="4"/>
             </w:tcBorders>
             <w:tcMar>
               <w:top w:type="dxa" w:w="60"/>
@@ -4685,10 +4685,10 @@
           <w:tcPr>
             <w:tcW w:type="dxa" w:w="2600"/>
             <w:tcBorders>
-              <w:top w:val="single" w:color="8EA9C8" w:sz="4"/>
-              <w:left w:val="single" w:color="8EA9C8" w:sz="4"/>
-              <w:bottom w:val="single" w:color="8EA9C8" w:sz="4"/>
-              <w:right w:val="single" w:color="8EA9C8" w:sz="4"/>
+              <w:top w:val="single" w:color="E3A3A3" w:sz="4"/>
+              <w:left w:val="single" w:color="E3A3A3" w:sz="4"/>
+              <w:bottom w:val="single" w:color="E3A3A3" w:sz="4"/>
+              <w:right w:val="single" w:color="E3A3A3" w:sz="4"/>
             </w:tcBorders>
             <w:tcMar>
               <w:top w:type="dxa" w:w="60"/>
@@ -4710,10 +4710,10 @@
           <w:tcPr>
             <w:tcW w:type="dxa" w:w="7038"/>
             <w:tcBorders>
-              <w:top w:val="single" w:color="8EA9C8" w:sz="4"/>
-              <w:left w:val="single" w:color="8EA9C8" w:sz="4"/>
-              <w:bottom w:val="single" w:color="8EA9C8" w:sz="4"/>
-              <w:right w:val="single" w:color="8EA9C8" w:sz="4"/>
+              <w:top w:val="single" w:color="E3A3A3" w:sz="4"/>
+              <w:left w:val="single" w:color="E3A3A3" w:sz="4"/>
+              <w:bottom w:val="single" w:color="E3A3A3" w:sz="4"/>
+              <w:right w:val="single" w:color="E3A3A3" w:sz="4"/>
             </w:tcBorders>
             <w:tcMar>
               <w:top w:type="dxa" w:w="60"/>
@@ -4797,12 +4797,12 @@
           <w:tcPr>
             <w:tcW w:type="dxa" w:w="2700"/>
             <w:tcBorders>
-              <w:top w:val="single" w:color="8EA9C8" w:sz="4"/>
-              <w:left w:val="single" w:color="8EA9C8" w:sz="4"/>
-              <w:bottom w:val="single" w:color="8EA9C8" w:sz="4"/>
-              <w:right w:val="single" w:color="8EA9C8" w:sz="4"/>
-            </w:tcBorders>
-            <w:shd w:fill="A7C7F2" w:color="auto" w:val="clear"/>
+              <w:top w:val="single" w:color="E3A3A3" w:sz="4"/>
+              <w:left w:val="single" w:color="E3A3A3" w:sz="4"/>
+              <w:bottom w:val="single" w:color="E3A3A3" w:sz="4"/>
+              <w:right w:val="single" w:color="E3A3A3" w:sz="4"/>
+            </w:tcBorders>
+            <w:shd w:fill="F6C1C1" w:color="auto" w:val="clear"/>
             <w:tcMar>
               <w:top w:type="dxa" w:w="60"/>
               <w:left w:type="dxa" w:w="100"/>
@@ -4827,12 +4827,12 @@
           <w:tcPr>
             <w:tcW w:type="dxa" w:w="2700"/>
             <w:tcBorders>
-              <w:top w:val="single" w:color="8EA9C8" w:sz="4"/>
-              <w:left w:val="single" w:color="8EA9C8" w:sz="4"/>
-              <w:bottom w:val="single" w:color="8EA9C8" w:sz="4"/>
-              <w:right w:val="single" w:color="8EA9C8" w:sz="4"/>
-            </w:tcBorders>
-            <w:shd w:fill="A7C7F2" w:color="auto" w:val="clear"/>
+              <w:top w:val="single" w:color="E3A3A3" w:sz="4"/>
+              <w:left w:val="single" w:color="E3A3A3" w:sz="4"/>
+              <w:bottom w:val="single" w:color="E3A3A3" w:sz="4"/>
+              <w:right w:val="single" w:color="E3A3A3" w:sz="4"/>
+            </w:tcBorders>
+            <w:shd w:fill="F6C1C1" w:color="auto" w:val="clear"/>
             <w:tcMar>
               <w:top w:type="dxa" w:w="60"/>
               <w:left w:type="dxa" w:w="100"/>
@@ -4857,12 +4857,12 @@
           <w:tcPr>
             <w:tcW w:type="dxa" w:w="4238"/>
             <w:tcBorders>
-              <w:top w:val="single" w:color="8EA9C8" w:sz="4"/>
-              <w:left w:val="single" w:color="8EA9C8" w:sz="4"/>
-              <w:bottom w:val="single" w:color="8EA9C8" w:sz="4"/>
-              <w:right w:val="single" w:color="8EA9C8" w:sz="4"/>
-            </w:tcBorders>
-            <w:shd w:fill="A7C7F2" w:color="auto" w:val="clear"/>
+              <w:top w:val="single" w:color="E3A3A3" w:sz="4"/>
+              <w:left w:val="single" w:color="E3A3A3" w:sz="4"/>
+              <w:bottom w:val="single" w:color="E3A3A3" w:sz="4"/>
+              <w:right w:val="single" w:color="E3A3A3" w:sz="4"/>
+            </w:tcBorders>
+            <w:shd w:fill="F6C1C1" w:color="auto" w:val="clear"/>
             <w:tcMar>
               <w:top w:type="dxa" w:w="60"/>
               <w:left w:type="dxa" w:w="100"/>
@@ -4889,10 +4889,10 @@
           <w:tcPr>
             <w:tcW w:type="dxa" w:w="2700"/>
             <w:tcBorders>
-              <w:top w:val="single" w:color="8EA9C8" w:sz="4"/>
-              <w:left w:val="single" w:color="8EA9C8" w:sz="4"/>
-              <w:bottom w:val="single" w:color="8EA9C8" w:sz="4"/>
-              <w:right w:val="single" w:color="8EA9C8" w:sz="4"/>
+              <w:top w:val="single" w:color="E3A3A3" w:sz="4"/>
+              <w:left w:val="single" w:color="E3A3A3" w:sz="4"/>
+              <w:bottom w:val="single" w:color="E3A3A3" w:sz="4"/>
+              <w:right w:val="single" w:color="E3A3A3" w:sz="4"/>
             </w:tcBorders>
             <w:tcMar>
               <w:top w:type="dxa" w:w="60"/>
@@ -4914,10 +4914,10 @@
           <w:tcPr>
             <w:tcW w:type="dxa" w:w="2700"/>
             <w:tcBorders>
-              <w:top w:val="single" w:color="8EA9C8" w:sz="4"/>
-              <w:left w:val="single" w:color="8EA9C8" w:sz="4"/>
-              <w:bottom w:val="single" w:color="8EA9C8" w:sz="4"/>
-              <w:right w:val="single" w:color="8EA9C8" w:sz="4"/>
+              <w:top w:val="single" w:color="E3A3A3" w:sz="4"/>
+              <w:left w:val="single" w:color="E3A3A3" w:sz="4"/>
+              <w:bottom w:val="single" w:color="E3A3A3" w:sz="4"/>
+              <w:right w:val="single" w:color="E3A3A3" w:sz="4"/>
             </w:tcBorders>
             <w:tcMar>
               <w:top w:type="dxa" w:w="60"/>
@@ -4952,10 +4952,10 @@
           <w:tcPr>
             <w:tcW w:type="dxa" w:w="4238"/>
             <w:tcBorders>
-              <w:top w:val="single" w:color="8EA9C8" w:sz="4"/>
-              <w:left w:val="single" w:color="8EA9C8" w:sz="4"/>
-              <w:bottom w:val="single" w:color="8EA9C8" w:sz="4"/>
-              <w:right w:val="single" w:color="8EA9C8" w:sz="4"/>
+              <w:top w:val="single" w:color="E3A3A3" w:sz="4"/>
+              <w:left w:val="single" w:color="E3A3A3" w:sz="4"/>
+              <w:bottom w:val="single" w:color="E3A3A3" w:sz="4"/>
+              <w:right w:val="single" w:color="E3A3A3" w:sz="4"/>
             </w:tcBorders>
             <w:tcMar>
               <w:top w:type="dxa" w:w="60"/>
@@ -4979,10 +4979,10 @@
           <w:tcPr>
             <w:tcW w:type="dxa" w:w="2700"/>
             <w:tcBorders>
-              <w:top w:val="single" w:color="8EA9C8" w:sz="4"/>
-              <w:left w:val="single" w:color="8EA9C8" w:sz="4"/>
-              <w:bottom w:val="single" w:color="8EA9C8" w:sz="4"/>
-              <w:right w:val="single" w:color="8EA9C8" w:sz="4"/>
+              <w:top w:val="single" w:color="E3A3A3" w:sz="4"/>
+              <w:left w:val="single" w:color="E3A3A3" w:sz="4"/>
+              <w:bottom w:val="single" w:color="E3A3A3" w:sz="4"/>
+              <w:right w:val="single" w:color="E3A3A3" w:sz="4"/>
             </w:tcBorders>
             <w:tcMar>
               <w:top w:type="dxa" w:w="60"/>
@@ -5004,10 +5004,10 @@
           <w:tcPr>
             <w:tcW w:type="dxa" w:w="2700"/>
             <w:tcBorders>
-              <w:top w:val="single" w:color="8EA9C8" w:sz="4"/>
-              <w:left w:val="single" w:color="8EA9C8" w:sz="4"/>
-              <w:bottom w:val="single" w:color="8EA9C8" w:sz="4"/>
-              <w:right w:val="single" w:color="8EA9C8" w:sz="4"/>
+              <w:top w:val="single" w:color="E3A3A3" w:sz="4"/>
+              <w:left w:val="single" w:color="E3A3A3" w:sz="4"/>
+              <w:bottom w:val="single" w:color="E3A3A3" w:sz="4"/>
+              <w:right w:val="single" w:color="E3A3A3" w:sz="4"/>
             </w:tcBorders>
             <w:tcMar>
               <w:top w:type="dxa" w:w="60"/>
@@ -5042,10 +5042,10 @@
           <w:tcPr>
             <w:tcW w:type="dxa" w:w="4238"/>
             <w:tcBorders>
-              <w:top w:val="single" w:color="8EA9C8" w:sz="4"/>
-              <w:left w:val="single" w:color="8EA9C8" w:sz="4"/>
-              <w:bottom w:val="single" w:color="8EA9C8" w:sz="4"/>
-              <w:right w:val="single" w:color="8EA9C8" w:sz="4"/>
+              <w:top w:val="single" w:color="E3A3A3" w:sz="4"/>
+              <w:left w:val="single" w:color="E3A3A3" w:sz="4"/>
+              <w:bottom w:val="single" w:color="E3A3A3" w:sz="4"/>
+              <w:right w:val="single" w:color="E3A3A3" w:sz="4"/>
             </w:tcBorders>
             <w:tcMar>
               <w:top w:type="dxa" w:w="60"/>
@@ -5069,10 +5069,10 @@
           <w:tcPr>
             <w:tcW w:type="dxa" w:w="2700"/>
             <w:tcBorders>
-              <w:top w:val="single" w:color="8EA9C8" w:sz="4"/>
-              <w:left w:val="single" w:color="8EA9C8" w:sz="4"/>
-              <w:bottom w:val="single" w:color="8EA9C8" w:sz="4"/>
-              <w:right w:val="single" w:color="8EA9C8" w:sz="4"/>
+              <w:top w:val="single" w:color="E3A3A3" w:sz="4"/>
+              <w:left w:val="single" w:color="E3A3A3" w:sz="4"/>
+              <w:bottom w:val="single" w:color="E3A3A3" w:sz="4"/>
+              <w:right w:val="single" w:color="E3A3A3" w:sz="4"/>
             </w:tcBorders>
             <w:tcMar>
               <w:top w:type="dxa" w:w="60"/>
@@ -5094,10 +5094,10 @@
           <w:tcPr>
             <w:tcW w:type="dxa" w:w="2700"/>
             <w:tcBorders>
-              <w:top w:val="single" w:color="8EA9C8" w:sz="4"/>
-              <w:left w:val="single" w:color="8EA9C8" w:sz="4"/>
-              <w:bottom w:val="single" w:color="8EA9C8" w:sz="4"/>
-              <w:right w:val="single" w:color="8EA9C8" w:sz="4"/>
+              <w:top w:val="single" w:color="E3A3A3" w:sz="4"/>
+              <w:left w:val="single" w:color="E3A3A3" w:sz="4"/>
+              <w:bottom w:val="single" w:color="E3A3A3" w:sz="4"/>
+              <w:right w:val="single" w:color="E3A3A3" w:sz="4"/>
             </w:tcBorders>
             <w:tcMar>
               <w:top w:type="dxa" w:w="60"/>
@@ -5132,10 +5132,10 @@
           <w:tcPr>
             <w:tcW w:type="dxa" w:w="4238"/>
             <w:tcBorders>
-              <w:top w:val="single" w:color="8EA9C8" w:sz="4"/>
-              <w:left w:val="single" w:color="8EA9C8" w:sz="4"/>
-              <w:bottom w:val="single" w:color="8EA9C8" w:sz="4"/>
-              <w:right w:val="single" w:color="8EA9C8" w:sz="4"/>
+              <w:top w:val="single" w:color="E3A3A3" w:sz="4"/>
+              <w:left w:val="single" w:color="E3A3A3" w:sz="4"/>
+              <w:bottom w:val="single" w:color="E3A3A3" w:sz="4"/>
+              <w:right w:val="single" w:color="E3A3A3" w:sz="4"/>
             </w:tcBorders>
             <w:tcMar>
               <w:top w:type="dxa" w:w="60"/>
@@ -5163,9 +5163,9 @@
     <w:p>
       <w:pPr>
         <w:pBdr>
-          <w:left w:val="single" w:color="2E75B6" w:sz="18" w:space="6"/>
+          <w:left w:val="single" w:color="E06666" w:sz="18" w:space="6"/>
         </w:pBdr>
-        <w:shd w:fill="EAF2FC" w:color="auto" w:val="clear"/>
+        <w:shd w:fill="FDECEC" w:color="auto" w:val="clear"/>
         <w:spacing w:after="160" w:before="60"/>
         <w:ind w:left="120"/>
       </w:pPr>
@@ -5241,12 +5241,12 @@
           <w:tcPr>
             <w:tcW w:type="dxa" w:w="2000"/>
             <w:tcBorders>
-              <w:top w:val="single" w:color="8EA9C8" w:sz="4"/>
-              <w:left w:val="single" w:color="8EA9C8" w:sz="4"/>
-              <w:bottom w:val="single" w:color="8EA9C8" w:sz="4"/>
-              <w:right w:val="single" w:color="8EA9C8" w:sz="4"/>
-            </w:tcBorders>
-            <w:shd w:fill="A7C7F2" w:color="auto" w:val="clear"/>
+              <w:top w:val="single" w:color="E3A3A3" w:sz="4"/>
+              <w:left w:val="single" w:color="E3A3A3" w:sz="4"/>
+              <w:bottom w:val="single" w:color="E3A3A3" w:sz="4"/>
+              <w:right w:val="single" w:color="E3A3A3" w:sz="4"/>
+            </w:tcBorders>
+            <w:shd w:fill="F6C1C1" w:color="auto" w:val="clear"/>
             <w:tcMar>
               <w:top w:type="dxa" w:w="60"/>
               <w:left w:type="dxa" w:w="100"/>
@@ -5271,12 +5271,12 @@
           <w:tcPr>
             <w:tcW w:type="dxa" w:w="3600"/>
             <w:tcBorders>
-              <w:top w:val="single" w:color="8EA9C8" w:sz="4"/>
-              <w:left w:val="single" w:color="8EA9C8" w:sz="4"/>
-              <w:bottom w:val="single" w:color="8EA9C8" w:sz="4"/>
-              <w:right w:val="single" w:color="8EA9C8" w:sz="4"/>
-            </w:tcBorders>
-            <w:shd w:fill="A7C7F2" w:color="auto" w:val="clear"/>
+              <w:top w:val="single" w:color="E3A3A3" w:sz="4"/>
+              <w:left w:val="single" w:color="E3A3A3" w:sz="4"/>
+              <w:bottom w:val="single" w:color="E3A3A3" w:sz="4"/>
+              <w:right w:val="single" w:color="E3A3A3" w:sz="4"/>
+            </w:tcBorders>
+            <w:shd w:fill="F6C1C1" w:color="auto" w:val="clear"/>
             <w:tcMar>
               <w:top w:type="dxa" w:w="60"/>
               <w:left w:type="dxa" w:w="100"/>
@@ -5301,12 +5301,12 @@
           <w:tcPr>
             <w:tcW w:type="dxa" w:w="4038"/>
             <w:tcBorders>
-              <w:top w:val="single" w:color="8EA9C8" w:sz="4"/>
-              <w:left w:val="single" w:color="8EA9C8" w:sz="4"/>
-              <w:bottom w:val="single" w:color="8EA9C8" w:sz="4"/>
-              <w:right w:val="single" w:color="8EA9C8" w:sz="4"/>
-            </w:tcBorders>
-            <w:shd w:fill="A7C7F2" w:color="auto" w:val="clear"/>
+              <w:top w:val="single" w:color="E3A3A3" w:sz="4"/>
+              <w:left w:val="single" w:color="E3A3A3" w:sz="4"/>
+              <w:bottom w:val="single" w:color="E3A3A3" w:sz="4"/>
+              <w:right w:val="single" w:color="E3A3A3" w:sz="4"/>
+            </w:tcBorders>
+            <w:shd w:fill="F6C1C1" w:color="auto" w:val="clear"/>
             <w:tcMar>
               <w:top w:type="dxa" w:w="60"/>
               <w:left w:type="dxa" w:w="100"/>
@@ -5333,10 +5333,10 @@
           <w:tcPr>
             <w:tcW w:type="dxa" w:w="2000"/>
             <w:tcBorders>
-              <w:top w:val="single" w:color="8EA9C8" w:sz="4"/>
-              <w:left w:val="single" w:color="8EA9C8" w:sz="4"/>
-              <w:bottom w:val="single" w:color="8EA9C8" w:sz="4"/>
-              <w:right w:val="single" w:color="8EA9C8" w:sz="4"/>
+              <w:top w:val="single" w:color="E3A3A3" w:sz="4"/>
+              <w:left w:val="single" w:color="E3A3A3" w:sz="4"/>
+              <w:bottom w:val="single" w:color="E3A3A3" w:sz="4"/>
+              <w:right w:val="single" w:color="E3A3A3" w:sz="4"/>
             </w:tcBorders>
             <w:tcMar>
               <w:top w:type="dxa" w:w="60"/>
@@ -5358,10 +5358,10 @@
           <w:tcPr>
             <w:tcW w:type="dxa" w:w="3600"/>
             <w:tcBorders>
-              <w:top w:val="single" w:color="8EA9C8" w:sz="4"/>
-              <w:left w:val="single" w:color="8EA9C8" w:sz="4"/>
-              <w:bottom w:val="single" w:color="8EA9C8" w:sz="4"/>
-              <w:right w:val="single" w:color="8EA9C8" w:sz="4"/>
+              <w:top w:val="single" w:color="E3A3A3" w:sz="4"/>
+              <w:left w:val="single" w:color="E3A3A3" w:sz="4"/>
+              <w:bottom w:val="single" w:color="E3A3A3" w:sz="4"/>
+              <w:right w:val="single" w:color="E3A3A3" w:sz="4"/>
             </w:tcBorders>
             <w:tcMar>
               <w:top w:type="dxa" w:w="60"/>
@@ -5388,10 +5388,10 @@
           <w:tcPr>
             <w:tcW w:type="dxa" w:w="4038"/>
             <w:tcBorders>
-              <w:top w:val="single" w:color="8EA9C8" w:sz="4"/>
-              <w:left w:val="single" w:color="8EA9C8" w:sz="4"/>
-              <w:bottom w:val="single" w:color="8EA9C8" w:sz="4"/>
-              <w:right w:val="single" w:color="8EA9C8" w:sz="4"/>
+              <w:top w:val="single" w:color="E3A3A3" w:sz="4"/>
+              <w:left w:val="single" w:color="E3A3A3" w:sz="4"/>
+              <w:bottom w:val="single" w:color="E3A3A3" w:sz="4"/>
+              <w:right w:val="single" w:color="E3A3A3" w:sz="4"/>
             </w:tcBorders>
             <w:tcMar>
               <w:top w:type="dxa" w:w="60"/>
@@ -5415,10 +5415,10 @@
           <w:tcPr>
             <w:tcW w:type="dxa" w:w="2000"/>
             <w:tcBorders>
-              <w:top w:val="single" w:color="8EA9C8" w:sz="4"/>
-              <w:left w:val="single" w:color="8EA9C8" w:sz="4"/>
-              <w:bottom w:val="single" w:color="8EA9C8" w:sz="4"/>
-              <w:right w:val="single" w:color="8EA9C8" w:sz="4"/>
+              <w:top w:val="single" w:color="E3A3A3" w:sz="4"/>
+              <w:left w:val="single" w:color="E3A3A3" w:sz="4"/>
+              <w:bottom w:val="single" w:color="E3A3A3" w:sz="4"/>
+              <w:right w:val="single" w:color="E3A3A3" w:sz="4"/>
             </w:tcBorders>
             <w:tcMar>
               <w:top w:type="dxa" w:w="60"/>
@@ -5440,10 +5440,10 @@
           <w:tcPr>
             <w:tcW w:type="dxa" w:w="3600"/>
             <w:tcBorders>
-              <w:top w:val="single" w:color="8EA9C8" w:sz="4"/>
-              <w:left w:val="single" w:color="8EA9C8" w:sz="4"/>
-              <w:bottom w:val="single" w:color="8EA9C8" w:sz="4"/>
-              <w:right w:val="single" w:color="8EA9C8" w:sz="4"/>
+              <w:top w:val="single" w:color="E3A3A3" w:sz="4"/>
+              <w:left w:val="single" w:color="E3A3A3" w:sz="4"/>
+              <w:bottom w:val="single" w:color="E3A3A3" w:sz="4"/>
+              <w:right w:val="single" w:color="E3A3A3" w:sz="4"/>
             </w:tcBorders>
             <w:tcMar>
               <w:top w:type="dxa" w:w="60"/>
@@ -5470,10 +5470,10 @@
           <w:tcPr>
             <w:tcW w:type="dxa" w:w="4038"/>
             <w:tcBorders>
-              <w:top w:val="single" w:color="8EA9C8" w:sz="4"/>
-              <w:left w:val="single" w:color="8EA9C8" w:sz="4"/>
-              <w:bottom w:val="single" w:color="8EA9C8" w:sz="4"/>
-              <w:right w:val="single" w:color="8EA9C8" w:sz="4"/>
+              <w:top w:val="single" w:color="E3A3A3" w:sz="4"/>
+              <w:left w:val="single" w:color="E3A3A3" w:sz="4"/>
+              <w:bottom w:val="single" w:color="E3A3A3" w:sz="4"/>
+              <w:right w:val="single" w:color="E3A3A3" w:sz="4"/>
             </w:tcBorders>
             <w:tcMar>
               <w:top w:type="dxa" w:w="60"/>
@@ -5682,12 +5682,12 @@
           <w:tcPr>
             <w:tcW w:type="dxa" w:w="5000"/>
             <w:tcBorders>
-              <w:top w:val="single" w:color="8EA9C8" w:sz="4"/>
-              <w:left w:val="single" w:color="8EA9C8" w:sz="4"/>
-              <w:bottom w:val="single" w:color="8EA9C8" w:sz="4"/>
-              <w:right w:val="single" w:color="8EA9C8" w:sz="4"/>
-            </w:tcBorders>
-            <w:shd w:fill="A7C7F2" w:color="auto" w:val="clear"/>
+              <w:top w:val="single" w:color="E3A3A3" w:sz="4"/>
+              <w:left w:val="single" w:color="E3A3A3" w:sz="4"/>
+              <w:bottom w:val="single" w:color="E3A3A3" w:sz="4"/>
+              <w:right w:val="single" w:color="E3A3A3" w:sz="4"/>
+            </w:tcBorders>
+            <w:shd w:fill="F6C1C1" w:color="auto" w:val="clear"/>
             <w:tcMar>
               <w:top w:type="dxa" w:w="60"/>
               <w:left w:type="dxa" w:w="100"/>
@@ -5712,12 +5712,12 @@
           <w:tcPr>
             <w:tcW w:type="dxa" w:w="4638"/>
             <w:tcBorders>
-              <w:top w:val="single" w:color="8EA9C8" w:sz="4"/>
-              <w:left w:val="single" w:color="8EA9C8" w:sz="4"/>
-              <w:bottom w:val="single" w:color="8EA9C8" w:sz="4"/>
-              <w:right w:val="single" w:color="8EA9C8" w:sz="4"/>
-            </w:tcBorders>
-            <w:shd w:fill="A7C7F2" w:color="auto" w:val="clear"/>
+              <w:top w:val="single" w:color="E3A3A3" w:sz="4"/>
+              <w:left w:val="single" w:color="E3A3A3" w:sz="4"/>
+              <w:bottom w:val="single" w:color="E3A3A3" w:sz="4"/>
+              <w:right w:val="single" w:color="E3A3A3" w:sz="4"/>
+            </w:tcBorders>
+            <w:shd w:fill="F6C1C1" w:color="auto" w:val="clear"/>
             <w:tcMar>
               <w:top w:type="dxa" w:w="60"/>
               <w:left w:type="dxa" w:w="100"/>
@@ -5744,10 +5744,10 @@
           <w:tcPr>
             <w:tcW w:type="dxa" w:w="5000"/>
             <w:tcBorders>
-              <w:top w:val="single" w:color="8EA9C8" w:sz="4"/>
-              <w:left w:val="single" w:color="8EA9C8" w:sz="4"/>
-              <w:bottom w:val="single" w:color="8EA9C8" w:sz="4"/>
-              <w:right w:val="single" w:color="8EA9C8" w:sz="4"/>
+              <w:top w:val="single" w:color="E3A3A3" w:sz="4"/>
+              <w:left w:val="single" w:color="E3A3A3" w:sz="4"/>
+              <w:bottom w:val="single" w:color="E3A3A3" w:sz="4"/>
+              <w:right w:val="single" w:color="E3A3A3" w:sz="4"/>
             </w:tcBorders>
             <w:tcMar>
               <w:top w:type="dxa" w:w="60"/>
@@ -5769,10 +5769,10 @@
           <w:tcPr>
             <w:tcW w:type="dxa" w:w="4638"/>
             <w:tcBorders>
-              <w:top w:val="single" w:color="8EA9C8" w:sz="4"/>
-              <w:left w:val="single" w:color="8EA9C8" w:sz="4"/>
-              <w:bottom w:val="single" w:color="8EA9C8" w:sz="4"/>
-              <w:right w:val="single" w:color="8EA9C8" w:sz="4"/>
+              <w:top w:val="single" w:color="E3A3A3" w:sz="4"/>
+              <w:left w:val="single" w:color="E3A3A3" w:sz="4"/>
+              <w:bottom w:val="single" w:color="E3A3A3" w:sz="4"/>
+              <w:right w:val="single" w:color="E3A3A3" w:sz="4"/>
             </w:tcBorders>
             <w:tcMar>
               <w:top w:type="dxa" w:w="60"/>
@@ -5796,10 +5796,10 @@
           <w:tcPr>
             <w:tcW w:type="dxa" w:w="5000"/>
             <w:tcBorders>
-              <w:top w:val="single" w:color="8EA9C8" w:sz="4"/>
-              <w:left w:val="single" w:color="8EA9C8" w:sz="4"/>
-              <w:bottom w:val="single" w:color="8EA9C8" w:sz="4"/>
-              <w:right w:val="single" w:color="8EA9C8" w:sz="4"/>
+              <w:top w:val="single" w:color="E3A3A3" w:sz="4"/>
+              <w:left w:val="single" w:color="E3A3A3" w:sz="4"/>
+              <w:bottom w:val="single" w:color="E3A3A3" w:sz="4"/>
+              <w:right w:val="single" w:color="E3A3A3" w:sz="4"/>
             </w:tcBorders>
             <w:tcMar>
               <w:top w:type="dxa" w:w="60"/>
@@ -5821,10 +5821,10 @@
           <w:tcPr>
             <w:tcW w:type="dxa" w:w="4638"/>
             <w:tcBorders>
-              <w:top w:val="single" w:color="8EA9C8" w:sz="4"/>
-              <w:left w:val="single" w:color="8EA9C8" w:sz="4"/>
-              <w:bottom w:val="single" w:color="8EA9C8" w:sz="4"/>
-              <w:right w:val="single" w:color="8EA9C8" w:sz="4"/>
+              <w:top w:val="single" w:color="E3A3A3" w:sz="4"/>
+              <w:left w:val="single" w:color="E3A3A3" w:sz="4"/>
+              <w:bottom w:val="single" w:color="E3A3A3" w:sz="4"/>
+              <w:right w:val="single" w:color="E3A3A3" w:sz="4"/>
             </w:tcBorders>
             <w:tcMar>
               <w:top w:type="dxa" w:w="60"/>
@@ -5848,10 +5848,10 @@
           <w:tcPr>
             <w:tcW w:type="dxa" w:w="5000"/>
             <w:tcBorders>
-              <w:top w:val="single" w:color="8EA9C8" w:sz="4"/>
-              <w:left w:val="single" w:color="8EA9C8" w:sz="4"/>
-              <w:bottom w:val="single" w:color="8EA9C8" w:sz="4"/>
-              <w:right w:val="single" w:color="8EA9C8" w:sz="4"/>
+              <w:top w:val="single" w:color="E3A3A3" w:sz="4"/>
+              <w:left w:val="single" w:color="E3A3A3" w:sz="4"/>
+              <w:bottom w:val="single" w:color="E3A3A3" w:sz="4"/>
+              <w:right w:val="single" w:color="E3A3A3" w:sz="4"/>
             </w:tcBorders>
             <w:tcMar>
               <w:top w:type="dxa" w:w="60"/>
@@ -5873,10 +5873,10 @@
           <w:tcPr>
             <w:tcW w:type="dxa" w:w="4638"/>
             <w:tcBorders>
-              <w:top w:val="single" w:color="8EA9C8" w:sz="4"/>
-              <w:left w:val="single" w:color="8EA9C8" w:sz="4"/>
-              <w:bottom w:val="single" w:color="8EA9C8" w:sz="4"/>
-              <w:right w:val="single" w:color="8EA9C8" w:sz="4"/>
+              <w:top w:val="single" w:color="E3A3A3" w:sz="4"/>
+              <w:left w:val="single" w:color="E3A3A3" w:sz="4"/>
+              <w:bottom w:val="single" w:color="E3A3A3" w:sz="4"/>
+              <w:right w:val="single" w:color="E3A3A3" w:sz="4"/>
             </w:tcBorders>
             <w:tcMar>
               <w:top w:type="dxa" w:w="60"/>
@@ -5900,10 +5900,10 @@
           <w:tcPr>
             <w:tcW w:type="dxa" w:w="5000"/>
             <w:tcBorders>
-              <w:top w:val="single" w:color="8EA9C8" w:sz="4"/>
-              <w:left w:val="single" w:color="8EA9C8" w:sz="4"/>
-              <w:bottom w:val="single" w:color="8EA9C8" w:sz="4"/>
-              <w:right w:val="single" w:color="8EA9C8" w:sz="4"/>
+              <w:top w:val="single" w:color="E3A3A3" w:sz="4"/>
+              <w:left w:val="single" w:color="E3A3A3" w:sz="4"/>
+              <w:bottom w:val="single" w:color="E3A3A3" w:sz="4"/>
+              <w:right w:val="single" w:color="E3A3A3" w:sz="4"/>
             </w:tcBorders>
             <w:tcMar>
               <w:top w:type="dxa" w:w="60"/>
@@ -5925,10 +5925,10 @@
           <w:tcPr>
             <w:tcW w:type="dxa" w:w="4638"/>
             <w:tcBorders>
-              <w:top w:val="single" w:color="8EA9C8" w:sz="4"/>
-              <w:left w:val="single" w:color="8EA9C8" w:sz="4"/>
-              <w:bottom w:val="single" w:color="8EA9C8" w:sz="4"/>
-              <w:right w:val="single" w:color="8EA9C8" w:sz="4"/>
+              <w:top w:val="single" w:color="E3A3A3" w:sz="4"/>
+              <w:left w:val="single" w:color="E3A3A3" w:sz="4"/>
+              <w:bottom w:val="single" w:color="E3A3A3" w:sz="4"/>
+              <w:right w:val="single" w:color="E3A3A3" w:sz="4"/>
             </w:tcBorders>
             <w:tcMar>
               <w:top w:type="dxa" w:w="60"/>
@@ -5952,10 +5952,10 @@
           <w:tcPr>
             <w:tcW w:type="dxa" w:w="5000"/>
             <w:tcBorders>
-              <w:top w:val="single" w:color="8EA9C8" w:sz="4"/>
-              <w:left w:val="single" w:color="8EA9C8" w:sz="4"/>
-              <w:bottom w:val="single" w:color="8EA9C8" w:sz="4"/>
-              <w:right w:val="single" w:color="8EA9C8" w:sz="4"/>
+              <w:top w:val="single" w:color="E3A3A3" w:sz="4"/>
+              <w:left w:val="single" w:color="E3A3A3" w:sz="4"/>
+              <w:bottom w:val="single" w:color="E3A3A3" w:sz="4"/>
+              <w:right w:val="single" w:color="E3A3A3" w:sz="4"/>
             </w:tcBorders>
             <w:tcMar>
               <w:top w:type="dxa" w:w="60"/>
@@ -5977,10 +5977,10 @@
           <w:tcPr>
             <w:tcW w:type="dxa" w:w="4638"/>
             <w:tcBorders>
-              <w:top w:val="single" w:color="8EA9C8" w:sz="4"/>
-              <w:left w:val="single" w:color="8EA9C8" w:sz="4"/>
-              <w:bottom w:val="single" w:color="8EA9C8" w:sz="4"/>
-              <w:right w:val="single" w:color="8EA9C8" w:sz="4"/>
+              <w:top w:val="single" w:color="E3A3A3" w:sz="4"/>
+              <w:left w:val="single" w:color="E3A3A3" w:sz="4"/>
+              <w:bottom w:val="single" w:color="E3A3A3" w:sz="4"/>
+              <w:right w:val="single" w:color="E3A3A3" w:sz="4"/>
             </w:tcBorders>
             <w:tcMar>
               <w:top w:type="dxa" w:w="60"/>
@@ -6004,10 +6004,10 @@
           <w:tcPr>
             <w:tcW w:type="dxa" w:w="5000"/>
             <w:tcBorders>
-              <w:top w:val="single" w:color="8EA9C8" w:sz="4"/>
-              <w:left w:val="single" w:color="8EA9C8" w:sz="4"/>
-              <w:bottom w:val="single" w:color="8EA9C8" w:sz="4"/>
-              <w:right w:val="single" w:color="8EA9C8" w:sz="4"/>
+              <w:top w:val="single" w:color="E3A3A3" w:sz="4"/>
+              <w:left w:val="single" w:color="E3A3A3" w:sz="4"/>
+              <w:bottom w:val="single" w:color="E3A3A3" w:sz="4"/>
+              <w:right w:val="single" w:color="E3A3A3" w:sz="4"/>
             </w:tcBorders>
             <w:tcMar>
               <w:top w:type="dxa" w:w="60"/>
@@ -6029,10 +6029,10 @@
           <w:tcPr>
             <w:tcW w:type="dxa" w:w="4638"/>
             <w:tcBorders>
-              <w:top w:val="single" w:color="8EA9C8" w:sz="4"/>
-              <w:left w:val="single" w:color="8EA9C8" w:sz="4"/>
-              <w:bottom w:val="single" w:color="8EA9C8" w:sz="4"/>
-              <w:right w:val="single" w:color="8EA9C8" w:sz="4"/>
+              <w:top w:val="single" w:color="E3A3A3" w:sz="4"/>
+              <w:left w:val="single" w:color="E3A3A3" w:sz="4"/>
+              <w:bottom w:val="single" w:color="E3A3A3" w:sz="4"/>
+              <w:right w:val="single" w:color="E3A3A3" w:sz="4"/>
             </w:tcBorders>
             <w:tcMar>
               <w:top w:type="dxa" w:w="60"/>
@@ -6056,10 +6056,10 @@
           <w:tcPr>
             <w:tcW w:type="dxa" w:w="5000"/>
             <w:tcBorders>
-              <w:top w:val="single" w:color="8EA9C8" w:sz="4"/>
-              <w:left w:val="single" w:color="8EA9C8" w:sz="4"/>
-              <w:bottom w:val="single" w:color="8EA9C8" w:sz="4"/>
-              <w:right w:val="single" w:color="8EA9C8" w:sz="4"/>
+              <w:top w:val="single" w:color="E3A3A3" w:sz="4"/>
+              <w:left w:val="single" w:color="E3A3A3" w:sz="4"/>
+              <w:bottom w:val="single" w:color="E3A3A3" w:sz="4"/>
+              <w:right w:val="single" w:color="E3A3A3" w:sz="4"/>
             </w:tcBorders>
             <w:tcMar>
               <w:top w:type="dxa" w:w="60"/>
@@ -6081,10 +6081,10 @@
           <w:tcPr>
             <w:tcW w:type="dxa" w:w="4638"/>
             <w:tcBorders>
-              <w:top w:val="single" w:color="8EA9C8" w:sz="4"/>
-              <w:left w:val="single" w:color="8EA9C8" w:sz="4"/>
-              <w:bottom w:val="single" w:color="8EA9C8" w:sz="4"/>
-              <w:right w:val="single" w:color="8EA9C8" w:sz="4"/>
+              <w:top w:val="single" w:color="E3A3A3" w:sz="4"/>
+              <w:left w:val="single" w:color="E3A3A3" w:sz="4"/>
+              <w:bottom w:val="single" w:color="E3A3A3" w:sz="4"/>
+              <w:right w:val="single" w:color="E3A3A3" w:sz="4"/>
             </w:tcBorders>
             <w:tcMar>
               <w:top w:type="dxa" w:w="60"/>
@@ -6108,10 +6108,10 @@
           <w:tcPr>
             <w:tcW w:type="dxa" w:w="5000"/>
             <w:tcBorders>
-              <w:top w:val="single" w:color="8EA9C8" w:sz="4"/>
-              <w:left w:val="single" w:color="8EA9C8" w:sz="4"/>
-              <w:bottom w:val="single" w:color="8EA9C8" w:sz="4"/>
-              <w:right w:val="single" w:color="8EA9C8" w:sz="4"/>
+              <w:top w:val="single" w:color="E3A3A3" w:sz="4"/>
+              <w:left w:val="single" w:color="E3A3A3" w:sz="4"/>
+              <w:bottom w:val="single" w:color="E3A3A3" w:sz="4"/>
+              <w:right w:val="single" w:color="E3A3A3" w:sz="4"/>
             </w:tcBorders>
             <w:tcMar>
               <w:top w:type="dxa" w:w="60"/>
@@ -6133,10 +6133,10 @@
           <w:tcPr>
             <w:tcW w:type="dxa" w:w="4638"/>
             <w:tcBorders>
-              <w:top w:val="single" w:color="8EA9C8" w:sz="4"/>
-              <w:left w:val="single" w:color="8EA9C8" w:sz="4"/>
-              <w:bottom w:val="single" w:color="8EA9C8" w:sz="4"/>
-              <w:right w:val="single" w:color="8EA9C8" w:sz="4"/>
+              <w:top w:val="single" w:color="E3A3A3" w:sz="4"/>
+              <w:left w:val="single" w:color="E3A3A3" w:sz="4"/>
+              <w:bottom w:val="single" w:color="E3A3A3" w:sz="4"/>
+              <w:right w:val="single" w:color="E3A3A3" w:sz="4"/>
             </w:tcBorders>
             <w:tcMar>
               <w:top w:type="dxa" w:w="60"/>
@@ -6160,10 +6160,10 @@
           <w:tcPr>
             <w:tcW w:type="dxa" w:w="5000"/>
             <w:tcBorders>
-              <w:top w:val="single" w:color="8EA9C8" w:sz="4"/>
-              <w:left w:val="single" w:color="8EA9C8" w:sz="4"/>
-              <w:bottom w:val="single" w:color="8EA9C8" w:sz="4"/>
-              <w:right w:val="single" w:color="8EA9C8" w:sz="4"/>
+              <w:top w:val="single" w:color="E3A3A3" w:sz="4"/>
+              <w:left w:val="single" w:color="E3A3A3" w:sz="4"/>
+              <w:bottom w:val="single" w:color="E3A3A3" w:sz="4"/>
+              <w:right w:val="single" w:color="E3A3A3" w:sz="4"/>
             </w:tcBorders>
             <w:tcMar>
               <w:top w:type="dxa" w:w="60"/>
@@ -6185,10 +6185,10 @@
           <w:tcPr>
             <w:tcW w:type="dxa" w:w="4638"/>
             <w:tcBorders>
-              <w:top w:val="single" w:color="8EA9C8" w:sz="4"/>
-              <w:left w:val="single" w:color="8EA9C8" w:sz="4"/>
-              <w:bottom w:val="single" w:color="8EA9C8" w:sz="4"/>
-              <w:right w:val="single" w:color="8EA9C8" w:sz="4"/>
+              <w:top w:val="single" w:color="E3A3A3" w:sz="4"/>
+              <w:left w:val="single" w:color="E3A3A3" w:sz="4"/>
+              <w:bottom w:val="single" w:color="E3A3A3" w:sz="4"/>
+              <w:right w:val="single" w:color="E3A3A3" w:sz="4"/>
             </w:tcBorders>
             <w:tcMar>
               <w:top w:type="dxa" w:w="60"/>
@@ -6212,10 +6212,10 @@
           <w:tcPr>
             <w:tcW w:type="dxa" w:w="5000"/>
             <w:tcBorders>
-              <w:top w:val="single" w:color="8EA9C8" w:sz="4"/>
-              <w:left w:val="single" w:color="8EA9C8" w:sz="4"/>
-              <w:bottom w:val="single" w:color="8EA9C8" w:sz="4"/>
-              <w:right w:val="single" w:color="8EA9C8" w:sz="4"/>
+              <w:top w:val="single" w:color="E3A3A3" w:sz="4"/>
+              <w:left w:val="single" w:color="E3A3A3" w:sz="4"/>
+              <w:bottom w:val="single" w:color="E3A3A3" w:sz="4"/>
+              <w:right w:val="single" w:color="E3A3A3" w:sz="4"/>
             </w:tcBorders>
             <w:tcMar>
               <w:top w:type="dxa" w:w="60"/>
@@ -6237,10 +6237,10 @@
           <w:tcPr>
             <w:tcW w:type="dxa" w:w="4638"/>
             <w:tcBorders>
-              <w:top w:val="single" w:color="8EA9C8" w:sz="4"/>
-              <w:left w:val="single" w:color="8EA9C8" w:sz="4"/>
-              <w:bottom w:val="single" w:color="8EA9C8" w:sz="4"/>
-              <w:right w:val="single" w:color="8EA9C8" w:sz="4"/>
+              <w:top w:val="single" w:color="E3A3A3" w:sz="4"/>
+              <w:left w:val="single" w:color="E3A3A3" w:sz="4"/>
+              <w:bottom w:val="single" w:color="E3A3A3" w:sz="4"/>
+              <w:right w:val="single" w:color="E3A3A3" w:sz="4"/>
             </w:tcBorders>
             <w:tcMar>
               <w:top w:type="dxa" w:w="60"/>
@@ -6264,10 +6264,10 @@
           <w:tcPr>
             <w:tcW w:type="dxa" w:w="5000"/>
             <w:tcBorders>
-              <w:top w:val="single" w:color="8EA9C8" w:sz="4"/>
-              <w:left w:val="single" w:color="8EA9C8" w:sz="4"/>
-              <w:bottom w:val="single" w:color="8EA9C8" w:sz="4"/>
-              <w:right w:val="single" w:color="8EA9C8" w:sz="4"/>
+              <w:top w:val="single" w:color="E3A3A3" w:sz="4"/>
+              <w:left w:val="single" w:color="E3A3A3" w:sz="4"/>
+              <w:bottom w:val="single" w:color="E3A3A3" w:sz="4"/>
+              <w:right w:val="single" w:color="E3A3A3" w:sz="4"/>
             </w:tcBorders>
             <w:tcMar>
               <w:top w:type="dxa" w:w="60"/>
@@ -6289,10 +6289,10 @@
           <w:tcPr>
             <w:tcW w:type="dxa" w:w="4638"/>
             <w:tcBorders>
-              <w:top w:val="single" w:color="8EA9C8" w:sz="4"/>
-              <w:left w:val="single" w:color="8EA9C8" w:sz="4"/>
-              <w:bottom w:val="single" w:color="8EA9C8" w:sz="4"/>
-              <w:right w:val="single" w:color="8EA9C8" w:sz="4"/>
+              <w:top w:val="single" w:color="E3A3A3" w:sz="4"/>
+              <w:left w:val="single" w:color="E3A3A3" w:sz="4"/>
+              <w:bottom w:val="single" w:color="E3A3A3" w:sz="4"/>
+              <w:right w:val="single" w:color="E3A3A3" w:sz="4"/>
             </w:tcBorders>
             <w:tcMar>
               <w:top w:type="dxa" w:w="60"/>
@@ -6349,12 +6349,12 @@
           <w:tcPr>
             <w:tcW w:type="dxa" w:w="3600"/>
             <w:tcBorders>
-              <w:top w:val="single" w:color="8EA9C8" w:sz="4"/>
-              <w:left w:val="single" w:color="8EA9C8" w:sz="4"/>
-              <w:bottom w:val="single" w:color="8EA9C8" w:sz="4"/>
-              <w:right w:val="single" w:color="8EA9C8" w:sz="4"/>
-            </w:tcBorders>
-            <w:shd w:fill="A7C7F2" w:color="auto" w:val="clear"/>
+              <w:top w:val="single" w:color="E3A3A3" w:sz="4"/>
+              <w:left w:val="single" w:color="E3A3A3" w:sz="4"/>
+              <w:bottom w:val="single" w:color="E3A3A3" w:sz="4"/>
+              <w:right w:val="single" w:color="E3A3A3" w:sz="4"/>
+            </w:tcBorders>
+            <w:shd w:fill="F6C1C1" w:color="auto" w:val="clear"/>
             <w:tcMar>
               <w:top w:type="dxa" w:w="60"/>
               <w:left w:type="dxa" w:w="100"/>
@@ -6379,12 +6379,12 @@
           <w:tcPr>
             <w:tcW w:type="dxa" w:w="6038"/>
             <w:tcBorders>
-              <w:top w:val="single" w:color="8EA9C8" w:sz="4"/>
-              <w:left w:val="single" w:color="8EA9C8" w:sz="4"/>
-              <w:bottom w:val="single" w:color="8EA9C8" w:sz="4"/>
-              <w:right w:val="single" w:color="8EA9C8" w:sz="4"/>
-            </w:tcBorders>
-            <w:shd w:fill="A7C7F2" w:color="auto" w:val="clear"/>
+              <w:top w:val="single" w:color="E3A3A3" w:sz="4"/>
+              <w:left w:val="single" w:color="E3A3A3" w:sz="4"/>
+              <w:bottom w:val="single" w:color="E3A3A3" w:sz="4"/>
+              <w:right w:val="single" w:color="E3A3A3" w:sz="4"/>
+            </w:tcBorders>
+            <w:shd w:fill="F6C1C1" w:color="auto" w:val="clear"/>
             <w:tcMar>
               <w:top w:type="dxa" w:w="60"/>
               <w:left w:type="dxa" w:w="100"/>
@@ -6411,10 +6411,10 @@
           <w:tcPr>
             <w:tcW w:type="dxa" w:w="3600"/>
             <w:tcBorders>
-              <w:top w:val="single" w:color="8EA9C8" w:sz="4"/>
-              <w:left w:val="single" w:color="8EA9C8" w:sz="4"/>
-              <w:bottom w:val="single" w:color="8EA9C8" w:sz="4"/>
-              <w:right w:val="single" w:color="8EA9C8" w:sz="4"/>
+              <w:top w:val="single" w:color="E3A3A3" w:sz="4"/>
+              <w:left w:val="single" w:color="E3A3A3" w:sz="4"/>
+              <w:bottom w:val="single" w:color="E3A3A3" w:sz="4"/>
+              <w:right w:val="single" w:color="E3A3A3" w:sz="4"/>
             </w:tcBorders>
             <w:tcMar>
               <w:top w:type="dxa" w:w="60"/>
@@ -6436,10 +6436,10 @@
           <w:tcPr>
             <w:tcW w:type="dxa" w:w="6038"/>
             <w:tcBorders>
-              <w:top w:val="single" w:color="8EA9C8" w:sz="4"/>
-              <w:left w:val="single" w:color="8EA9C8" w:sz="4"/>
-              <w:bottom w:val="single" w:color="8EA9C8" w:sz="4"/>
-              <w:right w:val="single" w:color="8EA9C8" w:sz="4"/>
+              <w:top w:val="single" w:color="E3A3A3" w:sz="4"/>
+              <w:left w:val="single" w:color="E3A3A3" w:sz="4"/>
+              <w:bottom w:val="single" w:color="E3A3A3" w:sz="4"/>
+              <w:right w:val="single" w:color="E3A3A3" w:sz="4"/>
             </w:tcBorders>
             <w:tcMar>
               <w:top w:type="dxa" w:w="60"/>
@@ -6474,10 +6474,10 @@
           <w:tcPr>
             <w:tcW w:type="dxa" w:w="3600"/>
             <w:tcBorders>
-              <w:top w:val="single" w:color="8EA9C8" w:sz="4"/>
-              <w:left w:val="single" w:color="8EA9C8" w:sz="4"/>
-              <w:bottom w:val="single" w:color="8EA9C8" w:sz="4"/>
-              <w:right w:val="single" w:color="8EA9C8" w:sz="4"/>
+              <w:top w:val="single" w:color="E3A3A3" w:sz="4"/>
+              <w:left w:val="single" w:color="E3A3A3" w:sz="4"/>
+              <w:bottom w:val="single" w:color="E3A3A3" w:sz="4"/>
+              <w:right w:val="single" w:color="E3A3A3" w:sz="4"/>
             </w:tcBorders>
             <w:tcMar>
               <w:top w:type="dxa" w:w="60"/>
@@ -6499,10 +6499,10 @@
           <w:tcPr>
             <w:tcW w:type="dxa" w:w="6038"/>
             <w:tcBorders>
-              <w:top w:val="single" w:color="8EA9C8" w:sz="4"/>
-              <w:left w:val="single" w:color="8EA9C8" w:sz="4"/>
-              <w:bottom w:val="single" w:color="8EA9C8" w:sz="4"/>
-              <w:right w:val="single" w:color="8EA9C8" w:sz="4"/>
+              <w:top w:val="single" w:color="E3A3A3" w:sz="4"/>
+              <w:left w:val="single" w:color="E3A3A3" w:sz="4"/>
+              <w:bottom w:val="single" w:color="E3A3A3" w:sz="4"/>
+              <w:right w:val="single" w:color="E3A3A3" w:sz="4"/>
             </w:tcBorders>
             <w:tcMar>
               <w:top w:type="dxa" w:w="60"/>
@@ -6536,10 +6536,10 @@
           <w:tcPr>
             <w:tcW w:type="dxa" w:w="3600"/>
             <w:tcBorders>
-              <w:top w:val="single" w:color="8EA9C8" w:sz="4"/>
-              <w:left w:val="single" w:color="8EA9C8" w:sz="4"/>
-              <w:bottom w:val="single" w:color="8EA9C8" w:sz="4"/>
-              <w:right w:val="single" w:color="8EA9C8" w:sz="4"/>
+              <w:top w:val="single" w:color="E3A3A3" w:sz="4"/>
+              <w:left w:val="single" w:color="E3A3A3" w:sz="4"/>
+              <w:bottom w:val="single" w:color="E3A3A3" w:sz="4"/>
+              <w:right w:val="single" w:color="E3A3A3" w:sz="4"/>
             </w:tcBorders>
             <w:tcMar>
               <w:top w:type="dxa" w:w="60"/>
@@ -6561,10 +6561,10 @@
           <w:tcPr>
             <w:tcW w:type="dxa" w:w="6038"/>
             <w:tcBorders>
-              <w:top w:val="single" w:color="8EA9C8" w:sz="4"/>
-              <w:left w:val="single" w:color="8EA9C8" w:sz="4"/>
-              <w:bottom w:val="single" w:color="8EA9C8" w:sz="4"/>
-              <w:right w:val="single" w:color="8EA9C8" w:sz="4"/>
+              <w:top w:val="single" w:color="E3A3A3" w:sz="4"/>
+              <w:left w:val="single" w:color="E3A3A3" w:sz="4"/>
+              <w:bottom w:val="single" w:color="E3A3A3" w:sz="4"/>
+              <w:right w:val="single" w:color="E3A3A3" w:sz="4"/>
             </w:tcBorders>
             <w:tcMar>
               <w:top w:type="dxa" w:w="60"/>
@@ -6598,10 +6598,10 @@
           <w:tcPr>
             <w:tcW w:type="dxa" w:w="3600"/>
             <w:tcBorders>
-              <w:top w:val="single" w:color="8EA9C8" w:sz="4"/>
-              <w:left w:val="single" w:color="8EA9C8" w:sz="4"/>
-              <w:bottom w:val="single" w:color="8EA9C8" w:sz="4"/>
-              <w:right w:val="single" w:color="8EA9C8" w:sz="4"/>
+              <w:top w:val="single" w:color="E3A3A3" w:sz="4"/>
+              <w:left w:val="single" w:color="E3A3A3" w:sz="4"/>
+              <w:bottom w:val="single" w:color="E3A3A3" w:sz="4"/>
+              <w:right w:val="single" w:color="E3A3A3" w:sz="4"/>
             </w:tcBorders>
             <w:tcMar>
               <w:top w:type="dxa" w:w="60"/>
@@ -6623,10 +6623,10 @@
           <w:tcPr>
             <w:tcW w:type="dxa" w:w="6038"/>
             <w:tcBorders>
-              <w:top w:val="single" w:color="8EA9C8" w:sz="4"/>
-              <w:left w:val="single" w:color="8EA9C8" w:sz="4"/>
-              <w:bottom w:val="single" w:color="8EA9C8" w:sz="4"/>
-              <w:right w:val="single" w:color="8EA9C8" w:sz="4"/>
+              <w:top w:val="single" w:color="E3A3A3" w:sz="4"/>
+              <w:left w:val="single" w:color="E3A3A3" w:sz="4"/>
+              <w:bottom w:val="single" w:color="E3A3A3" w:sz="4"/>
+              <w:right w:val="single" w:color="E3A3A3" w:sz="4"/>
             </w:tcBorders>
             <w:tcMar>
               <w:top w:type="dxa" w:w="60"/>
@@ -6650,10 +6650,10 @@
           <w:tcPr>
             <w:tcW w:type="dxa" w:w="3600"/>
             <w:tcBorders>
-              <w:top w:val="single" w:color="8EA9C8" w:sz="4"/>
-              <w:left w:val="single" w:color="8EA9C8" w:sz="4"/>
-              <w:bottom w:val="single" w:color="8EA9C8" w:sz="4"/>
-              <w:right w:val="single" w:color="8EA9C8" w:sz="4"/>
+              <w:top w:val="single" w:color="E3A3A3" w:sz="4"/>
+              <w:left w:val="single" w:color="E3A3A3" w:sz="4"/>
+              <w:bottom w:val="single" w:color="E3A3A3" w:sz="4"/>
+              <w:right w:val="single" w:color="E3A3A3" w:sz="4"/>
             </w:tcBorders>
             <w:tcMar>
               <w:top w:type="dxa" w:w="60"/>
@@ -6675,10 +6675,10 @@
           <w:tcPr>
             <w:tcW w:type="dxa" w:w="6038"/>
             <w:tcBorders>
-              <w:top w:val="single" w:color="8EA9C8" w:sz="4"/>
-              <w:left w:val="single" w:color="8EA9C8" w:sz="4"/>
-              <w:bottom w:val="single" w:color="8EA9C8" w:sz="4"/>
-              <w:right w:val="single" w:color="8EA9C8" w:sz="4"/>
+              <w:top w:val="single" w:color="E3A3A3" w:sz="4"/>
+              <w:left w:val="single" w:color="E3A3A3" w:sz="4"/>
+              <w:bottom w:val="single" w:color="E3A3A3" w:sz="4"/>
+              <w:right w:val="single" w:color="E3A3A3" w:sz="4"/>
             </w:tcBorders>
             <w:tcMar>
               <w:top w:type="dxa" w:w="60"/>
@@ -6712,10 +6712,10 @@
           <w:tcPr>
             <w:tcW w:type="dxa" w:w="3600"/>
             <w:tcBorders>
-              <w:top w:val="single" w:color="8EA9C8" w:sz="4"/>
-              <w:left w:val="single" w:color="8EA9C8" w:sz="4"/>
-              <w:bottom w:val="single" w:color="8EA9C8" w:sz="4"/>
-              <w:right w:val="single" w:color="8EA9C8" w:sz="4"/>
+              <w:top w:val="single" w:color="E3A3A3" w:sz="4"/>
+              <w:left w:val="single" w:color="E3A3A3" w:sz="4"/>
+              <w:bottom w:val="single" w:color="E3A3A3" w:sz="4"/>
+              <w:right w:val="single" w:color="E3A3A3" w:sz="4"/>
             </w:tcBorders>
             <w:tcMar>
               <w:top w:type="dxa" w:w="60"/>
@@ -6737,10 +6737,10 @@
           <w:tcPr>
             <w:tcW w:type="dxa" w:w="6038"/>
             <w:tcBorders>
-              <w:top w:val="single" w:color="8EA9C8" w:sz="4"/>
-              <w:left w:val="single" w:color="8EA9C8" w:sz="4"/>
-              <w:bottom w:val="single" w:color="8EA9C8" w:sz="4"/>
-              <w:right w:val="single" w:color="8EA9C8" w:sz="4"/>
+              <w:top w:val="single" w:color="E3A3A3" w:sz="4"/>
+              <w:left w:val="single" w:color="E3A3A3" w:sz="4"/>
+              <w:bottom w:val="single" w:color="E3A3A3" w:sz="4"/>
+              <w:right w:val="single" w:color="E3A3A3" w:sz="4"/>
             </w:tcBorders>
             <w:tcMar>
               <w:top w:type="dxa" w:w="60"/>
@@ -6764,10 +6764,10 @@
           <w:tcPr>
             <w:tcW w:type="dxa" w:w="3600"/>
             <w:tcBorders>
-              <w:top w:val="single" w:color="8EA9C8" w:sz="4"/>
-              <w:left w:val="single" w:color="8EA9C8" w:sz="4"/>
-              <w:bottom w:val="single" w:color="8EA9C8" w:sz="4"/>
-              <w:right w:val="single" w:color="8EA9C8" w:sz="4"/>
+              <w:top w:val="single" w:color="E3A3A3" w:sz="4"/>
+              <w:left w:val="single" w:color="E3A3A3" w:sz="4"/>
+              <w:bottom w:val="single" w:color="E3A3A3" w:sz="4"/>
+              <w:right w:val="single" w:color="E3A3A3" w:sz="4"/>
             </w:tcBorders>
             <w:tcMar>
               <w:top w:type="dxa" w:w="60"/>
@@ -6789,10 +6789,10 @@
           <w:tcPr>
             <w:tcW w:type="dxa" w:w="6038"/>
             <w:tcBorders>
-              <w:top w:val="single" w:color="8EA9C8" w:sz="4"/>
-              <w:left w:val="single" w:color="8EA9C8" w:sz="4"/>
-              <w:bottom w:val="single" w:color="8EA9C8" w:sz="4"/>
-              <w:right w:val="single" w:color="8EA9C8" w:sz="4"/>
+              <w:top w:val="single" w:color="E3A3A3" w:sz="4"/>
+              <w:left w:val="single" w:color="E3A3A3" w:sz="4"/>
+              <w:bottom w:val="single" w:color="E3A3A3" w:sz="4"/>
+              <w:right w:val="single" w:color="E3A3A3" w:sz="4"/>
             </w:tcBorders>
             <w:tcMar>
               <w:top w:type="dxa" w:w="60"/>
@@ -7283,7 +7283,7 @@
     <w:qFormat/>
     <w:pPr>
       <w:pBdr>
-        <w:bottom w:val="single" w:color="A7C7F2" w:sz="6" w:space="4"/>
+        <w:bottom w:val="single" w:color="F6C1C1" w:sz="6" w:space="4"/>
       </w:pBdr>
       <w:spacing w:after="160" w:before="360"/>
       <w:outlineLvl w:val="0"/>
@@ -7292,7 +7292,7 @@
       <w:rFonts w:ascii="Calibri" w:cs="Calibri" w:eastAsia="Calibri" w:hAnsi="Calibri"/>
       <w:b/>
       <w:bCs/>
-      <w:color w:val="1F4E79"/>
+      <w:color w:val="9B2C2C"/>
       <w:sz w:val="30"/>
       <w:szCs w:val="30"/>
     </w:rPr>
@@ -7310,7 +7310,7 @@
       <w:rFonts w:ascii="Calibri" w:cs="Calibri" w:eastAsia="Calibri" w:hAnsi="Calibri"/>
       <w:b/>
       <w:bCs/>
-      <w:color w:val="2E75B6"/>
+      <w:color w:val="C0504D"/>
       <w:sz w:val="25"/>
       <w:szCs w:val="25"/>
     </w:rPr>
@@ -7328,7 +7328,7 @@
       <w:rFonts w:ascii="Calibri" w:cs="Calibri" w:eastAsia="Calibri" w:hAnsi="Calibri"/>
       <w:b/>
       <w:bCs/>
-      <w:color w:val="1F4E79"/>
+      <w:color w:val="9B2C2C"/>
       <w:sz w:val="22"/>
       <w:szCs w:val="22"/>
     </w:rPr>

</xml_diff>

<commit_message>
Guide d'utilisation : captures des rapports, sommaire, annexe d'administration Oracle
Co-Authored-By: Claude Opus 5.5 <noreply@anthropic.com>
Claude-Session: https://claude.ai/code/session_01UgeLXzj9G5UyQ5F9qqzBDt
</commit_message>
<xml_diff>
--- a/docs/MobiPass_Guide_utilisation_outils_analyse.docx
+++ b/docs/MobiPass_Guide_utilisation_outils_analyse.docx
@@ -91,6 +91,158 @@
           <w:szCs w:val="22"/>
         </w:rPr>
         <w:t xml:space="preserve">Octobre 2026</w:t>
+      </w:r>
+    </w:p>
+    <w:p>
+      <w:r>
+        <w:br w:type="page"/>
+      </w:r>
+    </w:p>
+    <w:p>
+      <w:pPr>
+        <w:spacing w:after="200"/>
+      </w:pPr>
+      <w:r>
+        <w:rPr>
+          <w:b/>
+          <w:bCs/>
+          <w:color w:val="9B2C2C"/>
+          <w:sz w:val="32"/>
+          <w:szCs w:val="32"/>
+        </w:rPr>
+        <w:t xml:space="preserve">Sommaire</w:t>
+      </w:r>
+    </w:p>
+    <w:p>
+      <w:pPr>
+        <w:spacing w:after="80"/>
+        <w:ind w:left="300"/>
+      </w:pPr>
+      <w:r>
+        <w:rPr>
+          <w:sz w:val="22"/>
+          <w:szCs w:val="22"/>
+        </w:rPr>
+        <w:t xml:space="preserve">1. À qui s'adresse ce guide</w:t>
+      </w:r>
+    </w:p>
+    <w:p>
+      <w:pPr>
+        <w:spacing w:after="80"/>
+        <w:ind w:left="300"/>
+      </w:pPr>
+      <w:r>
+        <w:rPr>
+          <w:sz w:val="22"/>
+          <w:szCs w:val="22"/>
+        </w:rPr>
+        <w:t xml:space="preserve">2. Ouvrir et actualiser un rapport</w:t>
+      </w:r>
+    </w:p>
+    <w:p>
+      <w:pPr>
+        <w:spacing w:after="80"/>
+        <w:ind w:left="300"/>
+      </w:pPr>
+      <w:r>
+        <w:rPr>
+          <w:sz w:val="22"/>
+          <w:szCs w:val="22"/>
+        </w:rPr>
+        <w:t xml:space="preserve">3. Les gestes de base dans Power BI</w:t>
+      </w:r>
+    </w:p>
+    <w:p>
+      <w:pPr>
+        <w:spacing w:after="80"/>
+        <w:ind w:left="300"/>
+      </w:pPr>
+      <w:r>
+        <w:rPr>
+          <w:sz w:val="22"/>
+          <w:szCs w:val="22"/>
+        </w:rPr>
+        <w:t xml:space="preserve">4. Le rapport « Analyse des locations »</w:t>
+      </w:r>
+    </w:p>
+    <w:p>
+      <w:pPr>
+        <w:spacing w:after="80"/>
+        <w:ind w:left="300"/>
+      </w:pPr>
+      <w:r>
+        <w:rPr>
+          <w:sz w:val="22"/>
+          <w:szCs w:val="22"/>
+        </w:rPr>
+        <w:t xml:space="preserve">5. Le rapport « Analyse des ventes »</w:t>
+      </w:r>
+    </w:p>
+    <w:p>
+      <w:pPr>
+        <w:spacing w:after="80"/>
+        <w:ind w:left="300"/>
+      </w:pPr>
+      <w:r>
+        <w:rPr>
+          <w:sz w:val="22"/>
+          <w:szCs w:val="22"/>
+        </w:rPr>
+        <w:t xml:space="preserve">6. Quelle page pour quelle question ?</w:t>
+      </w:r>
+    </w:p>
+    <w:p>
+      <w:pPr>
+        <w:spacing w:after="80"/>
+        <w:ind w:left="300"/>
+      </w:pPr>
+      <w:r>
+        <w:rPr>
+          <w:sz w:val="22"/>
+          <w:szCs w:val="22"/>
+        </w:rPr>
+        <w:t xml:space="preserve">7. En cas de problème</w:t>
+      </w:r>
+    </w:p>
+    <w:p>
+      <w:pPr>
+        <w:spacing w:after="80"/>
+        <w:ind w:left="300"/>
+      </w:pPr>
+      <w:r>
+        <w:rPr>
+          <w:sz w:val="22"/>
+          <w:szCs w:val="22"/>
+        </w:rPr>
+        <w:t xml:space="preserve">Annexe : administration des magasins (service informatique)</w:t>
+      </w:r>
+    </w:p>
+    <w:p>
+      <w:pPr>
+        <w:spacing w:before="300"/>
+      </w:pPr>
+      <w:r>
+        <w:t xml:space="preserve">Les sections 1 à 7 s'adressent aux </w:t>
+      </w:r>
+      <w:r>
+        <w:rPr>
+          <w:b/>
+          <w:bCs/>
+        </w:rPr>
+        <w:t xml:space="preserve">décideurs</w:t>
+      </w:r>
+      <w:r>
+        <w:t xml:space="preserve"> (responsable des locations, responsables des ventes de Lyon et de Berlin). L'annexe s'adresse au </w:t>
+      </w:r>
+      <w:r>
+        <w:rPr>
+          <w:b/>
+          <w:bCs/>
+        </w:rPr>
+        <w:t xml:space="preserve">service informatique</w:t>
+      </w:r>
+      <w:r>
+        <w:t xml:space="preserve"> qui alimente l'entrepôt et rafraîchit les magasins.</w:t>
       </w:r>
     </w:p>
     <w:p>
@@ -925,406 +1077,10 @@
     </w:p>
     <w:p>
       <w:pPr>
-        <w:pStyle w:val="Heading2"/>
-      </w:pPr>
-      <w:r>
-        <w:t xml:space="preserve">Mettre les magasins à jour après un nouveau chargement</w:t>
-      </w:r>
-    </w:p>
-    <w:p>
-      <w:pPr>
         <w:spacing w:after="120"/>
       </w:pPr>
       <w:r>
-        <w:t xml:space="preserve">Les magasins sont des vues matérialisées rafraîchies à la demande. Après chaque alimentation de l'entrepôt, lancez dans SQL Developer le bloc de rafraîchissement du magasin concerné, puis cliquez sur </w:t>
-      </w:r>
-      <w:r>
-        <w:rPr>
-          <w:b/>
-          <w:bCs/>
-        </w:rPr>
-        <w:t xml:space="preserve">Actualiser</w:t>
-      </w:r>
-      <w:r>
-        <w:t xml:space="preserve"> dans Power BI.</w:t>
-      </w:r>
-    </w:p>
-    <w:p>
-      <w:pPr>
-        <w:spacing w:after="120"/>
-      </w:pPr>
-      <w:r>
-        <w:rPr>
-          <w:b/>
-          <w:bCs/>
-        </w:rPr>
-        <w:t xml:space="preserve">Magasin des ventes</w:t>
-      </w:r>
-      <w:r>
-        <w:t xml:space="preserve"> : le bloc se trouve à la fin de </w:t>
-      </w:r>
-      <w:r>
-        <w:rPr>
-          <w:rFonts w:ascii="Consolas" w:cs="Consolas" w:eastAsia="Consolas" w:hAnsi="Consolas"/>
-          <w:sz w:val="19"/>
-          <w:szCs w:val="19"/>
-        </w:rPr>
-        <w:t xml:space="preserve">sql/md_ventes/01_Achat_MD_structure_agregats.sql</w:t>
-      </w:r>
-      <w:r>
-        <w:t xml:space="preserve">. Il rafraîchit les dimensions, puis le fait, puis les agrégats, dans cet ordre :</w:t>
-      </w:r>
-    </w:p>
-    <w:p>
-      <w:pPr>
-        <w:shd w:fill="F2F2F2" w:color="auto" w:val="clear"/>
-        <w:spacing w:after="0"/>
-        <w:ind w:left="200"/>
-      </w:pPr>
-      <w:r>
-        <w:rPr>
-          <w:rFonts w:ascii="Consolas" w:cs="Consolas" w:eastAsia="Consolas" w:hAnsi="Consolas"/>
-          <w:sz w:val="18"/>
-          <w:szCs w:val="18"/>
-        </w:rPr>
-        <w:t xml:space="preserve">BEGIN</w:t>
-      </w:r>
-    </w:p>
-    <w:p>
-      <w:pPr>
-        <w:shd w:fill="F2F2F2" w:color="auto" w:val="clear"/>
-        <w:spacing w:after="0"/>
-        <w:ind w:left="200"/>
-      </w:pPr>
-      <w:r>
-        <w:rPr>
-          <w:rFonts w:ascii="Consolas" w:cs="Consolas" w:eastAsia="Consolas" w:hAnsi="Consolas"/>
-          <w:sz w:val="18"/>
-          <w:szCs w:val="18"/>
-        </w:rPr>
-        <w:t xml:space="preserve">  DBMS_MVIEW.REFRESH('TEMPS_MD2',   method =&gt; 'C');</w:t>
-      </w:r>
-    </w:p>
-    <w:p>
-      <w:pPr>
-        <w:shd w:fill="F2F2F2" w:color="auto" w:val="clear"/>
-        <w:spacing w:after="0"/>
-        <w:ind w:left="200"/>
-      </w:pPr>
-      <w:r>
-        <w:rPr>
-          <w:rFonts w:ascii="Consolas" w:cs="Consolas" w:eastAsia="Consolas" w:hAnsi="Consolas"/>
-          <w:sz w:val="18"/>
-          <w:szCs w:val="18"/>
-        </w:rPr>
-        <w:t xml:space="preserve">  DBMS_MVIEW.REFRESH('PRODUIT_MD2', method =&gt; 'C');</w:t>
-      </w:r>
-    </w:p>
-    <w:p>
-      <w:pPr>
-        <w:shd w:fill="F2F2F2" w:color="auto" w:val="clear"/>
-        <w:spacing w:after="0"/>
-        <w:ind w:left="200"/>
-      </w:pPr>
-      <w:r>
-        <w:rPr>
-          <w:rFonts w:ascii="Consolas" w:cs="Consolas" w:eastAsia="Consolas" w:hAnsi="Consolas"/>
-          <w:sz w:val="18"/>
-          <w:szCs w:val="18"/>
-        </w:rPr>
-        <w:t xml:space="preserve">  DBMS_MVIEW.REFRESH('METIER_MD2',  method =&gt; 'C');</w:t>
-      </w:r>
-    </w:p>
-    <w:p>
-      <w:pPr>
-        <w:shd w:fill="F2F2F2" w:color="auto" w:val="clear"/>
-        <w:spacing w:after="0"/>
-        <w:ind w:left="200"/>
-      </w:pPr>
-      <w:r>
-        <w:rPr>
-          <w:rFonts w:ascii="Consolas" w:cs="Consolas" w:eastAsia="Consolas" w:hAnsi="Consolas"/>
-          <w:sz w:val="18"/>
-          <w:szCs w:val="18"/>
-        </w:rPr>
-        <w:t xml:space="preserve">  DBMS_MVIEW.REFRESH('EMPLOYE_MD2', method =&gt; 'C');</w:t>
-      </w:r>
-    </w:p>
-    <w:p>
-      <w:pPr>
-        <w:shd w:fill="F2F2F2" w:color="auto" w:val="clear"/>
-        <w:spacing w:after="0"/>
-        <w:ind w:left="200"/>
-      </w:pPr>
-      <w:r>
-        <w:rPr>
-          <w:rFonts w:ascii="Consolas" w:cs="Consolas" w:eastAsia="Consolas" w:hAnsi="Consolas"/>
-          <w:sz w:val="18"/>
-          <w:szCs w:val="18"/>
-        </w:rPr>
-        <w:t xml:space="preserve">  DBMS_MVIEW.REFRESH('ACHAT_MD2',   method =&gt; 'C');</w:t>
-      </w:r>
-    </w:p>
-    <w:p>
-      <w:pPr>
-        <w:shd w:fill="F2F2F2" w:color="auto" w:val="clear"/>
-        <w:spacing w:after="0"/>
-        <w:ind w:left="200"/>
-      </w:pPr>
-      <w:r>
-        <w:rPr>
-          <w:rFonts w:ascii="Consolas" w:cs="Consolas" w:eastAsia="Consolas" w:hAnsi="Consolas"/>
-          <w:sz w:val="18"/>
-          <w:szCs w:val="18"/>
-        </w:rPr>
-        <w:t xml:space="preserve">  DBMS_MVIEW.REFRESH('MV_ACH_GAM_REG_MOIS', method =&gt; 'C');</w:t>
-      </w:r>
-    </w:p>
-    <w:p>
-      <w:pPr>
-        <w:shd w:fill="F2F2F2" w:color="auto" w:val="clear"/>
-        <w:spacing w:after="0"/>
-        <w:ind w:left="200"/>
-      </w:pPr>
-      <w:r>
-        <w:rPr>
-          <w:rFonts w:ascii="Consolas" w:cs="Consolas" w:eastAsia="Consolas" w:hAnsi="Consolas"/>
-          <w:sz w:val="18"/>
-          <w:szCs w:val="18"/>
-        </w:rPr>
-        <w:t xml:space="preserve">  DBMS_MVIEW.REFRESH('MV_ACH_PAYS_MOIS',    method =&gt; 'C');</w:t>
-      </w:r>
-    </w:p>
-    <w:p>
-      <w:pPr>
-        <w:shd w:fill="F2F2F2" w:color="auto" w:val="clear"/>
-        <w:spacing w:after="0"/>
-        <w:ind w:left="200"/>
-      </w:pPr>
-      <w:r>
-        <w:rPr>
-          <w:rFonts w:ascii="Consolas" w:cs="Consolas" w:eastAsia="Consolas" w:hAnsi="Consolas"/>
-          <w:sz w:val="18"/>
-          <w:szCs w:val="18"/>
-        </w:rPr>
-        <w:t xml:space="preserve">  DBMS_MVIEW.REFRESH('MV_ACH_TYPE_CJ_MOIS', method =&gt; 'C');</w:t>
-      </w:r>
-    </w:p>
-    <w:p>
-      <w:pPr>
-        <w:shd w:fill="F2F2F2" w:color="auto" w:val="clear"/>
-        <w:spacing w:after="0"/>
-        <w:ind w:left="200"/>
-      </w:pPr>
-      <w:r>
-        <w:rPr>
-          <w:rFonts w:ascii="Consolas" w:cs="Consolas" w:eastAsia="Consolas" w:hAnsi="Consolas"/>
-          <w:sz w:val="18"/>
-          <w:szCs w:val="18"/>
-        </w:rPr>
-        <w:t xml:space="preserve">END;</w:t>
-      </w:r>
-    </w:p>
-    <w:p>
-      <w:pPr>
-        <w:shd w:fill="F2F2F2" w:color="auto" w:val="clear"/>
-        <w:spacing w:after="160"/>
-        <w:ind w:left="200"/>
-      </w:pPr>
-      <w:r>
-        <w:rPr>
-          <w:rFonts w:ascii="Consolas" w:cs="Consolas" w:eastAsia="Consolas" w:hAnsi="Consolas"/>
-          <w:sz w:val="18"/>
-          <w:szCs w:val="18"/>
-        </w:rPr>
-        <w:t xml:space="preserve">/</w:t>
-      </w:r>
-    </w:p>
-    <w:p>
-      <w:pPr>
-        <w:spacing w:after="120"/>
-      </w:pPr>
-      <w:r>
-        <w:rPr>
-          <w:b/>
-          <w:bCs/>
-        </w:rPr>
-        <w:t xml:space="preserve">Magasin des locations</w:t>
-      </w:r>
-      <w:r>
-        <w:t xml:space="preserve"> : même principe, dimensions et fait d'abord, puis les agrégats (</w:t>
-      </w:r>
-      <w:r>
-        <w:rPr>
-          <w:rFonts w:ascii="Consolas" w:cs="Consolas" w:eastAsia="Consolas" w:hAnsi="Consolas"/>
-          <w:sz w:val="19"/>
-          <w:szCs w:val="19"/>
-        </w:rPr>
-        <w:t xml:space="preserve">AGG_MOIS_REGION_MD1</w:t>
-      </w:r>
-      <w:r>
-        <w:t xml:space="preserve"> en dernier, car il est calculé à partir de </w:t>
-      </w:r>
-      <w:r>
-        <w:rPr>
-          <w:rFonts w:ascii="Consolas" w:cs="Consolas" w:eastAsia="Consolas" w:hAnsi="Consolas"/>
-          <w:sz w:val="19"/>
-          <w:szCs w:val="19"/>
-        </w:rPr>
-        <w:t xml:space="preserve">AGG_MOIS_SOCIETE_MD1</w:t>
-      </w:r>
-      <w:r>
-        <w:t xml:space="preserve">) :</w:t>
-      </w:r>
-    </w:p>
-    <w:p>
-      <w:pPr>
-        <w:shd w:fill="F2F2F2" w:color="auto" w:val="clear"/>
-        <w:spacing w:after="0"/>
-        <w:ind w:left="200"/>
-      </w:pPr>
-      <w:r>
-        <w:rPr>
-          <w:rFonts w:ascii="Consolas" w:cs="Consolas" w:eastAsia="Consolas" w:hAnsi="Consolas"/>
-          <w:sz w:val="18"/>
-          <w:szCs w:val="18"/>
-        </w:rPr>
-        <w:t xml:space="preserve">BEGIN</w:t>
-      </w:r>
-    </w:p>
-    <w:p>
-      <w:pPr>
-        <w:shd w:fill="F2F2F2" w:color="auto" w:val="clear"/>
-        <w:spacing w:after="0"/>
-        <w:ind w:left="200"/>
-      </w:pPr>
-      <w:r>
-        <w:rPr>
-          <w:rFonts w:ascii="Consolas" w:cs="Consolas" w:eastAsia="Consolas" w:hAnsi="Consolas"/>
-          <w:sz w:val="18"/>
-          <w:szCs w:val="18"/>
-        </w:rPr>
-        <w:t xml:space="preserve">  DBMS_MVIEW.REFRESH('TEMPS_MD1',      method =&gt; 'C');</w:t>
-      </w:r>
-    </w:p>
-    <w:p>
-      <w:pPr>
-        <w:shd w:fill="F2F2F2" w:color="auto" w:val="clear"/>
-        <w:spacing w:after="0"/>
-        <w:ind w:left="200"/>
-      </w:pPr>
-      <w:r>
-        <w:rPr>
-          <w:rFonts w:ascii="Consolas" w:cs="Consolas" w:eastAsia="Consolas" w:hAnsi="Consolas"/>
-          <w:sz w:val="18"/>
-          <w:szCs w:val="18"/>
-        </w:rPr>
-        <w:t xml:space="preserve">  DBMS_MVIEW.REFRESH('EXEMPLAIRE_MD1', method =&gt; 'C');</w:t>
-      </w:r>
-    </w:p>
-    <w:p>
-      <w:pPr>
-        <w:shd w:fill="F2F2F2" w:color="auto" w:val="clear"/>
-        <w:spacing w:after="0"/>
-        <w:ind w:left="200"/>
-      </w:pPr>
-      <w:r>
-        <w:rPr>
-          <w:rFonts w:ascii="Consolas" w:cs="Consolas" w:eastAsia="Consolas" w:hAnsi="Consolas"/>
-          <w:sz w:val="18"/>
-          <w:szCs w:val="18"/>
-        </w:rPr>
-        <w:t xml:space="preserve">  DBMS_MVIEW.REFRESH('EMPLOYE_MD1',    method =&gt; 'C');</w:t>
-      </w:r>
-    </w:p>
-    <w:p>
-      <w:pPr>
-        <w:shd w:fill="F2F2F2" w:color="auto" w:val="clear"/>
-        <w:spacing w:after="0"/>
-        <w:ind w:left="200"/>
-      </w:pPr>
-      <w:r>
-        <w:rPr>
-          <w:rFonts w:ascii="Consolas" w:cs="Consolas" w:eastAsia="Consolas" w:hAnsi="Consolas"/>
-          <w:sz w:val="18"/>
-          <w:szCs w:val="18"/>
-        </w:rPr>
-        <w:t xml:space="preserve">  DBMS_MVIEW.REFRESH('LOCATION_MD1',   method =&gt; 'C');</w:t>
-      </w:r>
-    </w:p>
-    <w:p>
-      <w:pPr>
-        <w:shd w:fill="F2F2F2" w:color="auto" w:val="clear"/>
-        <w:spacing w:after="0"/>
-        <w:ind w:left="200"/>
-      </w:pPr>
-      <w:r>
-        <w:rPr>
-          <w:rFonts w:ascii="Consolas" w:cs="Consolas" w:eastAsia="Consolas" w:hAnsi="Consolas"/>
-          <w:sz w:val="18"/>
-          <w:szCs w:val="18"/>
-        </w:rPr>
-        <w:t xml:space="preserve">  DBMS_MVIEW.REFRESH('AGG_SEM_EMPLOYE_MD1',  method =&gt; 'C');</w:t>
-      </w:r>
-    </w:p>
-    <w:p>
-      <w:pPr>
-        <w:shd w:fill="F2F2F2" w:color="auto" w:val="clear"/>
-        <w:spacing w:after="0"/>
-        <w:ind w:left="200"/>
-      </w:pPr>
-      <w:r>
-        <w:rPr>
-          <w:rFonts w:ascii="Consolas" w:cs="Consolas" w:eastAsia="Consolas" w:hAnsi="Consolas"/>
-          <w:sz w:val="18"/>
-          <w:szCs w:val="18"/>
-        </w:rPr>
-        <w:t xml:space="preserve">  DBMS_MVIEW.REFRESH('AGG_MOIS_SOCIETE_MD1', method =&gt; 'C');</w:t>
-      </w:r>
-    </w:p>
-    <w:p>
-      <w:pPr>
-        <w:shd w:fill="F2F2F2" w:color="auto" w:val="clear"/>
-        <w:spacing w:after="0"/>
-        <w:ind w:left="200"/>
-      </w:pPr>
-      <w:r>
-        <w:rPr>
-          <w:rFonts w:ascii="Consolas" w:cs="Consolas" w:eastAsia="Consolas" w:hAnsi="Consolas"/>
-          <w:sz w:val="18"/>
-          <w:szCs w:val="18"/>
-        </w:rPr>
-        <w:t xml:space="preserve">  DBMS_MVIEW.REFRESH('AGG_MOIS_REGION_MD1',  method =&gt; 'C');</w:t>
-      </w:r>
-    </w:p>
-    <w:p>
-      <w:pPr>
-        <w:shd w:fill="F2F2F2" w:color="auto" w:val="clear"/>
-        <w:spacing w:after="0"/>
-        <w:ind w:left="200"/>
-      </w:pPr>
-      <w:r>
-        <w:rPr>
-          <w:rFonts w:ascii="Consolas" w:cs="Consolas" w:eastAsia="Consolas" w:hAnsi="Consolas"/>
-          <w:sz w:val="18"/>
-          <w:szCs w:val="18"/>
-        </w:rPr>
-        <w:t xml:space="preserve">END;</w:t>
-      </w:r>
-    </w:p>
-    <w:p>
-      <w:pPr>
-        <w:shd w:fill="F2F2F2" w:color="auto" w:val="clear"/>
-        <w:spacing w:after="160"/>
-        <w:ind w:left="200"/>
-      </w:pPr>
-      <w:r>
-        <w:rPr>
-          <w:rFonts w:ascii="Consolas" w:cs="Consolas" w:eastAsia="Consolas" w:hAnsi="Consolas"/>
-          <w:sz w:val="18"/>
-          <w:szCs w:val="18"/>
-        </w:rPr>
-        <w:t xml:space="preserve">/</w:t>
+        <w:t xml:space="preserve">Si les chiffres semblent anciens, le service informatique doit d'abord rafraîchir les magasins dans Oracle (voir l'annexe).</w:t>
       </w:r>
     </w:p>
     <w:p>
@@ -2794,6 +2550,195 @@
     </w:p>
     <w:p>
       <w:pPr>
+        <w:keepNext/>
+        <w:spacing w:after="40" w:before="120"/>
+        <w:jc w:val="center"/>
+      </w:pPr>
+      <w:r>
+        <w:drawing>
+          <wp:inline distT="0" distB="0" distL="0" distR="0">
+            <wp:extent cx="5905500" cy="3409950"/>
+            <wp:effectExtent t="0" r="0" b="0" l="0"/>
+            <wp:docPr id="1" name="loc-1.png" descr="Locations, page Analyse 1 : montants payés par type de société et société, mois par mois (2026)" title="Locations, page Analyse 1 : montants payés par type de société et société, mois par mois (2026)"/>
+            <wp:cNvGraphicFramePr>
+              <a:graphicFrameLocks xmlns:a="http://schemas.openxmlformats.org/drawingml/2006/main" noChangeAspect="1"/>
+            </wp:cNvGraphicFramePr>
+            <a:graphic xmlns:a="http://schemas.openxmlformats.org/drawingml/2006/main">
+              <a:graphicData uri="http://schemas.openxmlformats.org/drawingml/2006/picture">
+                <pic:pic xmlns:pic="http://schemas.openxmlformats.org/drawingml/2006/picture">
+                  <pic:nvPicPr>
+                    <pic:cNvPr id="0" name="" descr=""/>
+                    <pic:cNvPicPr>
+                      <a:picLocks noChangeAspect="1" noChangeArrowheads="1"/>
+                    </pic:cNvPicPr>
+                  </pic:nvPicPr>
+                  <pic:blipFill>
+                    <a:blip r:embed="rId8" cstate="none"/>
+                    <a:srcRect/>
+                    <a:stretch>
+                      <a:fillRect/>
+                    </a:stretch>
+                  </pic:blipFill>
+                  <pic:spPr bwMode="auto">
+                    <a:xfrm>
+                      <a:off x="0" y="0"/>
+                      <a:ext cx="5905500" cy="3409950"/>
+                    </a:xfrm>
+                    <a:prstGeom prst="rect">
+                      <a:avLst/>
+                    </a:prstGeom>
+                  </pic:spPr>
+                </pic:pic>
+              </a:graphicData>
+            </a:graphic>
+          </wp:inline>
+        </w:drawing>
+      </w:r>
+    </w:p>
+    <w:p>
+      <w:pPr>
+        <w:spacing w:after="200"/>
+        <w:jc w:val="center"/>
+      </w:pPr>
+      <w:r>
+        <w:rPr>
+          <w:i/>
+          <w:iCs/>
+          <w:color w:val="7F7F7F"/>
+          <w:sz w:val="18"/>
+          <w:szCs w:val="18"/>
+        </w:rPr>
+        <w:t xml:space="preserve">Locations, page Analyse 1 : montants payés par type de société et société, mois par mois (2026)</w:t>
+      </w:r>
+    </w:p>
+    <w:p>
+      <w:pPr>
+        <w:keepNext/>
+        <w:spacing w:after="40" w:before="120"/>
+        <w:jc w:val="center"/>
+      </w:pPr>
+      <w:r>
+        <w:drawing>
+          <wp:inline distT="0" distB="0" distL="0" distR="0">
+            <wp:extent cx="5905500" cy="3409950"/>
+            <wp:effectExtent t="0" r="0" b="0" l="0"/>
+            <wp:docPr id="1" name="loc-2.png" descr="Locations, page Analyse 2 : montants payés et durées par salarié, semaine par semaine" title="Locations, page Analyse 2 : montants payés et durées par salarié, semaine par semaine"/>
+            <wp:cNvGraphicFramePr>
+              <a:graphicFrameLocks xmlns:a="http://schemas.openxmlformats.org/drawingml/2006/main" noChangeAspect="1"/>
+            </wp:cNvGraphicFramePr>
+            <a:graphic xmlns:a="http://schemas.openxmlformats.org/drawingml/2006/main">
+              <a:graphicData uri="http://schemas.openxmlformats.org/drawingml/2006/picture">
+                <pic:pic xmlns:pic="http://schemas.openxmlformats.org/drawingml/2006/picture">
+                  <pic:nvPicPr>
+                    <pic:cNvPr id="0" name="" descr=""/>
+                    <pic:cNvPicPr>
+                      <a:picLocks noChangeAspect="1" noChangeArrowheads="1"/>
+                    </pic:cNvPicPr>
+                  </pic:nvPicPr>
+                  <pic:blipFill>
+                    <a:blip r:embed="rId9" cstate="none"/>
+                    <a:srcRect/>
+                    <a:stretch>
+                      <a:fillRect/>
+                    </a:stretch>
+                  </pic:blipFill>
+                  <pic:spPr bwMode="auto">
+                    <a:xfrm>
+                      <a:off x="0" y="0"/>
+                      <a:ext cx="5905500" cy="3409950"/>
+                    </a:xfrm>
+                    <a:prstGeom prst="rect">
+                      <a:avLst/>
+                    </a:prstGeom>
+                  </pic:spPr>
+                </pic:pic>
+              </a:graphicData>
+            </a:graphic>
+          </wp:inline>
+        </w:drawing>
+      </w:r>
+    </w:p>
+    <w:p>
+      <w:pPr>
+        <w:spacing w:after="200"/>
+        <w:jc w:val="center"/>
+      </w:pPr>
+      <w:r>
+        <w:rPr>
+          <w:i/>
+          <w:iCs/>
+          <w:color w:val="7F7F7F"/>
+          <w:sz w:val="18"/>
+          <w:szCs w:val="18"/>
+        </w:rPr>
+        <w:t xml:space="preserve">Locations, page Analyse 2 : montants payés et durées par salarié, semaine par semaine</w:t>
+      </w:r>
+    </w:p>
+    <w:p>
+      <w:pPr>
+        <w:keepNext/>
+        <w:spacing w:after="40" w:before="120"/>
+        <w:jc w:val="center"/>
+      </w:pPr>
+      <w:r>
+        <w:drawing>
+          <wp:inline distT="0" distB="0" distL="0" distR="0">
+            <wp:extent cx="5905500" cy="3409950"/>
+            <wp:effectExtent t="0" r="0" b="0" l="0"/>
+            <wp:docPr id="1" name="loc-3.png" descr="Locations, page Analyse 3 : durées mensuelles par région française et par Land allemand" title="Locations, page Analyse 3 : durées mensuelles par région française et par Land allemand"/>
+            <wp:cNvGraphicFramePr>
+              <a:graphicFrameLocks xmlns:a="http://schemas.openxmlformats.org/drawingml/2006/main" noChangeAspect="1"/>
+            </wp:cNvGraphicFramePr>
+            <a:graphic xmlns:a="http://schemas.openxmlformats.org/drawingml/2006/main">
+              <a:graphicData uri="http://schemas.openxmlformats.org/drawingml/2006/picture">
+                <pic:pic xmlns:pic="http://schemas.openxmlformats.org/drawingml/2006/picture">
+                  <pic:nvPicPr>
+                    <pic:cNvPr id="0" name="" descr=""/>
+                    <pic:cNvPicPr>
+                      <a:picLocks noChangeAspect="1" noChangeArrowheads="1"/>
+                    </pic:cNvPicPr>
+                  </pic:nvPicPr>
+                  <pic:blipFill>
+                    <a:blip r:embed="rId10" cstate="none"/>
+                    <a:srcRect/>
+                    <a:stretch>
+                      <a:fillRect/>
+                    </a:stretch>
+                  </pic:blipFill>
+                  <pic:spPr bwMode="auto">
+                    <a:xfrm>
+                      <a:off x="0" y="0"/>
+                      <a:ext cx="5905500" cy="3409950"/>
+                    </a:xfrm>
+                    <a:prstGeom prst="rect">
+                      <a:avLst/>
+                    </a:prstGeom>
+                  </pic:spPr>
+                </pic:pic>
+              </a:graphicData>
+            </a:graphic>
+          </wp:inline>
+        </w:drawing>
+      </w:r>
+    </w:p>
+    <w:p>
+      <w:pPr>
+        <w:spacing w:after="200"/>
+        <w:jc w:val="center"/>
+      </w:pPr>
+      <w:r>
+        <w:rPr>
+          <w:i/>
+          <w:iCs/>
+          <w:color w:val="7F7F7F"/>
+          <w:sz w:val="18"/>
+          <w:szCs w:val="18"/>
+        </w:rPr>
+        <w:t xml:space="preserve">Locations, page Analyse 3 : durées mensuelles par région française et par Land allemand</w:t>
+      </w:r>
+    </w:p>
+    <w:p>
+      <w:pPr>
         <w:pStyle w:val="Heading2"/>
       </w:pPr>
       <w:r>
@@ -2945,6 +2890,132 @@
       </w:r>
       <w:r>
         <w:t xml:space="preserve"> : les segments Type de société, Gamme et Marque sont hiérarchiques ; cliquez sur la flèche devant une valeur pour descendre jusqu'à la société ou au produit.</w:t>
+      </w:r>
+    </w:p>
+    <w:p>
+      <w:pPr>
+        <w:keepNext/>
+        <w:spacing w:after="40" w:before="120"/>
+        <w:jc w:val="center"/>
+      </w:pPr>
+      <w:r>
+        <w:drawing>
+          <wp:inline distT="0" distB="0" distL="0" distR="0">
+            <wp:extent cx="5905500" cy="3409950"/>
+            <wp:effectExtent t="0" r="0" b="0" l="0"/>
+            <wp:docPr id="1" name="loc-4.png" descr="Locations, page Synthèse 1 : vue d'ensemble par semaine, marque, secteur et région" title="Locations, page Synthèse 1 : vue d'ensemble par semaine, marque, secteur et région"/>
+            <wp:cNvGraphicFramePr>
+              <a:graphicFrameLocks xmlns:a="http://schemas.openxmlformats.org/drawingml/2006/main" noChangeAspect="1"/>
+            </wp:cNvGraphicFramePr>
+            <a:graphic xmlns:a="http://schemas.openxmlformats.org/drawingml/2006/main">
+              <a:graphicData uri="http://schemas.openxmlformats.org/drawingml/2006/picture">
+                <pic:pic xmlns:pic="http://schemas.openxmlformats.org/drawingml/2006/picture">
+                  <pic:nvPicPr>
+                    <pic:cNvPr id="0" name="" descr=""/>
+                    <pic:cNvPicPr>
+                      <a:picLocks noChangeAspect="1" noChangeArrowheads="1"/>
+                    </pic:cNvPicPr>
+                  </pic:nvPicPr>
+                  <pic:blipFill>
+                    <a:blip r:embed="rId11" cstate="none"/>
+                    <a:srcRect/>
+                    <a:stretch>
+                      <a:fillRect/>
+                    </a:stretch>
+                  </pic:blipFill>
+                  <pic:spPr bwMode="auto">
+                    <a:xfrm>
+                      <a:off x="0" y="0"/>
+                      <a:ext cx="5905500" cy="3409950"/>
+                    </a:xfrm>
+                    <a:prstGeom prst="rect">
+                      <a:avLst/>
+                    </a:prstGeom>
+                  </pic:spPr>
+                </pic:pic>
+              </a:graphicData>
+            </a:graphic>
+          </wp:inline>
+        </w:drawing>
+      </w:r>
+    </w:p>
+    <w:p>
+      <w:pPr>
+        <w:spacing w:after="200"/>
+        <w:jc w:val="center"/>
+      </w:pPr>
+      <w:r>
+        <w:rPr>
+          <w:i/>
+          <w:iCs/>
+          <w:color w:val="7F7F7F"/>
+          <w:sz w:val="18"/>
+          <w:szCs w:val="18"/>
+        </w:rPr>
+        <w:t xml:space="preserve">Locations, page Synthèse 1 : vue d'ensemble par semaine, marque, secteur et région</w:t>
+      </w:r>
+    </w:p>
+    <w:p>
+      <w:pPr>
+        <w:keepNext/>
+        <w:spacing w:after="40" w:before="120"/>
+        <w:jc w:val="center"/>
+      </w:pPr>
+      <w:r>
+        <w:drawing>
+          <wp:inline distT="0" distB="0" distL="0" distR="0">
+            <wp:extent cx="5905500" cy="3409950"/>
+            <wp:effectExtent t="0" r="0" b="0" l="0"/>
+            <wp:docPr id="1" name="loc-5.png" descr="Locations, page Synthèse 2 : comparaison N / N-1 et répartition par catégorie et par société" title="Locations, page Synthèse 2 : comparaison N / N-1 et répartition par catégorie et par société"/>
+            <wp:cNvGraphicFramePr>
+              <a:graphicFrameLocks xmlns:a="http://schemas.openxmlformats.org/drawingml/2006/main" noChangeAspect="1"/>
+            </wp:cNvGraphicFramePr>
+            <a:graphic xmlns:a="http://schemas.openxmlformats.org/drawingml/2006/main">
+              <a:graphicData uri="http://schemas.openxmlformats.org/drawingml/2006/picture">
+                <pic:pic xmlns:pic="http://schemas.openxmlformats.org/drawingml/2006/picture">
+                  <pic:nvPicPr>
+                    <pic:cNvPr id="0" name="" descr=""/>
+                    <pic:cNvPicPr>
+                      <a:picLocks noChangeAspect="1" noChangeArrowheads="1"/>
+                    </pic:cNvPicPr>
+                  </pic:nvPicPr>
+                  <pic:blipFill>
+                    <a:blip r:embed="rId12" cstate="none"/>
+                    <a:srcRect/>
+                    <a:stretch>
+                      <a:fillRect/>
+                    </a:stretch>
+                  </pic:blipFill>
+                  <pic:spPr bwMode="auto">
+                    <a:xfrm>
+                      <a:off x="0" y="0"/>
+                      <a:ext cx="5905500" cy="3409950"/>
+                    </a:xfrm>
+                    <a:prstGeom prst="rect">
+                      <a:avLst/>
+                    </a:prstGeom>
+                  </pic:spPr>
+                </pic:pic>
+              </a:graphicData>
+            </a:graphic>
+          </wp:inline>
+        </w:drawing>
+      </w:r>
+    </w:p>
+    <w:p>
+      <w:pPr>
+        <w:spacing w:after="200"/>
+        <w:jc w:val="center"/>
+      </w:pPr>
+      <w:r>
+        <w:rPr>
+          <w:i/>
+          <w:iCs/>
+          <w:color w:val="7F7F7F"/>
+          <w:sz w:val="18"/>
+          <w:szCs w:val="18"/>
+        </w:rPr>
+        <w:t xml:space="preserve">Locations, page Synthèse 2 : comparaison N / N-1 et répartition par catégorie et par société</w:t>
       </w:r>
     </w:p>
     <w:p>
@@ -4387,6 +4458,69 @@
     </w:p>
     <w:p>
       <w:pPr>
+        <w:keepNext/>
+        <w:spacing w:after="40" w:before="120"/>
+        <w:jc w:val="center"/>
+      </w:pPr>
+      <w:r>
+        <w:drawing>
+          <wp:inline distT="0" distB="0" distL="0" distR="0">
+            <wp:extent cx="5905500" cy="3409950"/>
+            <wp:effectExtent t="0" r="0" b="0" l="0"/>
+            <wp:docPr id="1" name="ventes-1.png" descr="Ventes, page Analyse des ventes" title="Ventes, page Analyse des ventes"/>
+            <wp:cNvGraphicFramePr>
+              <a:graphicFrameLocks xmlns:a="http://schemas.openxmlformats.org/drawingml/2006/main" noChangeAspect="1"/>
+            </wp:cNvGraphicFramePr>
+            <a:graphic xmlns:a="http://schemas.openxmlformats.org/drawingml/2006/main">
+              <a:graphicData uri="http://schemas.openxmlformats.org/drawingml/2006/picture">
+                <pic:pic xmlns:pic="http://schemas.openxmlformats.org/drawingml/2006/picture">
+                  <pic:nvPicPr>
+                    <pic:cNvPr id="0" name="" descr=""/>
+                    <pic:cNvPicPr>
+                      <a:picLocks noChangeAspect="1" noChangeArrowheads="1"/>
+                    </pic:cNvPicPr>
+                  </pic:nvPicPr>
+                  <pic:blipFill>
+                    <a:blip r:embed="rId13" cstate="none"/>
+                    <a:srcRect/>
+                    <a:stretch>
+                      <a:fillRect/>
+                    </a:stretch>
+                  </pic:blipFill>
+                  <pic:spPr bwMode="auto">
+                    <a:xfrm>
+                      <a:off x="0" y="0"/>
+                      <a:ext cx="5905500" cy="3409950"/>
+                    </a:xfrm>
+                    <a:prstGeom prst="rect">
+                      <a:avLst/>
+                    </a:prstGeom>
+                  </pic:spPr>
+                </pic:pic>
+              </a:graphicData>
+            </a:graphic>
+          </wp:inline>
+        </w:drawing>
+      </w:r>
+    </w:p>
+    <w:p>
+      <w:pPr>
+        <w:spacing w:after="200"/>
+        <w:jc w:val="center"/>
+      </w:pPr>
+      <w:r>
+        <w:rPr>
+          <w:i/>
+          <w:iCs/>
+          <w:color w:val="7F7F7F"/>
+          <w:sz w:val="18"/>
+          <w:szCs w:val="18"/>
+        </w:rPr>
+        <w:t xml:space="preserve">Ventes, page Analyse des ventes</w:t>
+      </w:r>
+    </w:p>
+    <w:p>
+      <w:pPr>
         <w:spacing w:after="120"/>
       </w:pPr>
       <w:r>
@@ -4737,6 +4871,69 @@
       <w:pPr>
         <w:spacing w:after="120"/>
       </w:pPr>
+    </w:p>
+    <w:p>
+      <w:pPr>
+        <w:keepNext/>
+        <w:spacing w:after="40" w:before="120"/>
+        <w:jc w:val="center"/>
+      </w:pPr>
+      <w:r>
+        <w:drawing>
+          <wp:inline distT="0" distB="0" distL="0" distR="0">
+            <wp:extent cx="5905500" cy="3409950"/>
+            <wp:effectExtent t="0" r="0" b="0" l="0"/>
+            <wp:docPr id="1" name="ventes-2.png" descr="Ventes, page Comparaison annuelle" title="Ventes, page Comparaison annuelle"/>
+            <wp:cNvGraphicFramePr>
+              <a:graphicFrameLocks xmlns:a="http://schemas.openxmlformats.org/drawingml/2006/main" noChangeAspect="1"/>
+            </wp:cNvGraphicFramePr>
+            <a:graphic xmlns:a="http://schemas.openxmlformats.org/drawingml/2006/main">
+              <a:graphicData uri="http://schemas.openxmlformats.org/drawingml/2006/picture">
+                <pic:pic xmlns:pic="http://schemas.openxmlformats.org/drawingml/2006/picture">
+                  <pic:nvPicPr>
+                    <pic:cNvPr id="0" name="" descr=""/>
+                    <pic:cNvPicPr>
+                      <a:picLocks noChangeAspect="1" noChangeArrowheads="1"/>
+                    </pic:cNvPicPr>
+                  </pic:nvPicPr>
+                  <pic:blipFill>
+                    <a:blip r:embed="rId14" cstate="none"/>
+                    <a:srcRect/>
+                    <a:stretch>
+                      <a:fillRect/>
+                    </a:stretch>
+                  </pic:blipFill>
+                  <pic:spPr bwMode="auto">
+                    <a:xfrm>
+                      <a:off x="0" y="0"/>
+                      <a:ext cx="5905500" cy="3409950"/>
+                    </a:xfrm>
+                    <a:prstGeom prst="rect">
+                      <a:avLst/>
+                    </a:prstGeom>
+                  </pic:spPr>
+                </pic:pic>
+              </a:graphicData>
+            </a:graphic>
+          </wp:inline>
+        </w:drawing>
+      </w:r>
+    </w:p>
+    <w:p>
+      <w:pPr>
+        <w:spacing w:after="200"/>
+        <w:jc w:val="center"/>
+      </w:pPr>
+      <w:r>
+        <w:rPr>
+          <w:i/>
+          <w:iCs/>
+          <w:color w:val="7F7F7F"/>
+          <w:sz w:val="18"/>
+          <w:szCs w:val="18"/>
+        </w:rPr>
+        <w:t xml:space="preserve">Ventes, page Comparaison annuelle</w:t>
+      </w:r>
     </w:p>
     <w:p>
       <w:pPr>
@@ -6640,7 +6837,7 @@
               <w:spacing w:after="0"/>
             </w:pPr>
             <w:r>
-              <w:t xml:space="preserve">Rafraîchissez d'abord les vues matérialisées dans Oracle (section 2), puis actualisez Power BI.</w:t>
+              <w:t xml:space="preserve">Demandez au service informatique de rafraîchir les vues matérialisées dans Oracle (annexe), puis actualisez Power BI.</w:t>
             </w:r>
           </w:p>
         </w:tc>
@@ -6816,6 +7013,727 @@
       <w:pPr>
         <w:spacing w:after="120"/>
       </w:pPr>
+    </w:p>
+    <w:p>
+      <w:r>
+        <w:br w:type="page"/>
+      </w:r>
+    </w:p>
+    <w:p>
+      <w:pPr>
+        <w:pStyle w:val="Heading1"/>
+      </w:pPr>
+      <w:r>
+        <w:t xml:space="preserve">Annexe : administration des magasins (service informatique)</w:t>
+      </w:r>
+    </w:p>
+    <w:p>
+      <w:pPr>
+        <w:spacing w:after="120"/>
+      </w:pPr>
+      <w:r>
+        <w:t xml:space="preserve">Cette annexe décrit les opérations faites dans Oracle par le service informatique. Les décideurs n'en ont pas besoin.</w:t>
+      </w:r>
+    </w:p>
+    <w:p>
+      <w:pPr>
+        <w:pStyle w:val="Heading2"/>
+      </w:pPr>
+      <w:r>
+        <w:t xml:space="preserve">Se connecter à Oracle avec SQL Developer</w:t>
+      </w:r>
+    </w:p>
+    <w:p>
+      <w:pPr>
+        <w:spacing w:after="120"/>
+      </w:pPr>
+      <w:r>
+        <w:t xml:space="preserve">Créez une connexion (bouton </w:t>
+      </w:r>
+      <w:r>
+        <w:rPr>
+          <w:b/>
+          <w:bCs/>
+        </w:rPr>
+        <w:t xml:space="preserve">+</w:t>
+      </w:r>
+      <w:r>
+        <w:t xml:space="preserve"> vert) avec votre compte Oracle. Depuis le réseau de l'université : hôte </w:t>
+      </w:r>
+      <w:r>
+        <w:rPr>
+          <w:rFonts w:ascii="Consolas" w:cs="Consolas" w:eastAsia="Consolas" w:hAnsi="Consolas"/>
+          <w:sz w:val="19"/>
+          <w:szCs w:val="19"/>
+        </w:rPr>
+        <w:t xml:space="preserve">etu-ora2.ut-capitole.fr</w:t>
+      </w:r>
+      <w:r>
+        <w:t xml:space="preserve">, port </w:t>
+      </w:r>
+      <w:r>
+        <w:rPr>
+          <w:rFonts w:ascii="Consolas" w:cs="Consolas" w:eastAsia="Consolas" w:hAnsi="Consolas"/>
+          <w:sz w:val="19"/>
+          <w:szCs w:val="19"/>
+        </w:rPr>
+        <w:t xml:space="preserve">1550</w:t>
+      </w:r>
+      <w:r>
+        <w:t xml:space="preserve">, SID </w:t>
+      </w:r>
+      <w:r>
+        <w:rPr>
+          <w:rFonts w:ascii="Consolas" w:cs="Consolas" w:eastAsia="Consolas" w:hAnsi="Consolas"/>
+          <w:sz w:val="19"/>
+          <w:szCs w:val="19"/>
+        </w:rPr>
+        <w:t xml:space="preserve">siad</w:t>
+      </w:r>
+      <w:r>
+        <w:t xml:space="preserve">. Depuis l'extérieur, à travers le tunnel SSH : hôte </w:t>
+      </w:r>
+      <w:r>
+        <w:rPr>
+          <w:rFonts w:ascii="Consolas" w:cs="Consolas" w:eastAsia="Consolas" w:hAnsi="Consolas"/>
+          <w:sz w:val="19"/>
+          <w:szCs w:val="19"/>
+        </w:rPr>
+        <w:t xml:space="preserve">localhost</w:t>
+      </w:r>
+      <w:r>
+        <w:t xml:space="preserve">, même port et même SID. Cliquez sur </w:t>
+      </w:r>
+      <w:r>
+        <w:rPr>
+          <w:b/>
+          <w:bCs/>
+        </w:rPr>
+        <w:t xml:space="preserve">Tester</w:t>
+      </w:r>
+      <w:r>
+        <w:t xml:space="preserve"> puis </w:t>
+      </w:r>
+      <w:r>
+        <w:rPr>
+          <w:b/>
+          <w:bCs/>
+        </w:rPr>
+        <w:t xml:space="preserve">Connexion</w:t>
+      </w:r>
+      <w:r>
+        <w:t xml:space="preserve">.</w:t>
+      </w:r>
+    </w:p>
+    <w:p>
+      <w:pPr>
+        <w:keepNext/>
+        <w:spacing w:after="40" w:before="120"/>
+        <w:jc w:val="center"/>
+      </w:pPr>
+      <w:r>
+        <w:drawing>
+          <wp:inline distT="0" distB="0" distL="0" distR="0">
+            <wp:extent cx="4953000" cy="3181350"/>
+            <wp:effectExtent t="0" r="0" b="0" l="0"/>
+            <wp:docPr id="1" name="oracle_connexion.png" descr="Connexion SQL Developer à travers le tunnel SSH (hôte localhost, port 1550, SID siad)" title="Connexion SQL Developer à travers le tunnel SSH (hôte localhost, port 1550, SID siad)"/>
+            <wp:cNvGraphicFramePr>
+              <a:graphicFrameLocks xmlns:a="http://schemas.openxmlformats.org/drawingml/2006/main" noChangeAspect="1"/>
+            </wp:cNvGraphicFramePr>
+            <a:graphic xmlns:a="http://schemas.openxmlformats.org/drawingml/2006/main">
+              <a:graphicData uri="http://schemas.openxmlformats.org/drawingml/2006/picture">
+                <pic:pic xmlns:pic="http://schemas.openxmlformats.org/drawingml/2006/picture">
+                  <pic:nvPicPr>
+                    <pic:cNvPr id="0" name="" descr=""/>
+                    <pic:cNvPicPr>
+                      <a:picLocks noChangeAspect="1" noChangeArrowheads="1"/>
+                    </pic:cNvPicPr>
+                  </pic:nvPicPr>
+                  <pic:blipFill>
+                    <a:blip r:embed="rId15" cstate="none"/>
+                    <a:srcRect/>
+                    <a:stretch>
+                      <a:fillRect/>
+                    </a:stretch>
+                  </pic:blipFill>
+                  <pic:spPr bwMode="auto">
+                    <a:xfrm>
+                      <a:off x="0" y="0"/>
+                      <a:ext cx="4953000" cy="3181350"/>
+                    </a:xfrm>
+                    <a:prstGeom prst="rect">
+                      <a:avLst/>
+                    </a:prstGeom>
+                  </pic:spPr>
+                </pic:pic>
+              </a:graphicData>
+            </a:graphic>
+          </wp:inline>
+        </w:drawing>
+      </w:r>
+    </w:p>
+    <w:p>
+      <w:pPr>
+        <w:spacing w:after="200"/>
+        <w:jc w:val="center"/>
+      </w:pPr>
+      <w:r>
+        <w:rPr>
+          <w:i/>
+          <w:iCs/>
+          <w:color w:val="7F7F7F"/>
+          <w:sz w:val="18"/>
+          <w:szCs w:val="18"/>
+        </w:rPr>
+        <w:t xml:space="preserve">Connexion SQL Developer à travers le tunnel SSH (hôte localhost, port 1550, SID siad)</w:t>
+      </w:r>
+    </w:p>
+    <w:p>
+      <w:pPr>
+        <w:pStyle w:val="Heading2"/>
+      </w:pPr>
+      <w:r>
+        <w:t xml:space="preserve">Mettre les magasins à jour après un nouveau chargement</w:t>
+      </w:r>
+    </w:p>
+    <w:p>
+      <w:pPr>
+        <w:spacing w:after="120"/>
+      </w:pPr>
+      <w:r>
+        <w:t xml:space="preserve">Les magasins sont des vues matérialisées rafraîchies à la demande. Après chaque alimentation de l'entrepôt, lancez dans SQL Developer le bloc de rafraîchissement du magasin concerné, puis cliquez sur </w:t>
+      </w:r>
+      <w:r>
+        <w:rPr>
+          <w:b/>
+          <w:bCs/>
+        </w:rPr>
+        <w:t xml:space="preserve">Actualiser</w:t>
+      </w:r>
+      <w:r>
+        <w:t xml:space="preserve"> dans Power BI.</w:t>
+      </w:r>
+    </w:p>
+    <w:p>
+      <w:pPr>
+        <w:spacing w:after="120"/>
+      </w:pPr>
+      <w:r>
+        <w:rPr>
+          <w:b/>
+          <w:bCs/>
+        </w:rPr>
+        <w:t xml:space="preserve">Magasin des ventes</w:t>
+      </w:r>
+      <w:r>
+        <w:t xml:space="preserve"> : le bloc se trouve à la fin de </w:t>
+      </w:r>
+      <w:r>
+        <w:rPr>
+          <w:rFonts w:ascii="Consolas" w:cs="Consolas" w:eastAsia="Consolas" w:hAnsi="Consolas"/>
+          <w:sz w:val="19"/>
+          <w:szCs w:val="19"/>
+        </w:rPr>
+        <w:t xml:space="preserve">sql/md_ventes/01_Achat_MD_structure_agregats.sql</w:t>
+      </w:r>
+      <w:r>
+        <w:t xml:space="preserve">. Il rafraîchit les dimensions, puis le fait, puis les agrégats, dans cet ordre :</w:t>
+      </w:r>
+    </w:p>
+    <w:p>
+      <w:pPr>
+        <w:shd w:fill="F2F2F2" w:color="auto" w:val="clear"/>
+        <w:spacing w:after="0"/>
+        <w:ind w:left="200"/>
+      </w:pPr>
+      <w:r>
+        <w:rPr>
+          <w:rFonts w:ascii="Consolas" w:cs="Consolas" w:eastAsia="Consolas" w:hAnsi="Consolas"/>
+          <w:sz w:val="18"/>
+          <w:szCs w:val="18"/>
+        </w:rPr>
+        <w:t xml:space="preserve">BEGIN</w:t>
+      </w:r>
+    </w:p>
+    <w:p>
+      <w:pPr>
+        <w:shd w:fill="F2F2F2" w:color="auto" w:val="clear"/>
+        <w:spacing w:after="0"/>
+        <w:ind w:left="200"/>
+      </w:pPr>
+      <w:r>
+        <w:rPr>
+          <w:rFonts w:ascii="Consolas" w:cs="Consolas" w:eastAsia="Consolas" w:hAnsi="Consolas"/>
+          <w:sz w:val="18"/>
+          <w:szCs w:val="18"/>
+        </w:rPr>
+        <w:t xml:space="preserve">  DBMS_MVIEW.REFRESH('TEMPS_MD2',   method =&gt; 'C');</w:t>
+      </w:r>
+    </w:p>
+    <w:p>
+      <w:pPr>
+        <w:shd w:fill="F2F2F2" w:color="auto" w:val="clear"/>
+        <w:spacing w:after="0"/>
+        <w:ind w:left="200"/>
+      </w:pPr>
+      <w:r>
+        <w:rPr>
+          <w:rFonts w:ascii="Consolas" w:cs="Consolas" w:eastAsia="Consolas" w:hAnsi="Consolas"/>
+          <w:sz w:val="18"/>
+          <w:szCs w:val="18"/>
+        </w:rPr>
+        <w:t xml:space="preserve">  DBMS_MVIEW.REFRESH('PRODUIT_MD2', method =&gt; 'C');</w:t>
+      </w:r>
+    </w:p>
+    <w:p>
+      <w:pPr>
+        <w:shd w:fill="F2F2F2" w:color="auto" w:val="clear"/>
+        <w:spacing w:after="0"/>
+        <w:ind w:left="200"/>
+      </w:pPr>
+      <w:r>
+        <w:rPr>
+          <w:rFonts w:ascii="Consolas" w:cs="Consolas" w:eastAsia="Consolas" w:hAnsi="Consolas"/>
+          <w:sz w:val="18"/>
+          <w:szCs w:val="18"/>
+        </w:rPr>
+        <w:t xml:space="preserve">  DBMS_MVIEW.REFRESH('METIER_MD2',  method =&gt; 'C');</w:t>
+      </w:r>
+    </w:p>
+    <w:p>
+      <w:pPr>
+        <w:shd w:fill="F2F2F2" w:color="auto" w:val="clear"/>
+        <w:spacing w:after="0"/>
+        <w:ind w:left="200"/>
+      </w:pPr>
+      <w:r>
+        <w:rPr>
+          <w:rFonts w:ascii="Consolas" w:cs="Consolas" w:eastAsia="Consolas" w:hAnsi="Consolas"/>
+          <w:sz w:val="18"/>
+          <w:szCs w:val="18"/>
+        </w:rPr>
+        <w:t xml:space="preserve">  DBMS_MVIEW.REFRESH('EMPLOYE_MD2', method =&gt; 'C');</w:t>
+      </w:r>
+    </w:p>
+    <w:p>
+      <w:pPr>
+        <w:shd w:fill="F2F2F2" w:color="auto" w:val="clear"/>
+        <w:spacing w:after="0"/>
+        <w:ind w:left="200"/>
+      </w:pPr>
+      <w:r>
+        <w:rPr>
+          <w:rFonts w:ascii="Consolas" w:cs="Consolas" w:eastAsia="Consolas" w:hAnsi="Consolas"/>
+          <w:sz w:val="18"/>
+          <w:szCs w:val="18"/>
+        </w:rPr>
+        <w:t xml:space="preserve">  DBMS_MVIEW.REFRESH('ACHAT_MD2',   method =&gt; 'C');</w:t>
+      </w:r>
+    </w:p>
+    <w:p>
+      <w:pPr>
+        <w:shd w:fill="F2F2F2" w:color="auto" w:val="clear"/>
+        <w:spacing w:after="0"/>
+        <w:ind w:left="200"/>
+      </w:pPr>
+      <w:r>
+        <w:rPr>
+          <w:rFonts w:ascii="Consolas" w:cs="Consolas" w:eastAsia="Consolas" w:hAnsi="Consolas"/>
+          <w:sz w:val="18"/>
+          <w:szCs w:val="18"/>
+        </w:rPr>
+        <w:t xml:space="preserve">  DBMS_MVIEW.REFRESH('MV_ACH_GAM_REG_MOIS', method =&gt; 'C');</w:t>
+      </w:r>
+    </w:p>
+    <w:p>
+      <w:pPr>
+        <w:shd w:fill="F2F2F2" w:color="auto" w:val="clear"/>
+        <w:spacing w:after="0"/>
+        <w:ind w:left="200"/>
+      </w:pPr>
+      <w:r>
+        <w:rPr>
+          <w:rFonts w:ascii="Consolas" w:cs="Consolas" w:eastAsia="Consolas" w:hAnsi="Consolas"/>
+          <w:sz w:val="18"/>
+          <w:szCs w:val="18"/>
+        </w:rPr>
+        <w:t xml:space="preserve">  DBMS_MVIEW.REFRESH('MV_ACH_PAYS_MOIS',    method =&gt; 'C');</w:t>
+      </w:r>
+    </w:p>
+    <w:p>
+      <w:pPr>
+        <w:shd w:fill="F2F2F2" w:color="auto" w:val="clear"/>
+        <w:spacing w:after="0"/>
+        <w:ind w:left="200"/>
+      </w:pPr>
+      <w:r>
+        <w:rPr>
+          <w:rFonts w:ascii="Consolas" w:cs="Consolas" w:eastAsia="Consolas" w:hAnsi="Consolas"/>
+          <w:sz w:val="18"/>
+          <w:szCs w:val="18"/>
+        </w:rPr>
+        <w:t xml:space="preserve">  DBMS_MVIEW.REFRESH('MV_ACH_TYPE_CJ_MOIS', method =&gt; 'C');</w:t>
+      </w:r>
+    </w:p>
+    <w:p>
+      <w:pPr>
+        <w:shd w:fill="F2F2F2" w:color="auto" w:val="clear"/>
+        <w:spacing w:after="0"/>
+        <w:ind w:left="200"/>
+      </w:pPr>
+      <w:r>
+        <w:rPr>
+          <w:rFonts w:ascii="Consolas" w:cs="Consolas" w:eastAsia="Consolas" w:hAnsi="Consolas"/>
+          <w:sz w:val="18"/>
+          <w:szCs w:val="18"/>
+        </w:rPr>
+        <w:t xml:space="preserve">END;</w:t>
+      </w:r>
+    </w:p>
+    <w:p>
+      <w:pPr>
+        <w:shd w:fill="F2F2F2" w:color="auto" w:val="clear"/>
+        <w:spacing w:after="160"/>
+        <w:ind w:left="200"/>
+      </w:pPr>
+      <w:r>
+        <w:rPr>
+          <w:rFonts w:ascii="Consolas" w:cs="Consolas" w:eastAsia="Consolas" w:hAnsi="Consolas"/>
+          <w:sz w:val="18"/>
+          <w:szCs w:val="18"/>
+        </w:rPr>
+        <w:t xml:space="preserve">/</w:t>
+      </w:r>
+    </w:p>
+    <w:p>
+      <w:pPr>
+        <w:spacing w:after="120"/>
+      </w:pPr>
+      <w:r>
+        <w:rPr>
+          <w:b/>
+          <w:bCs/>
+        </w:rPr>
+        <w:t xml:space="preserve">Magasin des locations</w:t>
+      </w:r>
+      <w:r>
+        <w:t xml:space="preserve"> : même principe, dimensions et fait d'abord, puis les agrégats (</w:t>
+      </w:r>
+      <w:r>
+        <w:rPr>
+          <w:rFonts w:ascii="Consolas" w:cs="Consolas" w:eastAsia="Consolas" w:hAnsi="Consolas"/>
+          <w:sz w:val="19"/>
+          <w:szCs w:val="19"/>
+        </w:rPr>
+        <w:t xml:space="preserve">AGG_MOIS_REGION_MD1</w:t>
+      </w:r>
+      <w:r>
+        <w:t xml:space="preserve"> en dernier, car il est calculé à partir de </w:t>
+      </w:r>
+      <w:r>
+        <w:rPr>
+          <w:rFonts w:ascii="Consolas" w:cs="Consolas" w:eastAsia="Consolas" w:hAnsi="Consolas"/>
+          <w:sz w:val="19"/>
+          <w:szCs w:val="19"/>
+        </w:rPr>
+        <w:t xml:space="preserve">AGG_MOIS_SOCIETE_MD1</w:t>
+      </w:r>
+      <w:r>
+        <w:t xml:space="preserve">) :</w:t>
+      </w:r>
+    </w:p>
+    <w:p>
+      <w:pPr>
+        <w:shd w:fill="F2F2F2" w:color="auto" w:val="clear"/>
+        <w:spacing w:after="0"/>
+        <w:ind w:left="200"/>
+      </w:pPr>
+      <w:r>
+        <w:rPr>
+          <w:rFonts w:ascii="Consolas" w:cs="Consolas" w:eastAsia="Consolas" w:hAnsi="Consolas"/>
+          <w:sz w:val="18"/>
+          <w:szCs w:val="18"/>
+        </w:rPr>
+        <w:t xml:space="preserve">BEGIN</w:t>
+      </w:r>
+    </w:p>
+    <w:p>
+      <w:pPr>
+        <w:shd w:fill="F2F2F2" w:color="auto" w:val="clear"/>
+        <w:spacing w:after="0"/>
+        <w:ind w:left="200"/>
+      </w:pPr>
+      <w:r>
+        <w:rPr>
+          <w:rFonts w:ascii="Consolas" w:cs="Consolas" w:eastAsia="Consolas" w:hAnsi="Consolas"/>
+          <w:sz w:val="18"/>
+          <w:szCs w:val="18"/>
+        </w:rPr>
+        <w:t xml:space="preserve">  DBMS_MVIEW.REFRESH('TEMPS_MD1',      method =&gt; 'C');</w:t>
+      </w:r>
+    </w:p>
+    <w:p>
+      <w:pPr>
+        <w:shd w:fill="F2F2F2" w:color="auto" w:val="clear"/>
+        <w:spacing w:after="0"/>
+        <w:ind w:left="200"/>
+      </w:pPr>
+      <w:r>
+        <w:rPr>
+          <w:rFonts w:ascii="Consolas" w:cs="Consolas" w:eastAsia="Consolas" w:hAnsi="Consolas"/>
+          <w:sz w:val="18"/>
+          <w:szCs w:val="18"/>
+        </w:rPr>
+        <w:t xml:space="preserve">  DBMS_MVIEW.REFRESH('EXEMPLAIRE_MD1', method =&gt; 'C');</w:t>
+      </w:r>
+    </w:p>
+    <w:p>
+      <w:pPr>
+        <w:shd w:fill="F2F2F2" w:color="auto" w:val="clear"/>
+        <w:spacing w:after="0"/>
+        <w:ind w:left="200"/>
+      </w:pPr>
+      <w:r>
+        <w:rPr>
+          <w:rFonts w:ascii="Consolas" w:cs="Consolas" w:eastAsia="Consolas" w:hAnsi="Consolas"/>
+          <w:sz w:val="18"/>
+          <w:szCs w:val="18"/>
+        </w:rPr>
+        <w:t xml:space="preserve">  DBMS_MVIEW.REFRESH('EMPLOYE_MD1',    method =&gt; 'C');</w:t>
+      </w:r>
+    </w:p>
+    <w:p>
+      <w:pPr>
+        <w:shd w:fill="F2F2F2" w:color="auto" w:val="clear"/>
+        <w:spacing w:after="0"/>
+        <w:ind w:left="200"/>
+      </w:pPr>
+      <w:r>
+        <w:rPr>
+          <w:rFonts w:ascii="Consolas" w:cs="Consolas" w:eastAsia="Consolas" w:hAnsi="Consolas"/>
+          <w:sz w:val="18"/>
+          <w:szCs w:val="18"/>
+        </w:rPr>
+        <w:t xml:space="preserve">  DBMS_MVIEW.REFRESH('LOCATION_MD1',   method =&gt; 'C');</w:t>
+      </w:r>
+    </w:p>
+    <w:p>
+      <w:pPr>
+        <w:shd w:fill="F2F2F2" w:color="auto" w:val="clear"/>
+        <w:spacing w:after="0"/>
+        <w:ind w:left="200"/>
+      </w:pPr>
+      <w:r>
+        <w:rPr>
+          <w:rFonts w:ascii="Consolas" w:cs="Consolas" w:eastAsia="Consolas" w:hAnsi="Consolas"/>
+          <w:sz w:val="18"/>
+          <w:szCs w:val="18"/>
+        </w:rPr>
+        <w:t xml:space="preserve">  DBMS_MVIEW.REFRESH('AGG_SEM_EMPLOYE_MD1',  method =&gt; 'C');</w:t>
+      </w:r>
+    </w:p>
+    <w:p>
+      <w:pPr>
+        <w:shd w:fill="F2F2F2" w:color="auto" w:val="clear"/>
+        <w:spacing w:after="0"/>
+        <w:ind w:left="200"/>
+      </w:pPr>
+      <w:r>
+        <w:rPr>
+          <w:rFonts w:ascii="Consolas" w:cs="Consolas" w:eastAsia="Consolas" w:hAnsi="Consolas"/>
+          <w:sz w:val="18"/>
+          <w:szCs w:val="18"/>
+        </w:rPr>
+        <w:t xml:space="preserve">  DBMS_MVIEW.REFRESH('AGG_MOIS_SOCIETE_MD1', method =&gt; 'C');</w:t>
+      </w:r>
+    </w:p>
+    <w:p>
+      <w:pPr>
+        <w:shd w:fill="F2F2F2" w:color="auto" w:val="clear"/>
+        <w:spacing w:after="0"/>
+        <w:ind w:left="200"/>
+      </w:pPr>
+      <w:r>
+        <w:rPr>
+          <w:rFonts w:ascii="Consolas" w:cs="Consolas" w:eastAsia="Consolas" w:hAnsi="Consolas"/>
+          <w:sz w:val="18"/>
+          <w:szCs w:val="18"/>
+        </w:rPr>
+        <w:t xml:space="preserve">  DBMS_MVIEW.REFRESH('AGG_MOIS_REGION_MD1',  method =&gt; 'C');</w:t>
+      </w:r>
+    </w:p>
+    <w:p>
+      <w:pPr>
+        <w:shd w:fill="F2F2F2" w:color="auto" w:val="clear"/>
+        <w:spacing w:after="0"/>
+        <w:ind w:left="200"/>
+      </w:pPr>
+      <w:r>
+        <w:rPr>
+          <w:rFonts w:ascii="Consolas" w:cs="Consolas" w:eastAsia="Consolas" w:hAnsi="Consolas"/>
+          <w:sz w:val="18"/>
+          <w:szCs w:val="18"/>
+        </w:rPr>
+        <w:t xml:space="preserve">END;</w:t>
+      </w:r>
+    </w:p>
+    <w:p>
+      <w:pPr>
+        <w:shd w:fill="F2F2F2" w:color="auto" w:val="clear"/>
+        <w:spacing w:after="160"/>
+        <w:ind w:left="200"/>
+      </w:pPr>
+      <w:r>
+        <w:rPr>
+          <w:rFonts w:ascii="Consolas" w:cs="Consolas" w:eastAsia="Consolas" w:hAnsi="Consolas"/>
+          <w:sz w:val="18"/>
+          <w:szCs w:val="18"/>
+        </w:rPr>
+        <w:t xml:space="preserve">/</w:t>
+      </w:r>
+    </w:p>
+    <w:p>
+      <w:pPr>
+        <w:pStyle w:val="Heading2"/>
+      </w:pPr>
+      <w:r>
+        <w:t xml:space="preserve">Contrôler le magasin des ventes</w:t>
+      </w:r>
+    </w:p>
+    <w:p>
+      <w:pPr>
+        <w:spacing w:after="120"/>
+      </w:pPr>
+      <w:r>
+        <w:t xml:space="preserve">Après chaque rafraîchissement, on vérifie que toutes les quantités achetées dans l'entrepôt se retrouvent dans le fait du magasin. Les deux nombres doivent être égaux.</w:t>
+      </w:r>
+    </w:p>
+    <w:p>
+      <w:pPr>
+        <w:shd w:fill="F2F2F2" w:color="auto" w:val="clear"/>
+        <w:spacing w:after="0"/>
+        <w:ind w:left="200"/>
+      </w:pPr>
+      <w:r>
+        <w:rPr>
+          <w:rFonts w:ascii="Consolas" w:cs="Consolas" w:eastAsia="Consolas" w:hAnsi="Consolas"/>
+          <w:sz w:val="18"/>
+          <w:szCs w:val="18"/>
+        </w:rPr>
+        <w:t xml:space="preserve">SELECT (SELECT SUM(Qte)          FROM ACHAT)     AS qte_entrepot,</w:t>
+      </w:r>
+    </w:p>
+    <w:p>
+      <w:pPr>
+        <w:shd w:fill="F2F2F2" w:color="auto" w:val="clear"/>
+        <w:spacing w:after="0"/>
+        <w:ind w:left="200"/>
+      </w:pPr>
+      <w:r>
+        <w:rPr>
+          <w:rFonts w:ascii="Consolas" w:cs="Consolas" w:eastAsia="Consolas" w:hAnsi="Consolas"/>
+          <w:sz w:val="18"/>
+          <w:szCs w:val="18"/>
+        </w:rPr>
+        <w:t xml:space="preserve">       (SELECT SUM(Qte_Achat_MD) FROM ACHAT_MD2) AS qte_magasin</w:t>
+      </w:r>
+    </w:p>
+    <w:p>
+      <w:pPr>
+        <w:shd w:fill="F2F2F2" w:color="auto" w:val="clear"/>
+        <w:spacing w:after="160"/>
+        <w:ind w:left="200"/>
+      </w:pPr>
+      <w:r>
+        <w:rPr>
+          <w:rFonts w:ascii="Consolas" w:cs="Consolas" w:eastAsia="Consolas" w:hAnsi="Consolas"/>
+          <w:sz w:val="18"/>
+          <w:szCs w:val="18"/>
+        </w:rPr>
+        <w:t xml:space="preserve">FROM dual;</w:t>
+      </w:r>
+    </w:p>
+    <w:p>
+      <w:pPr>
+        <w:keepNext/>
+        <w:spacing w:after="40" w:before="120"/>
+        <w:jc w:val="center"/>
+      </w:pPr>
+      <w:r>
+        <w:drawing>
+          <wp:inline distT="0" distB="0" distL="0" distR="0">
+            <wp:extent cx="4572000" cy="1247775"/>
+            <wp:effectExtent t="0" r="0" b="0" l="0"/>
+            <wp:docPr id="1" name="oracle_controle2.png" descr="Contrôle après chargement : 2 690 articles dans l'entrepôt, 2 690 dans le magasin" title="Contrôle après chargement : 2 690 articles dans l'entrepôt, 2 690 dans le magasin"/>
+            <wp:cNvGraphicFramePr>
+              <a:graphicFrameLocks xmlns:a="http://schemas.openxmlformats.org/drawingml/2006/main" noChangeAspect="1"/>
+            </wp:cNvGraphicFramePr>
+            <a:graphic xmlns:a="http://schemas.openxmlformats.org/drawingml/2006/main">
+              <a:graphicData uri="http://schemas.openxmlformats.org/drawingml/2006/picture">
+                <pic:pic xmlns:pic="http://schemas.openxmlformats.org/drawingml/2006/picture">
+                  <pic:nvPicPr>
+                    <pic:cNvPr id="0" name="" descr=""/>
+                    <pic:cNvPicPr>
+                      <a:picLocks noChangeAspect="1" noChangeArrowheads="1"/>
+                    </pic:cNvPicPr>
+                  </pic:nvPicPr>
+                  <pic:blipFill>
+                    <a:blip r:embed="rId16" cstate="none"/>
+                    <a:srcRect/>
+                    <a:stretch>
+                      <a:fillRect/>
+                    </a:stretch>
+                  </pic:blipFill>
+                  <pic:spPr bwMode="auto">
+                    <a:xfrm>
+                      <a:off x="0" y="0"/>
+                      <a:ext cx="4572000" cy="1247775"/>
+                    </a:xfrm>
+                    <a:prstGeom prst="rect">
+                      <a:avLst/>
+                    </a:prstGeom>
+                  </pic:spPr>
+                </pic:pic>
+              </a:graphicData>
+            </a:graphic>
+          </wp:inline>
+        </w:drawing>
+      </w:r>
+    </w:p>
+    <w:p>
+      <w:pPr>
+        <w:spacing w:after="200"/>
+        <w:jc w:val="center"/>
+      </w:pPr>
+      <w:r>
+        <w:rPr>
+          <w:i/>
+          <w:iCs/>
+          <w:color w:val="7F7F7F"/>
+          <w:sz w:val="18"/>
+          <w:szCs w:val="18"/>
+        </w:rPr>
+        <w:t xml:space="preserve">Contrôle après chargement : 2 690 articles dans l'entrepôt, 2 690 dans le magasin</w:t>
+      </w:r>
+    </w:p>
+    <w:p>
+      <w:pPr>
+        <w:spacing w:after="120"/>
+      </w:pPr>
+      <w:r>
+        <w:t xml:space="preserve">Un écart signifie qu'un achat n'a pas trouvé son tarif, sa réduction ou son employé : les requêtes de la section 7 du script </w:t>
+      </w:r>
+      <w:r>
+        <w:rPr>
+          <w:rFonts w:ascii="Consolas" w:cs="Consolas" w:eastAsia="Consolas" w:hAnsi="Consolas"/>
+          <w:sz w:val="19"/>
+          <w:szCs w:val="19"/>
+        </w:rPr>
+        <w:t xml:space="preserve">sql/md_ventes/01_Achat_MD_structure_agregats.sql</w:t>
+      </w:r>
+      <w:r>
+        <w:t xml:space="preserve"> listent les achats concernés.</w:t>
+      </w:r>
     </w:p>
     <w:sectPr>
       <w:footerReference w:type="default" r:id="rId7"/>

</xml_diff>

<commit_message>
Guide d'utilisation : couleurs bleu foncé
Co-Authored-By: Claude Opus 5.5 <noreply@anthropic.com>
Claude-Session: https://claude.ai/code/session_01UgeLXzj9G5UyQ5F9qqzBDt
</commit_message>
<xml_diff>
--- a/docs/MobiPass_Guide_utilisation_outils_analyse.docx
+++ b/docs/MobiPass_Guide_utilisation_outils_analyse.docx
@@ -11,7 +11,7 @@
         <w:rPr>
           <w:b/>
           <w:bCs/>
-          <w:color w:val="9B2C2C"/>
+          <w:color w:val="1F3864"/>
           <w:sz w:val="56"/>
           <w:szCs w:val="56"/>
         </w:rPr>
@@ -25,7 +25,7 @@
       </w:pPr>
       <w:r>
         <w:rPr>
-          <w:color w:val="9B2C2C"/>
+          <w:color w:val="1F3864"/>
           <w:sz w:val="36"/>
           <w:szCs w:val="36"/>
         </w:rPr>
@@ -106,7 +106,7 @@
         <w:rPr>
           <w:b/>
           <w:bCs/>
-          <w:color w:val="9B2C2C"/>
+          <w:color w:val="1F3864"/>
           <w:sz w:val="32"/>
           <w:szCs w:val="32"/>
         </w:rPr>
@@ -292,12 +292,12 @@
           <w:tcPr>
             <w:tcW w:type="dxa" w:w="2300"/>
             <w:tcBorders>
-              <w:top w:val="single" w:color="E3A3A3" w:sz="4"/>
-              <w:left w:val="single" w:color="E3A3A3" w:sz="4"/>
-              <w:bottom w:val="single" w:color="E3A3A3" w:sz="4"/>
-              <w:right w:val="single" w:color="E3A3A3" w:sz="4"/>
-            </w:tcBorders>
-            <w:shd w:fill="F6C1C1" w:color="auto" w:val="clear"/>
+              <w:top w:val="single" w:color="5B7DB1" w:sz="4"/>
+              <w:left w:val="single" w:color="5B7DB1" w:sz="4"/>
+              <w:bottom w:val="single" w:color="5B7DB1" w:sz="4"/>
+              <w:right w:val="single" w:color="5B7DB1" w:sz="4"/>
+            </w:tcBorders>
+            <w:shd w:fill="1F4E79" w:color="auto" w:val="clear"/>
             <w:tcMar>
               <w:top w:type="dxa" w:w="60"/>
               <w:left w:type="dxa" w:w="100"/>
@@ -313,6 +313,7 @@
               <w:rPr>
                 <w:b/>
                 <w:bCs/>
+                <w:color w:val="FFFFFF"/>
               </w:rPr>
               <w:t xml:space="preserve">Rapport</w:t>
             </w:r>
@@ -322,12 +323,12 @@
           <w:tcPr>
             <w:tcW w:type="dxa" w:w="2600"/>
             <w:tcBorders>
-              <w:top w:val="single" w:color="E3A3A3" w:sz="4"/>
-              <w:left w:val="single" w:color="E3A3A3" w:sz="4"/>
-              <w:bottom w:val="single" w:color="E3A3A3" w:sz="4"/>
-              <w:right w:val="single" w:color="E3A3A3" w:sz="4"/>
-            </w:tcBorders>
-            <w:shd w:fill="F6C1C1" w:color="auto" w:val="clear"/>
+              <w:top w:val="single" w:color="5B7DB1" w:sz="4"/>
+              <w:left w:val="single" w:color="5B7DB1" w:sz="4"/>
+              <w:bottom w:val="single" w:color="5B7DB1" w:sz="4"/>
+              <w:right w:val="single" w:color="5B7DB1" w:sz="4"/>
+            </w:tcBorders>
+            <w:shd w:fill="1F4E79" w:color="auto" w:val="clear"/>
             <w:tcMar>
               <w:top w:type="dxa" w:w="60"/>
               <w:left w:type="dxa" w:w="100"/>
@@ -343,6 +344,7 @@
               <w:rPr>
                 <w:b/>
                 <w:bCs/>
+                <w:color w:val="FFFFFF"/>
               </w:rPr>
               <w:t xml:space="preserve">Fichier</w:t>
             </w:r>
@@ -352,12 +354,12 @@
           <w:tcPr>
             <w:tcW w:type="dxa" w:w="2400"/>
             <w:tcBorders>
-              <w:top w:val="single" w:color="E3A3A3" w:sz="4"/>
-              <w:left w:val="single" w:color="E3A3A3" w:sz="4"/>
-              <w:bottom w:val="single" w:color="E3A3A3" w:sz="4"/>
-              <w:right w:val="single" w:color="E3A3A3" w:sz="4"/>
-            </w:tcBorders>
-            <w:shd w:fill="F6C1C1" w:color="auto" w:val="clear"/>
+              <w:top w:val="single" w:color="5B7DB1" w:sz="4"/>
+              <w:left w:val="single" w:color="5B7DB1" w:sz="4"/>
+              <w:bottom w:val="single" w:color="5B7DB1" w:sz="4"/>
+              <w:right w:val="single" w:color="5B7DB1" w:sz="4"/>
+            </w:tcBorders>
+            <w:shd w:fill="1F4E79" w:color="auto" w:val="clear"/>
             <w:tcMar>
               <w:top w:type="dxa" w:w="60"/>
               <w:left w:type="dxa" w:w="100"/>
@@ -373,6 +375,7 @@
               <w:rPr>
                 <w:b/>
                 <w:bCs/>
+                <w:color w:val="FFFFFF"/>
               </w:rPr>
               <w:t xml:space="preserve">Magasin interrogé</w:t>
             </w:r>
@@ -382,12 +385,12 @@
           <w:tcPr>
             <w:tcW w:type="dxa" w:w="2338"/>
             <w:tcBorders>
-              <w:top w:val="single" w:color="E3A3A3" w:sz="4"/>
-              <w:left w:val="single" w:color="E3A3A3" w:sz="4"/>
-              <w:bottom w:val="single" w:color="E3A3A3" w:sz="4"/>
-              <w:right w:val="single" w:color="E3A3A3" w:sz="4"/>
-            </w:tcBorders>
-            <w:shd w:fill="F6C1C1" w:color="auto" w:val="clear"/>
+              <w:top w:val="single" w:color="5B7DB1" w:sz="4"/>
+              <w:left w:val="single" w:color="5B7DB1" w:sz="4"/>
+              <w:bottom w:val="single" w:color="5B7DB1" w:sz="4"/>
+              <w:right w:val="single" w:color="5B7DB1" w:sz="4"/>
+            </w:tcBorders>
+            <w:shd w:fill="1F4E79" w:color="auto" w:val="clear"/>
             <w:tcMar>
               <w:top w:type="dxa" w:w="60"/>
               <w:left w:type="dxa" w:w="100"/>
@@ -403,6 +406,7 @@
               <w:rPr>
                 <w:b/>
                 <w:bCs/>
+                <w:color w:val="FFFFFF"/>
               </w:rPr>
               <w:t xml:space="preserve">Destinataires</w:t>
             </w:r>
@@ -414,10 +418,10 @@
           <w:tcPr>
             <w:tcW w:type="dxa" w:w="2300"/>
             <w:tcBorders>
-              <w:top w:val="single" w:color="E3A3A3" w:sz="4"/>
-              <w:left w:val="single" w:color="E3A3A3" w:sz="4"/>
-              <w:bottom w:val="single" w:color="E3A3A3" w:sz="4"/>
-              <w:right w:val="single" w:color="E3A3A3" w:sz="4"/>
+              <w:top w:val="single" w:color="5B7DB1" w:sz="4"/>
+              <w:left w:val="single" w:color="5B7DB1" w:sz="4"/>
+              <w:bottom w:val="single" w:color="5B7DB1" w:sz="4"/>
+              <w:right w:val="single" w:color="5B7DB1" w:sz="4"/>
             </w:tcBorders>
             <w:tcMar>
               <w:top w:type="dxa" w:w="60"/>
@@ -439,10 +443,10 @@
           <w:tcPr>
             <w:tcW w:type="dxa" w:w="2600"/>
             <w:tcBorders>
-              <w:top w:val="single" w:color="E3A3A3" w:sz="4"/>
-              <w:left w:val="single" w:color="E3A3A3" w:sz="4"/>
-              <w:bottom w:val="single" w:color="E3A3A3" w:sz="4"/>
-              <w:right w:val="single" w:color="E3A3A3" w:sz="4"/>
+              <w:top w:val="single" w:color="5B7DB1" w:sz="4"/>
+              <w:left w:val="single" w:color="5B7DB1" w:sz="4"/>
+              <w:bottom w:val="single" w:color="5B7DB1" w:sz="4"/>
+              <w:right w:val="single" w:color="5B7DB1" w:sz="4"/>
             </w:tcBorders>
             <w:tcMar>
               <w:top w:type="dxa" w:w="60"/>
@@ -469,10 +473,10 @@
           <w:tcPr>
             <w:tcW w:type="dxa" w:w="2400"/>
             <w:tcBorders>
-              <w:top w:val="single" w:color="E3A3A3" w:sz="4"/>
-              <w:left w:val="single" w:color="E3A3A3" w:sz="4"/>
-              <w:bottom w:val="single" w:color="E3A3A3" w:sz="4"/>
-              <w:right w:val="single" w:color="E3A3A3" w:sz="4"/>
+              <w:top w:val="single" w:color="5B7DB1" w:sz="4"/>
+              <w:left w:val="single" w:color="5B7DB1" w:sz="4"/>
+              <w:bottom w:val="single" w:color="5B7DB1" w:sz="4"/>
+              <w:right w:val="single" w:color="5B7DB1" w:sz="4"/>
             </w:tcBorders>
             <w:tcMar>
               <w:top w:type="dxa" w:w="60"/>
@@ -505,10 +509,10 @@
           <w:tcPr>
             <w:tcW w:type="dxa" w:w="2338"/>
             <w:tcBorders>
-              <w:top w:val="single" w:color="E3A3A3" w:sz="4"/>
-              <w:left w:val="single" w:color="E3A3A3" w:sz="4"/>
-              <w:bottom w:val="single" w:color="E3A3A3" w:sz="4"/>
-              <w:right w:val="single" w:color="E3A3A3" w:sz="4"/>
+              <w:top w:val="single" w:color="5B7DB1" w:sz="4"/>
+              <w:left w:val="single" w:color="5B7DB1" w:sz="4"/>
+              <w:bottom w:val="single" w:color="5B7DB1" w:sz="4"/>
+              <w:right w:val="single" w:color="5B7DB1" w:sz="4"/>
             </w:tcBorders>
             <w:tcMar>
               <w:top w:type="dxa" w:w="60"/>
@@ -532,10 +536,10 @@
           <w:tcPr>
             <w:tcW w:type="dxa" w:w="2300"/>
             <w:tcBorders>
-              <w:top w:val="single" w:color="E3A3A3" w:sz="4"/>
-              <w:left w:val="single" w:color="E3A3A3" w:sz="4"/>
-              <w:bottom w:val="single" w:color="E3A3A3" w:sz="4"/>
-              <w:right w:val="single" w:color="E3A3A3" w:sz="4"/>
+              <w:top w:val="single" w:color="5B7DB1" w:sz="4"/>
+              <w:left w:val="single" w:color="5B7DB1" w:sz="4"/>
+              <w:bottom w:val="single" w:color="5B7DB1" w:sz="4"/>
+              <w:right w:val="single" w:color="5B7DB1" w:sz="4"/>
             </w:tcBorders>
             <w:tcMar>
               <w:top w:type="dxa" w:w="60"/>
@@ -557,10 +561,10 @@
           <w:tcPr>
             <w:tcW w:type="dxa" w:w="2600"/>
             <w:tcBorders>
-              <w:top w:val="single" w:color="E3A3A3" w:sz="4"/>
-              <w:left w:val="single" w:color="E3A3A3" w:sz="4"/>
-              <w:bottom w:val="single" w:color="E3A3A3" w:sz="4"/>
-              <w:right w:val="single" w:color="E3A3A3" w:sz="4"/>
+              <w:top w:val="single" w:color="5B7DB1" w:sz="4"/>
+              <w:left w:val="single" w:color="5B7DB1" w:sz="4"/>
+              <w:bottom w:val="single" w:color="5B7DB1" w:sz="4"/>
+              <w:right w:val="single" w:color="5B7DB1" w:sz="4"/>
             </w:tcBorders>
             <w:tcMar>
               <w:top w:type="dxa" w:w="60"/>
@@ -587,10 +591,10 @@
           <w:tcPr>
             <w:tcW w:type="dxa" w:w="2400"/>
             <w:tcBorders>
-              <w:top w:val="single" w:color="E3A3A3" w:sz="4"/>
-              <w:left w:val="single" w:color="E3A3A3" w:sz="4"/>
-              <w:bottom w:val="single" w:color="E3A3A3" w:sz="4"/>
-              <w:right w:val="single" w:color="E3A3A3" w:sz="4"/>
+              <w:top w:val="single" w:color="5B7DB1" w:sz="4"/>
+              <w:left w:val="single" w:color="5B7DB1" w:sz="4"/>
+              <w:bottom w:val="single" w:color="5B7DB1" w:sz="4"/>
+              <w:right w:val="single" w:color="5B7DB1" w:sz="4"/>
             </w:tcBorders>
             <w:tcMar>
               <w:top w:type="dxa" w:w="60"/>
@@ -623,10 +627,10 @@
           <w:tcPr>
             <w:tcW w:type="dxa" w:w="2338"/>
             <w:tcBorders>
-              <w:top w:val="single" w:color="E3A3A3" w:sz="4"/>
-              <w:left w:val="single" w:color="E3A3A3" w:sz="4"/>
-              <w:bottom w:val="single" w:color="E3A3A3" w:sz="4"/>
-              <w:right w:val="single" w:color="E3A3A3" w:sz="4"/>
+              <w:top w:val="single" w:color="5B7DB1" w:sz="4"/>
+              <w:left w:val="single" w:color="5B7DB1" w:sz="4"/>
+              <w:bottom w:val="single" w:color="5B7DB1" w:sz="4"/>
+              <w:right w:val="single" w:color="5B7DB1" w:sz="4"/>
             </w:tcBorders>
             <w:tcMar>
               <w:top w:type="dxa" w:w="60"/>
@@ -1038,9 +1042,9 @@
     <w:p>
       <w:pPr>
         <w:pBdr>
-          <w:left w:val="single" w:color="E06666" w:sz="18" w:space="6"/>
+          <w:left w:val="single" w:color="1F4E79" w:sz="18" w:space="6"/>
         </w:pBdr>
-        <w:shd w:fill="FDECEC" w:color="auto" w:val="clear"/>
+        <w:shd w:fill="DEEAF6" w:color="auto" w:val="clear"/>
         <w:spacing w:after="160" w:before="60"/>
         <w:ind w:left="120"/>
       </w:pPr>
@@ -1115,12 +1119,12 @@
           <w:tcPr>
             <w:tcW w:type="dxa" w:w="3000"/>
             <w:tcBorders>
-              <w:top w:val="single" w:color="E3A3A3" w:sz="4"/>
-              <w:left w:val="single" w:color="E3A3A3" w:sz="4"/>
-              <w:bottom w:val="single" w:color="E3A3A3" w:sz="4"/>
-              <w:right w:val="single" w:color="E3A3A3" w:sz="4"/>
-            </w:tcBorders>
-            <w:shd w:fill="F6C1C1" w:color="auto" w:val="clear"/>
+              <w:top w:val="single" w:color="5B7DB1" w:sz="4"/>
+              <w:left w:val="single" w:color="5B7DB1" w:sz="4"/>
+              <w:bottom w:val="single" w:color="5B7DB1" w:sz="4"/>
+              <w:right w:val="single" w:color="5B7DB1" w:sz="4"/>
+            </w:tcBorders>
+            <w:shd w:fill="1F4E79" w:color="auto" w:val="clear"/>
             <w:tcMar>
               <w:top w:type="dxa" w:w="60"/>
               <w:left w:type="dxa" w:w="100"/>
@@ -1136,6 +1140,7 @@
               <w:rPr>
                 <w:b/>
                 <w:bCs/>
+                <w:color w:val="FFFFFF"/>
               </w:rPr>
               <w:t xml:space="preserve">Pour…</w:t>
             </w:r>
@@ -1145,12 +1150,12 @@
           <w:tcPr>
             <w:tcW w:type="dxa" w:w="6638"/>
             <w:tcBorders>
-              <w:top w:val="single" w:color="E3A3A3" w:sz="4"/>
-              <w:left w:val="single" w:color="E3A3A3" w:sz="4"/>
-              <w:bottom w:val="single" w:color="E3A3A3" w:sz="4"/>
-              <w:right w:val="single" w:color="E3A3A3" w:sz="4"/>
-            </w:tcBorders>
-            <w:shd w:fill="F6C1C1" w:color="auto" w:val="clear"/>
+              <w:top w:val="single" w:color="5B7DB1" w:sz="4"/>
+              <w:left w:val="single" w:color="5B7DB1" w:sz="4"/>
+              <w:bottom w:val="single" w:color="5B7DB1" w:sz="4"/>
+              <w:right w:val="single" w:color="5B7DB1" w:sz="4"/>
+            </w:tcBorders>
+            <w:shd w:fill="1F4E79" w:color="auto" w:val="clear"/>
             <w:tcMar>
               <w:top w:type="dxa" w:w="60"/>
               <w:left w:type="dxa" w:w="100"/>
@@ -1166,6 +1171,7 @@
               <w:rPr>
                 <w:b/>
                 <w:bCs/>
+                <w:color w:val="FFFFFF"/>
               </w:rPr>
               <w:t xml:space="preserve">Faites…</w:t>
             </w:r>
@@ -1177,10 +1183,10 @@
           <w:tcPr>
             <w:tcW w:type="dxa" w:w="3000"/>
             <w:tcBorders>
-              <w:top w:val="single" w:color="E3A3A3" w:sz="4"/>
-              <w:left w:val="single" w:color="E3A3A3" w:sz="4"/>
-              <w:bottom w:val="single" w:color="E3A3A3" w:sz="4"/>
-              <w:right w:val="single" w:color="E3A3A3" w:sz="4"/>
+              <w:top w:val="single" w:color="5B7DB1" w:sz="4"/>
+              <w:left w:val="single" w:color="5B7DB1" w:sz="4"/>
+              <w:bottom w:val="single" w:color="5B7DB1" w:sz="4"/>
+              <w:right w:val="single" w:color="5B7DB1" w:sz="4"/>
             </w:tcBorders>
             <w:tcMar>
               <w:top w:type="dxa" w:w="60"/>
@@ -1202,10 +1208,10 @@
           <w:tcPr>
             <w:tcW w:type="dxa" w:w="6638"/>
             <w:tcBorders>
-              <w:top w:val="single" w:color="E3A3A3" w:sz="4"/>
-              <w:left w:val="single" w:color="E3A3A3" w:sz="4"/>
-              <w:bottom w:val="single" w:color="E3A3A3" w:sz="4"/>
-              <w:right w:val="single" w:color="E3A3A3" w:sz="4"/>
+              <w:top w:val="single" w:color="5B7DB1" w:sz="4"/>
+              <w:left w:val="single" w:color="5B7DB1" w:sz="4"/>
+              <w:bottom w:val="single" w:color="5B7DB1" w:sz="4"/>
+              <w:right w:val="single" w:color="5B7DB1" w:sz="4"/>
             </w:tcBorders>
             <w:tcMar>
               <w:top w:type="dxa" w:w="60"/>
@@ -1249,10 +1255,10 @@
           <w:tcPr>
             <w:tcW w:type="dxa" w:w="3000"/>
             <w:tcBorders>
-              <w:top w:val="single" w:color="E3A3A3" w:sz="4"/>
-              <w:left w:val="single" w:color="E3A3A3" w:sz="4"/>
-              <w:bottom w:val="single" w:color="E3A3A3" w:sz="4"/>
-              <w:right w:val="single" w:color="E3A3A3" w:sz="4"/>
+              <w:top w:val="single" w:color="5B7DB1" w:sz="4"/>
+              <w:left w:val="single" w:color="5B7DB1" w:sz="4"/>
+              <w:bottom w:val="single" w:color="5B7DB1" w:sz="4"/>
+              <w:right w:val="single" w:color="5B7DB1" w:sz="4"/>
             </w:tcBorders>
             <w:tcMar>
               <w:top w:type="dxa" w:w="60"/>
@@ -1274,10 +1280,10 @@
           <w:tcPr>
             <w:tcW w:type="dxa" w:w="6638"/>
             <w:tcBorders>
-              <w:top w:val="single" w:color="E3A3A3" w:sz="4"/>
-              <w:left w:val="single" w:color="E3A3A3" w:sz="4"/>
-              <w:bottom w:val="single" w:color="E3A3A3" w:sz="4"/>
-              <w:right w:val="single" w:color="E3A3A3" w:sz="4"/>
+              <w:top w:val="single" w:color="5B7DB1" w:sz="4"/>
+              <w:left w:val="single" w:color="5B7DB1" w:sz="4"/>
+              <w:bottom w:val="single" w:color="5B7DB1" w:sz="4"/>
+              <w:right w:val="single" w:color="5B7DB1" w:sz="4"/>
             </w:tcBorders>
             <w:tcMar>
               <w:top w:type="dxa" w:w="60"/>
@@ -1311,10 +1317,10 @@
           <w:tcPr>
             <w:tcW w:type="dxa" w:w="3000"/>
             <w:tcBorders>
-              <w:top w:val="single" w:color="E3A3A3" w:sz="4"/>
-              <w:left w:val="single" w:color="E3A3A3" w:sz="4"/>
-              <w:bottom w:val="single" w:color="E3A3A3" w:sz="4"/>
-              <w:right w:val="single" w:color="E3A3A3" w:sz="4"/>
+              <w:top w:val="single" w:color="5B7DB1" w:sz="4"/>
+              <w:left w:val="single" w:color="5B7DB1" w:sz="4"/>
+              <w:bottom w:val="single" w:color="5B7DB1" w:sz="4"/>
+              <w:right w:val="single" w:color="5B7DB1" w:sz="4"/>
             </w:tcBorders>
             <w:tcMar>
               <w:top w:type="dxa" w:w="60"/>
@@ -1336,10 +1342,10 @@
           <w:tcPr>
             <w:tcW w:type="dxa" w:w="6638"/>
             <w:tcBorders>
-              <w:top w:val="single" w:color="E3A3A3" w:sz="4"/>
-              <w:left w:val="single" w:color="E3A3A3" w:sz="4"/>
-              <w:bottom w:val="single" w:color="E3A3A3" w:sz="4"/>
-              <w:right w:val="single" w:color="E3A3A3" w:sz="4"/>
+              <w:top w:val="single" w:color="5B7DB1" w:sz="4"/>
+              <w:left w:val="single" w:color="5B7DB1" w:sz="4"/>
+              <w:bottom w:val="single" w:color="5B7DB1" w:sz="4"/>
+              <w:right w:val="single" w:color="5B7DB1" w:sz="4"/>
             </w:tcBorders>
             <w:tcMar>
               <w:top w:type="dxa" w:w="60"/>
@@ -1373,10 +1379,10 @@
           <w:tcPr>
             <w:tcW w:type="dxa" w:w="3000"/>
             <w:tcBorders>
-              <w:top w:val="single" w:color="E3A3A3" w:sz="4"/>
-              <w:left w:val="single" w:color="E3A3A3" w:sz="4"/>
-              <w:bottom w:val="single" w:color="E3A3A3" w:sz="4"/>
-              <w:right w:val="single" w:color="E3A3A3" w:sz="4"/>
+              <w:top w:val="single" w:color="5B7DB1" w:sz="4"/>
+              <w:left w:val="single" w:color="5B7DB1" w:sz="4"/>
+              <w:bottom w:val="single" w:color="5B7DB1" w:sz="4"/>
+              <w:right w:val="single" w:color="5B7DB1" w:sz="4"/>
             </w:tcBorders>
             <w:tcMar>
               <w:top w:type="dxa" w:w="60"/>
@@ -1398,10 +1404,10 @@
           <w:tcPr>
             <w:tcW w:type="dxa" w:w="6638"/>
             <w:tcBorders>
-              <w:top w:val="single" w:color="E3A3A3" w:sz="4"/>
-              <w:left w:val="single" w:color="E3A3A3" w:sz="4"/>
-              <w:bottom w:val="single" w:color="E3A3A3" w:sz="4"/>
-              <w:right w:val="single" w:color="E3A3A3" w:sz="4"/>
+              <w:top w:val="single" w:color="5B7DB1" w:sz="4"/>
+              <w:left w:val="single" w:color="5B7DB1" w:sz="4"/>
+              <w:bottom w:val="single" w:color="5B7DB1" w:sz="4"/>
+              <w:right w:val="single" w:color="5B7DB1" w:sz="4"/>
             </w:tcBorders>
             <w:tcMar>
               <w:top w:type="dxa" w:w="60"/>
@@ -1425,10 +1431,10 @@
           <w:tcPr>
             <w:tcW w:type="dxa" w:w="3000"/>
             <w:tcBorders>
-              <w:top w:val="single" w:color="E3A3A3" w:sz="4"/>
-              <w:left w:val="single" w:color="E3A3A3" w:sz="4"/>
-              <w:bottom w:val="single" w:color="E3A3A3" w:sz="4"/>
-              <w:right w:val="single" w:color="E3A3A3" w:sz="4"/>
+              <w:top w:val="single" w:color="5B7DB1" w:sz="4"/>
+              <w:left w:val="single" w:color="5B7DB1" w:sz="4"/>
+              <w:bottom w:val="single" w:color="5B7DB1" w:sz="4"/>
+              <w:right w:val="single" w:color="5B7DB1" w:sz="4"/>
             </w:tcBorders>
             <w:tcMar>
               <w:top w:type="dxa" w:w="60"/>
@@ -1450,10 +1456,10 @@
           <w:tcPr>
             <w:tcW w:type="dxa" w:w="6638"/>
             <w:tcBorders>
-              <w:top w:val="single" w:color="E3A3A3" w:sz="4"/>
-              <w:left w:val="single" w:color="E3A3A3" w:sz="4"/>
-              <w:bottom w:val="single" w:color="E3A3A3" w:sz="4"/>
-              <w:right w:val="single" w:color="E3A3A3" w:sz="4"/>
+              <w:top w:val="single" w:color="5B7DB1" w:sz="4"/>
+              <w:left w:val="single" w:color="5B7DB1" w:sz="4"/>
+              <w:bottom w:val="single" w:color="5B7DB1" w:sz="4"/>
+              <w:right w:val="single" w:color="5B7DB1" w:sz="4"/>
             </w:tcBorders>
             <w:tcMar>
               <w:top w:type="dxa" w:w="60"/>
@@ -1477,10 +1483,10 @@
           <w:tcPr>
             <w:tcW w:type="dxa" w:w="3000"/>
             <w:tcBorders>
-              <w:top w:val="single" w:color="E3A3A3" w:sz="4"/>
-              <w:left w:val="single" w:color="E3A3A3" w:sz="4"/>
-              <w:bottom w:val="single" w:color="E3A3A3" w:sz="4"/>
-              <w:right w:val="single" w:color="E3A3A3" w:sz="4"/>
+              <w:top w:val="single" w:color="5B7DB1" w:sz="4"/>
+              <w:left w:val="single" w:color="5B7DB1" w:sz="4"/>
+              <w:bottom w:val="single" w:color="5B7DB1" w:sz="4"/>
+              <w:right w:val="single" w:color="5B7DB1" w:sz="4"/>
             </w:tcBorders>
             <w:tcMar>
               <w:top w:type="dxa" w:w="60"/>
@@ -1502,10 +1508,10 @@
           <w:tcPr>
             <w:tcW w:type="dxa" w:w="6638"/>
             <w:tcBorders>
-              <w:top w:val="single" w:color="E3A3A3" w:sz="4"/>
-              <w:left w:val="single" w:color="E3A3A3" w:sz="4"/>
-              <w:bottom w:val="single" w:color="E3A3A3" w:sz="4"/>
-              <w:right w:val="single" w:color="E3A3A3" w:sz="4"/>
+              <w:top w:val="single" w:color="5B7DB1" w:sz="4"/>
+              <w:left w:val="single" w:color="5B7DB1" w:sz="4"/>
+              <w:bottom w:val="single" w:color="5B7DB1" w:sz="4"/>
+              <w:right w:val="single" w:color="5B7DB1" w:sz="4"/>
             </w:tcBorders>
             <w:tcMar>
               <w:top w:type="dxa" w:w="60"/>
@@ -1549,10 +1555,10 @@
           <w:tcPr>
             <w:tcW w:type="dxa" w:w="3000"/>
             <w:tcBorders>
-              <w:top w:val="single" w:color="E3A3A3" w:sz="4"/>
-              <w:left w:val="single" w:color="E3A3A3" w:sz="4"/>
-              <w:bottom w:val="single" w:color="E3A3A3" w:sz="4"/>
-              <w:right w:val="single" w:color="E3A3A3" w:sz="4"/>
+              <w:top w:val="single" w:color="5B7DB1" w:sz="4"/>
+              <w:left w:val="single" w:color="5B7DB1" w:sz="4"/>
+              <w:bottom w:val="single" w:color="5B7DB1" w:sz="4"/>
+              <w:right w:val="single" w:color="5B7DB1" w:sz="4"/>
             </w:tcBorders>
             <w:tcMar>
               <w:top w:type="dxa" w:w="60"/>
@@ -1574,10 +1580,10 @@
           <w:tcPr>
             <w:tcW w:type="dxa" w:w="6638"/>
             <w:tcBorders>
-              <w:top w:val="single" w:color="E3A3A3" w:sz="4"/>
-              <w:left w:val="single" w:color="E3A3A3" w:sz="4"/>
-              <w:bottom w:val="single" w:color="E3A3A3" w:sz="4"/>
-              <w:right w:val="single" w:color="E3A3A3" w:sz="4"/>
+              <w:top w:val="single" w:color="5B7DB1" w:sz="4"/>
+              <w:left w:val="single" w:color="5B7DB1" w:sz="4"/>
+              <w:bottom w:val="single" w:color="5B7DB1" w:sz="4"/>
+              <w:right w:val="single" w:color="5B7DB1" w:sz="4"/>
             </w:tcBorders>
             <w:tcMar>
               <w:top w:type="dxa" w:w="60"/>
@@ -1601,10 +1607,10 @@
           <w:tcPr>
             <w:tcW w:type="dxa" w:w="3000"/>
             <w:tcBorders>
-              <w:top w:val="single" w:color="E3A3A3" w:sz="4"/>
-              <w:left w:val="single" w:color="E3A3A3" w:sz="4"/>
-              <w:bottom w:val="single" w:color="E3A3A3" w:sz="4"/>
-              <w:right w:val="single" w:color="E3A3A3" w:sz="4"/>
+              <w:top w:val="single" w:color="5B7DB1" w:sz="4"/>
+              <w:left w:val="single" w:color="5B7DB1" w:sz="4"/>
+              <w:bottom w:val="single" w:color="5B7DB1" w:sz="4"/>
+              <w:right w:val="single" w:color="5B7DB1" w:sz="4"/>
             </w:tcBorders>
             <w:tcMar>
               <w:top w:type="dxa" w:w="60"/>
@@ -1626,10 +1632,10 @@
           <w:tcPr>
             <w:tcW w:type="dxa" w:w="6638"/>
             <w:tcBorders>
-              <w:top w:val="single" w:color="E3A3A3" w:sz="4"/>
-              <w:left w:val="single" w:color="E3A3A3" w:sz="4"/>
-              <w:bottom w:val="single" w:color="E3A3A3" w:sz="4"/>
-              <w:right w:val="single" w:color="E3A3A3" w:sz="4"/>
+              <w:top w:val="single" w:color="5B7DB1" w:sz="4"/>
+              <w:left w:val="single" w:color="5B7DB1" w:sz="4"/>
+              <w:bottom w:val="single" w:color="5B7DB1" w:sz="4"/>
+              <w:right w:val="single" w:color="5B7DB1" w:sz="4"/>
             </w:tcBorders>
             <w:tcMar>
               <w:top w:type="dxa" w:w="60"/>
@@ -1673,10 +1679,10 @@
           <w:tcPr>
             <w:tcW w:type="dxa" w:w="3000"/>
             <w:tcBorders>
-              <w:top w:val="single" w:color="E3A3A3" w:sz="4"/>
-              <w:left w:val="single" w:color="E3A3A3" w:sz="4"/>
-              <w:bottom w:val="single" w:color="E3A3A3" w:sz="4"/>
-              <w:right w:val="single" w:color="E3A3A3" w:sz="4"/>
+              <w:top w:val="single" w:color="5B7DB1" w:sz="4"/>
+              <w:left w:val="single" w:color="5B7DB1" w:sz="4"/>
+              <w:bottom w:val="single" w:color="5B7DB1" w:sz="4"/>
+              <w:right w:val="single" w:color="5B7DB1" w:sz="4"/>
             </w:tcBorders>
             <w:tcMar>
               <w:top w:type="dxa" w:w="60"/>
@@ -1698,10 +1704,10 @@
           <w:tcPr>
             <w:tcW w:type="dxa" w:w="6638"/>
             <w:tcBorders>
-              <w:top w:val="single" w:color="E3A3A3" w:sz="4"/>
-              <w:left w:val="single" w:color="E3A3A3" w:sz="4"/>
-              <w:bottom w:val="single" w:color="E3A3A3" w:sz="4"/>
-              <w:right w:val="single" w:color="E3A3A3" w:sz="4"/>
+              <w:top w:val="single" w:color="5B7DB1" w:sz="4"/>
+              <w:left w:val="single" w:color="5B7DB1" w:sz="4"/>
+              <w:bottom w:val="single" w:color="5B7DB1" w:sz="4"/>
+              <w:right w:val="single" w:color="5B7DB1" w:sz="4"/>
             </w:tcBorders>
             <w:tcMar>
               <w:top w:type="dxa" w:w="60"/>
@@ -1745,10 +1751,10 @@
           <w:tcPr>
             <w:tcW w:type="dxa" w:w="3000"/>
             <w:tcBorders>
-              <w:top w:val="single" w:color="E3A3A3" w:sz="4"/>
-              <w:left w:val="single" w:color="E3A3A3" w:sz="4"/>
-              <w:bottom w:val="single" w:color="E3A3A3" w:sz="4"/>
-              <w:right w:val="single" w:color="E3A3A3" w:sz="4"/>
+              <w:top w:val="single" w:color="5B7DB1" w:sz="4"/>
+              <w:left w:val="single" w:color="5B7DB1" w:sz="4"/>
+              <w:bottom w:val="single" w:color="5B7DB1" w:sz="4"/>
+              <w:right w:val="single" w:color="5B7DB1" w:sz="4"/>
             </w:tcBorders>
             <w:tcMar>
               <w:top w:type="dxa" w:w="60"/>
@@ -1770,10 +1776,10 @@
           <w:tcPr>
             <w:tcW w:type="dxa" w:w="6638"/>
             <w:tcBorders>
-              <w:top w:val="single" w:color="E3A3A3" w:sz="4"/>
-              <w:left w:val="single" w:color="E3A3A3" w:sz="4"/>
-              <w:bottom w:val="single" w:color="E3A3A3" w:sz="4"/>
-              <w:right w:val="single" w:color="E3A3A3" w:sz="4"/>
+              <w:top w:val="single" w:color="5B7DB1" w:sz="4"/>
+              <w:left w:val="single" w:color="5B7DB1" w:sz="4"/>
+              <w:bottom w:val="single" w:color="5B7DB1" w:sz="4"/>
+              <w:right w:val="single" w:color="5B7DB1" w:sz="4"/>
             </w:tcBorders>
             <w:tcMar>
               <w:top w:type="dxa" w:w="60"/>
@@ -1890,12 +1896,12 @@
           <w:tcPr>
             <w:tcW w:type="dxa" w:w="1700"/>
             <w:tcBorders>
-              <w:top w:val="single" w:color="E3A3A3" w:sz="4"/>
-              <w:left w:val="single" w:color="E3A3A3" w:sz="4"/>
-              <w:bottom w:val="single" w:color="E3A3A3" w:sz="4"/>
-              <w:right w:val="single" w:color="E3A3A3" w:sz="4"/>
-            </w:tcBorders>
-            <w:shd w:fill="F6C1C1" w:color="auto" w:val="clear"/>
+              <w:top w:val="single" w:color="5B7DB1" w:sz="4"/>
+              <w:left w:val="single" w:color="5B7DB1" w:sz="4"/>
+              <w:bottom w:val="single" w:color="5B7DB1" w:sz="4"/>
+              <w:right w:val="single" w:color="5B7DB1" w:sz="4"/>
+            </w:tcBorders>
+            <w:shd w:fill="1F4E79" w:color="auto" w:val="clear"/>
             <w:tcMar>
               <w:top w:type="dxa" w:w="60"/>
               <w:left w:type="dxa" w:w="100"/>
@@ -1911,6 +1917,7 @@
               <w:rPr>
                 <w:b/>
                 <w:bCs/>
+                <w:color w:val="FFFFFF"/>
               </w:rPr>
               <w:t xml:space="preserve">Page</w:t>
             </w:r>
@@ -1920,12 +1927,12 @@
           <w:tcPr>
             <w:tcW w:type="dxa" w:w="3300"/>
             <w:tcBorders>
-              <w:top w:val="single" w:color="E3A3A3" w:sz="4"/>
-              <w:left w:val="single" w:color="E3A3A3" w:sz="4"/>
-              <w:bottom w:val="single" w:color="E3A3A3" w:sz="4"/>
-              <w:right w:val="single" w:color="E3A3A3" w:sz="4"/>
-            </w:tcBorders>
-            <w:shd w:fill="F6C1C1" w:color="auto" w:val="clear"/>
+              <w:top w:val="single" w:color="5B7DB1" w:sz="4"/>
+              <w:left w:val="single" w:color="5B7DB1" w:sz="4"/>
+              <w:bottom w:val="single" w:color="5B7DB1" w:sz="4"/>
+              <w:right w:val="single" w:color="5B7DB1" w:sz="4"/>
+            </w:tcBorders>
+            <w:shd w:fill="1F4E79" w:color="auto" w:val="clear"/>
             <w:tcMar>
               <w:top w:type="dxa" w:w="60"/>
               <w:left w:type="dxa" w:w="100"/>
@@ -1941,6 +1948,7 @@
               <w:rPr>
                 <w:b/>
                 <w:bCs/>
+                <w:color w:val="FFFFFF"/>
               </w:rPr>
               <w:t xml:space="preserve">Question à laquelle elle répond</w:t>
             </w:r>
@@ -1950,12 +1958,12 @@
           <w:tcPr>
             <w:tcW w:type="dxa" w:w="2700"/>
             <w:tcBorders>
-              <w:top w:val="single" w:color="E3A3A3" w:sz="4"/>
-              <w:left w:val="single" w:color="E3A3A3" w:sz="4"/>
-              <w:bottom w:val="single" w:color="E3A3A3" w:sz="4"/>
-              <w:right w:val="single" w:color="E3A3A3" w:sz="4"/>
-            </w:tcBorders>
-            <w:shd w:fill="F6C1C1" w:color="auto" w:val="clear"/>
+              <w:top w:val="single" w:color="5B7DB1" w:sz="4"/>
+              <w:left w:val="single" w:color="5B7DB1" w:sz="4"/>
+              <w:bottom w:val="single" w:color="5B7DB1" w:sz="4"/>
+              <w:right w:val="single" w:color="5B7DB1" w:sz="4"/>
+            </w:tcBorders>
+            <w:shd w:fill="1F4E79" w:color="auto" w:val="clear"/>
             <w:tcMar>
               <w:top w:type="dxa" w:w="60"/>
               <w:left w:type="dxa" w:w="100"/>
@@ -1971,6 +1979,7 @@
               <w:rPr>
                 <w:b/>
                 <w:bCs/>
+                <w:color w:val="FFFFFF"/>
               </w:rPr>
               <w:t xml:space="preserve">Contenu</w:t>
             </w:r>
@@ -1980,12 +1989,12 @@
           <w:tcPr>
             <w:tcW w:type="dxa" w:w="1938"/>
             <w:tcBorders>
-              <w:top w:val="single" w:color="E3A3A3" w:sz="4"/>
-              <w:left w:val="single" w:color="E3A3A3" w:sz="4"/>
-              <w:bottom w:val="single" w:color="E3A3A3" w:sz="4"/>
-              <w:right w:val="single" w:color="E3A3A3" w:sz="4"/>
-            </w:tcBorders>
-            <w:shd w:fill="F6C1C1" w:color="auto" w:val="clear"/>
+              <w:top w:val="single" w:color="5B7DB1" w:sz="4"/>
+              <w:left w:val="single" w:color="5B7DB1" w:sz="4"/>
+              <w:bottom w:val="single" w:color="5B7DB1" w:sz="4"/>
+              <w:right w:val="single" w:color="5B7DB1" w:sz="4"/>
+            </w:tcBorders>
+            <w:shd w:fill="1F4E79" w:color="auto" w:val="clear"/>
             <w:tcMar>
               <w:top w:type="dxa" w:w="60"/>
               <w:left w:type="dxa" w:w="100"/>
@@ -2001,6 +2010,7 @@
               <w:rPr>
                 <w:b/>
                 <w:bCs/>
+                <w:color w:val="FFFFFF"/>
               </w:rPr>
               <w:t xml:space="preserve">Source</w:t>
             </w:r>
@@ -2012,10 +2022,10 @@
           <w:tcPr>
             <w:tcW w:type="dxa" w:w="1700"/>
             <w:tcBorders>
-              <w:top w:val="single" w:color="E3A3A3" w:sz="4"/>
-              <w:left w:val="single" w:color="E3A3A3" w:sz="4"/>
-              <w:bottom w:val="single" w:color="E3A3A3" w:sz="4"/>
-              <w:right w:val="single" w:color="E3A3A3" w:sz="4"/>
+              <w:top w:val="single" w:color="5B7DB1" w:sz="4"/>
+              <w:left w:val="single" w:color="5B7DB1" w:sz="4"/>
+              <w:bottom w:val="single" w:color="5B7DB1" w:sz="4"/>
+              <w:right w:val="single" w:color="5B7DB1" w:sz="4"/>
             </w:tcBorders>
             <w:tcMar>
               <w:top w:type="dxa" w:w="60"/>
@@ -2037,10 +2047,10 @@
           <w:tcPr>
             <w:tcW w:type="dxa" w:w="3300"/>
             <w:tcBorders>
-              <w:top w:val="single" w:color="E3A3A3" w:sz="4"/>
-              <w:left w:val="single" w:color="E3A3A3" w:sz="4"/>
-              <w:bottom w:val="single" w:color="E3A3A3" w:sz="4"/>
-              <w:right w:val="single" w:color="E3A3A3" w:sz="4"/>
+              <w:top w:val="single" w:color="5B7DB1" w:sz="4"/>
+              <w:left w:val="single" w:color="5B7DB1" w:sz="4"/>
+              <w:bottom w:val="single" w:color="5B7DB1" w:sz="4"/>
+              <w:right w:val="single" w:color="5B7DB1" w:sz="4"/>
             </w:tcBorders>
             <w:tcMar>
               <w:top w:type="dxa" w:w="60"/>
@@ -2062,10 +2072,10 @@
           <w:tcPr>
             <w:tcW w:type="dxa" w:w="2700"/>
             <w:tcBorders>
-              <w:top w:val="single" w:color="E3A3A3" w:sz="4"/>
-              <w:left w:val="single" w:color="E3A3A3" w:sz="4"/>
-              <w:bottom w:val="single" w:color="E3A3A3" w:sz="4"/>
-              <w:right w:val="single" w:color="E3A3A3" w:sz="4"/>
+              <w:top w:val="single" w:color="5B7DB1" w:sz="4"/>
+              <w:left w:val="single" w:color="5B7DB1" w:sz="4"/>
+              <w:bottom w:val="single" w:color="5B7DB1" w:sz="4"/>
+              <w:right w:val="single" w:color="5B7DB1" w:sz="4"/>
             </w:tcBorders>
             <w:tcMar>
               <w:top w:type="dxa" w:w="60"/>
@@ -2087,10 +2097,10 @@
           <w:tcPr>
             <w:tcW w:type="dxa" w:w="1938"/>
             <w:tcBorders>
-              <w:top w:val="single" w:color="E3A3A3" w:sz="4"/>
-              <w:left w:val="single" w:color="E3A3A3" w:sz="4"/>
-              <w:bottom w:val="single" w:color="E3A3A3" w:sz="4"/>
-              <w:right w:val="single" w:color="E3A3A3" w:sz="4"/>
+              <w:top w:val="single" w:color="5B7DB1" w:sz="4"/>
+              <w:left w:val="single" w:color="5B7DB1" w:sz="4"/>
+              <w:bottom w:val="single" w:color="5B7DB1" w:sz="4"/>
+              <w:right w:val="single" w:color="5B7DB1" w:sz="4"/>
             </w:tcBorders>
             <w:tcMar>
               <w:top w:type="dxa" w:w="60"/>
@@ -2119,10 +2129,10 @@
           <w:tcPr>
             <w:tcW w:type="dxa" w:w="1700"/>
             <w:tcBorders>
-              <w:top w:val="single" w:color="E3A3A3" w:sz="4"/>
-              <w:left w:val="single" w:color="E3A3A3" w:sz="4"/>
-              <w:bottom w:val="single" w:color="E3A3A3" w:sz="4"/>
-              <w:right w:val="single" w:color="E3A3A3" w:sz="4"/>
+              <w:top w:val="single" w:color="5B7DB1" w:sz="4"/>
+              <w:left w:val="single" w:color="5B7DB1" w:sz="4"/>
+              <w:bottom w:val="single" w:color="5B7DB1" w:sz="4"/>
+              <w:right w:val="single" w:color="5B7DB1" w:sz="4"/>
             </w:tcBorders>
             <w:tcMar>
               <w:top w:type="dxa" w:w="60"/>
@@ -2144,10 +2154,10 @@
           <w:tcPr>
             <w:tcW w:type="dxa" w:w="3300"/>
             <w:tcBorders>
-              <w:top w:val="single" w:color="E3A3A3" w:sz="4"/>
-              <w:left w:val="single" w:color="E3A3A3" w:sz="4"/>
-              <w:bottom w:val="single" w:color="E3A3A3" w:sz="4"/>
-              <w:right w:val="single" w:color="E3A3A3" w:sz="4"/>
+              <w:top w:val="single" w:color="5B7DB1" w:sz="4"/>
+              <w:left w:val="single" w:color="5B7DB1" w:sz="4"/>
+              <w:bottom w:val="single" w:color="5B7DB1" w:sz="4"/>
+              <w:right w:val="single" w:color="5B7DB1" w:sz="4"/>
             </w:tcBorders>
             <w:tcMar>
               <w:top w:type="dxa" w:w="60"/>
@@ -2169,10 +2179,10 @@
           <w:tcPr>
             <w:tcW w:type="dxa" w:w="2700"/>
             <w:tcBorders>
-              <w:top w:val="single" w:color="E3A3A3" w:sz="4"/>
-              <w:left w:val="single" w:color="E3A3A3" w:sz="4"/>
-              <w:bottom w:val="single" w:color="E3A3A3" w:sz="4"/>
-              <w:right w:val="single" w:color="E3A3A3" w:sz="4"/>
+              <w:top w:val="single" w:color="5B7DB1" w:sz="4"/>
+              <w:left w:val="single" w:color="5B7DB1" w:sz="4"/>
+              <w:bottom w:val="single" w:color="5B7DB1" w:sz="4"/>
+              <w:right w:val="single" w:color="5B7DB1" w:sz="4"/>
             </w:tcBorders>
             <w:tcMar>
               <w:top w:type="dxa" w:w="60"/>
@@ -2194,10 +2204,10 @@
           <w:tcPr>
             <w:tcW w:type="dxa" w:w="1938"/>
             <w:tcBorders>
-              <w:top w:val="single" w:color="E3A3A3" w:sz="4"/>
-              <w:left w:val="single" w:color="E3A3A3" w:sz="4"/>
-              <w:bottom w:val="single" w:color="E3A3A3" w:sz="4"/>
-              <w:right w:val="single" w:color="E3A3A3" w:sz="4"/>
+              <w:top w:val="single" w:color="5B7DB1" w:sz="4"/>
+              <w:left w:val="single" w:color="5B7DB1" w:sz="4"/>
+              <w:bottom w:val="single" w:color="5B7DB1" w:sz="4"/>
+              <w:right w:val="single" w:color="5B7DB1" w:sz="4"/>
             </w:tcBorders>
             <w:tcMar>
               <w:top w:type="dxa" w:w="60"/>
@@ -2226,10 +2236,10 @@
           <w:tcPr>
             <w:tcW w:type="dxa" w:w="1700"/>
             <w:tcBorders>
-              <w:top w:val="single" w:color="E3A3A3" w:sz="4"/>
-              <w:left w:val="single" w:color="E3A3A3" w:sz="4"/>
-              <w:bottom w:val="single" w:color="E3A3A3" w:sz="4"/>
-              <w:right w:val="single" w:color="E3A3A3" w:sz="4"/>
+              <w:top w:val="single" w:color="5B7DB1" w:sz="4"/>
+              <w:left w:val="single" w:color="5B7DB1" w:sz="4"/>
+              <w:bottom w:val="single" w:color="5B7DB1" w:sz="4"/>
+              <w:right w:val="single" w:color="5B7DB1" w:sz="4"/>
             </w:tcBorders>
             <w:tcMar>
               <w:top w:type="dxa" w:w="60"/>
@@ -2251,10 +2261,10 @@
           <w:tcPr>
             <w:tcW w:type="dxa" w:w="3300"/>
             <w:tcBorders>
-              <w:top w:val="single" w:color="E3A3A3" w:sz="4"/>
-              <w:left w:val="single" w:color="E3A3A3" w:sz="4"/>
-              <w:bottom w:val="single" w:color="E3A3A3" w:sz="4"/>
-              <w:right w:val="single" w:color="E3A3A3" w:sz="4"/>
+              <w:top w:val="single" w:color="5B7DB1" w:sz="4"/>
+              <w:left w:val="single" w:color="5B7DB1" w:sz="4"/>
+              <w:bottom w:val="single" w:color="5B7DB1" w:sz="4"/>
+              <w:right w:val="single" w:color="5B7DB1" w:sz="4"/>
             </w:tcBorders>
             <w:tcMar>
               <w:top w:type="dxa" w:w="60"/>
@@ -2276,10 +2286,10 @@
           <w:tcPr>
             <w:tcW w:type="dxa" w:w="2700"/>
             <w:tcBorders>
-              <w:top w:val="single" w:color="E3A3A3" w:sz="4"/>
-              <w:left w:val="single" w:color="E3A3A3" w:sz="4"/>
-              <w:bottom w:val="single" w:color="E3A3A3" w:sz="4"/>
-              <w:right w:val="single" w:color="E3A3A3" w:sz="4"/>
+              <w:top w:val="single" w:color="5B7DB1" w:sz="4"/>
+              <w:left w:val="single" w:color="5B7DB1" w:sz="4"/>
+              <w:bottom w:val="single" w:color="5B7DB1" w:sz="4"/>
+              <w:right w:val="single" w:color="5B7DB1" w:sz="4"/>
             </w:tcBorders>
             <w:tcMar>
               <w:top w:type="dxa" w:w="60"/>
@@ -2301,10 +2311,10 @@
           <w:tcPr>
             <w:tcW w:type="dxa" w:w="1938"/>
             <w:tcBorders>
-              <w:top w:val="single" w:color="E3A3A3" w:sz="4"/>
-              <w:left w:val="single" w:color="E3A3A3" w:sz="4"/>
-              <w:bottom w:val="single" w:color="E3A3A3" w:sz="4"/>
-              <w:right w:val="single" w:color="E3A3A3" w:sz="4"/>
+              <w:top w:val="single" w:color="5B7DB1" w:sz="4"/>
+              <w:left w:val="single" w:color="5B7DB1" w:sz="4"/>
+              <w:bottom w:val="single" w:color="5B7DB1" w:sz="4"/>
+              <w:right w:val="single" w:color="5B7DB1" w:sz="4"/>
             </w:tcBorders>
             <w:tcMar>
               <w:top w:type="dxa" w:w="60"/>
@@ -2333,10 +2343,10 @@
           <w:tcPr>
             <w:tcW w:type="dxa" w:w="1700"/>
             <w:tcBorders>
-              <w:top w:val="single" w:color="E3A3A3" w:sz="4"/>
-              <w:left w:val="single" w:color="E3A3A3" w:sz="4"/>
-              <w:bottom w:val="single" w:color="E3A3A3" w:sz="4"/>
-              <w:right w:val="single" w:color="E3A3A3" w:sz="4"/>
+              <w:top w:val="single" w:color="5B7DB1" w:sz="4"/>
+              <w:left w:val="single" w:color="5B7DB1" w:sz="4"/>
+              <w:bottom w:val="single" w:color="5B7DB1" w:sz="4"/>
+              <w:right w:val="single" w:color="5B7DB1" w:sz="4"/>
             </w:tcBorders>
             <w:tcMar>
               <w:top w:type="dxa" w:w="60"/>
@@ -2358,10 +2368,10 @@
           <w:tcPr>
             <w:tcW w:type="dxa" w:w="3300"/>
             <w:tcBorders>
-              <w:top w:val="single" w:color="E3A3A3" w:sz="4"/>
-              <w:left w:val="single" w:color="E3A3A3" w:sz="4"/>
-              <w:bottom w:val="single" w:color="E3A3A3" w:sz="4"/>
-              <w:right w:val="single" w:color="E3A3A3" w:sz="4"/>
+              <w:top w:val="single" w:color="5B7DB1" w:sz="4"/>
+              <w:left w:val="single" w:color="5B7DB1" w:sz="4"/>
+              <w:bottom w:val="single" w:color="5B7DB1" w:sz="4"/>
+              <w:right w:val="single" w:color="5B7DB1" w:sz="4"/>
             </w:tcBorders>
             <w:tcMar>
               <w:top w:type="dxa" w:w="60"/>
@@ -2383,10 +2393,10 @@
           <w:tcPr>
             <w:tcW w:type="dxa" w:w="2700"/>
             <w:tcBorders>
-              <w:top w:val="single" w:color="E3A3A3" w:sz="4"/>
-              <w:left w:val="single" w:color="E3A3A3" w:sz="4"/>
-              <w:bottom w:val="single" w:color="E3A3A3" w:sz="4"/>
-              <w:right w:val="single" w:color="E3A3A3" w:sz="4"/>
+              <w:top w:val="single" w:color="5B7DB1" w:sz="4"/>
+              <w:left w:val="single" w:color="5B7DB1" w:sz="4"/>
+              <w:bottom w:val="single" w:color="5B7DB1" w:sz="4"/>
+              <w:right w:val="single" w:color="5B7DB1" w:sz="4"/>
             </w:tcBorders>
             <w:tcMar>
               <w:top w:type="dxa" w:w="60"/>
@@ -2408,10 +2418,10 @@
           <w:tcPr>
             <w:tcW w:type="dxa" w:w="1938"/>
             <w:tcBorders>
-              <w:top w:val="single" w:color="E3A3A3" w:sz="4"/>
-              <w:left w:val="single" w:color="E3A3A3" w:sz="4"/>
-              <w:bottom w:val="single" w:color="E3A3A3" w:sz="4"/>
-              <w:right w:val="single" w:color="E3A3A3" w:sz="4"/>
+              <w:top w:val="single" w:color="5B7DB1" w:sz="4"/>
+              <w:left w:val="single" w:color="5B7DB1" w:sz="4"/>
+              <w:bottom w:val="single" w:color="5B7DB1" w:sz="4"/>
+              <w:right w:val="single" w:color="5B7DB1" w:sz="4"/>
             </w:tcBorders>
             <w:tcMar>
               <w:top w:type="dxa" w:w="60"/>
@@ -2440,10 +2450,10 @@
           <w:tcPr>
             <w:tcW w:type="dxa" w:w="1700"/>
             <w:tcBorders>
-              <w:top w:val="single" w:color="E3A3A3" w:sz="4"/>
-              <w:left w:val="single" w:color="E3A3A3" w:sz="4"/>
-              <w:bottom w:val="single" w:color="E3A3A3" w:sz="4"/>
-              <w:right w:val="single" w:color="E3A3A3" w:sz="4"/>
+              <w:top w:val="single" w:color="5B7DB1" w:sz="4"/>
+              <w:left w:val="single" w:color="5B7DB1" w:sz="4"/>
+              <w:bottom w:val="single" w:color="5B7DB1" w:sz="4"/>
+              <w:right w:val="single" w:color="5B7DB1" w:sz="4"/>
             </w:tcBorders>
             <w:tcMar>
               <w:top w:type="dxa" w:w="60"/>
@@ -2465,10 +2475,10 @@
           <w:tcPr>
             <w:tcW w:type="dxa" w:w="3300"/>
             <w:tcBorders>
-              <w:top w:val="single" w:color="E3A3A3" w:sz="4"/>
-              <w:left w:val="single" w:color="E3A3A3" w:sz="4"/>
-              <w:bottom w:val="single" w:color="E3A3A3" w:sz="4"/>
-              <w:right w:val="single" w:color="E3A3A3" w:sz="4"/>
+              <w:top w:val="single" w:color="5B7DB1" w:sz="4"/>
+              <w:left w:val="single" w:color="5B7DB1" w:sz="4"/>
+              <w:bottom w:val="single" w:color="5B7DB1" w:sz="4"/>
+              <w:right w:val="single" w:color="5B7DB1" w:sz="4"/>
             </w:tcBorders>
             <w:tcMar>
               <w:top w:type="dxa" w:w="60"/>
@@ -2490,10 +2500,10 @@
           <w:tcPr>
             <w:tcW w:type="dxa" w:w="2700"/>
             <w:tcBorders>
-              <w:top w:val="single" w:color="E3A3A3" w:sz="4"/>
-              <w:left w:val="single" w:color="E3A3A3" w:sz="4"/>
-              <w:bottom w:val="single" w:color="E3A3A3" w:sz="4"/>
-              <w:right w:val="single" w:color="E3A3A3" w:sz="4"/>
+              <w:top w:val="single" w:color="5B7DB1" w:sz="4"/>
+              <w:left w:val="single" w:color="5B7DB1" w:sz="4"/>
+              <w:bottom w:val="single" w:color="5B7DB1" w:sz="4"/>
+              <w:right w:val="single" w:color="5B7DB1" w:sz="4"/>
             </w:tcBorders>
             <w:tcMar>
               <w:top w:type="dxa" w:w="60"/>
@@ -2515,10 +2525,10 @@
           <w:tcPr>
             <w:tcW w:type="dxa" w:w="1938"/>
             <w:tcBorders>
-              <w:top w:val="single" w:color="E3A3A3" w:sz="4"/>
-              <w:left w:val="single" w:color="E3A3A3" w:sz="4"/>
-              <w:bottom w:val="single" w:color="E3A3A3" w:sz="4"/>
-              <w:right w:val="single" w:color="E3A3A3" w:sz="4"/>
+              <w:top w:val="single" w:color="5B7DB1" w:sz="4"/>
+              <w:left w:val="single" w:color="5B7DB1" w:sz="4"/>
+              <w:bottom w:val="single" w:color="5B7DB1" w:sz="4"/>
+              <w:right w:val="single" w:color="5B7DB1" w:sz="4"/>
             </w:tcBorders>
             <w:tcMar>
               <w:top w:type="dxa" w:w="60"/>
@@ -3109,12 +3119,12 @@
           <w:tcPr>
             <w:tcW w:type="dxa" w:w="2300"/>
             <w:tcBorders>
-              <w:top w:val="single" w:color="E3A3A3" w:sz="4"/>
-              <w:left w:val="single" w:color="E3A3A3" w:sz="4"/>
-              <w:bottom w:val="single" w:color="E3A3A3" w:sz="4"/>
-              <w:right w:val="single" w:color="E3A3A3" w:sz="4"/>
-            </w:tcBorders>
-            <w:shd w:fill="F6C1C1" w:color="auto" w:val="clear"/>
+              <w:top w:val="single" w:color="5B7DB1" w:sz="4"/>
+              <w:left w:val="single" w:color="5B7DB1" w:sz="4"/>
+              <w:bottom w:val="single" w:color="5B7DB1" w:sz="4"/>
+              <w:right w:val="single" w:color="5B7DB1" w:sz="4"/>
+            </w:tcBorders>
+            <w:shd w:fill="1F4E79" w:color="auto" w:val="clear"/>
             <w:tcMar>
               <w:top w:type="dxa" w:w="60"/>
               <w:left w:type="dxa" w:w="100"/>
@@ -3130,6 +3140,7 @@
               <w:rPr>
                 <w:b/>
                 <w:bCs/>
+                <w:color w:val="FFFFFF"/>
               </w:rPr>
               <w:t xml:space="preserve">Page</w:t>
             </w:r>
@@ -3139,12 +3150,12 @@
           <w:tcPr>
             <w:tcW w:type="dxa" w:w="4300"/>
             <w:tcBorders>
-              <w:top w:val="single" w:color="E3A3A3" w:sz="4"/>
-              <w:left w:val="single" w:color="E3A3A3" w:sz="4"/>
-              <w:bottom w:val="single" w:color="E3A3A3" w:sz="4"/>
-              <w:right w:val="single" w:color="E3A3A3" w:sz="4"/>
-            </w:tcBorders>
-            <w:shd w:fill="F6C1C1" w:color="auto" w:val="clear"/>
+              <w:top w:val="single" w:color="5B7DB1" w:sz="4"/>
+              <w:left w:val="single" w:color="5B7DB1" w:sz="4"/>
+              <w:bottom w:val="single" w:color="5B7DB1" w:sz="4"/>
+              <w:right w:val="single" w:color="5B7DB1" w:sz="4"/>
+            </w:tcBorders>
+            <w:shd w:fill="1F4E79" w:color="auto" w:val="clear"/>
             <w:tcMar>
               <w:top w:type="dxa" w:w="60"/>
               <w:left w:type="dxa" w:w="100"/>
@@ -3160,6 +3171,7 @@
               <w:rPr>
                 <w:b/>
                 <w:bCs/>
+                <w:color w:val="FFFFFF"/>
               </w:rPr>
               <w:t xml:space="preserve">Question à laquelle elle répond</w:t>
             </w:r>
@@ -3169,12 +3181,12 @@
           <w:tcPr>
             <w:tcW w:type="dxa" w:w="3038"/>
             <w:tcBorders>
-              <w:top w:val="single" w:color="E3A3A3" w:sz="4"/>
-              <w:left w:val="single" w:color="E3A3A3" w:sz="4"/>
-              <w:bottom w:val="single" w:color="E3A3A3" w:sz="4"/>
-              <w:right w:val="single" w:color="E3A3A3" w:sz="4"/>
-            </w:tcBorders>
-            <w:shd w:fill="F6C1C1" w:color="auto" w:val="clear"/>
+              <w:top w:val="single" w:color="5B7DB1" w:sz="4"/>
+              <w:left w:val="single" w:color="5B7DB1" w:sz="4"/>
+              <w:bottom w:val="single" w:color="5B7DB1" w:sz="4"/>
+              <w:right w:val="single" w:color="5B7DB1" w:sz="4"/>
+            </w:tcBorders>
+            <w:shd w:fill="1F4E79" w:color="auto" w:val="clear"/>
             <w:tcMar>
               <w:top w:type="dxa" w:w="60"/>
               <w:left w:type="dxa" w:w="100"/>
@@ -3190,6 +3202,7 @@
               <w:rPr>
                 <w:b/>
                 <w:bCs/>
+                <w:color w:val="FFFFFF"/>
               </w:rPr>
               <w:t xml:space="preserve">Source</w:t>
             </w:r>
@@ -3201,10 +3214,10 @@
           <w:tcPr>
             <w:tcW w:type="dxa" w:w="2300"/>
             <w:tcBorders>
-              <w:top w:val="single" w:color="E3A3A3" w:sz="4"/>
-              <w:left w:val="single" w:color="E3A3A3" w:sz="4"/>
-              <w:bottom w:val="single" w:color="E3A3A3" w:sz="4"/>
-              <w:right w:val="single" w:color="E3A3A3" w:sz="4"/>
+              <w:top w:val="single" w:color="5B7DB1" w:sz="4"/>
+              <w:left w:val="single" w:color="5B7DB1" w:sz="4"/>
+              <w:bottom w:val="single" w:color="5B7DB1" w:sz="4"/>
+              <w:right w:val="single" w:color="5B7DB1" w:sz="4"/>
             </w:tcBorders>
             <w:tcMar>
               <w:top w:type="dxa" w:w="60"/>
@@ -3226,10 +3239,10 @@
           <w:tcPr>
             <w:tcW w:type="dxa" w:w="4300"/>
             <w:tcBorders>
-              <w:top w:val="single" w:color="E3A3A3" w:sz="4"/>
-              <w:left w:val="single" w:color="E3A3A3" w:sz="4"/>
-              <w:bottom w:val="single" w:color="E3A3A3" w:sz="4"/>
-              <w:right w:val="single" w:color="E3A3A3" w:sz="4"/>
+              <w:top w:val="single" w:color="5B7DB1" w:sz="4"/>
+              <w:left w:val="single" w:color="5B7DB1" w:sz="4"/>
+              <w:bottom w:val="single" w:color="5B7DB1" w:sz="4"/>
+              <w:right w:val="single" w:color="5B7DB1" w:sz="4"/>
             </w:tcBorders>
             <w:tcMar>
               <w:top w:type="dxa" w:w="60"/>
@@ -3251,10 +3264,10 @@
           <w:tcPr>
             <w:tcW w:type="dxa" w:w="3038"/>
             <w:tcBorders>
-              <w:top w:val="single" w:color="E3A3A3" w:sz="4"/>
-              <w:left w:val="single" w:color="E3A3A3" w:sz="4"/>
-              <w:bottom w:val="single" w:color="E3A3A3" w:sz="4"/>
-              <w:right w:val="single" w:color="E3A3A3" w:sz="4"/>
+              <w:top w:val="single" w:color="5B7DB1" w:sz="4"/>
+              <w:left w:val="single" w:color="5B7DB1" w:sz="4"/>
+              <w:bottom w:val="single" w:color="5B7DB1" w:sz="4"/>
+              <w:right w:val="single" w:color="5B7DB1" w:sz="4"/>
             </w:tcBorders>
             <w:tcMar>
               <w:top w:type="dxa" w:w="60"/>
@@ -3286,10 +3299,10 @@
           <w:tcPr>
             <w:tcW w:type="dxa" w:w="2300"/>
             <w:tcBorders>
-              <w:top w:val="single" w:color="E3A3A3" w:sz="4"/>
-              <w:left w:val="single" w:color="E3A3A3" w:sz="4"/>
-              <w:bottom w:val="single" w:color="E3A3A3" w:sz="4"/>
-              <w:right w:val="single" w:color="E3A3A3" w:sz="4"/>
+              <w:top w:val="single" w:color="5B7DB1" w:sz="4"/>
+              <w:left w:val="single" w:color="5B7DB1" w:sz="4"/>
+              <w:bottom w:val="single" w:color="5B7DB1" w:sz="4"/>
+              <w:right w:val="single" w:color="5B7DB1" w:sz="4"/>
             </w:tcBorders>
             <w:tcMar>
               <w:top w:type="dxa" w:w="60"/>
@@ -3311,10 +3324,10 @@
           <w:tcPr>
             <w:tcW w:type="dxa" w:w="4300"/>
             <w:tcBorders>
-              <w:top w:val="single" w:color="E3A3A3" w:sz="4"/>
-              <w:left w:val="single" w:color="E3A3A3" w:sz="4"/>
-              <w:bottom w:val="single" w:color="E3A3A3" w:sz="4"/>
-              <w:right w:val="single" w:color="E3A3A3" w:sz="4"/>
+              <w:top w:val="single" w:color="5B7DB1" w:sz="4"/>
+              <w:left w:val="single" w:color="5B7DB1" w:sz="4"/>
+              <w:bottom w:val="single" w:color="5B7DB1" w:sz="4"/>
+              <w:right w:val="single" w:color="5B7DB1" w:sz="4"/>
             </w:tcBorders>
             <w:tcMar>
               <w:top w:type="dxa" w:w="60"/>
@@ -3336,10 +3349,10 @@
           <w:tcPr>
             <w:tcW w:type="dxa" w:w="3038"/>
             <w:tcBorders>
-              <w:top w:val="single" w:color="E3A3A3" w:sz="4"/>
-              <w:left w:val="single" w:color="E3A3A3" w:sz="4"/>
-              <w:bottom w:val="single" w:color="E3A3A3" w:sz="4"/>
-              <w:right w:val="single" w:color="E3A3A3" w:sz="4"/>
+              <w:top w:val="single" w:color="5B7DB1" w:sz="4"/>
+              <w:left w:val="single" w:color="5B7DB1" w:sz="4"/>
+              <w:bottom w:val="single" w:color="5B7DB1" w:sz="4"/>
+              <w:right w:val="single" w:color="5B7DB1" w:sz="4"/>
             </w:tcBorders>
             <w:tcMar>
               <w:top w:type="dxa" w:w="60"/>
@@ -3371,10 +3384,10 @@
           <w:tcPr>
             <w:tcW w:type="dxa" w:w="2300"/>
             <w:tcBorders>
-              <w:top w:val="single" w:color="E3A3A3" w:sz="4"/>
-              <w:left w:val="single" w:color="E3A3A3" w:sz="4"/>
-              <w:bottom w:val="single" w:color="E3A3A3" w:sz="4"/>
-              <w:right w:val="single" w:color="E3A3A3" w:sz="4"/>
+              <w:top w:val="single" w:color="5B7DB1" w:sz="4"/>
+              <w:left w:val="single" w:color="5B7DB1" w:sz="4"/>
+              <w:bottom w:val="single" w:color="5B7DB1" w:sz="4"/>
+              <w:right w:val="single" w:color="5B7DB1" w:sz="4"/>
             </w:tcBorders>
             <w:tcMar>
               <w:top w:type="dxa" w:w="60"/>
@@ -3396,10 +3409,10 @@
           <w:tcPr>
             <w:tcW w:type="dxa" w:w="4300"/>
             <w:tcBorders>
-              <w:top w:val="single" w:color="E3A3A3" w:sz="4"/>
-              <w:left w:val="single" w:color="E3A3A3" w:sz="4"/>
-              <w:bottom w:val="single" w:color="E3A3A3" w:sz="4"/>
-              <w:right w:val="single" w:color="E3A3A3" w:sz="4"/>
+              <w:top w:val="single" w:color="5B7DB1" w:sz="4"/>
+              <w:left w:val="single" w:color="5B7DB1" w:sz="4"/>
+              <w:bottom w:val="single" w:color="5B7DB1" w:sz="4"/>
+              <w:right w:val="single" w:color="5B7DB1" w:sz="4"/>
             </w:tcBorders>
             <w:tcMar>
               <w:top w:type="dxa" w:w="60"/>
@@ -3421,10 +3434,10 @@
           <w:tcPr>
             <w:tcW w:type="dxa" w:w="3038"/>
             <w:tcBorders>
-              <w:top w:val="single" w:color="E3A3A3" w:sz="4"/>
-              <w:left w:val="single" w:color="E3A3A3" w:sz="4"/>
-              <w:bottom w:val="single" w:color="E3A3A3" w:sz="4"/>
-              <w:right w:val="single" w:color="E3A3A3" w:sz="4"/>
+              <w:top w:val="single" w:color="5B7DB1" w:sz="4"/>
+              <w:left w:val="single" w:color="5B7DB1" w:sz="4"/>
+              <w:bottom w:val="single" w:color="5B7DB1" w:sz="4"/>
+              <w:right w:val="single" w:color="5B7DB1" w:sz="4"/>
             </w:tcBorders>
             <w:tcMar>
               <w:top w:type="dxa" w:w="60"/>
@@ -3509,12 +3522,12 @@
           <w:tcPr>
             <w:tcW w:type="dxa" w:w="2600"/>
             <w:tcBorders>
-              <w:top w:val="single" w:color="E3A3A3" w:sz="4"/>
-              <w:left w:val="single" w:color="E3A3A3" w:sz="4"/>
-              <w:bottom w:val="single" w:color="E3A3A3" w:sz="4"/>
-              <w:right w:val="single" w:color="E3A3A3" w:sz="4"/>
-            </w:tcBorders>
-            <w:shd w:fill="F6C1C1" w:color="auto" w:val="clear"/>
+              <w:top w:val="single" w:color="5B7DB1" w:sz="4"/>
+              <w:left w:val="single" w:color="5B7DB1" w:sz="4"/>
+              <w:bottom w:val="single" w:color="5B7DB1" w:sz="4"/>
+              <w:right w:val="single" w:color="5B7DB1" w:sz="4"/>
+            </w:tcBorders>
+            <w:shd w:fill="1F4E79" w:color="auto" w:val="clear"/>
             <w:tcMar>
               <w:top w:type="dxa" w:w="60"/>
               <w:left w:type="dxa" w:w="100"/>
@@ -3530,6 +3543,7 @@
               <w:rPr>
                 <w:b/>
                 <w:bCs/>
+                <w:color w:val="FFFFFF"/>
               </w:rPr>
               <w:t xml:space="preserve">Indicateur</w:t>
             </w:r>
@@ -3539,12 +3553,12 @@
           <w:tcPr>
             <w:tcW w:type="dxa" w:w="4600"/>
             <w:tcBorders>
-              <w:top w:val="single" w:color="E3A3A3" w:sz="4"/>
-              <w:left w:val="single" w:color="E3A3A3" w:sz="4"/>
-              <w:bottom w:val="single" w:color="E3A3A3" w:sz="4"/>
-              <w:right w:val="single" w:color="E3A3A3" w:sz="4"/>
-            </w:tcBorders>
-            <w:shd w:fill="F6C1C1" w:color="auto" w:val="clear"/>
+              <w:top w:val="single" w:color="5B7DB1" w:sz="4"/>
+              <w:left w:val="single" w:color="5B7DB1" w:sz="4"/>
+              <w:bottom w:val="single" w:color="5B7DB1" w:sz="4"/>
+              <w:right w:val="single" w:color="5B7DB1" w:sz="4"/>
+            </w:tcBorders>
+            <w:shd w:fill="1F4E79" w:color="auto" w:val="clear"/>
             <w:tcMar>
               <w:top w:type="dxa" w:w="60"/>
               <w:left w:type="dxa" w:w="100"/>
@@ -3560,6 +3574,7 @@
               <w:rPr>
                 <w:b/>
                 <w:bCs/>
+                <w:color w:val="FFFFFF"/>
               </w:rPr>
               <w:t xml:space="preserve">Définition</w:t>
             </w:r>
@@ -3569,12 +3584,12 @@
           <w:tcPr>
             <w:tcW w:type="dxa" w:w="2438"/>
             <w:tcBorders>
-              <w:top w:val="single" w:color="E3A3A3" w:sz="4"/>
-              <w:left w:val="single" w:color="E3A3A3" w:sz="4"/>
-              <w:bottom w:val="single" w:color="E3A3A3" w:sz="4"/>
-              <w:right w:val="single" w:color="E3A3A3" w:sz="4"/>
-            </w:tcBorders>
-            <w:shd w:fill="F6C1C1" w:color="auto" w:val="clear"/>
+              <w:top w:val="single" w:color="5B7DB1" w:sz="4"/>
+              <w:left w:val="single" w:color="5B7DB1" w:sz="4"/>
+              <w:bottom w:val="single" w:color="5B7DB1" w:sz="4"/>
+              <w:right w:val="single" w:color="5B7DB1" w:sz="4"/>
+            </w:tcBorders>
+            <w:shd w:fill="1F4E79" w:color="auto" w:val="clear"/>
             <w:tcMar>
               <w:top w:type="dxa" w:w="60"/>
               <w:left w:type="dxa" w:w="100"/>
@@ -3590,6 +3605,7 @@
               <w:rPr>
                 <w:b/>
                 <w:bCs/>
+                <w:color w:val="FFFFFF"/>
               </w:rPr>
               <w:t xml:space="preserve">Unité</w:t>
             </w:r>
@@ -3601,10 +3617,10 @@
           <w:tcPr>
             <w:tcW w:type="dxa" w:w="2600"/>
             <w:tcBorders>
-              <w:top w:val="single" w:color="E3A3A3" w:sz="4"/>
-              <w:left w:val="single" w:color="E3A3A3" w:sz="4"/>
-              <w:bottom w:val="single" w:color="E3A3A3" w:sz="4"/>
-              <w:right w:val="single" w:color="E3A3A3" w:sz="4"/>
+              <w:top w:val="single" w:color="5B7DB1" w:sz="4"/>
+              <w:left w:val="single" w:color="5B7DB1" w:sz="4"/>
+              <w:bottom w:val="single" w:color="5B7DB1" w:sz="4"/>
+              <w:right w:val="single" w:color="5B7DB1" w:sz="4"/>
             </w:tcBorders>
             <w:tcMar>
               <w:top w:type="dxa" w:w="60"/>
@@ -3626,10 +3642,10 @@
           <w:tcPr>
             <w:tcW w:type="dxa" w:w="4600"/>
             <w:tcBorders>
-              <w:top w:val="single" w:color="E3A3A3" w:sz="4"/>
-              <w:left w:val="single" w:color="E3A3A3" w:sz="4"/>
-              <w:bottom w:val="single" w:color="E3A3A3" w:sz="4"/>
-              <w:right w:val="single" w:color="E3A3A3" w:sz="4"/>
+              <w:top w:val="single" w:color="5B7DB1" w:sz="4"/>
+              <w:left w:val="single" w:color="5B7DB1" w:sz="4"/>
+              <w:bottom w:val="single" w:color="5B7DB1" w:sz="4"/>
+              <w:right w:val="single" w:color="5B7DB1" w:sz="4"/>
             </w:tcBorders>
             <w:tcMar>
               <w:top w:type="dxa" w:w="60"/>
@@ -3651,10 +3667,10 @@
           <w:tcPr>
             <w:tcW w:type="dxa" w:w="2438"/>
             <w:tcBorders>
-              <w:top w:val="single" w:color="E3A3A3" w:sz="4"/>
-              <w:left w:val="single" w:color="E3A3A3" w:sz="4"/>
-              <w:bottom w:val="single" w:color="E3A3A3" w:sz="4"/>
-              <w:right w:val="single" w:color="E3A3A3" w:sz="4"/>
+              <w:top w:val="single" w:color="5B7DB1" w:sz="4"/>
+              <w:left w:val="single" w:color="5B7DB1" w:sz="4"/>
+              <w:bottom w:val="single" w:color="5B7DB1" w:sz="4"/>
+              <w:right w:val="single" w:color="5B7DB1" w:sz="4"/>
             </w:tcBorders>
             <w:tcMar>
               <w:top w:type="dxa" w:w="60"/>
@@ -3678,10 +3694,10 @@
           <w:tcPr>
             <w:tcW w:type="dxa" w:w="2600"/>
             <w:tcBorders>
-              <w:top w:val="single" w:color="E3A3A3" w:sz="4"/>
-              <w:left w:val="single" w:color="E3A3A3" w:sz="4"/>
-              <w:bottom w:val="single" w:color="E3A3A3" w:sz="4"/>
-              <w:right w:val="single" w:color="E3A3A3" w:sz="4"/>
+              <w:top w:val="single" w:color="5B7DB1" w:sz="4"/>
+              <w:left w:val="single" w:color="5B7DB1" w:sz="4"/>
+              <w:bottom w:val="single" w:color="5B7DB1" w:sz="4"/>
+              <w:right w:val="single" w:color="5B7DB1" w:sz="4"/>
             </w:tcBorders>
             <w:tcMar>
               <w:top w:type="dxa" w:w="60"/>
@@ -3703,10 +3719,10 @@
           <w:tcPr>
             <w:tcW w:type="dxa" w:w="4600"/>
             <w:tcBorders>
-              <w:top w:val="single" w:color="E3A3A3" w:sz="4"/>
-              <w:left w:val="single" w:color="E3A3A3" w:sz="4"/>
-              <w:bottom w:val="single" w:color="E3A3A3" w:sz="4"/>
-              <w:right w:val="single" w:color="E3A3A3" w:sz="4"/>
+              <w:top w:val="single" w:color="5B7DB1" w:sz="4"/>
+              <w:left w:val="single" w:color="5B7DB1" w:sz="4"/>
+              <w:bottom w:val="single" w:color="5B7DB1" w:sz="4"/>
+              <w:right w:val="single" w:color="5B7DB1" w:sz="4"/>
             </w:tcBorders>
             <w:tcMar>
               <w:top w:type="dxa" w:w="60"/>
@@ -3728,10 +3744,10 @@
           <w:tcPr>
             <w:tcW w:type="dxa" w:w="2438"/>
             <w:tcBorders>
-              <w:top w:val="single" w:color="E3A3A3" w:sz="4"/>
-              <w:left w:val="single" w:color="E3A3A3" w:sz="4"/>
-              <w:bottom w:val="single" w:color="E3A3A3" w:sz="4"/>
-              <w:right w:val="single" w:color="E3A3A3" w:sz="4"/>
+              <w:top w:val="single" w:color="5B7DB1" w:sz="4"/>
+              <w:left w:val="single" w:color="5B7DB1" w:sz="4"/>
+              <w:bottom w:val="single" w:color="5B7DB1" w:sz="4"/>
+              <w:right w:val="single" w:color="5B7DB1" w:sz="4"/>
             </w:tcBorders>
             <w:tcMar>
               <w:top w:type="dxa" w:w="60"/>
@@ -3755,10 +3771,10 @@
           <w:tcPr>
             <w:tcW w:type="dxa" w:w="2600"/>
             <w:tcBorders>
-              <w:top w:val="single" w:color="E3A3A3" w:sz="4"/>
-              <w:left w:val="single" w:color="E3A3A3" w:sz="4"/>
-              <w:bottom w:val="single" w:color="E3A3A3" w:sz="4"/>
-              <w:right w:val="single" w:color="E3A3A3" w:sz="4"/>
+              <w:top w:val="single" w:color="5B7DB1" w:sz="4"/>
+              <w:left w:val="single" w:color="5B7DB1" w:sz="4"/>
+              <w:bottom w:val="single" w:color="5B7DB1" w:sz="4"/>
+              <w:right w:val="single" w:color="5B7DB1" w:sz="4"/>
             </w:tcBorders>
             <w:tcMar>
               <w:top w:type="dxa" w:w="60"/>
@@ -3780,10 +3796,10 @@
           <w:tcPr>
             <w:tcW w:type="dxa" w:w="4600"/>
             <w:tcBorders>
-              <w:top w:val="single" w:color="E3A3A3" w:sz="4"/>
-              <w:left w:val="single" w:color="E3A3A3" w:sz="4"/>
-              <w:bottom w:val="single" w:color="E3A3A3" w:sz="4"/>
-              <w:right w:val="single" w:color="E3A3A3" w:sz="4"/>
+              <w:top w:val="single" w:color="5B7DB1" w:sz="4"/>
+              <w:left w:val="single" w:color="5B7DB1" w:sz="4"/>
+              <w:bottom w:val="single" w:color="5B7DB1" w:sz="4"/>
+              <w:right w:val="single" w:color="5B7DB1" w:sz="4"/>
             </w:tcBorders>
             <w:tcMar>
               <w:top w:type="dxa" w:w="60"/>
@@ -3805,10 +3821,10 @@
           <w:tcPr>
             <w:tcW w:type="dxa" w:w="2438"/>
             <w:tcBorders>
-              <w:top w:val="single" w:color="E3A3A3" w:sz="4"/>
-              <w:left w:val="single" w:color="E3A3A3" w:sz="4"/>
-              <w:bottom w:val="single" w:color="E3A3A3" w:sz="4"/>
-              <w:right w:val="single" w:color="E3A3A3" w:sz="4"/>
+              <w:top w:val="single" w:color="5B7DB1" w:sz="4"/>
+              <w:left w:val="single" w:color="5B7DB1" w:sz="4"/>
+              <w:bottom w:val="single" w:color="5B7DB1" w:sz="4"/>
+              <w:right w:val="single" w:color="5B7DB1" w:sz="4"/>
             </w:tcBorders>
             <w:tcMar>
               <w:top w:type="dxa" w:w="60"/>
@@ -3832,10 +3848,10 @@
           <w:tcPr>
             <w:tcW w:type="dxa" w:w="2600"/>
             <w:tcBorders>
-              <w:top w:val="single" w:color="E3A3A3" w:sz="4"/>
-              <w:left w:val="single" w:color="E3A3A3" w:sz="4"/>
-              <w:bottom w:val="single" w:color="E3A3A3" w:sz="4"/>
-              <w:right w:val="single" w:color="E3A3A3" w:sz="4"/>
+              <w:top w:val="single" w:color="5B7DB1" w:sz="4"/>
+              <w:left w:val="single" w:color="5B7DB1" w:sz="4"/>
+              <w:bottom w:val="single" w:color="5B7DB1" w:sz="4"/>
+              <w:right w:val="single" w:color="5B7DB1" w:sz="4"/>
             </w:tcBorders>
             <w:tcMar>
               <w:top w:type="dxa" w:w="60"/>
@@ -3857,10 +3873,10 @@
           <w:tcPr>
             <w:tcW w:type="dxa" w:w="4600"/>
             <w:tcBorders>
-              <w:top w:val="single" w:color="E3A3A3" w:sz="4"/>
-              <w:left w:val="single" w:color="E3A3A3" w:sz="4"/>
-              <w:bottom w:val="single" w:color="E3A3A3" w:sz="4"/>
-              <w:right w:val="single" w:color="E3A3A3" w:sz="4"/>
+              <w:top w:val="single" w:color="5B7DB1" w:sz="4"/>
+              <w:left w:val="single" w:color="5B7DB1" w:sz="4"/>
+              <w:bottom w:val="single" w:color="5B7DB1" w:sz="4"/>
+              <w:right w:val="single" w:color="5B7DB1" w:sz="4"/>
             </w:tcBorders>
             <w:tcMar>
               <w:top w:type="dxa" w:w="60"/>
@@ -3882,10 +3898,10 @@
           <w:tcPr>
             <w:tcW w:type="dxa" w:w="2438"/>
             <w:tcBorders>
-              <w:top w:val="single" w:color="E3A3A3" w:sz="4"/>
-              <w:left w:val="single" w:color="E3A3A3" w:sz="4"/>
-              <w:bottom w:val="single" w:color="E3A3A3" w:sz="4"/>
-              <w:right w:val="single" w:color="E3A3A3" w:sz="4"/>
+              <w:top w:val="single" w:color="5B7DB1" w:sz="4"/>
+              <w:left w:val="single" w:color="5B7DB1" w:sz="4"/>
+              <w:bottom w:val="single" w:color="5B7DB1" w:sz="4"/>
+              <w:right w:val="single" w:color="5B7DB1" w:sz="4"/>
             </w:tcBorders>
             <w:tcMar>
               <w:top w:type="dxa" w:w="60"/>
@@ -3909,10 +3925,10 @@
           <w:tcPr>
             <w:tcW w:type="dxa" w:w="2600"/>
             <w:tcBorders>
-              <w:top w:val="single" w:color="E3A3A3" w:sz="4"/>
-              <w:left w:val="single" w:color="E3A3A3" w:sz="4"/>
-              <w:bottom w:val="single" w:color="E3A3A3" w:sz="4"/>
-              <w:right w:val="single" w:color="E3A3A3" w:sz="4"/>
+              <w:top w:val="single" w:color="5B7DB1" w:sz="4"/>
+              <w:left w:val="single" w:color="5B7DB1" w:sz="4"/>
+              <w:bottom w:val="single" w:color="5B7DB1" w:sz="4"/>
+              <w:right w:val="single" w:color="5B7DB1" w:sz="4"/>
             </w:tcBorders>
             <w:tcMar>
               <w:top w:type="dxa" w:w="60"/>
@@ -3934,10 +3950,10 @@
           <w:tcPr>
             <w:tcW w:type="dxa" w:w="4600"/>
             <w:tcBorders>
-              <w:top w:val="single" w:color="E3A3A3" w:sz="4"/>
-              <w:left w:val="single" w:color="E3A3A3" w:sz="4"/>
-              <w:bottom w:val="single" w:color="E3A3A3" w:sz="4"/>
-              <w:right w:val="single" w:color="E3A3A3" w:sz="4"/>
+              <w:top w:val="single" w:color="5B7DB1" w:sz="4"/>
+              <w:left w:val="single" w:color="5B7DB1" w:sz="4"/>
+              <w:bottom w:val="single" w:color="5B7DB1" w:sz="4"/>
+              <w:right w:val="single" w:color="5B7DB1" w:sz="4"/>
             </w:tcBorders>
             <w:tcMar>
               <w:top w:type="dxa" w:w="60"/>
@@ -3959,10 +3975,10 @@
           <w:tcPr>
             <w:tcW w:type="dxa" w:w="2438"/>
             <w:tcBorders>
-              <w:top w:val="single" w:color="E3A3A3" w:sz="4"/>
-              <w:left w:val="single" w:color="E3A3A3" w:sz="4"/>
-              <w:bottom w:val="single" w:color="E3A3A3" w:sz="4"/>
-              <w:right w:val="single" w:color="E3A3A3" w:sz="4"/>
+              <w:top w:val="single" w:color="5B7DB1" w:sz="4"/>
+              <w:left w:val="single" w:color="5B7DB1" w:sz="4"/>
+              <w:bottom w:val="single" w:color="5B7DB1" w:sz="4"/>
+              <w:right w:val="single" w:color="5B7DB1" w:sz="4"/>
             </w:tcBorders>
             <w:tcMar>
               <w:top w:type="dxa" w:w="60"/>
@@ -3990,9 +4006,9 @@
     <w:p>
       <w:pPr>
         <w:pBdr>
-          <w:left w:val="single" w:color="E06666" w:sz="18" w:space="6"/>
+          <w:left w:val="single" w:color="1F4E79" w:sz="18" w:space="6"/>
         </w:pBdr>
-        <w:shd w:fill="FDECEC" w:color="auto" w:val="clear"/>
+        <w:shd w:fill="DEEAF6" w:color="auto" w:val="clear"/>
         <w:spacing w:after="160" w:before="60"/>
         <w:ind w:left="120"/>
       </w:pPr>
@@ -4185,12 +4201,12 @@
           <w:tcPr>
             <w:tcW w:type="dxa" w:w="3300"/>
             <w:tcBorders>
-              <w:top w:val="single" w:color="E3A3A3" w:sz="4"/>
-              <w:left w:val="single" w:color="E3A3A3" w:sz="4"/>
-              <w:bottom w:val="single" w:color="E3A3A3" w:sz="4"/>
-              <w:right w:val="single" w:color="E3A3A3" w:sz="4"/>
-            </w:tcBorders>
-            <w:shd w:fill="F6C1C1" w:color="auto" w:val="clear"/>
+              <w:top w:val="single" w:color="5B7DB1" w:sz="4"/>
+              <w:left w:val="single" w:color="5B7DB1" w:sz="4"/>
+              <w:bottom w:val="single" w:color="5B7DB1" w:sz="4"/>
+              <w:right w:val="single" w:color="5B7DB1" w:sz="4"/>
+            </w:tcBorders>
+            <w:shd w:fill="1F4E79" w:color="auto" w:val="clear"/>
             <w:tcMar>
               <w:top w:type="dxa" w:w="60"/>
               <w:left w:type="dxa" w:w="100"/>
@@ -4206,6 +4222,7 @@
               <w:rPr>
                 <w:b/>
                 <w:bCs/>
+                <w:color w:val="FFFFFF"/>
               </w:rPr>
               <w:t xml:space="preserve">Visuel</w:t>
             </w:r>
@@ -4215,12 +4232,12 @@
           <w:tcPr>
             <w:tcW w:type="dxa" w:w="6338"/>
             <w:tcBorders>
-              <w:top w:val="single" w:color="E3A3A3" w:sz="4"/>
-              <w:left w:val="single" w:color="E3A3A3" w:sz="4"/>
-              <w:bottom w:val="single" w:color="E3A3A3" w:sz="4"/>
-              <w:right w:val="single" w:color="E3A3A3" w:sz="4"/>
-            </w:tcBorders>
-            <w:shd w:fill="F6C1C1" w:color="auto" w:val="clear"/>
+              <w:top w:val="single" w:color="5B7DB1" w:sz="4"/>
+              <w:left w:val="single" w:color="5B7DB1" w:sz="4"/>
+              <w:bottom w:val="single" w:color="5B7DB1" w:sz="4"/>
+              <w:right w:val="single" w:color="5B7DB1" w:sz="4"/>
+            </w:tcBorders>
+            <w:shd w:fill="1F4E79" w:color="auto" w:val="clear"/>
             <w:tcMar>
               <w:top w:type="dxa" w:w="60"/>
               <w:left w:type="dxa" w:w="100"/>
@@ -4236,6 +4253,7 @@
               <w:rPr>
                 <w:b/>
                 <w:bCs/>
+                <w:color w:val="FFFFFF"/>
               </w:rPr>
               <w:t xml:space="preserve">Ce qu'il montre</w:t>
             </w:r>
@@ -4247,10 +4265,10 @@
           <w:tcPr>
             <w:tcW w:type="dxa" w:w="3300"/>
             <w:tcBorders>
-              <w:top w:val="single" w:color="E3A3A3" w:sz="4"/>
-              <w:left w:val="single" w:color="E3A3A3" w:sz="4"/>
-              <w:bottom w:val="single" w:color="E3A3A3" w:sz="4"/>
-              <w:right w:val="single" w:color="E3A3A3" w:sz="4"/>
+              <w:top w:val="single" w:color="5B7DB1" w:sz="4"/>
+              <w:left w:val="single" w:color="5B7DB1" w:sz="4"/>
+              <w:bottom w:val="single" w:color="5B7DB1" w:sz="4"/>
+              <w:right w:val="single" w:color="5B7DB1" w:sz="4"/>
             </w:tcBorders>
             <w:tcMar>
               <w:top w:type="dxa" w:w="60"/>
@@ -4272,10 +4290,10 @@
           <w:tcPr>
             <w:tcW w:type="dxa" w:w="6338"/>
             <w:tcBorders>
-              <w:top w:val="single" w:color="E3A3A3" w:sz="4"/>
-              <w:left w:val="single" w:color="E3A3A3" w:sz="4"/>
-              <w:bottom w:val="single" w:color="E3A3A3" w:sz="4"/>
-              <w:right w:val="single" w:color="E3A3A3" w:sz="4"/>
+              <w:top w:val="single" w:color="5B7DB1" w:sz="4"/>
+              <w:left w:val="single" w:color="5B7DB1" w:sz="4"/>
+              <w:bottom w:val="single" w:color="5B7DB1" w:sz="4"/>
+              <w:right w:val="single" w:color="5B7DB1" w:sz="4"/>
             </w:tcBorders>
             <w:tcMar>
               <w:top w:type="dxa" w:w="60"/>
@@ -4299,10 +4317,10 @@
           <w:tcPr>
             <w:tcW w:type="dxa" w:w="3300"/>
             <w:tcBorders>
-              <w:top w:val="single" w:color="E3A3A3" w:sz="4"/>
-              <w:left w:val="single" w:color="E3A3A3" w:sz="4"/>
-              <w:bottom w:val="single" w:color="E3A3A3" w:sz="4"/>
-              <w:right w:val="single" w:color="E3A3A3" w:sz="4"/>
+              <w:top w:val="single" w:color="5B7DB1" w:sz="4"/>
+              <w:left w:val="single" w:color="5B7DB1" w:sz="4"/>
+              <w:bottom w:val="single" w:color="5B7DB1" w:sz="4"/>
+              <w:right w:val="single" w:color="5B7DB1" w:sz="4"/>
             </w:tcBorders>
             <w:tcMar>
               <w:top w:type="dxa" w:w="60"/>
@@ -4324,10 +4342,10 @@
           <w:tcPr>
             <w:tcW w:type="dxa" w:w="6338"/>
             <w:tcBorders>
-              <w:top w:val="single" w:color="E3A3A3" w:sz="4"/>
-              <w:left w:val="single" w:color="E3A3A3" w:sz="4"/>
-              <w:bottom w:val="single" w:color="E3A3A3" w:sz="4"/>
-              <w:right w:val="single" w:color="E3A3A3" w:sz="4"/>
+              <w:top w:val="single" w:color="5B7DB1" w:sz="4"/>
+              <w:left w:val="single" w:color="5B7DB1" w:sz="4"/>
+              <w:bottom w:val="single" w:color="5B7DB1" w:sz="4"/>
+              <w:right w:val="single" w:color="5B7DB1" w:sz="4"/>
             </w:tcBorders>
             <w:tcMar>
               <w:top w:type="dxa" w:w="60"/>
@@ -4351,10 +4369,10 @@
           <w:tcPr>
             <w:tcW w:type="dxa" w:w="3300"/>
             <w:tcBorders>
-              <w:top w:val="single" w:color="E3A3A3" w:sz="4"/>
-              <w:left w:val="single" w:color="E3A3A3" w:sz="4"/>
-              <w:bottom w:val="single" w:color="E3A3A3" w:sz="4"/>
-              <w:right w:val="single" w:color="E3A3A3" w:sz="4"/>
+              <w:top w:val="single" w:color="5B7DB1" w:sz="4"/>
+              <w:left w:val="single" w:color="5B7DB1" w:sz="4"/>
+              <w:bottom w:val="single" w:color="5B7DB1" w:sz="4"/>
+              <w:right w:val="single" w:color="5B7DB1" w:sz="4"/>
             </w:tcBorders>
             <w:tcMar>
               <w:top w:type="dxa" w:w="60"/>
@@ -4376,10 +4394,10 @@
           <w:tcPr>
             <w:tcW w:type="dxa" w:w="6338"/>
             <w:tcBorders>
-              <w:top w:val="single" w:color="E3A3A3" w:sz="4"/>
-              <w:left w:val="single" w:color="E3A3A3" w:sz="4"/>
-              <w:bottom w:val="single" w:color="E3A3A3" w:sz="4"/>
-              <w:right w:val="single" w:color="E3A3A3" w:sz="4"/>
+              <w:top w:val="single" w:color="5B7DB1" w:sz="4"/>
+              <w:left w:val="single" w:color="5B7DB1" w:sz="4"/>
+              <w:bottom w:val="single" w:color="5B7DB1" w:sz="4"/>
+              <w:right w:val="single" w:color="5B7DB1" w:sz="4"/>
             </w:tcBorders>
             <w:tcMar>
               <w:top w:type="dxa" w:w="60"/>
@@ -4403,10 +4421,10 @@
           <w:tcPr>
             <w:tcW w:type="dxa" w:w="3300"/>
             <w:tcBorders>
-              <w:top w:val="single" w:color="E3A3A3" w:sz="4"/>
-              <w:left w:val="single" w:color="E3A3A3" w:sz="4"/>
-              <w:bottom w:val="single" w:color="E3A3A3" w:sz="4"/>
-              <w:right w:val="single" w:color="E3A3A3" w:sz="4"/>
+              <w:top w:val="single" w:color="5B7DB1" w:sz="4"/>
+              <w:left w:val="single" w:color="5B7DB1" w:sz="4"/>
+              <w:bottom w:val="single" w:color="5B7DB1" w:sz="4"/>
+              <w:right w:val="single" w:color="5B7DB1" w:sz="4"/>
             </w:tcBorders>
             <w:tcMar>
               <w:top w:type="dxa" w:w="60"/>
@@ -4428,10 +4446,10 @@
           <w:tcPr>
             <w:tcW w:type="dxa" w:w="6338"/>
             <w:tcBorders>
-              <w:top w:val="single" w:color="E3A3A3" w:sz="4"/>
-              <w:left w:val="single" w:color="E3A3A3" w:sz="4"/>
-              <w:bottom w:val="single" w:color="E3A3A3" w:sz="4"/>
-              <w:right w:val="single" w:color="E3A3A3" w:sz="4"/>
+              <w:top w:val="single" w:color="5B7DB1" w:sz="4"/>
+              <w:left w:val="single" w:color="5B7DB1" w:sz="4"/>
+              <w:bottom w:val="single" w:color="5B7DB1" w:sz="4"/>
+              <w:right w:val="single" w:color="5B7DB1" w:sz="4"/>
             </w:tcBorders>
             <w:tcMar>
               <w:top w:type="dxa" w:w="60"/>
@@ -4653,12 +4671,12 @@
           <w:tcPr>
             <w:tcW w:type="dxa" w:w="2600"/>
             <w:tcBorders>
-              <w:top w:val="single" w:color="E3A3A3" w:sz="4"/>
-              <w:left w:val="single" w:color="E3A3A3" w:sz="4"/>
-              <w:bottom w:val="single" w:color="E3A3A3" w:sz="4"/>
-              <w:right w:val="single" w:color="E3A3A3" w:sz="4"/>
-            </w:tcBorders>
-            <w:shd w:fill="F6C1C1" w:color="auto" w:val="clear"/>
+              <w:top w:val="single" w:color="5B7DB1" w:sz="4"/>
+              <w:left w:val="single" w:color="5B7DB1" w:sz="4"/>
+              <w:bottom w:val="single" w:color="5B7DB1" w:sz="4"/>
+              <w:right w:val="single" w:color="5B7DB1" w:sz="4"/>
+            </w:tcBorders>
+            <w:shd w:fill="1F4E79" w:color="auto" w:val="clear"/>
             <w:tcMar>
               <w:top w:type="dxa" w:w="60"/>
               <w:left w:type="dxa" w:w="100"/>
@@ -4674,6 +4692,7 @@
               <w:rPr>
                 <w:b/>
                 <w:bCs/>
+                <w:color w:val="FFFFFF"/>
               </w:rPr>
               <w:t xml:space="preserve">Colonne de la matrice</w:t>
             </w:r>
@@ -4683,12 +4702,12 @@
           <w:tcPr>
             <w:tcW w:type="dxa" w:w="7038"/>
             <w:tcBorders>
-              <w:top w:val="single" w:color="E3A3A3" w:sz="4"/>
-              <w:left w:val="single" w:color="E3A3A3" w:sz="4"/>
-              <w:bottom w:val="single" w:color="E3A3A3" w:sz="4"/>
-              <w:right w:val="single" w:color="E3A3A3" w:sz="4"/>
-            </w:tcBorders>
-            <w:shd w:fill="F6C1C1" w:color="auto" w:val="clear"/>
+              <w:top w:val="single" w:color="5B7DB1" w:sz="4"/>
+              <w:left w:val="single" w:color="5B7DB1" w:sz="4"/>
+              <w:bottom w:val="single" w:color="5B7DB1" w:sz="4"/>
+              <w:right w:val="single" w:color="5B7DB1" w:sz="4"/>
+            </w:tcBorders>
+            <w:shd w:fill="1F4E79" w:color="auto" w:val="clear"/>
             <w:tcMar>
               <w:top w:type="dxa" w:w="60"/>
               <w:left w:type="dxa" w:w="100"/>
@@ -4704,6 +4723,7 @@
               <w:rPr>
                 <w:b/>
                 <w:bCs/>
+                <w:color w:val="FFFFFF"/>
               </w:rPr>
               <w:t xml:space="preserve">Signification</w:t>
             </w:r>
@@ -4715,10 +4735,10 @@
           <w:tcPr>
             <w:tcW w:type="dxa" w:w="2600"/>
             <w:tcBorders>
-              <w:top w:val="single" w:color="E3A3A3" w:sz="4"/>
-              <w:left w:val="single" w:color="E3A3A3" w:sz="4"/>
-              <w:bottom w:val="single" w:color="E3A3A3" w:sz="4"/>
-              <w:right w:val="single" w:color="E3A3A3" w:sz="4"/>
+              <w:top w:val="single" w:color="5B7DB1" w:sz="4"/>
+              <w:left w:val="single" w:color="5B7DB1" w:sz="4"/>
+              <w:bottom w:val="single" w:color="5B7DB1" w:sz="4"/>
+              <w:right w:val="single" w:color="5B7DB1" w:sz="4"/>
             </w:tcBorders>
             <w:tcMar>
               <w:top w:type="dxa" w:w="60"/>
@@ -4740,10 +4760,10 @@
           <w:tcPr>
             <w:tcW w:type="dxa" w:w="7038"/>
             <w:tcBorders>
-              <w:top w:val="single" w:color="E3A3A3" w:sz="4"/>
-              <w:left w:val="single" w:color="E3A3A3" w:sz="4"/>
-              <w:bottom w:val="single" w:color="E3A3A3" w:sz="4"/>
-              <w:right w:val="single" w:color="E3A3A3" w:sz="4"/>
+              <w:top w:val="single" w:color="5B7DB1" w:sz="4"/>
+              <w:left w:val="single" w:color="5B7DB1" w:sz="4"/>
+              <w:bottom w:val="single" w:color="5B7DB1" w:sz="4"/>
+              <w:right w:val="single" w:color="5B7DB1" w:sz="4"/>
             </w:tcBorders>
             <w:tcMar>
               <w:top w:type="dxa" w:w="60"/>
@@ -4767,10 +4787,10 @@
           <w:tcPr>
             <w:tcW w:type="dxa" w:w="2600"/>
             <w:tcBorders>
-              <w:top w:val="single" w:color="E3A3A3" w:sz="4"/>
-              <w:left w:val="single" w:color="E3A3A3" w:sz="4"/>
-              <w:bottom w:val="single" w:color="E3A3A3" w:sz="4"/>
-              <w:right w:val="single" w:color="E3A3A3" w:sz="4"/>
+              <w:top w:val="single" w:color="5B7DB1" w:sz="4"/>
+              <w:left w:val="single" w:color="5B7DB1" w:sz="4"/>
+              <w:bottom w:val="single" w:color="5B7DB1" w:sz="4"/>
+              <w:right w:val="single" w:color="5B7DB1" w:sz="4"/>
             </w:tcBorders>
             <w:tcMar>
               <w:top w:type="dxa" w:w="60"/>
@@ -4792,10 +4812,10 @@
           <w:tcPr>
             <w:tcW w:type="dxa" w:w="7038"/>
             <w:tcBorders>
-              <w:top w:val="single" w:color="E3A3A3" w:sz="4"/>
-              <w:left w:val="single" w:color="E3A3A3" w:sz="4"/>
-              <w:bottom w:val="single" w:color="E3A3A3" w:sz="4"/>
-              <w:right w:val="single" w:color="E3A3A3" w:sz="4"/>
+              <w:top w:val="single" w:color="5B7DB1" w:sz="4"/>
+              <w:left w:val="single" w:color="5B7DB1" w:sz="4"/>
+              <w:bottom w:val="single" w:color="5B7DB1" w:sz="4"/>
+              <w:right w:val="single" w:color="5B7DB1" w:sz="4"/>
             </w:tcBorders>
             <w:tcMar>
               <w:top w:type="dxa" w:w="60"/>
@@ -4819,10 +4839,10 @@
           <w:tcPr>
             <w:tcW w:type="dxa" w:w="2600"/>
             <w:tcBorders>
-              <w:top w:val="single" w:color="E3A3A3" w:sz="4"/>
-              <w:left w:val="single" w:color="E3A3A3" w:sz="4"/>
-              <w:bottom w:val="single" w:color="E3A3A3" w:sz="4"/>
-              <w:right w:val="single" w:color="E3A3A3" w:sz="4"/>
+              <w:top w:val="single" w:color="5B7DB1" w:sz="4"/>
+              <w:left w:val="single" w:color="5B7DB1" w:sz="4"/>
+              <w:bottom w:val="single" w:color="5B7DB1" w:sz="4"/>
+              <w:right w:val="single" w:color="5B7DB1" w:sz="4"/>
             </w:tcBorders>
             <w:tcMar>
               <w:top w:type="dxa" w:w="60"/>
@@ -4844,10 +4864,10 @@
           <w:tcPr>
             <w:tcW w:type="dxa" w:w="7038"/>
             <w:tcBorders>
-              <w:top w:val="single" w:color="E3A3A3" w:sz="4"/>
-              <w:left w:val="single" w:color="E3A3A3" w:sz="4"/>
-              <w:bottom w:val="single" w:color="E3A3A3" w:sz="4"/>
-              <w:right w:val="single" w:color="E3A3A3" w:sz="4"/>
+              <w:top w:val="single" w:color="5B7DB1" w:sz="4"/>
+              <w:left w:val="single" w:color="5B7DB1" w:sz="4"/>
+              <w:bottom w:val="single" w:color="5B7DB1" w:sz="4"/>
+              <w:right w:val="single" w:color="5B7DB1" w:sz="4"/>
             </w:tcBorders>
             <w:tcMar>
               <w:top w:type="dxa" w:w="60"/>
@@ -4994,12 +5014,12 @@
           <w:tcPr>
             <w:tcW w:type="dxa" w:w="2700"/>
             <w:tcBorders>
-              <w:top w:val="single" w:color="E3A3A3" w:sz="4"/>
-              <w:left w:val="single" w:color="E3A3A3" w:sz="4"/>
-              <w:bottom w:val="single" w:color="E3A3A3" w:sz="4"/>
-              <w:right w:val="single" w:color="E3A3A3" w:sz="4"/>
-            </w:tcBorders>
-            <w:shd w:fill="F6C1C1" w:color="auto" w:val="clear"/>
+              <w:top w:val="single" w:color="5B7DB1" w:sz="4"/>
+              <w:left w:val="single" w:color="5B7DB1" w:sz="4"/>
+              <w:bottom w:val="single" w:color="5B7DB1" w:sz="4"/>
+              <w:right w:val="single" w:color="5B7DB1" w:sz="4"/>
+            </w:tcBorders>
+            <w:shd w:fill="1F4E79" w:color="auto" w:val="clear"/>
             <w:tcMar>
               <w:top w:type="dxa" w:w="60"/>
               <w:left w:type="dxa" w:w="100"/>
@@ -5015,6 +5035,7 @@
               <w:rPr>
                 <w:b/>
                 <w:bCs/>
+                <w:color w:val="FFFFFF"/>
               </w:rPr>
               <w:t xml:space="preserve">Visuel</w:t>
             </w:r>
@@ -5024,12 +5045,12 @@
           <w:tcPr>
             <w:tcW w:type="dxa" w:w="2700"/>
             <w:tcBorders>
-              <w:top w:val="single" w:color="E3A3A3" w:sz="4"/>
-              <w:left w:val="single" w:color="E3A3A3" w:sz="4"/>
-              <w:bottom w:val="single" w:color="E3A3A3" w:sz="4"/>
-              <w:right w:val="single" w:color="E3A3A3" w:sz="4"/>
-            </w:tcBorders>
-            <w:shd w:fill="F6C1C1" w:color="auto" w:val="clear"/>
+              <w:top w:val="single" w:color="5B7DB1" w:sz="4"/>
+              <w:left w:val="single" w:color="5B7DB1" w:sz="4"/>
+              <w:bottom w:val="single" w:color="5B7DB1" w:sz="4"/>
+              <w:right w:val="single" w:color="5B7DB1" w:sz="4"/>
+            </w:tcBorders>
+            <w:shd w:fill="1F4E79" w:color="auto" w:val="clear"/>
             <w:tcMar>
               <w:top w:type="dxa" w:w="60"/>
               <w:left w:type="dxa" w:w="100"/>
@@ -5045,6 +5066,7 @@
               <w:rPr>
                 <w:b/>
                 <w:bCs/>
+                <w:color w:val="FFFFFF"/>
               </w:rPr>
               <w:t xml:space="preserve">Agrégat lu</w:t>
             </w:r>
@@ -5054,12 +5076,12 @@
           <w:tcPr>
             <w:tcW w:type="dxa" w:w="4238"/>
             <w:tcBorders>
-              <w:top w:val="single" w:color="E3A3A3" w:sz="4"/>
-              <w:left w:val="single" w:color="E3A3A3" w:sz="4"/>
-              <w:bottom w:val="single" w:color="E3A3A3" w:sz="4"/>
-              <w:right w:val="single" w:color="E3A3A3" w:sz="4"/>
-            </w:tcBorders>
-            <w:shd w:fill="F6C1C1" w:color="auto" w:val="clear"/>
+              <w:top w:val="single" w:color="5B7DB1" w:sz="4"/>
+              <w:left w:val="single" w:color="5B7DB1" w:sz="4"/>
+              <w:bottom w:val="single" w:color="5B7DB1" w:sz="4"/>
+              <w:right w:val="single" w:color="5B7DB1" w:sz="4"/>
+            </w:tcBorders>
+            <w:shd w:fill="1F4E79" w:color="auto" w:val="clear"/>
             <w:tcMar>
               <w:top w:type="dxa" w:w="60"/>
               <w:left w:type="dxa" w:w="100"/>
@@ -5075,6 +5097,7 @@
               <w:rPr>
                 <w:b/>
                 <w:bCs/>
+                <w:color w:val="FFFFFF"/>
               </w:rPr>
               <w:t xml:space="preserve">Comment le lire</w:t>
             </w:r>
@@ -5086,10 +5109,10 @@
           <w:tcPr>
             <w:tcW w:type="dxa" w:w="2700"/>
             <w:tcBorders>
-              <w:top w:val="single" w:color="E3A3A3" w:sz="4"/>
-              <w:left w:val="single" w:color="E3A3A3" w:sz="4"/>
-              <w:bottom w:val="single" w:color="E3A3A3" w:sz="4"/>
-              <w:right w:val="single" w:color="E3A3A3" w:sz="4"/>
+              <w:top w:val="single" w:color="5B7DB1" w:sz="4"/>
+              <w:left w:val="single" w:color="5B7DB1" w:sz="4"/>
+              <w:bottom w:val="single" w:color="5B7DB1" w:sz="4"/>
+              <w:right w:val="single" w:color="5B7DB1" w:sz="4"/>
             </w:tcBorders>
             <w:tcMar>
               <w:top w:type="dxa" w:w="60"/>
@@ -5111,10 +5134,10 @@
           <w:tcPr>
             <w:tcW w:type="dxa" w:w="2700"/>
             <w:tcBorders>
-              <w:top w:val="single" w:color="E3A3A3" w:sz="4"/>
-              <w:left w:val="single" w:color="E3A3A3" w:sz="4"/>
-              <w:bottom w:val="single" w:color="E3A3A3" w:sz="4"/>
-              <w:right w:val="single" w:color="E3A3A3" w:sz="4"/>
+              <w:top w:val="single" w:color="5B7DB1" w:sz="4"/>
+              <w:left w:val="single" w:color="5B7DB1" w:sz="4"/>
+              <w:bottom w:val="single" w:color="5B7DB1" w:sz="4"/>
+              <w:right w:val="single" w:color="5B7DB1" w:sz="4"/>
             </w:tcBorders>
             <w:tcMar>
               <w:top w:type="dxa" w:w="60"/>
@@ -5149,10 +5172,10 @@
           <w:tcPr>
             <w:tcW w:type="dxa" w:w="4238"/>
             <w:tcBorders>
-              <w:top w:val="single" w:color="E3A3A3" w:sz="4"/>
-              <w:left w:val="single" w:color="E3A3A3" w:sz="4"/>
-              <w:bottom w:val="single" w:color="E3A3A3" w:sz="4"/>
-              <w:right w:val="single" w:color="E3A3A3" w:sz="4"/>
+              <w:top w:val="single" w:color="5B7DB1" w:sz="4"/>
+              <w:left w:val="single" w:color="5B7DB1" w:sz="4"/>
+              <w:bottom w:val="single" w:color="5B7DB1" w:sz="4"/>
+              <w:right w:val="single" w:color="5B7DB1" w:sz="4"/>
             </w:tcBorders>
             <w:tcMar>
               <w:top w:type="dxa" w:w="60"/>
@@ -5176,10 +5199,10 @@
           <w:tcPr>
             <w:tcW w:type="dxa" w:w="2700"/>
             <w:tcBorders>
-              <w:top w:val="single" w:color="E3A3A3" w:sz="4"/>
-              <w:left w:val="single" w:color="E3A3A3" w:sz="4"/>
-              <w:bottom w:val="single" w:color="E3A3A3" w:sz="4"/>
-              <w:right w:val="single" w:color="E3A3A3" w:sz="4"/>
+              <w:top w:val="single" w:color="5B7DB1" w:sz="4"/>
+              <w:left w:val="single" w:color="5B7DB1" w:sz="4"/>
+              <w:bottom w:val="single" w:color="5B7DB1" w:sz="4"/>
+              <w:right w:val="single" w:color="5B7DB1" w:sz="4"/>
             </w:tcBorders>
             <w:tcMar>
               <w:top w:type="dxa" w:w="60"/>
@@ -5201,10 +5224,10 @@
           <w:tcPr>
             <w:tcW w:type="dxa" w:w="2700"/>
             <w:tcBorders>
-              <w:top w:val="single" w:color="E3A3A3" w:sz="4"/>
-              <w:left w:val="single" w:color="E3A3A3" w:sz="4"/>
-              <w:bottom w:val="single" w:color="E3A3A3" w:sz="4"/>
-              <w:right w:val="single" w:color="E3A3A3" w:sz="4"/>
+              <w:top w:val="single" w:color="5B7DB1" w:sz="4"/>
+              <w:left w:val="single" w:color="5B7DB1" w:sz="4"/>
+              <w:bottom w:val="single" w:color="5B7DB1" w:sz="4"/>
+              <w:right w:val="single" w:color="5B7DB1" w:sz="4"/>
             </w:tcBorders>
             <w:tcMar>
               <w:top w:type="dxa" w:w="60"/>
@@ -5239,10 +5262,10 @@
           <w:tcPr>
             <w:tcW w:type="dxa" w:w="4238"/>
             <w:tcBorders>
-              <w:top w:val="single" w:color="E3A3A3" w:sz="4"/>
-              <w:left w:val="single" w:color="E3A3A3" w:sz="4"/>
-              <w:bottom w:val="single" w:color="E3A3A3" w:sz="4"/>
-              <w:right w:val="single" w:color="E3A3A3" w:sz="4"/>
+              <w:top w:val="single" w:color="5B7DB1" w:sz="4"/>
+              <w:left w:val="single" w:color="5B7DB1" w:sz="4"/>
+              <w:bottom w:val="single" w:color="5B7DB1" w:sz="4"/>
+              <w:right w:val="single" w:color="5B7DB1" w:sz="4"/>
             </w:tcBorders>
             <w:tcMar>
               <w:top w:type="dxa" w:w="60"/>
@@ -5266,10 +5289,10 @@
           <w:tcPr>
             <w:tcW w:type="dxa" w:w="2700"/>
             <w:tcBorders>
-              <w:top w:val="single" w:color="E3A3A3" w:sz="4"/>
-              <w:left w:val="single" w:color="E3A3A3" w:sz="4"/>
-              <w:bottom w:val="single" w:color="E3A3A3" w:sz="4"/>
-              <w:right w:val="single" w:color="E3A3A3" w:sz="4"/>
+              <w:top w:val="single" w:color="5B7DB1" w:sz="4"/>
+              <w:left w:val="single" w:color="5B7DB1" w:sz="4"/>
+              <w:bottom w:val="single" w:color="5B7DB1" w:sz="4"/>
+              <w:right w:val="single" w:color="5B7DB1" w:sz="4"/>
             </w:tcBorders>
             <w:tcMar>
               <w:top w:type="dxa" w:w="60"/>
@@ -5291,10 +5314,10 @@
           <w:tcPr>
             <w:tcW w:type="dxa" w:w="2700"/>
             <w:tcBorders>
-              <w:top w:val="single" w:color="E3A3A3" w:sz="4"/>
-              <w:left w:val="single" w:color="E3A3A3" w:sz="4"/>
-              <w:bottom w:val="single" w:color="E3A3A3" w:sz="4"/>
-              <w:right w:val="single" w:color="E3A3A3" w:sz="4"/>
+              <w:top w:val="single" w:color="5B7DB1" w:sz="4"/>
+              <w:left w:val="single" w:color="5B7DB1" w:sz="4"/>
+              <w:bottom w:val="single" w:color="5B7DB1" w:sz="4"/>
+              <w:right w:val="single" w:color="5B7DB1" w:sz="4"/>
             </w:tcBorders>
             <w:tcMar>
               <w:top w:type="dxa" w:w="60"/>
@@ -5329,10 +5352,10 @@
           <w:tcPr>
             <w:tcW w:type="dxa" w:w="4238"/>
             <w:tcBorders>
-              <w:top w:val="single" w:color="E3A3A3" w:sz="4"/>
-              <w:left w:val="single" w:color="E3A3A3" w:sz="4"/>
-              <w:bottom w:val="single" w:color="E3A3A3" w:sz="4"/>
-              <w:right w:val="single" w:color="E3A3A3" w:sz="4"/>
+              <w:top w:val="single" w:color="5B7DB1" w:sz="4"/>
+              <w:left w:val="single" w:color="5B7DB1" w:sz="4"/>
+              <w:bottom w:val="single" w:color="5B7DB1" w:sz="4"/>
+              <w:right w:val="single" w:color="5B7DB1" w:sz="4"/>
             </w:tcBorders>
             <w:tcMar>
               <w:top w:type="dxa" w:w="60"/>
@@ -5360,9 +5383,9 @@
     <w:p>
       <w:pPr>
         <w:pBdr>
-          <w:left w:val="single" w:color="E06666" w:sz="18" w:space="6"/>
+          <w:left w:val="single" w:color="1F4E79" w:sz="18" w:space="6"/>
         </w:pBdr>
-        <w:shd w:fill="FDECEC" w:color="auto" w:val="clear"/>
+        <w:shd w:fill="DEEAF6" w:color="auto" w:val="clear"/>
         <w:spacing w:after="160" w:before="60"/>
         <w:ind w:left="120"/>
       </w:pPr>
@@ -5438,12 +5461,12 @@
           <w:tcPr>
             <w:tcW w:type="dxa" w:w="2000"/>
             <w:tcBorders>
-              <w:top w:val="single" w:color="E3A3A3" w:sz="4"/>
-              <w:left w:val="single" w:color="E3A3A3" w:sz="4"/>
-              <w:bottom w:val="single" w:color="E3A3A3" w:sz="4"/>
-              <w:right w:val="single" w:color="E3A3A3" w:sz="4"/>
-            </w:tcBorders>
-            <w:shd w:fill="F6C1C1" w:color="auto" w:val="clear"/>
+              <w:top w:val="single" w:color="5B7DB1" w:sz="4"/>
+              <w:left w:val="single" w:color="5B7DB1" w:sz="4"/>
+              <w:bottom w:val="single" w:color="5B7DB1" w:sz="4"/>
+              <w:right w:val="single" w:color="5B7DB1" w:sz="4"/>
+            </w:tcBorders>
+            <w:shd w:fill="1F4E79" w:color="auto" w:val="clear"/>
             <w:tcMar>
               <w:top w:type="dxa" w:w="60"/>
               <w:left w:type="dxa" w:w="100"/>
@@ -5459,6 +5482,7 @@
               <w:rPr>
                 <w:b/>
                 <w:bCs/>
+                <w:color w:val="FFFFFF"/>
               </w:rPr>
               <w:t xml:space="preserve">Rôle</w:t>
             </w:r>
@@ -5468,12 +5492,12 @@
           <w:tcPr>
             <w:tcW w:type="dxa" w:w="3600"/>
             <w:tcBorders>
-              <w:top w:val="single" w:color="E3A3A3" w:sz="4"/>
-              <w:left w:val="single" w:color="E3A3A3" w:sz="4"/>
-              <w:bottom w:val="single" w:color="E3A3A3" w:sz="4"/>
-              <w:right w:val="single" w:color="E3A3A3" w:sz="4"/>
-            </w:tcBorders>
-            <w:shd w:fill="F6C1C1" w:color="auto" w:val="clear"/>
+              <w:top w:val="single" w:color="5B7DB1" w:sz="4"/>
+              <w:left w:val="single" w:color="5B7DB1" w:sz="4"/>
+              <w:bottom w:val="single" w:color="5B7DB1" w:sz="4"/>
+              <w:right w:val="single" w:color="5B7DB1" w:sz="4"/>
+            </w:tcBorders>
+            <w:shd w:fill="1F4E79" w:color="auto" w:val="clear"/>
             <w:tcMar>
               <w:top w:type="dxa" w:w="60"/>
               <w:left w:type="dxa" w:w="100"/>
@@ -5489,6 +5513,7 @@
               <w:rPr>
                 <w:b/>
                 <w:bCs/>
+                <w:color w:val="FFFFFF"/>
               </w:rPr>
               <w:t xml:space="preserve">Filtre appliqué</w:t>
             </w:r>
@@ -5498,12 +5523,12 @@
           <w:tcPr>
             <w:tcW w:type="dxa" w:w="4038"/>
             <w:tcBorders>
-              <w:top w:val="single" w:color="E3A3A3" w:sz="4"/>
-              <w:left w:val="single" w:color="E3A3A3" w:sz="4"/>
-              <w:bottom w:val="single" w:color="E3A3A3" w:sz="4"/>
-              <w:right w:val="single" w:color="E3A3A3" w:sz="4"/>
-            </w:tcBorders>
-            <w:shd w:fill="F6C1C1" w:color="auto" w:val="clear"/>
+              <w:top w:val="single" w:color="5B7DB1" w:sz="4"/>
+              <w:left w:val="single" w:color="5B7DB1" w:sz="4"/>
+              <w:bottom w:val="single" w:color="5B7DB1" w:sz="4"/>
+              <w:right w:val="single" w:color="5B7DB1" w:sz="4"/>
+            </w:tcBorders>
+            <w:shd w:fill="1F4E79" w:color="auto" w:val="clear"/>
             <w:tcMar>
               <w:top w:type="dxa" w:w="60"/>
               <w:left w:type="dxa" w:w="100"/>
@@ -5519,6 +5544,7 @@
               <w:rPr>
                 <w:b/>
                 <w:bCs/>
+                <w:color w:val="FFFFFF"/>
               </w:rPr>
               <w:t xml:space="preserve">Ce que voit l'utilisateur</w:t>
             </w:r>
@@ -5530,10 +5556,10 @@
           <w:tcPr>
             <w:tcW w:type="dxa" w:w="2000"/>
             <w:tcBorders>
-              <w:top w:val="single" w:color="E3A3A3" w:sz="4"/>
-              <w:left w:val="single" w:color="E3A3A3" w:sz="4"/>
-              <w:bottom w:val="single" w:color="E3A3A3" w:sz="4"/>
-              <w:right w:val="single" w:color="E3A3A3" w:sz="4"/>
+              <w:top w:val="single" w:color="5B7DB1" w:sz="4"/>
+              <w:left w:val="single" w:color="5B7DB1" w:sz="4"/>
+              <w:bottom w:val="single" w:color="5B7DB1" w:sz="4"/>
+              <w:right w:val="single" w:color="5B7DB1" w:sz="4"/>
             </w:tcBorders>
             <w:tcMar>
               <w:top w:type="dxa" w:w="60"/>
@@ -5555,10 +5581,10 @@
           <w:tcPr>
             <w:tcW w:type="dxa" w:w="3600"/>
             <w:tcBorders>
-              <w:top w:val="single" w:color="E3A3A3" w:sz="4"/>
-              <w:left w:val="single" w:color="E3A3A3" w:sz="4"/>
-              <w:bottom w:val="single" w:color="E3A3A3" w:sz="4"/>
-              <w:right w:val="single" w:color="E3A3A3" w:sz="4"/>
+              <w:top w:val="single" w:color="5B7DB1" w:sz="4"/>
+              <w:left w:val="single" w:color="5B7DB1" w:sz="4"/>
+              <w:bottom w:val="single" w:color="5B7DB1" w:sz="4"/>
+              <w:right w:val="single" w:color="5B7DB1" w:sz="4"/>
             </w:tcBorders>
             <w:tcMar>
               <w:top w:type="dxa" w:w="60"/>
@@ -5585,10 +5611,10 @@
           <w:tcPr>
             <w:tcW w:type="dxa" w:w="4038"/>
             <w:tcBorders>
-              <w:top w:val="single" w:color="E3A3A3" w:sz="4"/>
-              <w:left w:val="single" w:color="E3A3A3" w:sz="4"/>
-              <w:bottom w:val="single" w:color="E3A3A3" w:sz="4"/>
-              <w:right w:val="single" w:color="E3A3A3" w:sz="4"/>
+              <w:top w:val="single" w:color="5B7DB1" w:sz="4"/>
+              <w:left w:val="single" w:color="5B7DB1" w:sz="4"/>
+              <w:bottom w:val="single" w:color="5B7DB1" w:sz="4"/>
+              <w:right w:val="single" w:color="5B7DB1" w:sz="4"/>
             </w:tcBorders>
             <w:tcMar>
               <w:top w:type="dxa" w:w="60"/>
@@ -5612,10 +5638,10 @@
           <w:tcPr>
             <w:tcW w:type="dxa" w:w="2000"/>
             <w:tcBorders>
-              <w:top w:val="single" w:color="E3A3A3" w:sz="4"/>
-              <w:left w:val="single" w:color="E3A3A3" w:sz="4"/>
-              <w:bottom w:val="single" w:color="E3A3A3" w:sz="4"/>
-              <w:right w:val="single" w:color="E3A3A3" w:sz="4"/>
+              <w:top w:val="single" w:color="5B7DB1" w:sz="4"/>
+              <w:left w:val="single" w:color="5B7DB1" w:sz="4"/>
+              <w:bottom w:val="single" w:color="5B7DB1" w:sz="4"/>
+              <w:right w:val="single" w:color="5B7DB1" w:sz="4"/>
             </w:tcBorders>
             <w:tcMar>
               <w:top w:type="dxa" w:w="60"/>
@@ -5637,10 +5663,10 @@
           <w:tcPr>
             <w:tcW w:type="dxa" w:w="3600"/>
             <w:tcBorders>
-              <w:top w:val="single" w:color="E3A3A3" w:sz="4"/>
-              <w:left w:val="single" w:color="E3A3A3" w:sz="4"/>
-              <w:bottom w:val="single" w:color="E3A3A3" w:sz="4"/>
-              <w:right w:val="single" w:color="E3A3A3" w:sz="4"/>
+              <w:top w:val="single" w:color="5B7DB1" w:sz="4"/>
+              <w:left w:val="single" w:color="5B7DB1" w:sz="4"/>
+              <w:bottom w:val="single" w:color="5B7DB1" w:sz="4"/>
+              <w:right w:val="single" w:color="5B7DB1" w:sz="4"/>
             </w:tcBorders>
             <w:tcMar>
               <w:top w:type="dxa" w:w="60"/>
@@ -5667,10 +5693,10 @@
           <w:tcPr>
             <w:tcW w:type="dxa" w:w="4038"/>
             <w:tcBorders>
-              <w:top w:val="single" w:color="E3A3A3" w:sz="4"/>
-              <w:left w:val="single" w:color="E3A3A3" w:sz="4"/>
-              <w:bottom w:val="single" w:color="E3A3A3" w:sz="4"/>
-              <w:right w:val="single" w:color="E3A3A3" w:sz="4"/>
+              <w:top w:val="single" w:color="5B7DB1" w:sz="4"/>
+              <w:left w:val="single" w:color="5B7DB1" w:sz="4"/>
+              <w:bottom w:val="single" w:color="5B7DB1" w:sz="4"/>
+              <w:right w:val="single" w:color="5B7DB1" w:sz="4"/>
             </w:tcBorders>
             <w:tcMar>
               <w:top w:type="dxa" w:w="60"/>
@@ -5879,12 +5905,12 @@
           <w:tcPr>
             <w:tcW w:type="dxa" w:w="5000"/>
             <w:tcBorders>
-              <w:top w:val="single" w:color="E3A3A3" w:sz="4"/>
-              <w:left w:val="single" w:color="E3A3A3" w:sz="4"/>
-              <w:bottom w:val="single" w:color="E3A3A3" w:sz="4"/>
-              <w:right w:val="single" w:color="E3A3A3" w:sz="4"/>
-            </w:tcBorders>
-            <w:shd w:fill="F6C1C1" w:color="auto" w:val="clear"/>
+              <w:top w:val="single" w:color="5B7DB1" w:sz="4"/>
+              <w:left w:val="single" w:color="5B7DB1" w:sz="4"/>
+              <w:bottom w:val="single" w:color="5B7DB1" w:sz="4"/>
+              <w:right w:val="single" w:color="5B7DB1" w:sz="4"/>
+            </w:tcBorders>
+            <w:shd w:fill="1F4E79" w:color="auto" w:val="clear"/>
             <w:tcMar>
               <w:top w:type="dxa" w:w="60"/>
               <w:left w:type="dxa" w:w="100"/>
@@ -5900,6 +5926,7 @@
               <w:rPr>
                 <w:b/>
                 <w:bCs/>
+                <w:color w:val="FFFFFF"/>
               </w:rPr>
               <w:t xml:space="preserve">Question du décideur</w:t>
             </w:r>
@@ -5909,12 +5936,12 @@
           <w:tcPr>
             <w:tcW w:type="dxa" w:w="4638"/>
             <w:tcBorders>
-              <w:top w:val="single" w:color="E3A3A3" w:sz="4"/>
-              <w:left w:val="single" w:color="E3A3A3" w:sz="4"/>
-              <w:bottom w:val="single" w:color="E3A3A3" w:sz="4"/>
-              <w:right w:val="single" w:color="E3A3A3" w:sz="4"/>
-            </w:tcBorders>
-            <w:shd w:fill="F6C1C1" w:color="auto" w:val="clear"/>
+              <w:top w:val="single" w:color="5B7DB1" w:sz="4"/>
+              <w:left w:val="single" w:color="5B7DB1" w:sz="4"/>
+              <w:bottom w:val="single" w:color="5B7DB1" w:sz="4"/>
+              <w:right w:val="single" w:color="5B7DB1" w:sz="4"/>
+            </w:tcBorders>
+            <w:shd w:fill="1F4E79" w:color="auto" w:val="clear"/>
             <w:tcMar>
               <w:top w:type="dxa" w:w="60"/>
               <w:left w:type="dxa" w:w="100"/>
@@ -5930,6 +5957,7 @@
               <w:rPr>
                 <w:b/>
                 <w:bCs/>
+                <w:color w:val="FFFFFF"/>
               </w:rPr>
               <w:t xml:space="preserve">Où regarder</w:t>
             </w:r>
@@ -5941,10 +5969,10 @@
           <w:tcPr>
             <w:tcW w:type="dxa" w:w="5000"/>
             <w:tcBorders>
-              <w:top w:val="single" w:color="E3A3A3" w:sz="4"/>
-              <w:left w:val="single" w:color="E3A3A3" w:sz="4"/>
-              <w:bottom w:val="single" w:color="E3A3A3" w:sz="4"/>
-              <w:right w:val="single" w:color="E3A3A3" w:sz="4"/>
+              <w:top w:val="single" w:color="5B7DB1" w:sz="4"/>
+              <w:left w:val="single" w:color="5B7DB1" w:sz="4"/>
+              <w:bottom w:val="single" w:color="5B7DB1" w:sz="4"/>
+              <w:right w:val="single" w:color="5B7DB1" w:sz="4"/>
             </w:tcBorders>
             <w:tcMar>
               <w:top w:type="dxa" w:w="60"/>
@@ -5966,10 +5994,10 @@
           <w:tcPr>
             <w:tcW w:type="dxa" w:w="4638"/>
             <w:tcBorders>
-              <w:top w:val="single" w:color="E3A3A3" w:sz="4"/>
-              <w:left w:val="single" w:color="E3A3A3" w:sz="4"/>
-              <w:bottom w:val="single" w:color="E3A3A3" w:sz="4"/>
-              <w:right w:val="single" w:color="E3A3A3" w:sz="4"/>
+              <w:top w:val="single" w:color="5B7DB1" w:sz="4"/>
+              <w:left w:val="single" w:color="5B7DB1" w:sz="4"/>
+              <w:bottom w:val="single" w:color="5B7DB1" w:sz="4"/>
+              <w:right w:val="single" w:color="5B7DB1" w:sz="4"/>
             </w:tcBorders>
             <w:tcMar>
               <w:top w:type="dxa" w:w="60"/>
@@ -5993,10 +6021,10 @@
           <w:tcPr>
             <w:tcW w:type="dxa" w:w="5000"/>
             <w:tcBorders>
-              <w:top w:val="single" w:color="E3A3A3" w:sz="4"/>
-              <w:left w:val="single" w:color="E3A3A3" w:sz="4"/>
-              <w:bottom w:val="single" w:color="E3A3A3" w:sz="4"/>
-              <w:right w:val="single" w:color="E3A3A3" w:sz="4"/>
+              <w:top w:val="single" w:color="5B7DB1" w:sz="4"/>
+              <w:left w:val="single" w:color="5B7DB1" w:sz="4"/>
+              <w:bottom w:val="single" w:color="5B7DB1" w:sz="4"/>
+              <w:right w:val="single" w:color="5B7DB1" w:sz="4"/>
             </w:tcBorders>
             <w:tcMar>
               <w:top w:type="dxa" w:w="60"/>
@@ -6018,10 +6046,10 @@
           <w:tcPr>
             <w:tcW w:type="dxa" w:w="4638"/>
             <w:tcBorders>
-              <w:top w:val="single" w:color="E3A3A3" w:sz="4"/>
-              <w:left w:val="single" w:color="E3A3A3" w:sz="4"/>
-              <w:bottom w:val="single" w:color="E3A3A3" w:sz="4"/>
-              <w:right w:val="single" w:color="E3A3A3" w:sz="4"/>
+              <w:top w:val="single" w:color="5B7DB1" w:sz="4"/>
+              <w:left w:val="single" w:color="5B7DB1" w:sz="4"/>
+              <w:bottom w:val="single" w:color="5B7DB1" w:sz="4"/>
+              <w:right w:val="single" w:color="5B7DB1" w:sz="4"/>
             </w:tcBorders>
             <w:tcMar>
               <w:top w:type="dxa" w:w="60"/>
@@ -6045,10 +6073,10 @@
           <w:tcPr>
             <w:tcW w:type="dxa" w:w="5000"/>
             <w:tcBorders>
-              <w:top w:val="single" w:color="E3A3A3" w:sz="4"/>
-              <w:left w:val="single" w:color="E3A3A3" w:sz="4"/>
-              <w:bottom w:val="single" w:color="E3A3A3" w:sz="4"/>
-              <w:right w:val="single" w:color="E3A3A3" w:sz="4"/>
+              <w:top w:val="single" w:color="5B7DB1" w:sz="4"/>
+              <w:left w:val="single" w:color="5B7DB1" w:sz="4"/>
+              <w:bottom w:val="single" w:color="5B7DB1" w:sz="4"/>
+              <w:right w:val="single" w:color="5B7DB1" w:sz="4"/>
             </w:tcBorders>
             <w:tcMar>
               <w:top w:type="dxa" w:w="60"/>
@@ -6070,10 +6098,10 @@
           <w:tcPr>
             <w:tcW w:type="dxa" w:w="4638"/>
             <w:tcBorders>
-              <w:top w:val="single" w:color="E3A3A3" w:sz="4"/>
-              <w:left w:val="single" w:color="E3A3A3" w:sz="4"/>
-              <w:bottom w:val="single" w:color="E3A3A3" w:sz="4"/>
-              <w:right w:val="single" w:color="E3A3A3" w:sz="4"/>
+              <w:top w:val="single" w:color="5B7DB1" w:sz="4"/>
+              <w:left w:val="single" w:color="5B7DB1" w:sz="4"/>
+              <w:bottom w:val="single" w:color="5B7DB1" w:sz="4"/>
+              <w:right w:val="single" w:color="5B7DB1" w:sz="4"/>
             </w:tcBorders>
             <w:tcMar>
               <w:top w:type="dxa" w:w="60"/>
@@ -6097,10 +6125,10 @@
           <w:tcPr>
             <w:tcW w:type="dxa" w:w="5000"/>
             <w:tcBorders>
-              <w:top w:val="single" w:color="E3A3A3" w:sz="4"/>
-              <w:left w:val="single" w:color="E3A3A3" w:sz="4"/>
-              <w:bottom w:val="single" w:color="E3A3A3" w:sz="4"/>
-              <w:right w:val="single" w:color="E3A3A3" w:sz="4"/>
+              <w:top w:val="single" w:color="5B7DB1" w:sz="4"/>
+              <w:left w:val="single" w:color="5B7DB1" w:sz="4"/>
+              <w:bottom w:val="single" w:color="5B7DB1" w:sz="4"/>
+              <w:right w:val="single" w:color="5B7DB1" w:sz="4"/>
             </w:tcBorders>
             <w:tcMar>
               <w:top w:type="dxa" w:w="60"/>
@@ -6122,10 +6150,10 @@
           <w:tcPr>
             <w:tcW w:type="dxa" w:w="4638"/>
             <w:tcBorders>
-              <w:top w:val="single" w:color="E3A3A3" w:sz="4"/>
-              <w:left w:val="single" w:color="E3A3A3" w:sz="4"/>
-              <w:bottom w:val="single" w:color="E3A3A3" w:sz="4"/>
-              <w:right w:val="single" w:color="E3A3A3" w:sz="4"/>
+              <w:top w:val="single" w:color="5B7DB1" w:sz="4"/>
+              <w:left w:val="single" w:color="5B7DB1" w:sz="4"/>
+              <w:bottom w:val="single" w:color="5B7DB1" w:sz="4"/>
+              <w:right w:val="single" w:color="5B7DB1" w:sz="4"/>
             </w:tcBorders>
             <w:tcMar>
               <w:top w:type="dxa" w:w="60"/>
@@ -6149,10 +6177,10 @@
           <w:tcPr>
             <w:tcW w:type="dxa" w:w="5000"/>
             <w:tcBorders>
-              <w:top w:val="single" w:color="E3A3A3" w:sz="4"/>
-              <w:left w:val="single" w:color="E3A3A3" w:sz="4"/>
-              <w:bottom w:val="single" w:color="E3A3A3" w:sz="4"/>
-              <w:right w:val="single" w:color="E3A3A3" w:sz="4"/>
+              <w:top w:val="single" w:color="5B7DB1" w:sz="4"/>
+              <w:left w:val="single" w:color="5B7DB1" w:sz="4"/>
+              <w:bottom w:val="single" w:color="5B7DB1" w:sz="4"/>
+              <w:right w:val="single" w:color="5B7DB1" w:sz="4"/>
             </w:tcBorders>
             <w:tcMar>
               <w:top w:type="dxa" w:w="60"/>
@@ -6174,10 +6202,10 @@
           <w:tcPr>
             <w:tcW w:type="dxa" w:w="4638"/>
             <w:tcBorders>
-              <w:top w:val="single" w:color="E3A3A3" w:sz="4"/>
-              <w:left w:val="single" w:color="E3A3A3" w:sz="4"/>
-              <w:bottom w:val="single" w:color="E3A3A3" w:sz="4"/>
-              <w:right w:val="single" w:color="E3A3A3" w:sz="4"/>
+              <w:top w:val="single" w:color="5B7DB1" w:sz="4"/>
+              <w:left w:val="single" w:color="5B7DB1" w:sz="4"/>
+              <w:bottom w:val="single" w:color="5B7DB1" w:sz="4"/>
+              <w:right w:val="single" w:color="5B7DB1" w:sz="4"/>
             </w:tcBorders>
             <w:tcMar>
               <w:top w:type="dxa" w:w="60"/>
@@ -6201,10 +6229,10 @@
           <w:tcPr>
             <w:tcW w:type="dxa" w:w="5000"/>
             <w:tcBorders>
-              <w:top w:val="single" w:color="E3A3A3" w:sz="4"/>
-              <w:left w:val="single" w:color="E3A3A3" w:sz="4"/>
-              <w:bottom w:val="single" w:color="E3A3A3" w:sz="4"/>
-              <w:right w:val="single" w:color="E3A3A3" w:sz="4"/>
+              <w:top w:val="single" w:color="5B7DB1" w:sz="4"/>
+              <w:left w:val="single" w:color="5B7DB1" w:sz="4"/>
+              <w:bottom w:val="single" w:color="5B7DB1" w:sz="4"/>
+              <w:right w:val="single" w:color="5B7DB1" w:sz="4"/>
             </w:tcBorders>
             <w:tcMar>
               <w:top w:type="dxa" w:w="60"/>
@@ -6226,10 +6254,10 @@
           <w:tcPr>
             <w:tcW w:type="dxa" w:w="4638"/>
             <w:tcBorders>
-              <w:top w:val="single" w:color="E3A3A3" w:sz="4"/>
-              <w:left w:val="single" w:color="E3A3A3" w:sz="4"/>
-              <w:bottom w:val="single" w:color="E3A3A3" w:sz="4"/>
-              <w:right w:val="single" w:color="E3A3A3" w:sz="4"/>
+              <w:top w:val="single" w:color="5B7DB1" w:sz="4"/>
+              <w:left w:val="single" w:color="5B7DB1" w:sz="4"/>
+              <w:bottom w:val="single" w:color="5B7DB1" w:sz="4"/>
+              <w:right w:val="single" w:color="5B7DB1" w:sz="4"/>
             </w:tcBorders>
             <w:tcMar>
               <w:top w:type="dxa" w:w="60"/>
@@ -6253,10 +6281,10 @@
           <w:tcPr>
             <w:tcW w:type="dxa" w:w="5000"/>
             <w:tcBorders>
-              <w:top w:val="single" w:color="E3A3A3" w:sz="4"/>
-              <w:left w:val="single" w:color="E3A3A3" w:sz="4"/>
-              <w:bottom w:val="single" w:color="E3A3A3" w:sz="4"/>
-              <w:right w:val="single" w:color="E3A3A3" w:sz="4"/>
+              <w:top w:val="single" w:color="5B7DB1" w:sz="4"/>
+              <w:left w:val="single" w:color="5B7DB1" w:sz="4"/>
+              <w:bottom w:val="single" w:color="5B7DB1" w:sz="4"/>
+              <w:right w:val="single" w:color="5B7DB1" w:sz="4"/>
             </w:tcBorders>
             <w:tcMar>
               <w:top w:type="dxa" w:w="60"/>
@@ -6278,10 +6306,10 @@
           <w:tcPr>
             <w:tcW w:type="dxa" w:w="4638"/>
             <w:tcBorders>
-              <w:top w:val="single" w:color="E3A3A3" w:sz="4"/>
-              <w:left w:val="single" w:color="E3A3A3" w:sz="4"/>
-              <w:bottom w:val="single" w:color="E3A3A3" w:sz="4"/>
-              <w:right w:val="single" w:color="E3A3A3" w:sz="4"/>
+              <w:top w:val="single" w:color="5B7DB1" w:sz="4"/>
+              <w:left w:val="single" w:color="5B7DB1" w:sz="4"/>
+              <w:bottom w:val="single" w:color="5B7DB1" w:sz="4"/>
+              <w:right w:val="single" w:color="5B7DB1" w:sz="4"/>
             </w:tcBorders>
             <w:tcMar>
               <w:top w:type="dxa" w:w="60"/>
@@ -6305,10 +6333,10 @@
           <w:tcPr>
             <w:tcW w:type="dxa" w:w="5000"/>
             <w:tcBorders>
-              <w:top w:val="single" w:color="E3A3A3" w:sz="4"/>
-              <w:left w:val="single" w:color="E3A3A3" w:sz="4"/>
-              <w:bottom w:val="single" w:color="E3A3A3" w:sz="4"/>
-              <w:right w:val="single" w:color="E3A3A3" w:sz="4"/>
+              <w:top w:val="single" w:color="5B7DB1" w:sz="4"/>
+              <w:left w:val="single" w:color="5B7DB1" w:sz="4"/>
+              <w:bottom w:val="single" w:color="5B7DB1" w:sz="4"/>
+              <w:right w:val="single" w:color="5B7DB1" w:sz="4"/>
             </w:tcBorders>
             <w:tcMar>
               <w:top w:type="dxa" w:w="60"/>
@@ -6330,10 +6358,10 @@
           <w:tcPr>
             <w:tcW w:type="dxa" w:w="4638"/>
             <w:tcBorders>
-              <w:top w:val="single" w:color="E3A3A3" w:sz="4"/>
-              <w:left w:val="single" w:color="E3A3A3" w:sz="4"/>
-              <w:bottom w:val="single" w:color="E3A3A3" w:sz="4"/>
-              <w:right w:val="single" w:color="E3A3A3" w:sz="4"/>
+              <w:top w:val="single" w:color="5B7DB1" w:sz="4"/>
+              <w:left w:val="single" w:color="5B7DB1" w:sz="4"/>
+              <w:bottom w:val="single" w:color="5B7DB1" w:sz="4"/>
+              <w:right w:val="single" w:color="5B7DB1" w:sz="4"/>
             </w:tcBorders>
             <w:tcMar>
               <w:top w:type="dxa" w:w="60"/>
@@ -6357,10 +6385,10 @@
           <w:tcPr>
             <w:tcW w:type="dxa" w:w="5000"/>
             <w:tcBorders>
-              <w:top w:val="single" w:color="E3A3A3" w:sz="4"/>
-              <w:left w:val="single" w:color="E3A3A3" w:sz="4"/>
-              <w:bottom w:val="single" w:color="E3A3A3" w:sz="4"/>
-              <w:right w:val="single" w:color="E3A3A3" w:sz="4"/>
+              <w:top w:val="single" w:color="5B7DB1" w:sz="4"/>
+              <w:left w:val="single" w:color="5B7DB1" w:sz="4"/>
+              <w:bottom w:val="single" w:color="5B7DB1" w:sz="4"/>
+              <w:right w:val="single" w:color="5B7DB1" w:sz="4"/>
             </w:tcBorders>
             <w:tcMar>
               <w:top w:type="dxa" w:w="60"/>
@@ -6382,10 +6410,10 @@
           <w:tcPr>
             <w:tcW w:type="dxa" w:w="4638"/>
             <w:tcBorders>
-              <w:top w:val="single" w:color="E3A3A3" w:sz="4"/>
-              <w:left w:val="single" w:color="E3A3A3" w:sz="4"/>
-              <w:bottom w:val="single" w:color="E3A3A3" w:sz="4"/>
-              <w:right w:val="single" w:color="E3A3A3" w:sz="4"/>
+              <w:top w:val="single" w:color="5B7DB1" w:sz="4"/>
+              <w:left w:val="single" w:color="5B7DB1" w:sz="4"/>
+              <w:bottom w:val="single" w:color="5B7DB1" w:sz="4"/>
+              <w:right w:val="single" w:color="5B7DB1" w:sz="4"/>
             </w:tcBorders>
             <w:tcMar>
               <w:top w:type="dxa" w:w="60"/>
@@ -6409,10 +6437,10 @@
           <w:tcPr>
             <w:tcW w:type="dxa" w:w="5000"/>
             <w:tcBorders>
-              <w:top w:val="single" w:color="E3A3A3" w:sz="4"/>
-              <w:left w:val="single" w:color="E3A3A3" w:sz="4"/>
-              <w:bottom w:val="single" w:color="E3A3A3" w:sz="4"/>
-              <w:right w:val="single" w:color="E3A3A3" w:sz="4"/>
+              <w:top w:val="single" w:color="5B7DB1" w:sz="4"/>
+              <w:left w:val="single" w:color="5B7DB1" w:sz="4"/>
+              <w:bottom w:val="single" w:color="5B7DB1" w:sz="4"/>
+              <w:right w:val="single" w:color="5B7DB1" w:sz="4"/>
             </w:tcBorders>
             <w:tcMar>
               <w:top w:type="dxa" w:w="60"/>
@@ -6434,10 +6462,10 @@
           <w:tcPr>
             <w:tcW w:type="dxa" w:w="4638"/>
             <w:tcBorders>
-              <w:top w:val="single" w:color="E3A3A3" w:sz="4"/>
-              <w:left w:val="single" w:color="E3A3A3" w:sz="4"/>
-              <w:bottom w:val="single" w:color="E3A3A3" w:sz="4"/>
-              <w:right w:val="single" w:color="E3A3A3" w:sz="4"/>
+              <w:top w:val="single" w:color="5B7DB1" w:sz="4"/>
+              <w:left w:val="single" w:color="5B7DB1" w:sz="4"/>
+              <w:bottom w:val="single" w:color="5B7DB1" w:sz="4"/>
+              <w:right w:val="single" w:color="5B7DB1" w:sz="4"/>
             </w:tcBorders>
             <w:tcMar>
               <w:top w:type="dxa" w:w="60"/>
@@ -6461,10 +6489,10 @@
           <w:tcPr>
             <w:tcW w:type="dxa" w:w="5000"/>
             <w:tcBorders>
-              <w:top w:val="single" w:color="E3A3A3" w:sz="4"/>
-              <w:left w:val="single" w:color="E3A3A3" w:sz="4"/>
-              <w:bottom w:val="single" w:color="E3A3A3" w:sz="4"/>
-              <w:right w:val="single" w:color="E3A3A3" w:sz="4"/>
+              <w:top w:val="single" w:color="5B7DB1" w:sz="4"/>
+              <w:left w:val="single" w:color="5B7DB1" w:sz="4"/>
+              <w:bottom w:val="single" w:color="5B7DB1" w:sz="4"/>
+              <w:right w:val="single" w:color="5B7DB1" w:sz="4"/>
             </w:tcBorders>
             <w:tcMar>
               <w:top w:type="dxa" w:w="60"/>
@@ -6486,10 +6514,10 @@
           <w:tcPr>
             <w:tcW w:type="dxa" w:w="4638"/>
             <w:tcBorders>
-              <w:top w:val="single" w:color="E3A3A3" w:sz="4"/>
-              <w:left w:val="single" w:color="E3A3A3" w:sz="4"/>
-              <w:bottom w:val="single" w:color="E3A3A3" w:sz="4"/>
-              <w:right w:val="single" w:color="E3A3A3" w:sz="4"/>
+              <w:top w:val="single" w:color="5B7DB1" w:sz="4"/>
+              <w:left w:val="single" w:color="5B7DB1" w:sz="4"/>
+              <w:bottom w:val="single" w:color="5B7DB1" w:sz="4"/>
+              <w:right w:val="single" w:color="5B7DB1" w:sz="4"/>
             </w:tcBorders>
             <w:tcMar>
               <w:top w:type="dxa" w:w="60"/>
@@ -6546,12 +6574,12 @@
           <w:tcPr>
             <w:tcW w:type="dxa" w:w="3600"/>
             <w:tcBorders>
-              <w:top w:val="single" w:color="E3A3A3" w:sz="4"/>
-              <w:left w:val="single" w:color="E3A3A3" w:sz="4"/>
-              <w:bottom w:val="single" w:color="E3A3A3" w:sz="4"/>
-              <w:right w:val="single" w:color="E3A3A3" w:sz="4"/>
-            </w:tcBorders>
-            <w:shd w:fill="F6C1C1" w:color="auto" w:val="clear"/>
+              <w:top w:val="single" w:color="5B7DB1" w:sz="4"/>
+              <w:left w:val="single" w:color="5B7DB1" w:sz="4"/>
+              <w:bottom w:val="single" w:color="5B7DB1" w:sz="4"/>
+              <w:right w:val="single" w:color="5B7DB1" w:sz="4"/>
+            </w:tcBorders>
+            <w:shd w:fill="1F4E79" w:color="auto" w:val="clear"/>
             <w:tcMar>
               <w:top w:type="dxa" w:w="60"/>
               <w:left w:type="dxa" w:w="100"/>
@@ -6567,6 +6595,7 @@
               <w:rPr>
                 <w:b/>
                 <w:bCs/>
+                <w:color w:val="FFFFFF"/>
               </w:rPr>
               <w:t xml:space="preserve">Symptôme</w:t>
             </w:r>
@@ -6576,12 +6605,12 @@
           <w:tcPr>
             <w:tcW w:type="dxa" w:w="6038"/>
             <w:tcBorders>
-              <w:top w:val="single" w:color="E3A3A3" w:sz="4"/>
-              <w:left w:val="single" w:color="E3A3A3" w:sz="4"/>
-              <w:bottom w:val="single" w:color="E3A3A3" w:sz="4"/>
-              <w:right w:val="single" w:color="E3A3A3" w:sz="4"/>
-            </w:tcBorders>
-            <w:shd w:fill="F6C1C1" w:color="auto" w:val="clear"/>
+              <w:top w:val="single" w:color="5B7DB1" w:sz="4"/>
+              <w:left w:val="single" w:color="5B7DB1" w:sz="4"/>
+              <w:bottom w:val="single" w:color="5B7DB1" w:sz="4"/>
+              <w:right w:val="single" w:color="5B7DB1" w:sz="4"/>
+            </w:tcBorders>
+            <w:shd w:fill="1F4E79" w:color="auto" w:val="clear"/>
             <w:tcMar>
               <w:top w:type="dxa" w:w="60"/>
               <w:left w:type="dxa" w:w="100"/>
@@ -6597,6 +6626,7 @@
               <w:rPr>
                 <w:b/>
                 <w:bCs/>
+                <w:color w:val="FFFFFF"/>
               </w:rPr>
               <w:t xml:space="preserve">Solution</w:t>
             </w:r>
@@ -6608,10 +6638,10 @@
           <w:tcPr>
             <w:tcW w:type="dxa" w:w="3600"/>
             <w:tcBorders>
-              <w:top w:val="single" w:color="E3A3A3" w:sz="4"/>
-              <w:left w:val="single" w:color="E3A3A3" w:sz="4"/>
-              <w:bottom w:val="single" w:color="E3A3A3" w:sz="4"/>
-              <w:right w:val="single" w:color="E3A3A3" w:sz="4"/>
+              <w:top w:val="single" w:color="5B7DB1" w:sz="4"/>
+              <w:left w:val="single" w:color="5B7DB1" w:sz="4"/>
+              <w:bottom w:val="single" w:color="5B7DB1" w:sz="4"/>
+              <w:right w:val="single" w:color="5B7DB1" w:sz="4"/>
             </w:tcBorders>
             <w:tcMar>
               <w:top w:type="dxa" w:w="60"/>
@@ -6633,10 +6663,10 @@
           <w:tcPr>
             <w:tcW w:type="dxa" w:w="6038"/>
             <w:tcBorders>
-              <w:top w:val="single" w:color="E3A3A3" w:sz="4"/>
-              <w:left w:val="single" w:color="E3A3A3" w:sz="4"/>
-              <w:bottom w:val="single" w:color="E3A3A3" w:sz="4"/>
-              <w:right w:val="single" w:color="E3A3A3" w:sz="4"/>
+              <w:top w:val="single" w:color="5B7DB1" w:sz="4"/>
+              <w:left w:val="single" w:color="5B7DB1" w:sz="4"/>
+              <w:bottom w:val="single" w:color="5B7DB1" w:sz="4"/>
+              <w:right w:val="single" w:color="5B7DB1" w:sz="4"/>
             </w:tcBorders>
             <w:tcMar>
               <w:top w:type="dxa" w:w="60"/>
@@ -6671,10 +6701,10 @@
           <w:tcPr>
             <w:tcW w:type="dxa" w:w="3600"/>
             <w:tcBorders>
-              <w:top w:val="single" w:color="E3A3A3" w:sz="4"/>
-              <w:left w:val="single" w:color="E3A3A3" w:sz="4"/>
-              <w:bottom w:val="single" w:color="E3A3A3" w:sz="4"/>
-              <w:right w:val="single" w:color="E3A3A3" w:sz="4"/>
+              <w:top w:val="single" w:color="5B7DB1" w:sz="4"/>
+              <w:left w:val="single" w:color="5B7DB1" w:sz="4"/>
+              <w:bottom w:val="single" w:color="5B7DB1" w:sz="4"/>
+              <w:right w:val="single" w:color="5B7DB1" w:sz="4"/>
             </w:tcBorders>
             <w:tcMar>
               <w:top w:type="dxa" w:w="60"/>
@@ -6696,10 +6726,10 @@
           <w:tcPr>
             <w:tcW w:type="dxa" w:w="6038"/>
             <w:tcBorders>
-              <w:top w:val="single" w:color="E3A3A3" w:sz="4"/>
-              <w:left w:val="single" w:color="E3A3A3" w:sz="4"/>
-              <w:bottom w:val="single" w:color="E3A3A3" w:sz="4"/>
-              <w:right w:val="single" w:color="E3A3A3" w:sz="4"/>
+              <w:top w:val="single" w:color="5B7DB1" w:sz="4"/>
+              <w:left w:val="single" w:color="5B7DB1" w:sz="4"/>
+              <w:bottom w:val="single" w:color="5B7DB1" w:sz="4"/>
+              <w:right w:val="single" w:color="5B7DB1" w:sz="4"/>
             </w:tcBorders>
             <w:tcMar>
               <w:top w:type="dxa" w:w="60"/>
@@ -6733,10 +6763,10 @@
           <w:tcPr>
             <w:tcW w:type="dxa" w:w="3600"/>
             <w:tcBorders>
-              <w:top w:val="single" w:color="E3A3A3" w:sz="4"/>
-              <w:left w:val="single" w:color="E3A3A3" w:sz="4"/>
-              <w:bottom w:val="single" w:color="E3A3A3" w:sz="4"/>
-              <w:right w:val="single" w:color="E3A3A3" w:sz="4"/>
+              <w:top w:val="single" w:color="5B7DB1" w:sz="4"/>
+              <w:left w:val="single" w:color="5B7DB1" w:sz="4"/>
+              <w:bottom w:val="single" w:color="5B7DB1" w:sz="4"/>
+              <w:right w:val="single" w:color="5B7DB1" w:sz="4"/>
             </w:tcBorders>
             <w:tcMar>
               <w:top w:type="dxa" w:w="60"/>
@@ -6758,10 +6788,10 @@
           <w:tcPr>
             <w:tcW w:type="dxa" w:w="6038"/>
             <w:tcBorders>
-              <w:top w:val="single" w:color="E3A3A3" w:sz="4"/>
-              <w:left w:val="single" w:color="E3A3A3" w:sz="4"/>
-              <w:bottom w:val="single" w:color="E3A3A3" w:sz="4"/>
-              <w:right w:val="single" w:color="E3A3A3" w:sz="4"/>
+              <w:top w:val="single" w:color="5B7DB1" w:sz="4"/>
+              <w:left w:val="single" w:color="5B7DB1" w:sz="4"/>
+              <w:bottom w:val="single" w:color="5B7DB1" w:sz="4"/>
+              <w:right w:val="single" w:color="5B7DB1" w:sz="4"/>
             </w:tcBorders>
             <w:tcMar>
               <w:top w:type="dxa" w:w="60"/>
@@ -6795,10 +6825,10 @@
           <w:tcPr>
             <w:tcW w:type="dxa" w:w="3600"/>
             <w:tcBorders>
-              <w:top w:val="single" w:color="E3A3A3" w:sz="4"/>
-              <w:left w:val="single" w:color="E3A3A3" w:sz="4"/>
-              <w:bottom w:val="single" w:color="E3A3A3" w:sz="4"/>
-              <w:right w:val="single" w:color="E3A3A3" w:sz="4"/>
+              <w:top w:val="single" w:color="5B7DB1" w:sz="4"/>
+              <w:left w:val="single" w:color="5B7DB1" w:sz="4"/>
+              <w:bottom w:val="single" w:color="5B7DB1" w:sz="4"/>
+              <w:right w:val="single" w:color="5B7DB1" w:sz="4"/>
             </w:tcBorders>
             <w:tcMar>
               <w:top w:type="dxa" w:w="60"/>
@@ -6820,10 +6850,10 @@
           <w:tcPr>
             <w:tcW w:type="dxa" w:w="6038"/>
             <w:tcBorders>
-              <w:top w:val="single" w:color="E3A3A3" w:sz="4"/>
-              <w:left w:val="single" w:color="E3A3A3" w:sz="4"/>
-              <w:bottom w:val="single" w:color="E3A3A3" w:sz="4"/>
-              <w:right w:val="single" w:color="E3A3A3" w:sz="4"/>
+              <w:top w:val="single" w:color="5B7DB1" w:sz="4"/>
+              <w:left w:val="single" w:color="5B7DB1" w:sz="4"/>
+              <w:bottom w:val="single" w:color="5B7DB1" w:sz="4"/>
+              <w:right w:val="single" w:color="5B7DB1" w:sz="4"/>
             </w:tcBorders>
             <w:tcMar>
               <w:top w:type="dxa" w:w="60"/>
@@ -6847,10 +6877,10 @@
           <w:tcPr>
             <w:tcW w:type="dxa" w:w="3600"/>
             <w:tcBorders>
-              <w:top w:val="single" w:color="E3A3A3" w:sz="4"/>
-              <w:left w:val="single" w:color="E3A3A3" w:sz="4"/>
-              <w:bottom w:val="single" w:color="E3A3A3" w:sz="4"/>
-              <w:right w:val="single" w:color="E3A3A3" w:sz="4"/>
+              <w:top w:val="single" w:color="5B7DB1" w:sz="4"/>
+              <w:left w:val="single" w:color="5B7DB1" w:sz="4"/>
+              <w:bottom w:val="single" w:color="5B7DB1" w:sz="4"/>
+              <w:right w:val="single" w:color="5B7DB1" w:sz="4"/>
             </w:tcBorders>
             <w:tcMar>
               <w:top w:type="dxa" w:w="60"/>
@@ -6872,10 +6902,10 @@
           <w:tcPr>
             <w:tcW w:type="dxa" w:w="6038"/>
             <w:tcBorders>
-              <w:top w:val="single" w:color="E3A3A3" w:sz="4"/>
-              <w:left w:val="single" w:color="E3A3A3" w:sz="4"/>
-              <w:bottom w:val="single" w:color="E3A3A3" w:sz="4"/>
-              <w:right w:val="single" w:color="E3A3A3" w:sz="4"/>
+              <w:top w:val="single" w:color="5B7DB1" w:sz="4"/>
+              <w:left w:val="single" w:color="5B7DB1" w:sz="4"/>
+              <w:bottom w:val="single" w:color="5B7DB1" w:sz="4"/>
+              <w:right w:val="single" w:color="5B7DB1" w:sz="4"/>
             </w:tcBorders>
             <w:tcMar>
               <w:top w:type="dxa" w:w="60"/>
@@ -6909,10 +6939,10 @@
           <w:tcPr>
             <w:tcW w:type="dxa" w:w="3600"/>
             <w:tcBorders>
-              <w:top w:val="single" w:color="E3A3A3" w:sz="4"/>
-              <w:left w:val="single" w:color="E3A3A3" w:sz="4"/>
-              <w:bottom w:val="single" w:color="E3A3A3" w:sz="4"/>
-              <w:right w:val="single" w:color="E3A3A3" w:sz="4"/>
+              <w:top w:val="single" w:color="5B7DB1" w:sz="4"/>
+              <w:left w:val="single" w:color="5B7DB1" w:sz="4"/>
+              <w:bottom w:val="single" w:color="5B7DB1" w:sz="4"/>
+              <w:right w:val="single" w:color="5B7DB1" w:sz="4"/>
             </w:tcBorders>
             <w:tcMar>
               <w:top w:type="dxa" w:w="60"/>
@@ -6934,10 +6964,10 @@
           <w:tcPr>
             <w:tcW w:type="dxa" w:w="6038"/>
             <w:tcBorders>
-              <w:top w:val="single" w:color="E3A3A3" w:sz="4"/>
-              <w:left w:val="single" w:color="E3A3A3" w:sz="4"/>
-              <w:bottom w:val="single" w:color="E3A3A3" w:sz="4"/>
-              <w:right w:val="single" w:color="E3A3A3" w:sz="4"/>
+              <w:top w:val="single" w:color="5B7DB1" w:sz="4"/>
+              <w:left w:val="single" w:color="5B7DB1" w:sz="4"/>
+              <w:bottom w:val="single" w:color="5B7DB1" w:sz="4"/>
+              <w:right w:val="single" w:color="5B7DB1" w:sz="4"/>
             </w:tcBorders>
             <w:tcMar>
               <w:top w:type="dxa" w:w="60"/>
@@ -6961,10 +6991,10 @@
           <w:tcPr>
             <w:tcW w:type="dxa" w:w="3600"/>
             <w:tcBorders>
-              <w:top w:val="single" w:color="E3A3A3" w:sz="4"/>
-              <w:left w:val="single" w:color="E3A3A3" w:sz="4"/>
-              <w:bottom w:val="single" w:color="E3A3A3" w:sz="4"/>
-              <w:right w:val="single" w:color="E3A3A3" w:sz="4"/>
+              <w:top w:val="single" w:color="5B7DB1" w:sz="4"/>
+              <w:left w:val="single" w:color="5B7DB1" w:sz="4"/>
+              <w:bottom w:val="single" w:color="5B7DB1" w:sz="4"/>
+              <w:right w:val="single" w:color="5B7DB1" w:sz="4"/>
             </w:tcBorders>
             <w:tcMar>
               <w:top w:type="dxa" w:w="60"/>
@@ -6986,10 +7016,10 @@
           <w:tcPr>
             <w:tcW w:type="dxa" w:w="6038"/>
             <w:tcBorders>
-              <w:top w:val="single" w:color="E3A3A3" w:sz="4"/>
-              <w:left w:val="single" w:color="E3A3A3" w:sz="4"/>
-              <w:bottom w:val="single" w:color="E3A3A3" w:sz="4"/>
-              <w:right w:val="single" w:color="E3A3A3" w:sz="4"/>
+              <w:top w:val="single" w:color="5B7DB1" w:sz="4"/>
+              <w:left w:val="single" w:color="5B7DB1" w:sz="4"/>
+              <w:bottom w:val="single" w:color="5B7DB1" w:sz="4"/>
+              <w:right w:val="single" w:color="5B7DB1" w:sz="4"/>
             </w:tcBorders>
             <w:tcMar>
               <w:top w:type="dxa" w:w="60"/>
@@ -8201,7 +8231,7 @@
     <w:qFormat/>
     <w:pPr>
       <w:pBdr>
-        <w:bottom w:val="single" w:color="F6C1C1" w:sz="6" w:space="4"/>
+        <w:bottom w:val="single" w:color="1F4E79" w:sz="6" w:space="4"/>
       </w:pBdr>
       <w:spacing w:after="160" w:before="360"/>
       <w:outlineLvl w:val="0"/>
@@ -8210,7 +8240,7 @@
       <w:rFonts w:ascii="Calibri" w:cs="Calibri" w:eastAsia="Calibri" w:hAnsi="Calibri"/>
       <w:b/>
       <w:bCs/>
-      <w:color w:val="9B2C2C"/>
+      <w:color w:val="1F3864"/>
       <w:sz w:val="30"/>
       <w:szCs w:val="30"/>
     </w:rPr>
@@ -8228,7 +8258,7 @@
       <w:rFonts w:ascii="Calibri" w:cs="Calibri" w:eastAsia="Calibri" w:hAnsi="Calibri"/>
       <w:b/>
       <w:bCs/>
-      <w:color w:val="C0504D"/>
+      <w:color w:val="2E5597"/>
       <w:sz w:val="25"/>
       <w:szCs w:val="25"/>
     </w:rPr>
@@ -8246,7 +8276,7 @@
       <w:rFonts w:ascii="Calibri" w:cs="Calibri" w:eastAsia="Calibri" w:hAnsi="Calibri"/>
       <w:b/>
       <w:bCs/>
-      <w:color w:val="9B2C2C"/>
+      <w:color w:val="1F3864"/>
       <w:sz w:val="22"/>
       <w:szCs w:val="22"/>
     </w:rPr>

</xml_diff>

<commit_message>
Guide d'utilisation : page de garde NABHIS Consulting et membres du groupe
Co-Authored-By: Claude Opus 5.5 <noreply@anthropic.com>
Claude-Session: https://claude.ai/code/session_01UgeLXzj9G5UyQ5F9qqzBDt
</commit_message>
<xml_diff>
--- a/docs/MobiPass_Guide_utilisation_outils_analyse.docx
+++ b/docs/MobiPass_Guide_utilisation_outils_analyse.docx
@@ -4,7 +4,7 @@
   <w:body>
     <w:p>
       <w:pPr>
-        <w:spacing w:before="2600"/>
+        <w:spacing w:before="1800"/>
         <w:jc w:val="center"/>
       </w:pPr>
       <w:r>
@@ -46,7 +46,7 @@
     </w:p>
     <w:p>
       <w:pPr>
-        <w:spacing w:after="1800"/>
+        <w:spacing w:after="900"/>
         <w:jc w:val="center"/>
       </w:pPr>
       <w:r>
@@ -56,6 +56,92 @@
         </w:rPr>
         <w:t xml:space="preserve">Magasins de données LOCATION_MD et ACHAT_MD (Oracle 11g)</w:t>
       </w:r>
+    </w:p>
+    <w:p>
+      <w:pPr>
+        <w:spacing w:after="160"/>
+        <w:jc w:val="center"/>
+      </w:pPr>
+      <w:r>
+        <w:rPr>
+          <w:b/>
+          <w:bCs/>
+          <w:color w:val="1F3864"/>
+          <w:sz w:val="30"/>
+          <w:szCs w:val="30"/>
+        </w:rPr>
+        <w:t xml:space="preserve">NABHIS Consulting</w:t>
+      </w:r>
+    </w:p>
+    <w:p>
+      <w:pPr>
+        <w:spacing w:after="40"/>
+        <w:jc w:val="center"/>
+      </w:pPr>
+      <w:r>
+        <w:rPr>
+          <w:sz w:val="22"/>
+          <w:szCs w:val="22"/>
+        </w:rPr>
+        <w:t xml:space="preserve">AKAKPO Alexandre</w:t>
+      </w:r>
+    </w:p>
+    <w:p>
+      <w:pPr>
+        <w:spacing w:after="40"/>
+        <w:jc w:val="center"/>
+      </w:pPr>
+      <w:r>
+        <w:rPr>
+          <w:sz w:val="22"/>
+          <w:szCs w:val="22"/>
+        </w:rPr>
+        <w:t xml:space="preserve">CARRERE Sami</w:t>
+      </w:r>
+    </w:p>
+    <w:p>
+      <w:pPr>
+        <w:spacing w:after="40"/>
+        <w:jc w:val="center"/>
+      </w:pPr>
+      <w:r>
+        <w:rPr>
+          <w:sz w:val="22"/>
+          <w:szCs w:val="22"/>
+        </w:rPr>
+        <w:t xml:space="preserve">EL CHERIAA Nader</w:t>
+      </w:r>
+    </w:p>
+    <w:p>
+      <w:pPr>
+        <w:spacing w:after="40"/>
+        <w:jc w:val="center"/>
+      </w:pPr>
+      <w:r>
+        <w:rPr>
+          <w:sz w:val="22"/>
+          <w:szCs w:val="22"/>
+        </w:rPr>
+        <w:t xml:space="preserve">JAHID Hicham</w:t>
+      </w:r>
+    </w:p>
+    <w:p>
+      <w:pPr>
+        <w:spacing w:after="40"/>
+        <w:jc w:val="center"/>
+      </w:pPr>
+      <w:r>
+        <w:rPr>
+          <w:sz w:val="22"/>
+          <w:szCs w:val="22"/>
+        </w:rPr>
+        <w:t xml:space="preserve">NDALA Brusny</w:t>
+      </w:r>
+    </w:p>
+    <w:p>
+      <w:pPr>
+        <w:spacing w:after="700"/>
+      </w:pPr>
     </w:p>
     <w:p>
       <w:pPr>
@@ -7829,7 +7915,7 @@
         <w:sz w:val="16"/>
         <w:szCs w:val="16"/>
       </w:rPr>
-      <w:t xml:space="preserve">MobiPass V2 : guide d'utilisation des outils d'analyse    </w:t>
+      <w:t xml:space="preserve">NABHIS Consulting  |  MobiPass V2 : guide d'utilisation des outils d'analyse    </w:t>
     </w:r>
     <w:r>
       <w:rPr>

</xml_diff>